<commit_message>
update 8th version document
</commit_message>
<xml_diff>
--- a/BookingWebsiteBackendBlueprint_8th_Version.docx
+++ b/BookingWebsiteBackendBlueprint_8th_Version.docx
@@ -160,7 +160,7 @@
           <w:r>
             <w:fldChar w:fldCharType="separate"/>
           </w:r>
-          <w:hyperlink w:anchor="_Toc243479259" w:history="1">
+          <w:hyperlink w:anchor="_Toc243582885" w:history="1">
             <w:r>
               <w:rPr>
                 <w:rStyle w:val="Hyperlink"/>
@@ -184,7 +184,7 @@
               <w:rPr>
                 <w:noProof/>
               </w:rPr>
-              <w:instrText xml:space="preserve"> PAGEREF _Toc243479259 \h </w:instrText>
+              <w:instrText xml:space="preserve"> PAGEREF _Toc243582885 \h </w:instrText>
             </w:r>
             <w:r>
               <w:rPr>
@@ -226,7 +226,7 @@
               <w14:ligatures w14:val="standardContextual"/>
             </w:rPr>
           </w:pPr>
-          <w:hyperlink w:anchor="_Toc243479260" w:history="1">
+          <w:hyperlink w:anchor="_Toc243582886" w:history="1">
             <w:r>
               <w:rPr>
                 <w:rStyle w:val="Hyperlink"/>
@@ -250,7 +250,7 @@
               <w:rPr>
                 <w:noProof/>
               </w:rPr>
-              <w:instrText xml:space="preserve"> PAGEREF _Toc243479260 \h </w:instrText>
+              <w:instrText xml:space="preserve"> PAGEREF _Toc243582886 \h </w:instrText>
             </w:r>
             <w:r>
               <w:rPr>
@@ -292,7 +292,7 @@
               <w14:ligatures w14:val="standardContextual"/>
             </w:rPr>
           </w:pPr>
-          <w:hyperlink w:anchor="_Toc243479261" w:history="1">
+          <w:hyperlink w:anchor="_Toc243582887" w:history="1">
             <w:r>
               <w:rPr>
                 <w:rStyle w:val="Hyperlink"/>
@@ -316,7 +316,7 @@
               <w:rPr>
                 <w:noProof/>
               </w:rPr>
-              <w:instrText xml:space="preserve"> PAGEREF _Toc243479261 \h </w:instrText>
+              <w:instrText xml:space="preserve"> PAGEREF _Toc243582887 \h </w:instrText>
             </w:r>
             <w:r>
               <w:rPr>
@@ -358,7 +358,7 @@
               <w14:ligatures w14:val="standardContextual"/>
             </w:rPr>
           </w:pPr>
-          <w:hyperlink w:anchor="_Toc243479262" w:history="1">
+          <w:hyperlink w:anchor="_Toc243582888" w:history="1">
             <w:r>
               <w:rPr>
                 <w:rStyle w:val="Hyperlink"/>
@@ -382,7 +382,7 @@
               <w:rPr>
                 <w:noProof/>
               </w:rPr>
-              <w:instrText xml:space="preserve"> PAGEREF _Toc243479262 \h </w:instrText>
+              <w:instrText xml:space="preserve"> PAGEREF _Toc243582888 \h </w:instrText>
             </w:r>
             <w:r>
               <w:rPr>
@@ -399,7 +399,7 @@
               <w:rPr>
                 <w:noProof/>
               </w:rPr>
-              <w:t>5</w:t>
+              <w:t>6</w:t>
             </w:r>
             <w:r>
               <w:rPr>
@@ -424,7 +424,7 @@
               <w14:ligatures w14:val="standardContextual"/>
             </w:rPr>
           </w:pPr>
-          <w:hyperlink w:anchor="_Toc243479263" w:history="1">
+          <w:hyperlink w:anchor="_Toc243582889" w:history="1">
             <w:r>
               <w:rPr>
                 <w:rStyle w:val="Hyperlink"/>
@@ -448,7 +448,7 @@
               <w:rPr>
                 <w:noProof/>
               </w:rPr>
-              <w:instrText xml:space="preserve"> PAGEREF _Toc243479263 \h </w:instrText>
+              <w:instrText xml:space="preserve"> PAGEREF _Toc243582889 \h </w:instrText>
             </w:r>
             <w:r>
               <w:rPr>
@@ -490,7 +490,7 @@
               <w14:ligatures w14:val="standardContextual"/>
             </w:rPr>
           </w:pPr>
-          <w:hyperlink w:anchor="_Toc243479264" w:history="1">
+          <w:hyperlink w:anchor="_Toc243582890" w:history="1">
             <w:r>
               <w:rPr>
                 <w:rStyle w:val="Hyperlink"/>
@@ -514,7 +514,7 @@
               <w:rPr>
                 <w:noProof/>
               </w:rPr>
-              <w:instrText xml:space="preserve"> PAGEREF _Toc243479264 \h </w:instrText>
+              <w:instrText xml:space="preserve"> PAGEREF _Toc243582890 \h </w:instrText>
             </w:r>
             <w:r>
               <w:rPr>
@@ -556,7 +556,7 @@
               <w14:ligatures w14:val="standardContextual"/>
             </w:rPr>
           </w:pPr>
-          <w:hyperlink w:anchor="_Toc243479265" w:history="1">
+          <w:hyperlink w:anchor="_Toc243582891" w:history="1">
             <w:r>
               <w:rPr>
                 <w:rStyle w:val="Hyperlink"/>
@@ -580,7 +580,7 @@
               <w:rPr>
                 <w:noProof/>
               </w:rPr>
-              <w:instrText xml:space="preserve"> PAGEREF _Toc243479265 \h </w:instrText>
+              <w:instrText xml:space="preserve"> PAGEREF _Toc243582891 \h </w:instrText>
             </w:r>
             <w:r>
               <w:rPr>
@@ -622,7 +622,7 @@
               <w14:ligatures w14:val="standardContextual"/>
             </w:rPr>
           </w:pPr>
-          <w:hyperlink w:anchor="_Toc243479266" w:history="1">
+          <w:hyperlink w:anchor="_Toc243582892" w:history="1">
             <w:r>
               <w:rPr>
                 <w:rStyle w:val="Hyperlink"/>
@@ -646,7 +646,7 @@
               <w:rPr>
                 <w:noProof/>
               </w:rPr>
-              <w:instrText xml:space="preserve"> PAGEREF _Toc243479266 \h </w:instrText>
+              <w:instrText xml:space="preserve"> PAGEREF _Toc243582892 \h </w:instrText>
             </w:r>
             <w:r>
               <w:rPr>
@@ -688,7 +688,7 @@
               <w14:ligatures w14:val="standardContextual"/>
             </w:rPr>
           </w:pPr>
-          <w:hyperlink w:anchor="_Toc243479267" w:history="1">
+          <w:hyperlink w:anchor="_Toc243582893" w:history="1">
             <w:r>
               <w:rPr>
                 <w:rStyle w:val="Hyperlink"/>
@@ -712,7 +712,7 @@
               <w:rPr>
                 <w:noProof/>
               </w:rPr>
-              <w:instrText xml:space="preserve"> PAGEREF _Toc243479267 \h </w:instrText>
+              <w:instrText xml:space="preserve"> PAGEREF _Toc243582893 \h </w:instrText>
             </w:r>
             <w:r>
               <w:rPr>
@@ -754,7 +754,7 @@
               <w14:ligatures w14:val="standardContextual"/>
             </w:rPr>
           </w:pPr>
-          <w:hyperlink w:anchor="_Toc243479268" w:history="1">
+          <w:hyperlink w:anchor="_Toc243582894" w:history="1">
             <w:r>
               <w:rPr>
                 <w:rStyle w:val="Hyperlink"/>
@@ -778,7 +778,7 @@
               <w:rPr>
                 <w:noProof/>
               </w:rPr>
-              <w:instrText xml:space="preserve"> PAGEREF _Toc243479268 \h </w:instrText>
+              <w:instrText xml:space="preserve"> PAGEREF _Toc243582894 \h </w:instrText>
             </w:r>
             <w:r>
               <w:rPr>
@@ -795,7 +795,7 @@
               <w:rPr>
                 <w:noProof/>
               </w:rPr>
-              <w:t>7</w:t>
+              <w:t>8</w:t>
             </w:r>
             <w:r>
               <w:rPr>
@@ -820,7 +820,7 @@
               <w14:ligatures w14:val="standardContextual"/>
             </w:rPr>
           </w:pPr>
-          <w:hyperlink w:anchor="_Toc243479269" w:history="1">
+          <w:hyperlink w:anchor="_Toc243582895" w:history="1">
             <w:r>
               <w:rPr>
                 <w:rStyle w:val="Hyperlink"/>
@@ -844,7 +844,7 @@
               <w:rPr>
                 <w:noProof/>
               </w:rPr>
-              <w:instrText xml:space="preserve"> PAGEREF _Toc243479269 \h </w:instrText>
+              <w:instrText xml:space="preserve"> PAGEREF _Toc243582895 \h </w:instrText>
             </w:r>
             <w:r>
               <w:rPr>
@@ -886,7 +886,7 @@
               <w14:ligatures w14:val="standardContextual"/>
             </w:rPr>
           </w:pPr>
-          <w:hyperlink w:anchor="_Toc243479270" w:history="1">
+          <w:hyperlink w:anchor="_Toc243582896" w:history="1">
             <w:r>
               <w:rPr>
                 <w:rStyle w:val="Hyperlink"/>
@@ -910,7 +910,7 @@
               <w:rPr>
                 <w:noProof/>
               </w:rPr>
-              <w:instrText xml:space="preserve"> PAGEREF _Toc243479270 \h </w:instrText>
+              <w:instrText xml:space="preserve"> PAGEREF _Toc243582896 \h </w:instrText>
             </w:r>
             <w:r>
               <w:rPr>
@@ -952,7 +952,7 @@
               <w14:ligatures w14:val="standardContextual"/>
             </w:rPr>
           </w:pPr>
-          <w:hyperlink w:anchor="_Toc243479271" w:history="1">
+          <w:hyperlink w:anchor="_Toc243582897" w:history="1">
             <w:r>
               <w:rPr>
                 <w:rStyle w:val="Hyperlink"/>
@@ -976,7 +976,7 @@
               <w:rPr>
                 <w:noProof/>
               </w:rPr>
-              <w:instrText xml:space="preserve"> PAGEREF _Toc243479271 \h </w:instrText>
+              <w:instrText xml:space="preserve"> PAGEREF _Toc243582897 \h </w:instrText>
             </w:r>
             <w:r>
               <w:rPr>
@@ -1018,7 +1018,7 @@
               <w14:ligatures w14:val="standardContextual"/>
             </w:rPr>
           </w:pPr>
-          <w:hyperlink w:anchor="_Toc243479272" w:history="1">
+          <w:hyperlink w:anchor="_Toc243582898" w:history="1">
             <w:r>
               <w:rPr>
                 <w:rStyle w:val="Hyperlink"/>
@@ -1042,7 +1042,7 @@
               <w:rPr>
                 <w:noProof/>
               </w:rPr>
-              <w:instrText xml:space="preserve"> PAGEREF _Toc243479272 \h </w:instrText>
+              <w:instrText xml:space="preserve"> PAGEREF _Toc243582898 \h </w:instrText>
             </w:r>
             <w:r>
               <w:rPr>
@@ -1084,7 +1084,7 @@
               <w14:ligatures w14:val="standardContextual"/>
             </w:rPr>
           </w:pPr>
-          <w:hyperlink w:anchor="_Toc243479273" w:history="1">
+          <w:hyperlink w:anchor="_Toc243582899" w:history="1">
             <w:r>
               <w:rPr>
                 <w:rStyle w:val="Hyperlink"/>
@@ -1108,7 +1108,7 @@
               <w:rPr>
                 <w:noProof/>
               </w:rPr>
-              <w:instrText xml:space="preserve"> PAGEREF _Toc243479273 \h </w:instrText>
+              <w:instrText xml:space="preserve"> PAGEREF _Toc243582899 \h </w:instrText>
             </w:r>
             <w:r>
               <w:rPr>
@@ -1150,7 +1150,7 @@
               <w14:ligatures w14:val="standardContextual"/>
             </w:rPr>
           </w:pPr>
-          <w:hyperlink w:anchor="_Toc243479274" w:history="1">
+          <w:hyperlink w:anchor="_Toc243582900" w:history="1">
             <w:r>
               <w:rPr>
                 <w:rStyle w:val="Hyperlink"/>
@@ -1174,7 +1174,7 @@
               <w:rPr>
                 <w:noProof/>
               </w:rPr>
-              <w:instrText xml:space="preserve"> PAGEREF _Toc243479274 \h </w:instrText>
+              <w:instrText xml:space="preserve"> PAGEREF _Toc243582900 \h </w:instrText>
             </w:r>
             <w:r>
               <w:rPr>
@@ -1216,7 +1216,7 @@
               <w14:ligatures w14:val="standardContextual"/>
             </w:rPr>
           </w:pPr>
-          <w:hyperlink w:anchor="_Toc243479275" w:history="1">
+          <w:hyperlink w:anchor="_Toc243582901" w:history="1">
             <w:r>
               <w:rPr>
                 <w:rStyle w:val="Hyperlink"/>
@@ -1240,7 +1240,7 @@
               <w:rPr>
                 <w:noProof/>
               </w:rPr>
-              <w:instrText xml:space="preserve"> PAGEREF _Toc243479275 \h </w:instrText>
+              <w:instrText xml:space="preserve"> PAGEREF _Toc243582901 \h </w:instrText>
             </w:r>
             <w:r>
               <w:rPr>
@@ -1257,7 +1257,7 @@
               <w:rPr>
                 <w:noProof/>
               </w:rPr>
-              <w:t>10</w:t>
+              <w:t>11</w:t>
             </w:r>
             <w:r>
               <w:rPr>
@@ -1282,7 +1282,7 @@
               <w14:ligatures w14:val="standardContextual"/>
             </w:rPr>
           </w:pPr>
-          <w:hyperlink w:anchor="_Toc243479276" w:history="1">
+          <w:hyperlink w:anchor="_Toc243582902" w:history="1">
             <w:r>
               <w:rPr>
                 <w:rStyle w:val="Hyperlink"/>
@@ -1306,7 +1306,7 @@
               <w:rPr>
                 <w:noProof/>
               </w:rPr>
-              <w:instrText xml:space="preserve"> PAGEREF _Toc243479276 \h </w:instrText>
+              <w:instrText xml:space="preserve"> PAGEREF _Toc243582902 \h </w:instrText>
             </w:r>
             <w:r>
               <w:rPr>
@@ -1323,7 +1323,7 @@
               <w:rPr>
                 <w:noProof/>
               </w:rPr>
-              <w:t>10</w:t>
+              <w:t>11</w:t>
             </w:r>
             <w:r>
               <w:rPr>
@@ -1348,7 +1348,7 @@
               <w14:ligatures w14:val="standardContextual"/>
             </w:rPr>
           </w:pPr>
-          <w:hyperlink w:anchor="_Toc243479277" w:history="1">
+          <w:hyperlink w:anchor="_Toc243582903" w:history="1">
             <w:r>
               <w:rPr>
                 <w:rStyle w:val="Hyperlink"/>
@@ -1372,7 +1372,7 @@
               <w:rPr>
                 <w:noProof/>
               </w:rPr>
-              <w:instrText xml:space="preserve"> PAGEREF _Toc243479277 \h </w:instrText>
+              <w:instrText xml:space="preserve"> PAGEREF _Toc243582903 \h </w:instrText>
             </w:r>
             <w:r>
               <w:rPr>
@@ -1414,7 +1414,7 @@
               <w14:ligatures w14:val="standardContextual"/>
             </w:rPr>
           </w:pPr>
-          <w:hyperlink w:anchor="_Toc243479278" w:history="1">
+          <w:hyperlink w:anchor="_Toc243582904" w:history="1">
             <w:r>
               <w:rPr>
                 <w:rStyle w:val="Hyperlink"/>
@@ -1438,7 +1438,7 @@
               <w:rPr>
                 <w:noProof/>
               </w:rPr>
-              <w:instrText xml:space="preserve"> PAGEREF _Toc243479278 \h </w:instrText>
+              <w:instrText xml:space="preserve"> PAGEREF _Toc243582904 \h </w:instrText>
             </w:r>
             <w:r>
               <w:rPr>
@@ -1480,7 +1480,7 @@
               <w14:ligatures w14:val="standardContextual"/>
             </w:rPr>
           </w:pPr>
-          <w:hyperlink w:anchor="_Toc243479279" w:history="1">
+          <w:hyperlink w:anchor="_Toc243582905" w:history="1">
             <w:r>
               <w:rPr>
                 <w:rStyle w:val="Hyperlink"/>
@@ -1504,7 +1504,7 @@
               <w:rPr>
                 <w:noProof/>
               </w:rPr>
-              <w:instrText xml:space="preserve"> PAGEREF _Toc243479279 \h </w:instrText>
+              <w:instrText xml:space="preserve"> PAGEREF _Toc243582905 \h </w:instrText>
             </w:r>
             <w:r>
               <w:rPr>
@@ -1521,7 +1521,7 @@
               <w:rPr>
                 <w:noProof/>
               </w:rPr>
-              <w:t>12</w:t>
+              <w:t>13</w:t>
             </w:r>
             <w:r>
               <w:rPr>
@@ -1546,7 +1546,7 @@
               <w14:ligatures w14:val="standardContextual"/>
             </w:rPr>
           </w:pPr>
-          <w:hyperlink w:anchor="_Toc243479280" w:history="1">
+          <w:hyperlink w:anchor="_Toc243582906" w:history="1">
             <w:r>
               <w:rPr>
                 <w:rStyle w:val="Hyperlink"/>
@@ -1570,7 +1570,7 @@
               <w:rPr>
                 <w:noProof/>
               </w:rPr>
-              <w:instrText xml:space="preserve"> PAGEREF _Toc243479280 \h </w:instrText>
+              <w:instrText xml:space="preserve"> PAGEREF _Toc243582906 \h </w:instrText>
             </w:r>
             <w:r>
               <w:rPr>
@@ -1612,7 +1612,7 @@
               <w14:ligatures w14:val="standardContextual"/>
             </w:rPr>
           </w:pPr>
-          <w:hyperlink w:anchor="_Toc243479281" w:history="1">
+          <w:hyperlink w:anchor="_Toc243582907" w:history="1">
             <w:r>
               <w:rPr>
                 <w:rStyle w:val="Hyperlink"/>
@@ -1636,7 +1636,7 @@
               <w:rPr>
                 <w:noProof/>
               </w:rPr>
-              <w:instrText xml:space="preserve"> PAGEREF _Toc243479281 \h </w:instrText>
+              <w:instrText xml:space="preserve"> PAGEREF _Toc243582907 \h </w:instrText>
             </w:r>
             <w:r>
               <w:rPr>
@@ -1653,7 +1653,7 @@
               <w:rPr>
                 <w:noProof/>
               </w:rPr>
-              <w:t>14</w:t>
+              <w:t>16</w:t>
             </w:r>
             <w:r>
               <w:rPr>
@@ -1678,7 +1678,7 @@
               <w14:ligatures w14:val="standardContextual"/>
             </w:rPr>
           </w:pPr>
-          <w:hyperlink w:anchor="_Toc243479282" w:history="1">
+          <w:hyperlink w:anchor="_Toc243582908" w:history="1">
             <w:r>
               <w:rPr>
                 <w:rStyle w:val="Hyperlink"/>
@@ -1702,7 +1702,7 @@
               <w:rPr>
                 <w:noProof/>
               </w:rPr>
-              <w:instrText xml:space="preserve"> PAGEREF _Toc243479282 \h </w:instrText>
+              <w:instrText xml:space="preserve"> PAGEREF _Toc243582908 \h </w:instrText>
             </w:r>
             <w:r>
               <w:rPr>
@@ -1719,7 +1719,7 @@
               <w:rPr>
                 <w:noProof/>
               </w:rPr>
-              <w:t>15</w:t>
+              <w:t>16</w:t>
             </w:r>
             <w:r>
               <w:rPr>
@@ -1744,7 +1744,7 @@
               <w14:ligatures w14:val="standardContextual"/>
             </w:rPr>
           </w:pPr>
-          <w:hyperlink w:anchor="_Toc243479283" w:history="1">
+          <w:hyperlink w:anchor="_Toc243582909" w:history="1">
             <w:r>
               <w:rPr>
                 <w:rStyle w:val="Hyperlink"/>
@@ -1768,7 +1768,7 @@
               <w:rPr>
                 <w:noProof/>
               </w:rPr>
-              <w:instrText xml:space="preserve"> PAGEREF _Toc243479283 \h </w:instrText>
+              <w:instrText xml:space="preserve"> PAGEREF _Toc243582909 \h </w:instrText>
             </w:r>
             <w:r>
               <w:rPr>
@@ -1785,7 +1785,7 @@
               <w:rPr>
                 <w:noProof/>
               </w:rPr>
-              <w:t>15</w:t>
+              <w:t>16</w:t>
             </w:r>
             <w:r>
               <w:rPr>
@@ -1810,7 +1810,7 @@
               <w14:ligatures w14:val="standardContextual"/>
             </w:rPr>
           </w:pPr>
-          <w:hyperlink w:anchor="_Toc243479284" w:history="1">
+          <w:hyperlink w:anchor="_Toc243582910" w:history="1">
             <w:r>
               <w:rPr>
                 <w:rStyle w:val="Hyperlink"/>
@@ -1834,7 +1834,7 @@
               <w:rPr>
                 <w:noProof/>
               </w:rPr>
-              <w:instrText xml:space="preserve"> PAGEREF _Toc243479284 \h </w:instrText>
+              <w:instrText xml:space="preserve"> PAGEREF _Toc243582910 \h </w:instrText>
             </w:r>
             <w:r>
               <w:rPr>
@@ -1851,7 +1851,7 @@
               <w:rPr>
                 <w:noProof/>
               </w:rPr>
-              <w:t>15</w:t>
+              <w:t>16</w:t>
             </w:r>
             <w:r>
               <w:rPr>
@@ -1876,7 +1876,7 @@
               <w14:ligatures w14:val="standardContextual"/>
             </w:rPr>
           </w:pPr>
-          <w:hyperlink w:anchor="_Toc243479285" w:history="1">
+          <w:hyperlink w:anchor="_Toc243582911" w:history="1">
             <w:r>
               <w:rPr>
                 <w:rStyle w:val="Hyperlink"/>
@@ -1900,7 +1900,7 @@
               <w:rPr>
                 <w:noProof/>
               </w:rPr>
-              <w:instrText xml:space="preserve"> PAGEREF _Toc243479285 \h </w:instrText>
+              <w:instrText xml:space="preserve"> PAGEREF _Toc243582911 \h </w:instrText>
             </w:r>
             <w:r>
               <w:rPr>
@@ -1917,7 +1917,7 @@
               <w:rPr>
                 <w:noProof/>
               </w:rPr>
-              <w:t>15</w:t>
+              <w:t>17</w:t>
             </w:r>
             <w:r>
               <w:rPr>
@@ -1942,7 +1942,7 @@
               <w14:ligatures w14:val="standardContextual"/>
             </w:rPr>
           </w:pPr>
-          <w:hyperlink w:anchor="_Toc243479286" w:history="1">
+          <w:hyperlink w:anchor="_Toc243582912" w:history="1">
             <w:r>
               <w:rPr>
                 <w:rStyle w:val="Hyperlink"/>
@@ -1966,7 +1966,7 @@
               <w:rPr>
                 <w:noProof/>
               </w:rPr>
-              <w:instrText xml:space="preserve"> PAGEREF _Toc243479286 \h </w:instrText>
+              <w:instrText xml:space="preserve"> PAGEREF _Toc243582912 \h </w:instrText>
             </w:r>
             <w:r>
               <w:rPr>
@@ -1983,7 +1983,7 @@
               <w:rPr>
                 <w:noProof/>
               </w:rPr>
-              <w:t>16</w:t>
+              <w:t>18</w:t>
             </w:r>
             <w:r>
               <w:rPr>
@@ -2008,7 +2008,7 @@
               <w14:ligatures w14:val="standardContextual"/>
             </w:rPr>
           </w:pPr>
-          <w:hyperlink w:anchor="_Toc243479287" w:history="1">
+          <w:hyperlink w:anchor="_Toc243582913" w:history="1">
             <w:r>
               <w:rPr>
                 <w:rStyle w:val="Hyperlink"/>
@@ -2032,7 +2032,7 @@
               <w:rPr>
                 <w:noProof/>
               </w:rPr>
-              <w:instrText xml:space="preserve"> PAGEREF _Toc243479287 \h </w:instrText>
+              <w:instrText xml:space="preserve"> PAGEREF _Toc243582913 \h </w:instrText>
             </w:r>
             <w:r>
               <w:rPr>
@@ -2049,7 +2049,7 @@
               <w:rPr>
                 <w:noProof/>
               </w:rPr>
-              <w:t>16</w:t>
+              <w:t>18</w:t>
             </w:r>
             <w:r>
               <w:rPr>
@@ -2074,7 +2074,7 @@
               <w14:ligatures w14:val="standardContextual"/>
             </w:rPr>
           </w:pPr>
-          <w:hyperlink w:anchor="_Toc243479288" w:history="1">
+          <w:hyperlink w:anchor="_Toc243582914" w:history="1">
             <w:r>
               <w:rPr>
                 <w:rStyle w:val="Hyperlink"/>
@@ -2098,7 +2098,7 @@
               <w:rPr>
                 <w:noProof/>
               </w:rPr>
-              <w:instrText xml:space="preserve"> PAGEREF _Toc243479288 \h </w:instrText>
+              <w:instrText xml:space="preserve"> PAGEREF _Toc243582914 \h </w:instrText>
             </w:r>
             <w:r>
               <w:rPr>
@@ -2115,7 +2115,7 @@
               <w:rPr>
                 <w:noProof/>
               </w:rPr>
-              <w:t>17</w:t>
+              <w:t>18</w:t>
             </w:r>
             <w:r>
               <w:rPr>
@@ -2140,7 +2140,7 @@
               <w14:ligatures w14:val="standardContextual"/>
             </w:rPr>
           </w:pPr>
-          <w:hyperlink w:anchor="_Toc243479289" w:history="1">
+          <w:hyperlink w:anchor="_Toc243582915" w:history="1">
             <w:r>
               <w:rPr>
                 <w:rStyle w:val="Hyperlink"/>
@@ -2164,7 +2164,7 @@
               <w:rPr>
                 <w:noProof/>
               </w:rPr>
-              <w:instrText xml:space="preserve"> PAGEREF _Toc243479289 \h </w:instrText>
+              <w:instrText xml:space="preserve"> PAGEREF _Toc243582915 \h </w:instrText>
             </w:r>
             <w:r>
               <w:rPr>
@@ -2181,7 +2181,7 @@
               <w:rPr>
                 <w:noProof/>
               </w:rPr>
-              <w:t>17</w:t>
+              <w:t>18</w:t>
             </w:r>
             <w:r>
               <w:rPr>
@@ -2206,7 +2206,7 @@
               <w14:ligatures w14:val="standardContextual"/>
             </w:rPr>
           </w:pPr>
-          <w:hyperlink w:anchor="_Toc243479290" w:history="1">
+          <w:hyperlink w:anchor="_Toc243582916" w:history="1">
             <w:r>
               <w:rPr>
                 <w:rStyle w:val="Hyperlink"/>
@@ -2230,7 +2230,7 @@
               <w:rPr>
                 <w:noProof/>
               </w:rPr>
-              <w:instrText xml:space="preserve"> PAGEREF _Toc243479290 \h </w:instrText>
+              <w:instrText xml:space="preserve"> PAGEREF _Toc243582916 \h </w:instrText>
             </w:r>
             <w:r>
               <w:rPr>
@@ -2247,7 +2247,7 @@
               <w:rPr>
                 <w:noProof/>
               </w:rPr>
-              <w:t>17</w:t>
+              <w:t>19</w:t>
             </w:r>
             <w:r>
               <w:rPr>
@@ -2272,7 +2272,7 @@
               <w14:ligatures w14:val="standardContextual"/>
             </w:rPr>
           </w:pPr>
-          <w:hyperlink w:anchor="_Toc243479291" w:history="1">
+          <w:hyperlink w:anchor="_Toc243582917" w:history="1">
             <w:r>
               <w:rPr>
                 <w:rStyle w:val="Hyperlink"/>
@@ -2296,7 +2296,7 @@
               <w:rPr>
                 <w:noProof/>
               </w:rPr>
-              <w:instrText xml:space="preserve"> PAGEREF _Toc243479291 \h </w:instrText>
+              <w:instrText xml:space="preserve"> PAGEREF _Toc243582917 \h </w:instrText>
             </w:r>
             <w:r>
               <w:rPr>
@@ -2313,7 +2313,7 @@
               <w:rPr>
                 <w:noProof/>
               </w:rPr>
-              <w:t>17</w:t>
+              <w:t>19</w:t>
             </w:r>
             <w:r>
               <w:rPr>
@@ -2338,7 +2338,7 @@
               <w14:ligatures w14:val="standardContextual"/>
             </w:rPr>
           </w:pPr>
-          <w:hyperlink w:anchor="_Toc243479292" w:history="1">
+          <w:hyperlink w:anchor="_Toc243582918" w:history="1">
             <w:r>
               <w:rPr>
                 <w:rStyle w:val="Hyperlink"/>
@@ -2362,7 +2362,7 @@
               <w:rPr>
                 <w:noProof/>
               </w:rPr>
-              <w:instrText xml:space="preserve"> PAGEREF _Toc243479292 \h </w:instrText>
+              <w:instrText xml:space="preserve"> PAGEREF _Toc243582918 \h </w:instrText>
             </w:r>
             <w:r>
               <w:rPr>
@@ -2379,7 +2379,7 @@
               <w:rPr>
                 <w:noProof/>
               </w:rPr>
-              <w:t>18</w:t>
+              <w:t>19</w:t>
             </w:r>
             <w:r>
               <w:rPr>
@@ -2404,7 +2404,7 @@
               <w14:ligatures w14:val="standardContextual"/>
             </w:rPr>
           </w:pPr>
-          <w:hyperlink w:anchor="_Toc243479293" w:history="1">
+          <w:hyperlink w:anchor="_Toc243582919" w:history="1">
             <w:r>
               <w:rPr>
                 <w:rStyle w:val="Hyperlink"/>
@@ -2428,7 +2428,7 @@
               <w:rPr>
                 <w:noProof/>
               </w:rPr>
-              <w:instrText xml:space="preserve"> PAGEREF _Toc243479293 \h </w:instrText>
+              <w:instrText xml:space="preserve"> PAGEREF _Toc243582919 \h </w:instrText>
             </w:r>
             <w:r>
               <w:rPr>
@@ -2445,7 +2445,7 @@
               <w:rPr>
                 <w:noProof/>
               </w:rPr>
-              <w:t>18</w:t>
+              <w:t>19</w:t>
             </w:r>
             <w:r>
               <w:rPr>
@@ -2470,7 +2470,7 @@
               <w14:ligatures w14:val="standardContextual"/>
             </w:rPr>
           </w:pPr>
-          <w:hyperlink w:anchor="_Toc243479294" w:history="1">
+          <w:hyperlink w:anchor="_Toc243582920" w:history="1">
             <w:r>
               <w:rPr>
                 <w:rStyle w:val="Hyperlink"/>
@@ -2494,7 +2494,7 @@
               <w:rPr>
                 <w:noProof/>
               </w:rPr>
-              <w:instrText xml:space="preserve"> PAGEREF _Toc243479294 \h </w:instrText>
+              <w:instrText xml:space="preserve"> PAGEREF _Toc243582920 \h </w:instrText>
             </w:r>
             <w:r>
               <w:rPr>
@@ -2511,7 +2511,7 @@
               <w:rPr>
                 <w:noProof/>
               </w:rPr>
-              <w:t>18</w:t>
+              <w:t>20</w:t>
             </w:r>
             <w:r>
               <w:rPr>
@@ -2536,7 +2536,7 @@
               <w14:ligatures w14:val="standardContextual"/>
             </w:rPr>
           </w:pPr>
-          <w:hyperlink w:anchor="_Toc243479295" w:history="1">
+          <w:hyperlink w:anchor="_Toc243582921" w:history="1">
             <w:r>
               <w:rPr>
                 <w:rStyle w:val="Hyperlink"/>
@@ -2560,7 +2560,7 @@
               <w:rPr>
                 <w:noProof/>
               </w:rPr>
-              <w:instrText xml:space="preserve"> PAGEREF _Toc243479295 \h </w:instrText>
+              <w:instrText xml:space="preserve"> PAGEREF _Toc243582921 \h </w:instrText>
             </w:r>
             <w:r>
               <w:rPr>
@@ -2577,7 +2577,7 @@
               <w:rPr>
                 <w:noProof/>
               </w:rPr>
-              <w:t>18</w:t>
+              <w:t>20</w:t>
             </w:r>
             <w:r>
               <w:rPr>
@@ -2602,7 +2602,7 @@
               <w14:ligatures w14:val="standardContextual"/>
             </w:rPr>
           </w:pPr>
-          <w:hyperlink w:anchor="_Toc243479296" w:history="1">
+          <w:hyperlink w:anchor="_Toc243582922" w:history="1">
             <w:r>
               <w:rPr>
                 <w:rStyle w:val="Hyperlink"/>
@@ -2626,7 +2626,7 @@
               <w:rPr>
                 <w:noProof/>
               </w:rPr>
-              <w:instrText xml:space="preserve"> PAGEREF _Toc243479296 \h </w:instrText>
+              <w:instrText xml:space="preserve"> PAGEREF _Toc243582922 \h </w:instrText>
             </w:r>
             <w:r>
               <w:rPr>
@@ -2643,7 +2643,7 @@
               <w:rPr>
                 <w:noProof/>
               </w:rPr>
-              <w:t>19</w:t>
+              <w:t>20</w:t>
             </w:r>
             <w:r>
               <w:rPr>
@@ -2668,7 +2668,7 @@
               <w14:ligatures w14:val="standardContextual"/>
             </w:rPr>
           </w:pPr>
-          <w:hyperlink w:anchor="_Toc243479297" w:history="1">
+          <w:hyperlink w:anchor="_Toc243582923" w:history="1">
             <w:r>
               <w:rPr>
                 <w:rStyle w:val="Hyperlink"/>
@@ -2692,7 +2692,7 @@
               <w:rPr>
                 <w:noProof/>
               </w:rPr>
-              <w:instrText xml:space="preserve"> PAGEREF _Toc243479297 \h </w:instrText>
+              <w:instrText xml:space="preserve"> PAGEREF _Toc243582923 \h </w:instrText>
             </w:r>
             <w:r>
               <w:rPr>
@@ -2709,7 +2709,7 @@
               <w:rPr>
                 <w:noProof/>
               </w:rPr>
-              <w:t>19</w:t>
+              <w:t>20</w:t>
             </w:r>
             <w:r>
               <w:rPr>
@@ -2734,7 +2734,7 @@
               <w14:ligatures w14:val="standardContextual"/>
             </w:rPr>
           </w:pPr>
-          <w:hyperlink w:anchor="_Toc243479298" w:history="1">
+          <w:hyperlink w:anchor="_Toc243582924" w:history="1">
             <w:r>
               <w:rPr>
                 <w:rStyle w:val="Hyperlink"/>
@@ -2758,7 +2758,7 @@
               <w:rPr>
                 <w:noProof/>
               </w:rPr>
-              <w:instrText xml:space="preserve"> PAGEREF _Toc243479298 \h </w:instrText>
+              <w:instrText xml:space="preserve"> PAGEREF _Toc243582924 \h </w:instrText>
             </w:r>
             <w:r>
               <w:rPr>
@@ -2775,7 +2775,7 @@
               <w:rPr>
                 <w:noProof/>
               </w:rPr>
-              <w:t>20</w:t>
+              <w:t>21</w:t>
             </w:r>
             <w:r>
               <w:rPr>
@@ -2800,7 +2800,7 @@
               <w14:ligatures w14:val="standardContextual"/>
             </w:rPr>
           </w:pPr>
-          <w:hyperlink w:anchor="_Toc243479299" w:history="1">
+          <w:hyperlink w:anchor="_Toc243582925" w:history="1">
             <w:r>
               <w:rPr>
                 <w:rStyle w:val="Hyperlink"/>
@@ -2824,7 +2824,7 @@
               <w:rPr>
                 <w:noProof/>
               </w:rPr>
-              <w:instrText xml:space="preserve"> PAGEREF _Toc243479299 \h </w:instrText>
+              <w:instrText xml:space="preserve"> PAGEREF _Toc243582925 \h </w:instrText>
             </w:r>
             <w:r>
               <w:rPr>
@@ -2841,7 +2841,7 @@
               <w:rPr>
                 <w:noProof/>
               </w:rPr>
-              <w:t>20</w:t>
+              <w:t>21</w:t>
             </w:r>
             <w:r>
               <w:rPr>
@@ -2866,7 +2866,7 @@
               <w14:ligatures w14:val="standardContextual"/>
             </w:rPr>
           </w:pPr>
-          <w:hyperlink w:anchor="_Toc243479300" w:history="1">
+          <w:hyperlink w:anchor="_Toc243582926" w:history="1">
             <w:r>
               <w:rPr>
                 <w:rStyle w:val="Hyperlink"/>
@@ -2890,7 +2890,7 @@
               <w:rPr>
                 <w:noProof/>
               </w:rPr>
-              <w:instrText xml:space="preserve"> PAGEREF _Toc243479300 \h </w:instrText>
+              <w:instrText xml:space="preserve"> PAGEREF _Toc243582926 \h </w:instrText>
             </w:r>
             <w:r>
               <w:rPr>
@@ -2907,7 +2907,7 @@
               <w:rPr>
                 <w:noProof/>
               </w:rPr>
-              <w:t>20</w:t>
+              <w:t>21</w:t>
             </w:r>
             <w:r>
               <w:rPr>
@@ -2932,7 +2932,7 @@
               <w14:ligatures w14:val="standardContextual"/>
             </w:rPr>
           </w:pPr>
-          <w:hyperlink w:anchor="_Toc243479301" w:history="1">
+          <w:hyperlink w:anchor="_Toc243582927" w:history="1">
             <w:r>
               <w:rPr>
                 <w:rStyle w:val="Hyperlink"/>
@@ -2956,7 +2956,7 @@
               <w:rPr>
                 <w:noProof/>
               </w:rPr>
-              <w:instrText xml:space="preserve"> PAGEREF _Toc243479301 \h </w:instrText>
+              <w:instrText xml:space="preserve"> PAGEREF _Toc243582927 \h </w:instrText>
             </w:r>
             <w:r>
               <w:rPr>
@@ -2973,7 +2973,7 @@
               <w:rPr>
                 <w:noProof/>
               </w:rPr>
-              <w:t>20</w:t>
+              <w:t>22</w:t>
             </w:r>
             <w:r>
               <w:rPr>
@@ -2998,7 +2998,7 @@
               <w14:ligatures w14:val="standardContextual"/>
             </w:rPr>
           </w:pPr>
-          <w:hyperlink w:anchor="_Toc243479302" w:history="1">
+          <w:hyperlink w:anchor="_Toc243582928" w:history="1">
             <w:r>
               <w:rPr>
                 <w:rStyle w:val="Hyperlink"/>
@@ -3022,7 +3022,7 @@
               <w:rPr>
                 <w:noProof/>
               </w:rPr>
-              <w:instrText xml:space="preserve"> PAGEREF _Toc243479302 \h </w:instrText>
+              <w:instrText xml:space="preserve"> PAGEREF _Toc243582928 \h </w:instrText>
             </w:r>
             <w:r>
               <w:rPr>
@@ -3039,7 +3039,7 @@
               <w:rPr>
                 <w:noProof/>
               </w:rPr>
-              <w:t>21</w:t>
+              <w:t>23</w:t>
             </w:r>
             <w:r>
               <w:rPr>
@@ -3064,7 +3064,7 @@
               <w14:ligatures w14:val="standardContextual"/>
             </w:rPr>
           </w:pPr>
-          <w:hyperlink w:anchor="_Toc243479303" w:history="1">
+          <w:hyperlink w:anchor="_Toc243582929" w:history="1">
             <w:r>
               <w:rPr>
                 <w:rStyle w:val="Hyperlink"/>
@@ -3088,7 +3088,7 @@
               <w:rPr>
                 <w:noProof/>
               </w:rPr>
-              <w:instrText xml:space="preserve"> PAGEREF _Toc243479303 \h </w:instrText>
+              <w:instrText xml:space="preserve"> PAGEREF _Toc243582929 \h </w:instrText>
             </w:r>
             <w:r>
               <w:rPr>
@@ -3105,7 +3105,7 @@
               <w:rPr>
                 <w:noProof/>
               </w:rPr>
-              <w:t>21</w:t>
+              <w:t>23</w:t>
             </w:r>
             <w:r>
               <w:rPr>
@@ -3130,7 +3130,7 @@
               <w14:ligatures w14:val="standardContextual"/>
             </w:rPr>
           </w:pPr>
-          <w:hyperlink w:anchor="_Toc243479304" w:history="1">
+          <w:hyperlink w:anchor="_Toc243582930" w:history="1">
             <w:r>
               <w:rPr>
                 <w:rStyle w:val="Hyperlink"/>
@@ -3154,7 +3154,7 @@
               <w:rPr>
                 <w:noProof/>
               </w:rPr>
-              <w:instrText xml:space="preserve"> PAGEREF _Toc243479304 \h </w:instrText>
+              <w:instrText xml:space="preserve"> PAGEREF _Toc243582930 \h </w:instrText>
             </w:r>
             <w:r>
               <w:rPr>
@@ -3171,7 +3171,7 @@
               <w:rPr>
                 <w:noProof/>
               </w:rPr>
-              <w:t>21</w:t>
+              <w:t>23</w:t>
             </w:r>
             <w:r>
               <w:rPr>
@@ -3196,7 +3196,7 @@
               <w14:ligatures w14:val="standardContextual"/>
             </w:rPr>
           </w:pPr>
-          <w:hyperlink w:anchor="_Toc243479305" w:history="1">
+          <w:hyperlink w:anchor="_Toc243582931" w:history="1">
             <w:r>
               <w:rPr>
                 <w:rStyle w:val="Hyperlink"/>
@@ -3220,7 +3220,7 @@
               <w:rPr>
                 <w:noProof/>
               </w:rPr>
-              <w:instrText xml:space="preserve"> PAGEREF _Toc243479305 \h </w:instrText>
+              <w:instrText xml:space="preserve"> PAGEREF _Toc243582931 \h </w:instrText>
             </w:r>
             <w:r>
               <w:rPr>
@@ -3237,7 +3237,7 @@
               <w:rPr>
                 <w:noProof/>
               </w:rPr>
-              <w:t>22</w:t>
+              <w:t>23</w:t>
             </w:r>
             <w:r>
               <w:rPr>
@@ -3262,7 +3262,7 @@
               <w14:ligatures w14:val="standardContextual"/>
             </w:rPr>
           </w:pPr>
-          <w:hyperlink w:anchor="_Toc243479306" w:history="1">
+          <w:hyperlink w:anchor="_Toc243582932" w:history="1">
             <w:r>
               <w:rPr>
                 <w:rStyle w:val="Hyperlink"/>
@@ -3286,7 +3286,7 @@
               <w:rPr>
                 <w:noProof/>
               </w:rPr>
-              <w:instrText xml:space="preserve"> PAGEREF _Toc243479306 \h </w:instrText>
+              <w:instrText xml:space="preserve"> PAGEREF _Toc243582932 \h </w:instrText>
             </w:r>
             <w:r>
               <w:rPr>
@@ -3303,7 +3303,7 @@
               <w:rPr>
                 <w:noProof/>
               </w:rPr>
-              <w:t>23</w:t>
+              <w:t>24</w:t>
             </w:r>
             <w:r>
               <w:rPr>
@@ -3328,7 +3328,7 @@
               <w14:ligatures w14:val="standardContextual"/>
             </w:rPr>
           </w:pPr>
-          <w:hyperlink w:anchor="_Toc243479307" w:history="1">
+          <w:hyperlink w:anchor="_Toc243582933" w:history="1">
             <w:r>
               <w:rPr>
                 <w:rStyle w:val="Hyperlink"/>
@@ -3352,7 +3352,7 @@
               <w:rPr>
                 <w:noProof/>
               </w:rPr>
-              <w:instrText xml:space="preserve"> PAGEREF _Toc243479307 \h </w:instrText>
+              <w:instrText xml:space="preserve"> PAGEREF _Toc243582933 \h </w:instrText>
             </w:r>
             <w:r>
               <w:rPr>
@@ -3369,7 +3369,7 @@
               <w:rPr>
                 <w:noProof/>
               </w:rPr>
-              <w:t>25</w:t>
+              <w:t>26</w:t>
             </w:r>
             <w:r>
               <w:rPr>
@@ -3394,7 +3394,7 @@
               <w14:ligatures w14:val="standardContextual"/>
             </w:rPr>
           </w:pPr>
-          <w:hyperlink w:anchor="_Toc243479308" w:history="1">
+          <w:hyperlink w:anchor="_Toc243582934" w:history="1">
             <w:r>
               <w:rPr>
                 <w:rStyle w:val="Hyperlink"/>
@@ -3418,7 +3418,7 @@
               <w:rPr>
                 <w:noProof/>
               </w:rPr>
-              <w:instrText xml:space="preserve"> PAGEREF _Toc243479308 \h </w:instrText>
+              <w:instrText xml:space="preserve"> PAGEREF _Toc243582934 \h </w:instrText>
             </w:r>
             <w:r>
               <w:rPr>
@@ -3435,7 +3435,7 @@
               <w:rPr>
                 <w:noProof/>
               </w:rPr>
-              <w:t>25</w:t>
+              <w:t>26</w:t>
             </w:r>
             <w:r>
               <w:rPr>
@@ -3460,7 +3460,7 @@
               <w14:ligatures w14:val="standardContextual"/>
             </w:rPr>
           </w:pPr>
-          <w:hyperlink w:anchor="_Toc243479309" w:history="1">
+          <w:hyperlink w:anchor="_Toc243582935" w:history="1">
             <w:r>
               <w:rPr>
                 <w:rStyle w:val="Hyperlink"/>
@@ -3484,7 +3484,7 @@
               <w:rPr>
                 <w:noProof/>
               </w:rPr>
-              <w:instrText xml:space="preserve"> PAGEREF _Toc243479309 \h </w:instrText>
+              <w:instrText xml:space="preserve"> PAGEREF _Toc243582935 \h </w:instrText>
             </w:r>
             <w:r>
               <w:rPr>
@@ -3501,7 +3501,7 @@
               <w:rPr>
                 <w:noProof/>
               </w:rPr>
-              <w:t>25</w:t>
+              <w:t>26</w:t>
             </w:r>
             <w:r>
               <w:rPr>
@@ -3526,7 +3526,7 @@
               <w14:ligatures w14:val="standardContextual"/>
             </w:rPr>
           </w:pPr>
-          <w:hyperlink w:anchor="_Toc243479310" w:history="1">
+          <w:hyperlink w:anchor="_Toc243582936" w:history="1">
             <w:r>
               <w:rPr>
                 <w:rStyle w:val="Hyperlink"/>
@@ -3550,7 +3550,7 @@
               <w:rPr>
                 <w:noProof/>
               </w:rPr>
-              <w:instrText xml:space="preserve"> PAGEREF _Toc243479310 \h </w:instrText>
+              <w:instrText xml:space="preserve"> PAGEREF _Toc243582936 \h </w:instrText>
             </w:r>
             <w:r>
               <w:rPr>
@@ -3567,7 +3567,7 @@
               <w:rPr>
                 <w:noProof/>
               </w:rPr>
-              <w:t>25</w:t>
+              <w:t>27</w:t>
             </w:r>
             <w:r>
               <w:rPr>
@@ -3592,7 +3592,7 @@
               <w14:ligatures w14:val="standardContextual"/>
             </w:rPr>
           </w:pPr>
-          <w:hyperlink w:anchor="_Toc243479311" w:history="1">
+          <w:hyperlink w:anchor="_Toc243582937" w:history="1">
             <w:r>
               <w:rPr>
                 <w:rStyle w:val="Hyperlink"/>
@@ -3616,7 +3616,7 @@
               <w:rPr>
                 <w:noProof/>
               </w:rPr>
-              <w:instrText xml:space="preserve"> PAGEREF _Toc243479311 \h </w:instrText>
+              <w:instrText xml:space="preserve"> PAGEREF _Toc243582937 \h </w:instrText>
             </w:r>
             <w:r>
               <w:rPr>
@@ -3633,7 +3633,7 @@
               <w:rPr>
                 <w:noProof/>
               </w:rPr>
-              <w:t>26</w:t>
+              <w:t>28</w:t>
             </w:r>
             <w:r>
               <w:rPr>
@@ -3658,7 +3658,7 @@
               <w14:ligatures w14:val="standardContextual"/>
             </w:rPr>
           </w:pPr>
-          <w:hyperlink w:anchor="_Toc243479312" w:history="1">
+          <w:hyperlink w:anchor="_Toc243582938" w:history="1">
             <w:r>
               <w:rPr>
                 <w:rStyle w:val="Hyperlink"/>
@@ -3682,7 +3682,7 @@
               <w:rPr>
                 <w:noProof/>
               </w:rPr>
-              <w:instrText xml:space="preserve"> PAGEREF _Toc243479312 \h </w:instrText>
+              <w:instrText xml:space="preserve"> PAGEREF _Toc243582938 \h </w:instrText>
             </w:r>
             <w:r>
               <w:rPr>
@@ -3699,7 +3699,7 @@
               <w:rPr>
                 <w:noProof/>
               </w:rPr>
-              <w:t>27</w:t>
+              <w:t>28</w:t>
             </w:r>
             <w:r>
               <w:rPr>
@@ -3724,7 +3724,7 @@
               <w14:ligatures w14:val="standardContextual"/>
             </w:rPr>
           </w:pPr>
-          <w:hyperlink w:anchor="_Toc243479313" w:history="1">
+          <w:hyperlink w:anchor="_Toc243582939" w:history="1">
             <w:r>
               <w:rPr>
                 <w:rStyle w:val="Hyperlink"/>
@@ -3748,7 +3748,7 @@
               <w:rPr>
                 <w:noProof/>
               </w:rPr>
-              <w:instrText xml:space="preserve"> PAGEREF _Toc243479313 \h </w:instrText>
+              <w:instrText xml:space="preserve"> PAGEREF _Toc243582939 \h </w:instrText>
             </w:r>
             <w:r>
               <w:rPr>
@@ -3765,7 +3765,7 @@
               <w:rPr>
                 <w:noProof/>
               </w:rPr>
-              <w:t>28</w:t>
+              <w:t>29</w:t>
             </w:r>
             <w:r>
               <w:rPr>
@@ -3790,7 +3790,7 @@
               <w14:ligatures w14:val="standardContextual"/>
             </w:rPr>
           </w:pPr>
-          <w:hyperlink w:anchor="_Toc243479314" w:history="1">
+          <w:hyperlink w:anchor="_Toc243582940" w:history="1">
             <w:r>
               <w:rPr>
                 <w:rStyle w:val="Hyperlink"/>
@@ -3814,7 +3814,7 @@
               <w:rPr>
                 <w:noProof/>
               </w:rPr>
-              <w:instrText xml:space="preserve"> PAGEREF _Toc243479314 \h </w:instrText>
+              <w:instrText xml:space="preserve"> PAGEREF _Toc243582940 \h </w:instrText>
             </w:r>
             <w:r>
               <w:rPr>
@@ -3831,7 +3831,7 @@
               <w:rPr>
                 <w:noProof/>
               </w:rPr>
-              <w:t>31</w:t>
+              <w:t>33</w:t>
             </w:r>
             <w:r>
               <w:rPr>
@@ -3856,7 +3856,7 @@
               <w14:ligatures w14:val="standardContextual"/>
             </w:rPr>
           </w:pPr>
-          <w:hyperlink w:anchor="_Toc243479315" w:history="1">
+          <w:hyperlink w:anchor="_Toc243582941" w:history="1">
             <w:r>
               <w:rPr>
                 <w:rStyle w:val="Hyperlink"/>
@@ -3880,7 +3880,7 @@
               <w:rPr>
                 <w:noProof/>
               </w:rPr>
-              <w:instrText xml:space="preserve"> PAGEREF _Toc243479315 \h </w:instrText>
+              <w:instrText xml:space="preserve"> PAGEREF _Toc243582941 \h </w:instrText>
             </w:r>
             <w:r>
               <w:rPr>
@@ -3897,7 +3897,7 @@
               <w:rPr>
                 <w:noProof/>
               </w:rPr>
-              <w:t>33</w:t>
+              <w:t>34</w:t>
             </w:r>
             <w:r>
               <w:rPr>
@@ -3922,7 +3922,7 @@
               <w14:ligatures w14:val="standardContextual"/>
             </w:rPr>
           </w:pPr>
-          <w:hyperlink w:anchor="_Toc243479316" w:history="1">
+          <w:hyperlink w:anchor="_Toc243582942" w:history="1">
             <w:r>
               <w:rPr>
                 <w:rStyle w:val="Hyperlink"/>
@@ -3946,7 +3946,7 @@
               <w:rPr>
                 <w:noProof/>
               </w:rPr>
-              <w:instrText xml:space="preserve"> PAGEREF _Toc243479316 \h </w:instrText>
+              <w:instrText xml:space="preserve"> PAGEREF _Toc243582942 \h </w:instrText>
             </w:r>
             <w:r>
               <w:rPr>
@@ -3963,7 +3963,7 @@
               <w:rPr>
                 <w:noProof/>
               </w:rPr>
-              <w:t>35</w:t>
+              <w:t>36</w:t>
             </w:r>
             <w:r>
               <w:rPr>
@@ -3988,7 +3988,7 @@
               <w14:ligatures w14:val="standardContextual"/>
             </w:rPr>
           </w:pPr>
-          <w:hyperlink w:anchor="_Toc243479317" w:history="1">
+          <w:hyperlink w:anchor="_Toc243582943" w:history="1">
             <w:r>
               <w:rPr>
                 <w:rStyle w:val="Hyperlink"/>
@@ -4012,7 +4012,7 @@
               <w:rPr>
                 <w:noProof/>
               </w:rPr>
-              <w:instrText xml:space="preserve"> PAGEREF _Toc243479317 \h </w:instrText>
+              <w:instrText xml:space="preserve"> PAGEREF _Toc243582943 \h </w:instrText>
             </w:r>
             <w:r>
               <w:rPr>
@@ -4029,7 +4029,7 @@
               <w:rPr>
                 <w:noProof/>
               </w:rPr>
-              <w:t>35</w:t>
+              <w:t>37</w:t>
             </w:r>
             <w:r>
               <w:rPr>
@@ -4054,7 +4054,7 @@
               <w14:ligatures w14:val="standardContextual"/>
             </w:rPr>
           </w:pPr>
-          <w:hyperlink w:anchor="_Toc243479318" w:history="1">
+          <w:hyperlink w:anchor="_Toc243582944" w:history="1">
             <w:r>
               <w:rPr>
                 <w:rStyle w:val="Hyperlink"/>
@@ -4078,7 +4078,7 @@
               <w:rPr>
                 <w:noProof/>
               </w:rPr>
-              <w:instrText xml:space="preserve"> PAGEREF _Toc243479318 \h </w:instrText>
+              <w:instrText xml:space="preserve"> PAGEREF _Toc243582944 \h </w:instrText>
             </w:r>
             <w:r>
               <w:rPr>
@@ -4095,7 +4095,7 @@
               <w:rPr>
                 <w:noProof/>
               </w:rPr>
-              <w:t>35</w:t>
+              <w:t>37</w:t>
             </w:r>
             <w:r>
               <w:rPr>
@@ -4120,7 +4120,7 @@
               <w14:ligatures w14:val="standardContextual"/>
             </w:rPr>
           </w:pPr>
-          <w:hyperlink w:anchor="_Toc243479319" w:history="1">
+          <w:hyperlink w:anchor="_Toc243582945" w:history="1">
             <w:r>
               <w:rPr>
                 <w:rStyle w:val="Hyperlink"/>
@@ -4144,7 +4144,7 @@
               <w:rPr>
                 <w:noProof/>
               </w:rPr>
-              <w:instrText xml:space="preserve"> PAGEREF _Toc243479319 \h </w:instrText>
+              <w:instrText xml:space="preserve"> PAGEREF _Toc243582945 \h </w:instrText>
             </w:r>
             <w:r>
               <w:rPr>
@@ -4161,7 +4161,7 @@
               <w:rPr>
                 <w:noProof/>
               </w:rPr>
-              <w:t>36</w:t>
+              <w:t>37</w:t>
             </w:r>
             <w:r>
               <w:rPr>
@@ -4186,7 +4186,7 @@
               <w14:ligatures w14:val="standardContextual"/>
             </w:rPr>
           </w:pPr>
-          <w:hyperlink w:anchor="_Toc243479320" w:history="1">
+          <w:hyperlink w:anchor="_Toc243582946" w:history="1">
             <w:r>
               <w:rPr>
                 <w:rStyle w:val="Hyperlink"/>
@@ -4210,7 +4210,7 @@
               <w:rPr>
                 <w:noProof/>
               </w:rPr>
-              <w:instrText xml:space="preserve"> PAGEREF _Toc243479320 \h </w:instrText>
+              <w:instrText xml:space="preserve"> PAGEREF _Toc243582946 \h </w:instrText>
             </w:r>
             <w:r>
               <w:rPr>
@@ -4227,7 +4227,7 @@
               <w:rPr>
                 <w:noProof/>
               </w:rPr>
-              <w:t>36</w:t>
+              <w:t>38</w:t>
             </w:r>
             <w:r>
               <w:rPr>
@@ -4252,7 +4252,7 @@
               <w14:ligatures w14:val="standardContextual"/>
             </w:rPr>
           </w:pPr>
-          <w:hyperlink w:anchor="_Toc243479321" w:history="1">
+          <w:hyperlink w:anchor="_Toc243582947" w:history="1">
             <w:r>
               <w:rPr>
                 <w:rStyle w:val="Hyperlink"/>
@@ -4276,7 +4276,7 @@
               <w:rPr>
                 <w:noProof/>
               </w:rPr>
-              <w:instrText xml:space="preserve"> PAGEREF _Toc243479321 \h </w:instrText>
+              <w:instrText xml:space="preserve"> PAGEREF _Toc243582947 \h </w:instrText>
             </w:r>
             <w:r>
               <w:rPr>
@@ -4293,7 +4293,7 @@
               <w:rPr>
                 <w:noProof/>
               </w:rPr>
-              <w:t>37</w:t>
+              <w:t>38</w:t>
             </w:r>
             <w:r>
               <w:rPr>
@@ -4318,7 +4318,7 @@
               <w14:ligatures w14:val="standardContextual"/>
             </w:rPr>
           </w:pPr>
-          <w:hyperlink w:anchor="_Toc243479322" w:history="1">
+          <w:hyperlink w:anchor="_Toc243582948" w:history="1">
             <w:r>
               <w:rPr>
                 <w:rStyle w:val="Hyperlink"/>
@@ -4342,7 +4342,7 @@
               <w:rPr>
                 <w:noProof/>
               </w:rPr>
-              <w:instrText xml:space="preserve"> PAGEREF _Toc243479322 \h </w:instrText>
+              <w:instrText xml:space="preserve"> PAGEREF _Toc243582948 \h </w:instrText>
             </w:r>
             <w:r>
               <w:rPr>
@@ -4359,7 +4359,7 @@
               <w:rPr>
                 <w:noProof/>
               </w:rPr>
-              <w:t>37</w:t>
+              <w:t>39</w:t>
             </w:r>
             <w:r>
               <w:rPr>
@@ -4384,7 +4384,7 @@
               <w14:ligatures w14:val="standardContextual"/>
             </w:rPr>
           </w:pPr>
-          <w:hyperlink w:anchor="_Toc243479323" w:history="1">
+          <w:hyperlink w:anchor="_Toc243582949" w:history="1">
             <w:r>
               <w:rPr>
                 <w:rStyle w:val="Hyperlink"/>
@@ -4408,7 +4408,7 @@
               <w:rPr>
                 <w:noProof/>
               </w:rPr>
-              <w:instrText xml:space="preserve"> PAGEREF _Toc243479323 \h </w:instrText>
+              <w:instrText xml:space="preserve"> PAGEREF _Toc243582949 \h </w:instrText>
             </w:r>
             <w:r>
               <w:rPr>
@@ -4425,7 +4425,7 @@
               <w:rPr>
                 <w:noProof/>
               </w:rPr>
-              <w:t>38</w:t>
+              <w:t>39</w:t>
             </w:r>
             <w:r>
               <w:rPr>
@@ -4450,7 +4450,7 @@
               <w14:ligatures w14:val="standardContextual"/>
             </w:rPr>
           </w:pPr>
-          <w:hyperlink w:anchor="_Toc243479324" w:history="1">
+          <w:hyperlink w:anchor="_Toc243582950" w:history="1">
             <w:r>
               <w:rPr>
                 <w:rStyle w:val="Hyperlink"/>
@@ -4474,7 +4474,7 @@
               <w:rPr>
                 <w:noProof/>
               </w:rPr>
-              <w:instrText xml:space="preserve"> PAGEREF _Toc243479324 \h </w:instrText>
+              <w:instrText xml:space="preserve"> PAGEREF _Toc243582950 \h </w:instrText>
             </w:r>
             <w:r>
               <w:rPr>
@@ -4491,7 +4491,7 @@
               <w:rPr>
                 <w:noProof/>
               </w:rPr>
-              <w:t>38</w:t>
+              <w:t>40</w:t>
             </w:r>
             <w:r>
               <w:rPr>
@@ -4516,7 +4516,7 @@
               <w14:ligatures w14:val="standardContextual"/>
             </w:rPr>
           </w:pPr>
-          <w:hyperlink w:anchor="_Toc243479325" w:history="1">
+          <w:hyperlink w:anchor="_Toc243582951" w:history="1">
             <w:r>
               <w:rPr>
                 <w:rStyle w:val="Hyperlink"/>
@@ -4540,7 +4540,7 @@
               <w:rPr>
                 <w:noProof/>
               </w:rPr>
-              <w:instrText xml:space="preserve"> PAGEREF _Toc243479325 \h </w:instrText>
+              <w:instrText xml:space="preserve"> PAGEREF _Toc243582951 \h </w:instrText>
             </w:r>
             <w:r>
               <w:rPr>
@@ -4557,7 +4557,7 @@
               <w:rPr>
                 <w:noProof/>
               </w:rPr>
-              <w:t>39</w:t>
+              <w:t>41</w:t>
             </w:r>
             <w:r>
               <w:rPr>
@@ -4582,7 +4582,7 @@
               <w14:ligatures w14:val="standardContextual"/>
             </w:rPr>
           </w:pPr>
-          <w:hyperlink w:anchor="_Toc243479326" w:history="1">
+          <w:hyperlink w:anchor="_Toc243582952" w:history="1">
             <w:r>
               <w:rPr>
                 <w:rStyle w:val="Hyperlink"/>
@@ -4606,7 +4606,7 @@
               <w:rPr>
                 <w:noProof/>
               </w:rPr>
-              <w:instrText xml:space="preserve"> PAGEREF _Toc243479326 \h </w:instrText>
+              <w:instrText xml:space="preserve"> PAGEREF _Toc243582952 \h </w:instrText>
             </w:r>
             <w:r>
               <w:rPr>
@@ -4623,7 +4623,7 @@
               <w:rPr>
                 <w:noProof/>
               </w:rPr>
-              <w:t>40</w:t>
+              <w:t>41</w:t>
             </w:r>
             <w:r>
               <w:rPr>
@@ -4648,7 +4648,7 @@
               <w14:ligatures w14:val="standardContextual"/>
             </w:rPr>
           </w:pPr>
-          <w:hyperlink w:anchor="_Toc243479327" w:history="1">
+          <w:hyperlink w:anchor="_Toc243582953" w:history="1">
             <w:r>
               <w:rPr>
                 <w:rStyle w:val="Hyperlink"/>
@@ -4672,7 +4672,7 @@
               <w:rPr>
                 <w:noProof/>
               </w:rPr>
-              <w:instrText xml:space="preserve"> PAGEREF _Toc243479327 \h </w:instrText>
+              <w:instrText xml:space="preserve"> PAGEREF _Toc243582953 \h </w:instrText>
             </w:r>
             <w:r>
               <w:rPr>
@@ -4689,7 +4689,7 @@
               <w:rPr>
                 <w:noProof/>
               </w:rPr>
-              <w:t>41</w:t>
+              <w:t>43</w:t>
             </w:r>
             <w:r>
               <w:rPr>
@@ -4714,7 +4714,7 @@
               <w14:ligatures w14:val="standardContextual"/>
             </w:rPr>
           </w:pPr>
-          <w:hyperlink w:anchor="_Toc243479328" w:history="1">
+          <w:hyperlink w:anchor="_Toc243582954" w:history="1">
             <w:r>
               <w:rPr>
                 <w:rStyle w:val="Hyperlink"/>
@@ -4738,7 +4738,7 @@
               <w:rPr>
                 <w:noProof/>
               </w:rPr>
-              <w:instrText xml:space="preserve"> PAGEREF _Toc243479328 \h </w:instrText>
+              <w:instrText xml:space="preserve"> PAGEREF _Toc243582954 \h </w:instrText>
             </w:r>
             <w:r>
               <w:rPr>
@@ -4755,7 +4755,7 @@
               <w:rPr>
                 <w:noProof/>
               </w:rPr>
-              <w:t>41</w:t>
+              <w:t>43</w:t>
             </w:r>
             <w:r>
               <w:rPr>
@@ -4780,7 +4780,7 @@
               <w14:ligatures w14:val="standardContextual"/>
             </w:rPr>
           </w:pPr>
-          <w:hyperlink w:anchor="_Toc243479329" w:history="1">
+          <w:hyperlink w:anchor="_Toc243582955" w:history="1">
             <w:r>
               <w:rPr>
                 <w:rStyle w:val="Hyperlink"/>
@@ -4804,7 +4804,7 @@
               <w:rPr>
                 <w:noProof/>
               </w:rPr>
-              <w:instrText xml:space="preserve"> PAGEREF _Toc243479329 \h </w:instrText>
+              <w:instrText xml:space="preserve"> PAGEREF _Toc243582955 \h </w:instrText>
             </w:r>
             <w:r>
               <w:rPr>
@@ -4821,7 +4821,7 @@
               <w:rPr>
                 <w:noProof/>
               </w:rPr>
-              <w:t>41</w:t>
+              <w:t>43</w:t>
             </w:r>
             <w:r>
               <w:rPr>
@@ -4846,7 +4846,7 @@
               <w14:ligatures w14:val="standardContextual"/>
             </w:rPr>
           </w:pPr>
-          <w:hyperlink w:anchor="_Toc243479330" w:history="1">
+          <w:hyperlink w:anchor="_Toc243582956" w:history="1">
             <w:r>
               <w:rPr>
                 <w:rStyle w:val="Hyperlink"/>
@@ -4870,7 +4870,7 @@
               <w:rPr>
                 <w:noProof/>
               </w:rPr>
-              <w:instrText xml:space="preserve"> PAGEREF _Toc243479330 \h </w:instrText>
+              <w:instrText xml:space="preserve"> PAGEREF _Toc243582956 \h </w:instrText>
             </w:r>
             <w:r>
               <w:rPr>
@@ -4887,7 +4887,7 @@
               <w:rPr>
                 <w:noProof/>
               </w:rPr>
-              <w:t>42</w:t>
+              <w:t>43</w:t>
             </w:r>
             <w:r>
               <w:rPr>
@@ -4912,7 +4912,7 @@
               <w14:ligatures w14:val="standardContextual"/>
             </w:rPr>
           </w:pPr>
-          <w:hyperlink w:anchor="_Toc243479331" w:history="1">
+          <w:hyperlink w:anchor="_Toc243582957" w:history="1">
             <w:r>
               <w:rPr>
                 <w:rStyle w:val="Hyperlink"/>
@@ -4936,7 +4936,7 @@
               <w:rPr>
                 <w:noProof/>
               </w:rPr>
-              <w:instrText xml:space="preserve"> PAGEREF _Toc243479331 \h </w:instrText>
+              <w:instrText xml:space="preserve"> PAGEREF _Toc243582957 \h </w:instrText>
             </w:r>
             <w:r>
               <w:rPr>
@@ -4953,7 +4953,7 @@
               <w:rPr>
                 <w:noProof/>
               </w:rPr>
-              <w:t>42</w:t>
+              <w:t>44</w:t>
             </w:r>
             <w:r>
               <w:rPr>
@@ -4978,13 +4978,13 @@
               <w14:ligatures w14:val="standardContextual"/>
             </w:rPr>
           </w:pPr>
-          <w:hyperlink w:anchor="_Toc243479332" w:history="1">
+          <w:hyperlink w:anchor="_Toc243582958" w:history="1">
             <w:r>
               <w:rPr>
                 <w:rStyle w:val="Hyperlink"/>
                 <w:noProof/>
               </w:rPr>
-              <w:t>20.5 Countries and localisation: Malaysia, Singapore, Australia</w:t>
+              <w:t>20.5 Countries and localisation: every country, three in detail</w:t>
             </w:r>
             <w:r>
               <w:rPr>
@@ -5002,7 +5002,7 @@
               <w:rPr>
                 <w:noProof/>
               </w:rPr>
-              <w:instrText xml:space="preserve"> PAGEREF _Toc243479332 \h </w:instrText>
+              <w:instrText xml:space="preserve"> PAGEREF _Toc243582958 \h </w:instrText>
             </w:r>
             <w:r>
               <w:rPr>
@@ -5019,7 +5019,7 @@
               <w:rPr>
                 <w:noProof/>
               </w:rPr>
-              <w:t>42</w:t>
+              <w:t>44</w:t>
             </w:r>
             <w:r>
               <w:rPr>
@@ -5044,7 +5044,7 @@
               <w14:ligatures w14:val="standardContextual"/>
             </w:rPr>
           </w:pPr>
-          <w:hyperlink w:anchor="_Toc243479333" w:history="1">
+          <w:hyperlink w:anchor="_Toc243582959" w:history="1">
             <w:r>
               <w:rPr>
                 <w:rStyle w:val="Hyperlink"/>
@@ -5068,7 +5068,7 @@
               <w:rPr>
                 <w:noProof/>
               </w:rPr>
-              <w:instrText xml:space="preserve"> PAGEREF _Toc243479333 \h </w:instrText>
+              <w:instrText xml:space="preserve"> PAGEREF _Toc243582959 \h </w:instrText>
             </w:r>
             <w:r>
               <w:rPr>
@@ -5085,7 +5085,7 @@
               <w:rPr>
                 <w:noProof/>
               </w:rPr>
-              <w:t>42</w:t>
+              <w:t>44</w:t>
             </w:r>
             <w:r>
               <w:rPr>
@@ -5110,7 +5110,7 @@
               <w14:ligatures w14:val="standardContextual"/>
             </w:rPr>
           </w:pPr>
-          <w:hyperlink w:anchor="_Toc243479334" w:history="1">
+          <w:hyperlink w:anchor="_Toc243582960" w:history="1">
             <w:r>
               <w:rPr>
                 <w:rStyle w:val="Hyperlink"/>
@@ -5134,7 +5134,7 @@
               <w:rPr>
                 <w:noProof/>
               </w:rPr>
-              <w:instrText xml:space="preserve"> PAGEREF _Toc243479334 \h </w:instrText>
+              <w:instrText xml:space="preserve"> PAGEREF _Toc243582960 \h </w:instrText>
             </w:r>
             <w:r>
               <w:rPr>
@@ -5151,7 +5151,7 @@
               <w:rPr>
                 <w:noProof/>
               </w:rPr>
-              <w:t>43</w:t>
+              <w:t>44</w:t>
             </w:r>
             <w:r>
               <w:rPr>
@@ -5178,7 +5178,7 @@
         <w:pStyle w:val="Heading1"/>
       </w:pPr>
       <w:bookmarkStart w:id="0" w:name="_Toc97008001"/>
-      <w:bookmarkStart w:id="1" w:name="_Toc243479259"/>
+      <w:bookmarkStart w:id="1" w:name="_Toc243582885"/>
       <w:r>
         <w:lastRenderedPageBreak/>
         <w:t>What Changed from the 7th Version</w:t>
@@ -5191,7 +5191,7 @@
         <w:spacing w:after="120"/>
       </w:pPr>
       <w:r>
-        <w:t>The 7th Version recorded the backend as it stood on 2026-10-16 (31 migrations, 2,518 tests). Since then the prototype's screens were connected to the real backend, first as a local test site for testers and then as an online demo, and using them showed what the backend still lacked. This version keeps the 7th Version and adds what is new in green blocks tagged NEW IN 8TH VERSION, placed in the section they belong to. Sections 19 and 20 are updated in place, and Section 19.8 is new.</w:t>
+        <w:t>The 7th Version recorded the backend as it stood on 2026-10-16 (31 migrations, 2,518 tests). Since then the prototype's screens were connected to the real backend, first as a local test site for testers and then as an online demo, and using them showed what the backend still lacked. On 2026-10-22 business sign-up was opened to every country. This version keeps the 7th Version and adds what is new in green blocks tagged NEW IN 8TH VERSION, placed in the section they belong to. Sections 19 and 20 are updated in place, and Section 19.8 is new.</w:t>
       </w:r>
     </w:p>
     <w:tbl>
@@ -5705,7 +5705,7 @@
                 <w:sz w:val="19"/>
                 <w:szCs w:val="19"/>
               </w:rPr>
-              <w:t>Numbers</w:t>
+              <w:t>Every country</w:t>
             </w:r>
           </w:p>
         </w:tc>
@@ -5731,7 +5731,7 @@
                 <w:sz w:val="19"/>
                 <w:szCs w:val="19"/>
               </w:rPr>
-              <w:t>33 migrations (0032 and 0033 are new) and 2,607 tests. Every backend change was mutation-tested, and the full suite was run ten times in a row, clean, after each.</w:t>
+              <w:t>A business from any country can sign up (242 countries and territories), with that country's time zones, phone code and currency. Malaysia, Singapore and Australia keep their detailed address rules; every other country has basic ones. The test screens show prices in the business's currency, and the demo's register page has a country code in front of the mobile number.</w:t>
             </w:r>
           </w:p>
         </w:tc>
@@ -5762,6 +5762,63 @@
                 <w:sz w:val="19"/>
                 <w:szCs w:val="19"/>
               </w:rPr>
+              <w:t>Numbers</w:t>
+            </w:r>
+          </w:p>
+        </w:tc>
+        <w:tc>
+          <w:tcPr>
+            <w:tcW w:w="7438" w:type="dxa"/>
+            <w:tcBorders>
+              <w:top w:val="single" w:sz="4" w:space="0" w:color="B4B2A9"/>
+              <w:left w:val="single" w:sz="4" w:space="0" w:color="B4B2A9"/>
+              <w:bottom w:val="single" w:sz="4" w:space="0" w:color="B4B2A9"/>
+              <w:right w:val="single" w:sz="4" w:space="0" w:color="B4B2A9"/>
+            </w:tcBorders>
+            <w:tcMar>
+              <w:top w:w="60" w:type="dxa"/>
+              <w:left w:w="100" w:type="dxa"/>
+              <w:bottom w:w="60" w:type="dxa"/>
+              <w:right w:w="100" w:type="dxa"/>
+            </w:tcMar>
+          </w:tcPr>
+          <w:p>
+            <w:r>
+              <w:rPr>
+                <w:sz w:val="19"/>
+                <w:szCs w:val="19"/>
+              </w:rPr>
+              <w:t>34 migrations (0032, 0033 and 0034 are new) and 2,635 tests. The changes up to 0033 were mutation-tested, and the full suite was run ten times in a row, clean, after each. The every-country change (0034) was checked with one full run and in the browser; it has not been mutation-tested or run ten times yet.</w:t>
+            </w:r>
+          </w:p>
+        </w:tc>
+      </w:tr>
+      <w:tr>
+        <w:trPr>
+          <w:cantSplit/>
+        </w:trPr>
+        <w:tc>
+          <w:tcPr>
+            <w:tcW w:w="2200" w:type="dxa"/>
+            <w:tcBorders>
+              <w:top w:val="single" w:sz="4" w:space="0" w:color="B4B2A9"/>
+              <w:left w:val="single" w:sz="4" w:space="0" w:color="B4B2A9"/>
+              <w:bottom w:val="single" w:sz="4" w:space="0" w:color="B4B2A9"/>
+              <w:right w:val="single" w:sz="4" w:space="0" w:color="B4B2A9"/>
+            </w:tcBorders>
+            <w:tcMar>
+              <w:top w:w="60" w:type="dxa"/>
+              <w:left w:w="100" w:type="dxa"/>
+              <w:bottom w:w="60" w:type="dxa"/>
+              <w:right w:w="100" w:type="dxa"/>
+            </w:tcMar>
+          </w:tcPr>
+          <w:p>
+            <w:r>
+              <w:rPr>
+                <w:sz w:val="19"/>
+                <w:szCs w:val="19"/>
+              </w:rPr>
               <w:t>Still open</w:t>
             </w:r>
           </w:p>
@@ -5804,7 +5861,7 @@
         <w:pStyle w:val="Heading1"/>
       </w:pPr>
       <w:bookmarkStart w:id="2" w:name="_Toc96007001"/>
-      <w:bookmarkStart w:id="3" w:name="_Toc243479260"/>
+      <w:bookmarkStart w:id="3" w:name="_Toc243582886"/>
       <w:r>
         <w:t>What Changed from the 6th Version</w:t>
       </w:r>
@@ -5988,6 +6045,7 @@
                 <w:sz w:val="19"/>
                 <w:szCs w:val="19"/>
               </w:rPr>
+              <w:lastRenderedPageBreak/>
               <w:t>Restaurant</w:t>
             </w:r>
           </w:p>
@@ -6102,7 +6160,6 @@
                 <w:sz w:val="19"/>
                 <w:szCs w:val="19"/>
               </w:rPr>
-              <w:lastRenderedPageBreak/>
               <w:t>Corrections</w:t>
             </w:r>
           </w:p>
@@ -6259,7 +6316,7 @@
         <w:pStyle w:val="Heading1"/>
       </w:pPr>
       <w:bookmarkStart w:id="4" w:name="_Toc96005001"/>
-      <w:bookmarkStart w:id="5" w:name="_Toc243479261"/>
+      <w:bookmarkStart w:id="5" w:name="_Toc243582887"/>
       <w:r>
         <w:t>What Changed from the 5th Version</w:t>
       </w:r>
@@ -6842,6 +6899,7 @@
                 <w:sz w:val="19"/>
                 <w:szCs w:val="19"/>
               </w:rPr>
+              <w:lastRenderedPageBreak/>
               <w:t>Still open</w:t>
             </w:r>
           </w:p>
@@ -6883,7 +6941,7 @@
       <w:pPr>
         <w:pStyle w:val="Heading1"/>
       </w:pPr>
-      <w:bookmarkStart w:id="6" w:name="_Toc243479262"/>
+      <w:bookmarkStart w:id="6" w:name="_Toc243582888"/>
       <w:r>
         <w:t>What Changed from the 2nd Version</w:t>
       </w:r>
@@ -6894,7 +6952,6 @@
         <w:spacing w:after="120"/>
       </w:pPr>
       <w:r>
-        <w:lastRenderedPageBreak/>
         <w:t>The 2nd Version defined the business entities and rules for each business type. This version keeps all of that business content and adds the technical design needed to build it as a hosted, headless platform that ships as a WordPress plugin.</w:t>
       </w:r>
     </w:p>
@@ -7479,7 +7536,7 @@
         <w:pStyle w:val="Heading1"/>
       </w:pPr>
       <w:bookmarkStart w:id="7" w:name="_Toc90001001"/>
-      <w:bookmarkStart w:id="8" w:name="_Toc243479263"/>
+      <w:bookmarkStart w:id="8" w:name="_Toc243582889"/>
       <w:r>
         <w:t>What Changed from the 3rd Version</w:t>
       </w:r>
@@ -7789,6 +7846,7 @@
                 <w:sz w:val="19"/>
                 <w:szCs w:val="19"/>
               </w:rPr>
+              <w:lastRenderedPageBreak/>
               <w:t>Customer side</w:t>
             </w:r>
           </w:p>
@@ -7960,7 +8018,6 @@
                 <w:sz w:val="19"/>
                 <w:szCs w:val="19"/>
               </w:rPr>
-              <w:lastRenderedPageBreak/>
               <w:t>Addresses</w:t>
             </w:r>
           </w:p>
@@ -8101,7 +8158,7 @@
                 <w:sz w:val="19"/>
                 <w:szCs w:val="19"/>
               </w:rPr>
-              <w:t>Free tier on the same hosted backend with limits; one paid account is one business of one type; Malaysia, Singapore and Australia as the supported countries; the plugin is built last; Google Meet / online meetings cancelled (since the 8th Version: online consultations use the business's own meeting service, Section 11).</w:t>
+              <w:t>Free tier on the same hosted backend with limits; one paid account is one business of one type; Malaysia, Singapore and Australia as the supported countries (since the 8th Version every country can sign up and these three keep the detailed rules, Section 5.3); the plugin is built last; Google Meet / online meetings cancelled (since the 8th Version: online consultations use the business's own meeting service, Section 11).</w:t>
             </w:r>
           </w:p>
         </w:tc>
@@ -8173,7 +8230,7 @@
       <w:pPr>
         <w:pStyle w:val="Heading1"/>
       </w:pPr>
-      <w:bookmarkStart w:id="9" w:name="_Toc243479264"/>
+      <w:bookmarkStart w:id="9" w:name="_Toc243582890"/>
       <w:r>
         <w:t>1. Overview and Scope</w:t>
       </w:r>
@@ -8183,7 +8240,7 @@
       <w:pPr>
         <w:pStyle w:val="Heading2"/>
       </w:pPr>
-      <w:bookmarkStart w:id="10" w:name="_Toc243479265"/>
+      <w:bookmarkStart w:id="10" w:name="_Toc243582891"/>
       <w:r>
         <w:t>1.1 Target Businesses</w:t>
       </w:r>
@@ -8273,7 +8330,7 @@
       <w:pPr>
         <w:pStyle w:val="Heading2"/>
       </w:pPr>
-      <w:bookmarkStart w:id="11" w:name="_Toc243479266"/>
+      <w:bookmarkStart w:id="11" w:name="_Toc243582892"/>
       <w:r>
         <w:t>1.2 References</w:t>
       </w:r>
@@ -8328,7 +8385,7 @@
       <w:pPr>
         <w:pStyle w:val="Heading2"/>
       </w:pPr>
-      <w:bookmarkStart w:id="12" w:name="_Toc243479267"/>
+      <w:bookmarkStart w:id="12" w:name="_Toc243582893"/>
       <w:r>
         <w:t>1.3 Product Model</w:t>
       </w:r>
@@ -8417,6 +8474,7 @@
         <w:spacing w:after="120"/>
       </w:pPr>
       <w:r>
+        <w:lastRenderedPageBreak/>
         <w:t>Because the company pays for hosting continuously, the expected pricing model is a monthly or yearly subscription (for example tiered by staff count, locations, or bookings). A self-hosted Docker package for large clients can be considered later.</w:t>
       </w:r>
     </w:p>
@@ -8424,7 +8482,7 @@
       <w:pPr>
         <w:pStyle w:val="Heading1"/>
       </w:pPr>
-      <w:bookmarkStart w:id="13" w:name="_Toc243479268"/>
+      <w:bookmarkStart w:id="13" w:name="_Toc243582894"/>
       <w:r>
         <w:t>2. System Architecture</w:t>
       </w:r>
@@ -8446,7 +8504,6 @@
         <w:rPr>
           <w:noProof/>
         </w:rPr>
-        <w:lastRenderedPageBreak/>
         <w:drawing>
           <wp:inline distT="0" distB="0" distL="0" distR="0" wp14:anchorId="41446FF0" wp14:editId="798710C4">
             <wp:extent cx="5905500" cy="3086100"/>
@@ -8507,7 +8564,7 @@
       <w:pPr>
         <w:pStyle w:val="Heading2"/>
       </w:pPr>
-      <w:bookmarkStart w:id="14" w:name="_Toc243479269"/>
+      <w:bookmarkStart w:id="14" w:name="_Toc243582895"/>
       <w:r>
         <w:t>2.1 Where Each Language Is Used</w:t>
       </w:r>
@@ -9037,7 +9094,7 @@
       <w:pPr>
         <w:pStyle w:val="Heading2"/>
       </w:pPr>
-      <w:bookmarkStart w:id="15" w:name="_Toc243479270"/>
+      <w:bookmarkStart w:id="15" w:name="_Toc243582896"/>
       <w:r>
         <w:t>2.2 Microservice Boundaries</w:t>
       </w:r>
@@ -9420,6 +9477,7 @@
                 <w:sz w:val="19"/>
                 <w:szCs w:val="19"/>
               </w:rPr>
+              <w:lastRenderedPageBreak/>
               <w:t>Scheduling Core</w:t>
             </w:r>
           </w:p>
@@ -9812,7 +9870,6 @@
           <w:b/>
           <w:bCs/>
         </w:rPr>
-        <w:lastRenderedPageBreak/>
         <w:t>Design rule:</w:t>
       </w:r>
       <w:r>
@@ -9823,7 +9880,7 @@
       <w:pPr>
         <w:pStyle w:val="Heading2"/>
       </w:pPr>
-      <w:bookmarkStart w:id="16" w:name="_Toc243479271"/>
+      <w:bookmarkStart w:id="16" w:name="_Toc243582897"/>
       <w:r>
         <w:t>2.3 Communication</w:t>
       </w:r>
@@ -10121,7 +10178,7 @@
       <w:pPr>
         <w:pStyle w:val="Heading1"/>
       </w:pPr>
-      <w:bookmarkStart w:id="17" w:name="_Toc243479272"/>
+      <w:bookmarkStart w:id="17" w:name="_Toc243582898"/>
       <w:r>
         <w:t>3. Technology Stack</w:t>
       </w:r>
@@ -10342,6 +10399,7 @@
                 <w:sz w:val="19"/>
                 <w:szCs w:val="19"/>
               </w:rPr>
+              <w:lastRenderedPageBreak/>
               <w:t>Database</w:t>
             </w:r>
           </w:p>
@@ -11061,7 +11119,7 @@
       <w:pPr>
         <w:pStyle w:val="Heading1"/>
       </w:pPr>
-      <w:bookmarkStart w:id="18" w:name="_Toc243479273"/>
+      <w:bookmarkStart w:id="18" w:name="_Toc243582899"/>
       <w:r>
         <w:t>4. WordPress Plugin and Headless Integration</w:t>
       </w:r>
@@ -11071,7 +11129,7 @@
       <w:pPr>
         <w:pStyle w:val="Heading2"/>
       </w:pPr>
-      <w:bookmarkStart w:id="19" w:name="_Toc243479274"/>
+      <w:bookmarkStart w:id="19" w:name="_Toc243582900"/>
       <w:r>
         <w:t>4.1 Plugin Responsibilities</w:t>
       </w:r>
@@ -11151,6 +11209,7 @@
           <w:b/>
           <w:bCs/>
         </w:rPr>
+        <w:lastRenderedPageBreak/>
         <w:t>Webhook receiver (optional):</w:t>
       </w:r>
       <w:r>
@@ -11169,7 +11228,7 @@
       <w:pPr>
         <w:pStyle w:val="Heading2"/>
       </w:pPr>
-      <w:bookmarkStart w:id="20" w:name="_Toc243479275"/>
+      <w:bookmarkStart w:id="20" w:name="_Toc243582901"/>
       <w:r>
         <w:t>4.2 Headless Clients</w:t>
       </w:r>
@@ -11218,7 +11277,7 @@
       <w:pPr>
         <w:pStyle w:val="Heading2"/>
       </w:pPr>
-      <w:bookmarkStart w:id="21" w:name="_Toc243479276"/>
+      <w:bookmarkStart w:id="21" w:name="_Toc243582902"/>
       <w:r>
         <w:t>4.3 Roles</w:t>
       </w:r>
@@ -11274,7 +11333,6 @@
                 <w:sz w:val="19"/>
                 <w:szCs w:val="19"/>
               </w:rPr>
-              <w:lastRenderedPageBreak/>
               <w:t>Role</w:t>
             </w:r>
           </w:p>
@@ -11846,7 +11904,11 @@
         <w:t>Owner sign-in by email:</w:t>
       </w:r>
       <w:r>
-        <w:t xml:space="preserve"> an owner signs in with the email address the business has on file, without WordPress and without a password. A single-use link (valid 15 minutes, kept only as a hash) returns the same owner admin token that WordPress gets. The answer never says whether an address is registered, and requests are limited per address and per client.</w:t>
+        <w:t xml:space="preserve"> an owner signs in with the email address the business has on file, without WordPress and without a password. A single-use link (valid 15 minutes, kept only as a hash) returns the </w:t>
+      </w:r>
+      <w:r>
+        <w:lastRenderedPageBreak/>
+        <w:t>same owner admin token that WordPress gets. The answer never says whether an address is registered, and requests are limited per address and per client.</w:t>
       </w:r>
     </w:p>
     <w:p>
@@ -11918,11 +11980,7 @@
         <w:t>Customer sign-in by email, corrected:</w:t>
       </w:r>
       <w:r>
-        <w:t xml:space="preserve"> anyone can book with any phone number and any email, so an email typed into a booking says nothing about who owns the phone. Before this fix such a booking replaced the customer's email, and the emailed sign-in link then signed the attacker in as that customer. Now a public booking never replaces an email or gender already on the customer, and each booking keeps its own contact email (its messages go there). A customer who signed in with the phone code can confirm </w:t>
-      </w:r>
-      <w:r>
-        <w:lastRenderedPageBreak/>
-        <w:t>an email through a link sent to it; only a confirmed email signs in as the whole customer. A link for an unconfirmed address opens a limited session: it can list, cancel, move and review only the bookings made with that address, and cannot see saved addresses, vehicles, the profile or data requests. Existing emails count as unconfirmed.</w:t>
+        <w:t xml:space="preserve"> anyone can book with any phone number and any email, so an email typed into a booking says nothing about who owns the phone. Before this fix such a booking replaced the customer's email, and the emailed sign-in link then signed the attacker in as that customer. Now a public booking never replaces an email or gender already on the customer, and each booking keeps its own contact email (its messages go there). A customer who signed in with the phone code can confirm an email through a link sent to it; only a confirmed email signs in as the whole customer. A link for an unconfirmed address opens a limited session: it can list, cancel, move and review only the bookings made with that address, and cannot see saved addresses, vehicles, the profile or data requests. Existing emails count as unconfirmed.</w:t>
       </w:r>
     </w:p>
     <w:p>
@@ -12122,7 +12180,7 @@
       <w:pPr>
         <w:pStyle w:val="Heading1"/>
       </w:pPr>
-      <w:bookmarkStart w:id="22" w:name="_Toc243479277"/>
+      <w:bookmarkStart w:id="22" w:name="_Toc243582903"/>
       <w:r>
         <w:t>5. Global Entities and Policies (All Business Types)</w:t>
       </w:r>
@@ -12132,7 +12190,7 @@
       <w:pPr>
         <w:pStyle w:val="Heading2"/>
       </w:pPr>
-      <w:bookmarkStart w:id="23" w:name="_Toc243479278"/>
+      <w:bookmarkStart w:id="23" w:name="_Toc243582904"/>
       <w:r>
         <w:t>5.1 Entities</w:t>
       </w:r>
@@ -12252,6 +12310,7 @@
           <w:b/>
           <w:bCs/>
         </w:rPr>
+        <w:lastRenderedPageBreak/>
         <w:t>BookingPolicy:</w:t>
       </w:r>
       <w:r>
@@ -12292,7 +12351,7 @@
       <w:pPr>
         <w:pStyle w:val="Heading2"/>
       </w:pPr>
-      <w:bookmarkStart w:id="24" w:name="_Toc243479279"/>
+      <w:bookmarkStart w:id="24" w:name="_Toc243582905"/>
       <w:r>
         <w:t>5.2 Data Entry / Activity</w:t>
       </w:r>
@@ -12362,9 +12421,8 @@
       <w:pPr>
         <w:pStyle w:val="Heading2"/>
       </w:pPr>
-      <w:bookmarkStart w:id="25" w:name="_Toc243479280"/>
-      <w:r>
-        <w:lastRenderedPageBreak/>
+      <w:bookmarkStart w:id="25" w:name="_Toc243582906"/>
+      <w:r>
         <w:t>5.3 Business Logic</w:t>
       </w:r>
       <w:bookmarkEnd w:id="25"/>
@@ -12740,6 +12798,7 @@
           <w:sz w:val="17"/>
           <w:szCs w:val="17"/>
         </w:rPr>
+        <w:lastRenderedPageBreak/>
         <w:t>NEW IN 6TH VERSION</w:t>
       </w:r>
       <w:r>
@@ -13276,7 +13335,6 @@
                 <w:sz w:val="19"/>
                 <w:szCs w:val="19"/>
               </w:rPr>
-              <w:lastRenderedPageBreak/>
               <w:t>Postcode</w:t>
             </w:r>
           </w:p>
@@ -13677,7 +13735,7 @@
         <w:t>Not built:</w:t>
       </w:r>
       <w:r>
-        <w:t xml:space="preserve"> a currency on prices (prices are not modelled), changing the country after set-up, and hosting-region or data-residency choices for Australian customers.</w:t>
+        <w:t xml:space="preserve"> a currency on each price (a price is an amount in the business's currency; see the 8th-Version block below), changing the country after set-up, and hosting-region or data-residency choices for Australian customers.</w:t>
       </w:r>
     </w:p>
     <w:p>
@@ -13707,7 +13765,7 @@
           <w:sz w:val="19"/>
           <w:szCs w:val="19"/>
         </w:rPr>
-        <w:t xml:space="preserve">  |  Services and booking rules since the 7th Version (Section 5)</w:t>
+        <w:t xml:space="preserve">  |  Every country since the 7th Version (Section 5.3)</w:t>
       </w:r>
     </w:p>
     <w:p>
@@ -13728,29 +13786,10 @@
           <w:b/>
           <w:bCs/>
         </w:rPr>
-        <w:t>Booking rules for a new business:</w:t>
-      </w:r>
-      <w:r>
-        <w:t xml:space="preserve"> a business made by self-service sign-up or by the operator gets a booking policy called Default, made its default: confirmed at once, 2 hours' notice, 24 hours' notice to cancel, a 60-day window, a 30-minute hold for a request. Both ways share one onboarding service, so they behave the same.</w:t>
-      </w:r>
-    </w:p>
-    <w:p>
-      <w:pPr>
-        <w:pBdr>
-          <w:left w:val="single" w:sz="24" w:space="6" w:color="1F4E79"/>
-        </w:pBdr>
-        <w:shd w:val="clear" w:color="auto" w:fill="E8EEF7"/>
-        <w:spacing w:after="80"/>
-      </w:pPr>
-      <w:r>
-        <w:rPr>
-          <w:b/>
-          <w:bCs/>
-        </w:rPr>
-        <w:t>Decision (2026-10-16):</w:t>
-      </w:r>
-      <w:r>
-        <w:t xml:space="preserve"> businesses made before this change are not given rules. Adding rules without the owner would open booking for services they had not finished setting up.</w:t>
+        <w:t>Who can sign up:</w:t>
+      </w:r>
+      <w:r>
+        <w:t xml:space="preserve"> a business from any country that has a time zone of its own: 242 countries and territories (ISO 3166). Antarctica and a few uninhabited islands have none and are refused. The list is written into the code (app/core/world.py) by scripts/make_world.py from the time-zone database (tzdata), the phonenumbers library (calling codes) and CLDR through babel (English names and currencies). The script is run again when tzdata changes; the libraries are needed only to run it.</w:t>
       </w:r>
     </w:p>
     <w:p>
@@ -13771,29 +13810,13 @@
           <w:b/>
           <w:bCs/>
         </w:rPr>
-        <w:t>Price after inspection:</w:t>
-      </w:r>
-      <w:r>
-        <w:t xml:space="preserve"> a service has a new setting, price_after_inspection (off by default; migration 0033). With it on and a price of 0, customers see "Price after inspection"; with a price above 0 that price is a starting price ("From RM 50", for example an inspection fee). It is in the public and admin service answers, and only a manager or owner can change it.</w:t>
-      </w:r>
-    </w:p>
-    <w:p>
-      <w:pPr>
-        <w:pBdr>
-          <w:left w:val="single" w:sz="24" w:space="6" w:color="1F4E79"/>
-        </w:pBdr>
-        <w:shd w:val="clear" w:color="auto" w:fill="E8EEF7"/>
-        <w:spacing w:after="80"/>
-      </w:pPr>
-      <w:r>
-        <w:rPr>
-          <w:b/>
-          <w:bCs/>
-        </w:rPr>
-        <w:t>Decision (2026-10-21):</w:t>
-      </w:r>
-      <w:r>
-        <w:t xml:space="preserve"> price after inspection is a real setting of the service, not a display trick, so every client (the widget, a custom site, the WordPress plugin) shows it the same way.</w:t>
+        <w:t>How the time is worked out:</w:t>
+      </w:r>
+      <w:r>
+        <w:t xml:space="preserve"> a business's clock is its IANA time zone (tenants.timezone), read with Python's zoneinfo and tzdata, which carry every country's daylight-saving rules. The country only limits which zones may be chosen. A country with one zone gets it; a country with several gets a default (the zone of its main city, for example America/New_York, America/Toronto, America/Sao_Paulo, Europe/Moscow) and the owner can pick another of that country's zones. All interval maths stays in UTC, as in the 6th-Version block above. The </w:t>
+      </w:r>
+      <w:r>
+        <w:t>sign-up page guesses the country and zone from the browser's time zone; the owner can change both.</w:t>
       </w:r>
     </w:p>
     <w:p>
@@ -13814,11 +13837,648 @@
           <w:b/>
           <w:bCs/>
         </w:rPr>
-        <w:t>Required settings cannot be emptied:</w:t>
-      </w:r>
-      <w:r>
-        <w:t xml:space="preserve"> a service change that sends an empty value (null) for a required setting (name, length, buffer, price, price after inspection, active, add-on, location type, travel time) used to crash the server; it is now refused with 422 "cannot be empty". Optional settings such as the description can still be cleared.</w:t>
-      </w:r>
+        <w:t>Country codes:</w:t>
+      </w:r>
+      <w:r>
+        <w:t xml:space="preserve"> two capital letters (ISO 3166-1 alpha-2, such as MY). 'my', 'MYS', 'Malaysia' or an unknown code are refused with 422 and a pointer to GET /v1/countries.</w:t>
+      </w:r>
+    </w:p>
+    <w:p>
+      <w:pPr>
+        <w:pBdr>
+          <w:left w:val="single" w:sz="24" w:space="6" w:color="1E6B2E"/>
+        </w:pBdr>
+        <w:shd w:val="clear" w:color="auto" w:fill="EAF4EA"/>
+        <w:spacing w:after="80"/>
+      </w:pPr>
+      <w:r>
+        <w:rPr>
+          <w:b/>
+          <w:bCs/>
+        </w:rPr>
+        <w:lastRenderedPageBreak/>
+        <w:t>Two levels of address rules:</w:t>
+      </w:r>
+    </w:p>
+    <w:tbl>
+      <w:tblPr>
+        <w:tblW w:w="9638" w:type="dxa"/>
+        <w:tblBorders>
+          <w:top w:val="single" w:sz="4" w:space="0" w:color="auto"/>
+          <w:left w:val="single" w:sz="4" w:space="0" w:color="auto"/>
+          <w:bottom w:val="single" w:sz="4" w:space="0" w:color="auto"/>
+          <w:right w:val="single" w:sz="4" w:space="0" w:color="auto"/>
+          <w:insideH w:val="single" w:sz="4" w:space="0" w:color="auto"/>
+          <w:insideV w:val="single" w:sz="4" w:space="0" w:color="auto"/>
+        </w:tblBorders>
+        <w:tblLayout w:type="fixed"/>
+        <w:tblCellMar>
+          <w:left w:w="10" w:type="dxa"/>
+          <w:right w:w="10" w:type="dxa"/>
+        </w:tblCellMar>
+        <w:tblLook w:val="0000" w:firstRow="0" w:lastRow="0" w:firstColumn="0" w:lastColumn="0" w:noHBand="0" w:noVBand="0"/>
+      </w:tblPr>
+      <w:tblGrid>
+        <w:gridCol w:w="2400"/>
+        <w:gridCol w:w="3619"/>
+        <w:gridCol w:w="3619"/>
+      </w:tblGrid>
+      <w:tr>
+        <w:trPr>
+          <w:cantSplit/>
+          <w:tblHeader/>
+        </w:trPr>
+        <w:tc>
+          <w:tcPr>
+            <w:tcW w:w="2400" w:type="dxa"/>
+            <w:tcBorders>
+              <w:top w:val="single" w:sz="4" w:space="0" w:color="B4B2A9"/>
+              <w:left w:val="single" w:sz="4" w:space="0" w:color="B4B2A9"/>
+              <w:bottom w:val="single" w:sz="4" w:space="0" w:color="B4B2A9"/>
+              <w:right w:val="single" w:sz="4" w:space="0" w:color="B4B2A9"/>
+            </w:tcBorders>
+            <w:shd w:val="clear" w:color="auto" w:fill="DCE6F1"/>
+            <w:tcMar>
+              <w:top w:w="60" w:type="dxa"/>
+              <w:left w:w="100" w:type="dxa"/>
+              <w:bottom w:w="60" w:type="dxa"/>
+              <w:right w:w="100" w:type="dxa"/>
+            </w:tcMar>
+          </w:tcPr>
+          <w:p>
+            <w:r>
+              <w:rPr>
+                <w:b/>
+                <w:bCs/>
+                <w:sz w:val="19"/>
+                <w:szCs w:val="19"/>
+              </w:rPr>
+              <w:t>Item</w:t>
+            </w:r>
+          </w:p>
+        </w:tc>
+        <w:tc>
+          <w:tcPr>
+            <w:tcW w:w="3619" w:type="dxa"/>
+            <w:tcBorders>
+              <w:top w:val="single" w:sz="4" w:space="0" w:color="B4B2A9"/>
+              <w:left w:val="single" w:sz="4" w:space="0" w:color="B4B2A9"/>
+              <w:bottom w:val="single" w:sz="4" w:space="0" w:color="B4B2A9"/>
+              <w:right w:val="single" w:sz="4" w:space="0" w:color="B4B2A9"/>
+            </w:tcBorders>
+            <w:shd w:val="clear" w:color="auto" w:fill="DCE6F1"/>
+            <w:tcMar>
+              <w:top w:w="60" w:type="dxa"/>
+              <w:left w:w="100" w:type="dxa"/>
+              <w:bottom w:w="60" w:type="dxa"/>
+              <w:right w:w="100" w:type="dxa"/>
+            </w:tcMar>
+          </w:tcPr>
+          <w:p>
+            <w:r>
+              <w:rPr>
+                <w:b/>
+                <w:bCs/>
+                <w:sz w:val="19"/>
+                <w:szCs w:val="19"/>
+              </w:rPr>
+              <w:t>Malaysia, Singapore, Australia</w:t>
+            </w:r>
+          </w:p>
+        </w:tc>
+        <w:tc>
+          <w:tcPr>
+            <w:tcW w:w="3619" w:type="dxa"/>
+            <w:tcBorders>
+              <w:top w:val="single" w:sz="4" w:space="0" w:color="B4B2A9"/>
+              <w:left w:val="single" w:sz="4" w:space="0" w:color="B4B2A9"/>
+              <w:bottom w:val="single" w:sz="4" w:space="0" w:color="B4B2A9"/>
+              <w:right w:val="single" w:sz="4" w:space="0" w:color="B4B2A9"/>
+            </w:tcBorders>
+            <w:shd w:val="clear" w:color="auto" w:fill="DCE6F1"/>
+            <w:tcMar>
+              <w:top w:w="60" w:type="dxa"/>
+              <w:left w:w="100" w:type="dxa"/>
+              <w:bottom w:w="60" w:type="dxa"/>
+              <w:right w:w="100" w:type="dxa"/>
+            </w:tcMar>
+          </w:tcPr>
+          <w:p>
+            <w:r>
+              <w:rPr>
+                <w:b/>
+                <w:bCs/>
+                <w:sz w:val="19"/>
+                <w:szCs w:val="19"/>
+              </w:rPr>
+              <w:t>Every other country</w:t>
+            </w:r>
+          </w:p>
+        </w:tc>
+      </w:tr>
+      <w:tr>
+        <w:trPr>
+          <w:cantSplit/>
+        </w:trPr>
+        <w:tc>
+          <w:tcPr>
+            <w:tcW w:w="2400" w:type="dxa"/>
+            <w:tcBorders>
+              <w:top w:val="single" w:sz="4" w:space="0" w:color="B4B2A9"/>
+              <w:left w:val="single" w:sz="4" w:space="0" w:color="B4B2A9"/>
+              <w:bottom w:val="single" w:sz="4" w:space="0" w:color="B4B2A9"/>
+              <w:right w:val="single" w:sz="4" w:space="0" w:color="B4B2A9"/>
+            </w:tcBorders>
+            <w:tcMar>
+              <w:top w:w="60" w:type="dxa"/>
+              <w:left w:w="100" w:type="dxa"/>
+              <w:bottom w:w="60" w:type="dxa"/>
+              <w:right w:w="100" w:type="dxa"/>
+            </w:tcMar>
+          </w:tcPr>
+          <w:p>
+            <w:r>
+              <w:rPr>
+                <w:sz w:val="19"/>
+                <w:szCs w:val="19"/>
+              </w:rPr>
+              <w:t>Street and city</w:t>
+            </w:r>
+          </w:p>
+        </w:tc>
+        <w:tc>
+          <w:tcPr>
+            <w:tcW w:w="3619" w:type="dxa"/>
+            <w:tcBorders>
+              <w:top w:val="single" w:sz="4" w:space="0" w:color="B4B2A9"/>
+              <w:left w:val="single" w:sz="4" w:space="0" w:color="B4B2A9"/>
+              <w:bottom w:val="single" w:sz="4" w:space="0" w:color="B4B2A9"/>
+              <w:right w:val="single" w:sz="4" w:space="0" w:color="B4B2A9"/>
+            </w:tcBorders>
+            <w:tcMar>
+              <w:top w:w="60" w:type="dxa"/>
+              <w:left w:w="100" w:type="dxa"/>
+              <w:bottom w:w="60" w:type="dxa"/>
+              <w:right w:w="100" w:type="dxa"/>
+            </w:tcMar>
+          </w:tcPr>
+          <w:p>
+            <w:r>
+              <w:rPr>
+                <w:sz w:val="19"/>
+                <w:szCs w:val="19"/>
+              </w:rPr>
+              <w:t>Required (Singapore's city may be left out)</w:t>
+            </w:r>
+          </w:p>
+        </w:tc>
+        <w:tc>
+          <w:tcPr>
+            <w:tcW w:w="3619" w:type="dxa"/>
+            <w:tcBorders>
+              <w:top w:val="single" w:sz="4" w:space="0" w:color="B4B2A9"/>
+              <w:left w:val="single" w:sz="4" w:space="0" w:color="B4B2A9"/>
+              <w:bottom w:val="single" w:sz="4" w:space="0" w:color="B4B2A9"/>
+              <w:right w:val="single" w:sz="4" w:space="0" w:color="B4B2A9"/>
+            </w:tcBorders>
+            <w:tcMar>
+              <w:top w:w="60" w:type="dxa"/>
+              <w:left w:w="100" w:type="dxa"/>
+              <w:bottom w:w="60" w:type="dxa"/>
+              <w:right w:w="100" w:type="dxa"/>
+            </w:tcMar>
+          </w:tcPr>
+          <w:p>
+            <w:r>
+              <w:rPr>
+                <w:sz w:val="19"/>
+                <w:szCs w:val="19"/>
+              </w:rPr>
+              <w:t>Required</w:t>
+            </w:r>
+          </w:p>
+        </w:tc>
+      </w:tr>
+      <w:tr>
+        <w:trPr>
+          <w:cantSplit/>
+        </w:trPr>
+        <w:tc>
+          <w:tcPr>
+            <w:tcW w:w="2400" w:type="dxa"/>
+            <w:tcBorders>
+              <w:top w:val="single" w:sz="4" w:space="0" w:color="B4B2A9"/>
+              <w:left w:val="single" w:sz="4" w:space="0" w:color="B4B2A9"/>
+              <w:bottom w:val="single" w:sz="4" w:space="0" w:color="B4B2A9"/>
+              <w:right w:val="single" w:sz="4" w:space="0" w:color="B4B2A9"/>
+            </w:tcBorders>
+            <w:tcMar>
+              <w:top w:w="60" w:type="dxa"/>
+              <w:left w:w="100" w:type="dxa"/>
+              <w:bottom w:w="60" w:type="dxa"/>
+              <w:right w:w="100" w:type="dxa"/>
+            </w:tcMar>
+          </w:tcPr>
+          <w:p>
+            <w:r>
+              <w:rPr>
+                <w:sz w:val="19"/>
+                <w:szCs w:val="19"/>
+              </w:rPr>
+              <w:t>State or province</w:t>
+            </w:r>
+          </w:p>
+        </w:tc>
+        <w:tc>
+          <w:tcPr>
+            <w:tcW w:w="3619" w:type="dxa"/>
+            <w:tcBorders>
+              <w:top w:val="single" w:sz="4" w:space="0" w:color="B4B2A9"/>
+              <w:left w:val="single" w:sz="4" w:space="0" w:color="B4B2A9"/>
+              <w:bottom w:val="single" w:sz="4" w:space="0" w:color="B4B2A9"/>
+              <w:right w:val="single" w:sz="4" w:space="0" w:color="B4B2A9"/>
+            </w:tcBorders>
+            <w:tcMar>
+              <w:top w:w="60" w:type="dxa"/>
+              <w:left w:w="100" w:type="dxa"/>
+              <w:bottom w:w="60" w:type="dxa"/>
+              <w:right w:w="100" w:type="dxa"/>
+            </w:tcMar>
+          </w:tcPr>
+          <w:p>
+            <w:r>
+              <w:rPr>
+                <w:sz w:val="19"/>
+                <w:szCs w:val="19"/>
+              </w:rPr>
+              <w:t>One of the country's list (Malaysia, Australia); none in Singapore</w:t>
+            </w:r>
+          </w:p>
+        </w:tc>
+        <w:tc>
+          <w:tcPr>
+            <w:tcW w:w="3619" w:type="dxa"/>
+            <w:tcBorders>
+              <w:top w:val="single" w:sz="4" w:space="0" w:color="B4B2A9"/>
+              <w:left w:val="single" w:sz="4" w:space="0" w:color="B4B2A9"/>
+              <w:bottom w:val="single" w:sz="4" w:space="0" w:color="B4B2A9"/>
+              <w:right w:val="single" w:sz="4" w:space="0" w:color="B4B2A9"/>
+            </w:tcBorders>
+            <w:tcMar>
+              <w:top w:w="60" w:type="dxa"/>
+              <w:left w:w="100" w:type="dxa"/>
+              <w:bottom w:w="60" w:type="dxa"/>
+              <w:right w:w="100" w:type="dxa"/>
+            </w:tcMar>
+          </w:tcPr>
+          <w:p>
+            <w:r>
+              <w:rPr>
+                <w:sz w:val="19"/>
+                <w:szCs w:val="19"/>
+              </w:rPr>
+              <w:t>Optional, free text up to 100 characters</w:t>
+            </w:r>
+          </w:p>
+        </w:tc>
+      </w:tr>
+      <w:tr>
+        <w:trPr>
+          <w:cantSplit/>
+        </w:trPr>
+        <w:tc>
+          <w:tcPr>
+            <w:tcW w:w="2400" w:type="dxa"/>
+            <w:tcBorders>
+              <w:top w:val="single" w:sz="4" w:space="0" w:color="B4B2A9"/>
+              <w:left w:val="single" w:sz="4" w:space="0" w:color="B4B2A9"/>
+              <w:bottom w:val="single" w:sz="4" w:space="0" w:color="B4B2A9"/>
+              <w:right w:val="single" w:sz="4" w:space="0" w:color="B4B2A9"/>
+            </w:tcBorders>
+            <w:tcMar>
+              <w:top w:w="60" w:type="dxa"/>
+              <w:left w:w="100" w:type="dxa"/>
+              <w:bottom w:w="60" w:type="dxa"/>
+              <w:right w:w="100" w:type="dxa"/>
+            </w:tcMar>
+          </w:tcPr>
+          <w:p>
+            <w:r>
+              <w:rPr>
+                <w:sz w:val="19"/>
+                <w:szCs w:val="19"/>
+              </w:rPr>
+              <w:t>Postcode</w:t>
+            </w:r>
+          </w:p>
+        </w:tc>
+        <w:tc>
+          <w:tcPr>
+            <w:tcW w:w="3619" w:type="dxa"/>
+            <w:tcBorders>
+              <w:top w:val="single" w:sz="4" w:space="0" w:color="B4B2A9"/>
+              <w:left w:val="single" w:sz="4" w:space="0" w:color="B4B2A9"/>
+              <w:bottom w:val="single" w:sz="4" w:space="0" w:color="B4B2A9"/>
+              <w:right w:val="single" w:sz="4" w:space="0" w:color="B4B2A9"/>
+            </w:tcBorders>
+            <w:tcMar>
+              <w:top w:w="60" w:type="dxa"/>
+              <w:left w:w="100" w:type="dxa"/>
+              <w:bottom w:w="60" w:type="dxa"/>
+              <w:right w:w="100" w:type="dxa"/>
+            </w:tcMar>
+          </w:tcPr>
+          <w:p>
+            <w:r>
+              <w:rPr>
+                <w:sz w:val="19"/>
+                <w:szCs w:val="19"/>
+              </w:rPr>
+              <w:t>Required, the exact shape (5, 6 or 4 digits)</w:t>
+            </w:r>
+          </w:p>
+        </w:tc>
+        <w:tc>
+          <w:tcPr>
+            <w:tcW w:w="3619" w:type="dxa"/>
+            <w:tcBorders>
+              <w:top w:val="single" w:sz="4" w:space="0" w:color="B4B2A9"/>
+              <w:left w:val="single" w:sz="4" w:space="0" w:color="B4B2A9"/>
+              <w:bottom w:val="single" w:sz="4" w:space="0" w:color="B4B2A9"/>
+              <w:right w:val="single" w:sz="4" w:space="0" w:color="B4B2A9"/>
+            </w:tcBorders>
+            <w:tcMar>
+              <w:top w:w="60" w:type="dxa"/>
+              <w:left w:w="100" w:type="dxa"/>
+              <w:bottom w:w="60" w:type="dxa"/>
+              <w:right w:w="100" w:type="dxa"/>
+            </w:tcMar>
+          </w:tcPr>
+          <w:p>
+            <w:r>
+              <w:rPr>
+                <w:sz w:val="19"/>
+                <w:szCs w:val="19"/>
+              </w:rPr>
+              <w:t>Optional; 2 to 10 letters, digits, spaces or hyphens, kept in capitals with single spaces</w:t>
+            </w:r>
+          </w:p>
+        </w:tc>
+      </w:tr>
+      <w:tr>
+        <w:trPr>
+          <w:cantSplit/>
+        </w:trPr>
+        <w:tc>
+          <w:tcPr>
+            <w:tcW w:w="2400" w:type="dxa"/>
+            <w:tcBorders>
+              <w:top w:val="single" w:sz="4" w:space="0" w:color="B4B2A9"/>
+              <w:left w:val="single" w:sz="4" w:space="0" w:color="B4B2A9"/>
+              <w:bottom w:val="single" w:sz="4" w:space="0" w:color="B4B2A9"/>
+              <w:right w:val="single" w:sz="4" w:space="0" w:color="B4B2A9"/>
+            </w:tcBorders>
+            <w:tcMar>
+              <w:top w:w="60" w:type="dxa"/>
+              <w:left w:w="100" w:type="dxa"/>
+              <w:bottom w:w="60" w:type="dxa"/>
+              <w:right w:w="100" w:type="dxa"/>
+            </w:tcMar>
+          </w:tcPr>
+          <w:p>
+            <w:r>
+              <w:rPr>
+                <w:sz w:val="19"/>
+                <w:szCs w:val="19"/>
+              </w:rPr>
+              <w:t>One-line address</w:t>
+            </w:r>
+          </w:p>
+        </w:tc>
+        <w:tc>
+          <w:tcPr>
+            <w:tcW w:w="3619" w:type="dxa"/>
+            <w:tcBorders>
+              <w:top w:val="single" w:sz="4" w:space="0" w:color="B4B2A9"/>
+              <w:left w:val="single" w:sz="4" w:space="0" w:color="B4B2A9"/>
+              <w:bottom w:val="single" w:sz="4" w:space="0" w:color="B4B2A9"/>
+              <w:right w:val="single" w:sz="4" w:space="0" w:color="B4B2A9"/>
+            </w:tcBorders>
+            <w:tcMar>
+              <w:top w:w="60" w:type="dxa"/>
+              <w:left w:w="100" w:type="dxa"/>
+              <w:bottom w:w="60" w:type="dxa"/>
+              <w:right w:w="100" w:type="dxa"/>
+            </w:tcMar>
+          </w:tcPr>
+          <w:p>
+            <w:r>
+              <w:rPr>
+                <w:sz w:val="19"/>
+                <w:szCs w:val="19"/>
+              </w:rPr>
+              <w:t>As each country writes it (Section 5.3 above)</w:t>
+            </w:r>
+          </w:p>
+        </w:tc>
+        <w:tc>
+          <w:tcPr>
+            <w:tcW w:w="3619" w:type="dxa"/>
+            <w:tcBorders>
+              <w:top w:val="single" w:sz="4" w:space="0" w:color="B4B2A9"/>
+              <w:left w:val="single" w:sz="4" w:space="0" w:color="B4B2A9"/>
+              <w:bottom w:val="single" w:sz="4" w:space="0" w:color="B4B2A9"/>
+              <w:right w:val="single" w:sz="4" w:space="0" w:color="B4B2A9"/>
+            </w:tcBorders>
+            <w:tcMar>
+              <w:top w:w="60" w:type="dxa"/>
+              <w:left w:w="100" w:type="dxa"/>
+              <w:bottom w:w="60" w:type="dxa"/>
+              <w:right w:w="100" w:type="dxa"/>
+            </w:tcMar>
+          </w:tcPr>
+          <w:p>
+            <w:r>
+              <w:rPr>
+                <w:sz w:val="19"/>
+                <w:szCs w:val="19"/>
+              </w:rPr>
+              <w:t>Street, city, then state and postcode together ("1455 Market St, San Francisco, California 94103")</w:t>
+            </w:r>
+          </w:p>
+        </w:tc>
+      </w:tr>
+      <w:tr>
+        <w:trPr>
+          <w:cantSplit/>
+        </w:trPr>
+        <w:tc>
+          <w:tcPr>
+            <w:tcW w:w="2400" w:type="dxa"/>
+            <w:tcBorders>
+              <w:top w:val="single" w:sz="4" w:space="0" w:color="B4B2A9"/>
+              <w:left w:val="single" w:sz="4" w:space="0" w:color="B4B2A9"/>
+              <w:bottom w:val="single" w:sz="4" w:space="0" w:color="B4B2A9"/>
+              <w:right w:val="single" w:sz="4" w:space="0" w:color="B4B2A9"/>
+            </w:tcBorders>
+            <w:tcMar>
+              <w:top w:w="60" w:type="dxa"/>
+              <w:left w:w="100" w:type="dxa"/>
+              <w:bottom w:w="60" w:type="dxa"/>
+              <w:right w:w="100" w:type="dxa"/>
+            </w:tcMar>
+          </w:tcPr>
+          <w:p>
+            <w:r>
+              <w:rPr>
+                <w:sz w:val="19"/>
+                <w:szCs w:val="19"/>
+              </w:rPr>
+              <w:t>Privacy law</w:t>
+            </w:r>
+          </w:p>
+        </w:tc>
+        <w:tc>
+          <w:tcPr>
+            <w:tcW w:w="3619" w:type="dxa"/>
+            <w:tcBorders>
+              <w:top w:val="single" w:sz="4" w:space="0" w:color="B4B2A9"/>
+              <w:left w:val="single" w:sz="4" w:space="0" w:color="B4B2A9"/>
+              <w:bottom w:val="single" w:sz="4" w:space="0" w:color="B4B2A9"/>
+              <w:right w:val="single" w:sz="4" w:space="0" w:color="B4B2A9"/>
+            </w:tcBorders>
+            <w:tcMar>
+              <w:top w:w="60" w:type="dxa"/>
+              <w:left w:w="100" w:type="dxa"/>
+              <w:bottom w:w="60" w:type="dxa"/>
+              <w:right w:w="100" w:type="dxa"/>
+            </w:tcMar>
+          </w:tcPr>
+          <w:p>
+            <w:r>
+              <w:rPr>
+                <w:sz w:val="19"/>
+                <w:szCs w:val="19"/>
+              </w:rPr>
+              <w:t>PDPA 2010, PDPA 2012, Privacy Act 1988</w:t>
+            </w:r>
+          </w:p>
+        </w:tc>
+        <w:tc>
+          <w:tcPr>
+            <w:tcW w:w="3619" w:type="dxa"/>
+            <w:tcBorders>
+              <w:top w:val="single" w:sz="4" w:space="0" w:color="B4B2A9"/>
+              <w:left w:val="single" w:sz="4" w:space="0" w:color="B4B2A9"/>
+              <w:bottom w:val="single" w:sz="4" w:space="0" w:color="B4B2A9"/>
+              <w:right w:val="single" w:sz="4" w:space="0" w:color="B4B2A9"/>
+            </w:tcBorders>
+            <w:tcMar>
+              <w:top w:w="60" w:type="dxa"/>
+              <w:left w:w="100" w:type="dxa"/>
+              <w:bottom w:w="60" w:type="dxa"/>
+              <w:right w:w="100" w:type="dxa"/>
+            </w:tcMar>
+          </w:tcPr>
+          <w:p>
+            <w:r>
+              <w:rPr>
+                <w:sz w:val="19"/>
+                <w:szCs w:val="19"/>
+              </w:rPr>
+              <w:t>None recorded</w:t>
+            </w:r>
+          </w:p>
+        </w:tc>
+      </w:tr>
+      <w:tr>
+        <w:trPr>
+          <w:cantSplit/>
+        </w:trPr>
+        <w:tc>
+          <w:tcPr>
+            <w:tcW w:w="2400" w:type="dxa"/>
+            <w:tcBorders>
+              <w:top w:val="single" w:sz="4" w:space="0" w:color="B4B2A9"/>
+              <w:left w:val="single" w:sz="4" w:space="0" w:color="B4B2A9"/>
+              <w:bottom w:val="single" w:sz="4" w:space="0" w:color="B4B2A9"/>
+              <w:right w:val="single" w:sz="4" w:space="0" w:color="B4B2A9"/>
+            </w:tcBorders>
+            <w:tcMar>
+              <w:top w:w="60" w:type="dxa"/>
+              <w:left w:w="100" w:type="dxa"/>
+              <w:bottom w:w="60" w:type="dxa"/>
+              <w:right w:w="100" w:type="dxa"/>
+            </w:tcMar>
+          </w:tcPr>
+          <w:p>
+            <w:r>
+              <w:rPr>
+                <w:sz w:val="19"/>
+                <w:szCs w:val="19"/>
+              </w:rPr>
+              <w:t>Google look-up region</w:t>
+            </w:r>
+          </w:p>
+        </w:tc>
+        <w:tc>
+          <w:tcPr>
+            <w:tcW w:w="3619" w:type="dxa"/>
+            <w:tcBorders>
+              <w:top w:val="single" w:sz="4" w:space="0" w:color="B4B2A9"/>
+              <w:left w:val="single" w:sz="4" w:space="0" w:color="B4B2A9"/>
+              <w:bottom w:val="single" w:sz="4" w:space="0" w:color="B4B2A9"/>
+              <w:right w:val="single" w:sz="4" w:space="0" w:color="B4B2A9"/>
+            </w:tcBorders>
+            <w:tcMar>
+              <w:top w:w="60" w:type="dxa"/>
+              <w:left w:w="100" w:type="dxa"/>
+              <w:bottom w:w="60" w:type="dxa"/>
+              <w:right w:w="100" w:type="dxa"/>
+            </w:tcMar>
+          </w:tcPr>
+          <w:p>
+            <w:r>
+              <w:rPr>
+                <w:sz w:val="19"/>
+                <w:szCs w:val="19"/>
+              </w:rPr>
+              <w:t>my, sg, au</w:t>
+            </w:r>
+          </w:p>
+        </w:tc>
+        <w:tc>
+          <w:tcPr>
+            <w:tcW w:w="3619" w:type="dxa"/>
+            <w:tcBorders>
+              <w:top w:val="single" w:sz="4" w:space="0" w:color="B4B2A9"/>
+              <w:left w:val="single" w:sz="4" w:space="0" w:color="B4B2A9"/>
+              <w:bottom w:val="single" w:sz="4" w:space="0" w:color="B4B2A9"/>
+              <w:right w:val="single" w:sz="4" w:space="0" w:color="B4B2A9"/>
+            </w:tcBorders>
+            <w:tcMar>
+              <w:top w:w="60" w:type="dxa"/>
+              <w:left w:w="100" w:type="dxa"/>
+              <w:bottom w:w="60" w:type="dxa"/>
+              <w:right w:w="100" w:type="dxa"/>
+            </w:tcMar>
+          </w:tcPr>
+          <w:p>
+            <w:r>
+              <w:rPr>
+                <w:sz w:val="19"/>
+                <w:szCs w:val="19"/>
+              </w:rPr>
+              <w:t>The country code in lower case (uk for the United Kingdom)</w:t>
+            </w:r>
+          </w:p>
+        </w:tc>
+      </w:tr>
+    </w:tbl>
+    <w:p>
+      <w:pPr>
+        <w:spacing w:after="60"/>
+      </w:pPr>
     </w:p>
     <w:p>
       <w:pPr>
@@ -13838,6 +14498,313 @@
           <w:b/>
           <w:bCs/>
         </w:rPr>
+        <w:t>Phone and currency:</w:t>
+      </w:r>
+      <w:r>
+        <w:t xml:space="preserve"> every country's calling code is the business's phone code, used to write customers' numbers as +&lt;code&gt;&lt;number&gt;. The older set-up by phone code alone still knows only 60, 65 and 61. Each country has its currency (ISO 4217, from CLDR; set by hand where CLDR lists two: Bhutan BTN, Lesotho LSL, Namibia NAD, Panama USD).</w:t>
+      </w:r>
+    </w:p>
+    <w:p>
+      <w:pPr>
+        <w:pStyle w:val="ListParagraph"/>
+        <w:numPr>
+          <w:ilvl w:val="0"/>
+          <w:numId w:val="2"/>
+        </w:numPr>
+        <w:pBdr>
+          <w:left w:val="single" w:sz="24" w:space="6" w:color="1E6B2E"/>
+        </w:pBdr>
+        <w:shd w:val="clear" w:color="auto" w:fill="EAF4EA"/>
+        <w:spacing w:after="60"/>
+      </w:pPr>
+      <w:r>
+        <w:rPr>
+          <w:b/>
+          <w:bCs/>
+        </w:rPr>
+        <w:t>Prices in the business's currency:</w:t>
+      </w:r>
+      <w:r>
+        <w:t xml:space="preserve"> a price is an amount in the business's currency. The test screens show it that way: "RM 150" for Malaysia, "$45" for the United States, other currencies written by the browser. The free plan's "RM 0 a month" is the platform's own price and stays in ringgit.</w:t>
+      </w:r>
+    </w:p>
+    <w:p>
+      <w:pPr>
+        <w:pStyle w:val="ListParagraph"/>
+        <w:numPr>
+          <w:ilvl w:val="0"/>
+          <w:numId w:val="2"/>
+        </w:numPr>
+        <w:pBdr>
+          <w:left w:val="single" w:sz="24" w:space="6" w:color="1E6B2E"/>
+        </w:pBdr>
+        <w:shd w:val="clear" w:color="auto" w:fill="EAF4EA"/>
+        <w:spacing w:after="60"/>
+      </w:pPr>
+      <w:r>
+        <w:rPr>
+          <w:b/>
+          <w:bCs/>
+        </w:rPr>
+        <w:t>Migration 0034:</w:t>
+      </w:r>
+      <w:r>
+        <w:t xml:space="preserve"> the check on tenants.country accepts any two capital letters (it was MY, SG or AU), and business_profiles.state holds up to 100 characters (it was 3). The downgrade refuses while a business is outside Malaysia, Singapore or Australia or has a longer state.</w:t>
+      </w:r>
+    </w:p>
+    <w:p>
+      <w:pPr>
+        <w:pStyle w:val="ListParagraph"/>
+        <w:numPr>
+          <w:ilvl w:val="0"/>
+          <w:numId w:val="2"/>
+        </w:numPr>
+        <w:pBdr>
+          <w:left w:val="single" w:sz="24" w:space="6" w:color="1E6B2E"/>
+        </w:pBdr>
+        <w:shd w:val="clear" w:color="auto" w:fill="EAF4EA"/>
+        <w:spacing w:after="60"/>
+      </w:pPr>
+      <w:r>
+        <w:rPr>
+          <w:b/>
+          <w:bCs/>
+        </w:rPr>
+        <w:t>The demo's register page:</w:t>
+      </w:r>
+      <w:r>
+        <w:t xml:space="preserve"> the mobile number has a country code in front of it, chosen from every country (Malaysia +60 by default).</w:t>
+      </w:r>
+    </w:p>
+    <w:p>
+      <w:pPr>
+        <w:pBdr>
+          <w:left w:val="single" w:sz="24" w:space="6" w:color="1F4E79"/>
+        </w:pBdr>
+        <w:shd w:val="clear" w:color="auto" w:fill="E8EEF7"/>
+        <w:spacing w:after="80"/>
+      </w:pPr>
+      <w:r>
+        <w:rPr>
+          <w:b/>
+          <w:bCs/>
+        </w:rPr>
+        <w:t>Decision (2026-10-22):</w:t>
+      </w:r>
+      <w:r>
+        <w:t xml:space="preserve"> every country rather than a longer list of chosen countries; Malaysia, Singapore and Australia keep the detailed rules; prices are shown in the business's currency now rather than later.</w:t>
+      </w:r>
+    </w:p>
+    <w:p>
+      <w:pPr>
+        <w:pStyle w:val="ListParagraph"/>
+        <w:numPr>
+          <w:ilvl w:val="0"/>
+          <w:numId w:val="2"/>
+        </w:numPr>
+        <w:pBdr>
+          <w:left w:val="single" w:sz="24" w:space="6" w:color="1E6B2E"/>
+        </w:pBdr>
+        <w:shd w:val="clear" w:color="auto" w:fill="EAF4EA"/>
+        <w:spacing w:after="60"/>
+      </w:pPr>
+      <w:r>
+        <w:rPr>
+          <w:b/>
+          <w:bCs/>
+        </w:rPr>
+        <w:t>Verified:</w:t>
+      </w:r>
+      <w:r>
+        <w:t xml:space="preserve"> the full suite once (2,634 passed; the one failure was an older test that expected New Zealand to be refused, now changed to an unknown code, and that file passes); mypy clean. A United States business was signed up on the local test site from start to finish: it was stored as US, USD and America/Los_Angeles with the address written as above, and its prices showed "$45". Not done yet: mutation testing, ten full runs in a row, and an upgrade and downgrade round trip of 0034 (it was upgraded on the local tes</w:t>
+      </w:r>
+      <w:r>
+        <w:t>t site's database).</w:t>
+      </w:r>
+    </w:p>
+    <w:p>
+      <w:pPr>
+        <w:pStyle w:val="ListParagraph"/>
+        <w:numPr>
+          <w:ilvl w:val="0"/>
+          <w:numId w:val="2"/>
+        </w:numPr>
+        <w:pBdr>
+          <w:left w:val="single" w:sz="24" w:space="6" w:color="1E6B2E"/>
+        </w:pBdr>
+        <w:shd w:val="clear" w:color="auto" w:fill="EAF4EA"/>
+        <w:spacing w:after="60"/>
+      </w:pPr>
+      <w:r>
+        <w:rPr>
+          <w:b/>
+          <w:bCs/>
+        </w:rPr>
+        <w:t>Not built:</w:t>
+      </w:r>
+      <w:r>
+        <w:t xml:space="preserve"> exact postcode shapes and state lists for countries other than the three, privacy-law text for them, and the prototype (it still shows three countries and ringgit).</w:t>
+      </w:r>
+    </w:p>
+    <w:p>
+      <w:pPr>
+        <w:keepNext/>
+        <w:pBdr>
+          <w:left w:val="single" w:sz="24" w:space="6" w:color="1E6B2E"/>
+        </w:pBdr>
+        <w:shd w:val="clear" w:color="auto" w:fill="EAF4EA"/>
+        <w:spacing w:before="120" w:after="60"/>
+      </w:pPr>
+      <w:r>
+        <w:rPr>
+          <w:b/>
+          <w:bCs/>
+          <w:color w:val="1E6B2E"/>
+          <w:sz w:val="17"/>
+          <w:szCs w:val="17"/>
+        </w:rPr>
+        <w:t>NEW IN 8TH VERSION</w:t>
+      </w:r>
+      <w:r>
+        <w:rPr>
+          <w:b/>
+          <w:bCs/>
+          <w:color w:val="1E6B2E"/>
+          <w:sz w:val="19"/>
+          <w:szCs w:val="19"/>
+        </w:rPr>
+        <w:t xml:space="preserve">  |  Services and booking rules since the 7th Version (Section 5)</w:t>
+      </w:r>
+    </w:p>
+    <w:p>
+      <w:pPr>
+        <w:pStyle w:val="ListParagraph"/>
+        <w:numPr>
+          <w:ilvl w:val="0"/>
+          <w:numId w:val="2"/>
+        </w:numPr>
+        <w:pBdr>
+          <w:left w:val="single" w:sz="24" w:space="6" w:color="1E6B2E"/>
+        </w:pBdr>
+        <w:shd w:val="clear" w:color="auto" w:fill="EAF4EA"/>
+        <w:spacing w:after="60"/>
+      </w:pPr>
+      <w:r>
+        <w:rPr>
+          <w:b/>
+          <w:bCs/>
+        </w:rPr>
+        <w:t>Booking rules for a new business:</w:t>
+      </w:r>
+      <w:r>
+        <w:t xml:space="preserve"> a business made by self-service sign-up or by the operator gets a booking policy called Default, made its default: confirmed at once, 2 hours' notice, 24 hours' notice to cancel, a 60-day window, a 30-minute hold for a request. Both ways share one onboarding service, so they behave the same.</w:t>
+      </w:r>
+    </w:p>
+    <w:p>
+      <w:pPr>
+        <w:pBdr>
+          <w:left w:val="single" w:sz="24" w:space="6" w:color="1F4E79"/>
+        </w:pBdr>
+        <w:shd w:val="clear" w:color="auto" w:fill="E8EEF7"/>
+        <w:spacing w:after="80"/>
+      </w:pPr>
+      <w:r>
+        <w:rPr>
+          <w:b/>
+          <w:bCs/>
+        </w:rPr>
+        <w:t>Decision (2026-10-16):</w:t>
+      </w:r>
+      <w:r>
+        <w:t xml:space="preserve"> businesses made before this change are not given rules. Adding rules without the owner would open booking for services they had not finished setting up.</w:t>
+      </w:r>
+    </w:p>
+    <w:p>
+      <w:pPr>
+        <w:pStyle w:val="ListParagraph"/>
+        <w:numPr>
+          <w:ilvl w:val="0"/>
+          <w:numId w:val="2"/>
+        </w:numPr>
+        <w:pBdr>
+          <w:left w:val="single" w:sz="24" w:space="6" w:color="1E6B2E"/>
+        </w:pBdr>
+        <w:shd w:val="clear" w:color="auto" w:fill="EAF4EA"/>
+        <w:spacing w:after="60"/>
+      </w:pPr>
+      <w:r>
+        <w:rPr>
+          <w:b/>
+          <w:bCs/>
+        </w:rPr>
+        <w:t>Price after inspection:</w:t>
+      </w:r>
+      <w:r>
+        <w:t xml:space="preserve"> a service has a new setting, price_after_inspection (off by default; migration 0033). With it on and a price of 0, customers see "Price after inspection"; with a price above 0 that price is a starting price ("From RM 50", for example an inspection fee). It is in the public and admin service answers, and only a manager or owner can change it.</w:t>
+      </w:r>
+    </w:p>
+    <w:p>
+      <w:pPr>
+        <w:pBdr>
+          <w:left w:val="single" w:sz="24" w:space="6" w:color="1F4E79"/>
+        </w:pBdr>
+        <w:shd w:val="clear" w:color="auto" w:fill="E8EEF7"/>
+        <w:spacing w:after="80"/>
+      </w:pPr>
+      <w:r>
+        <w:rPr>
+          <w:b/>
+          <w:bCs/>
+        </w:rPr>
+        <w:t>Decision (2026-10-21):</w:t>
+      </w:r>
+      <w:r>
+        <w:t xml:space="preserve"> price after inspection is a real setting of the service, not a display trick, so every client (the widget, a custom site, the WordPress plugin) shows it the same way.</w:t>
+      </w:r>
+    </w:p>
+    <w:p>
+      <w:pPr>
+        <w:pStyle w:val="ListParagraph"/>
+        <w:numPr>
+          <w:ilvl w:val="0"/>
+          <w:numId w:val="2"/>
+        </w:numPr>
+        <w:pBdr>
+          <w:left w:val="single" w:sz="24" w:space="6" w:color="1E6B2E"/>
+        </w:pBdr>
+        <w:shd w:val="clear" w:color="auto" w:fill="EAF4EA"/>
+        <w:spacing w:after="60"/>
+      </w:pPr>
+      <w:r>
+        <w:rPr>
+          <w:b/>
+          <w:bCs/>
+        </w:rPr>
+        <w:lastRenderedPageBreak/>
+        <w:t>Required settings cannot be emptied:</w:t>
+      </w:r>
+      <w:r>
+        <w:t xml:space="preserve"> a service change that sends an empty value (null) for a required setting (name, length, buffer, price, price after inspection, active, add-on, location type, travel time) used to crash the server; it is now refused with 422 "cannot be empty". Optional settings such as the description can still be cleared.</w:t>
+      </w:r>
+    </w:p>
+    <w:p>
+      <w:pPr>
+        <w:pStyle w:val="ListParagraph"/>
+        <w:numPr>
+          <w:ilvl w:val="0"/>
+          <w:numId w:val="2"/>
+        </w:numPr>
+        <w:pBdr>
+          <w:left w:val="single" w:sz="24" w:space="6" w:color="1E6B2E"/>
+        </w:pBdr>
+        <w:shd w:val="clear" w:color="auto" w:fill="EAF4EA"/>
+        <w:spacing w:after="60"/>
+      </w:pPr>
+      <w:r>
+        <w:rPr>
+          <w:b/>
+          <w:bCs/>
+        </w:rPr>
         <w:t>Lengths are usual, not exact:</w:t>
       </w:r>
       <w:r>
@@ -13848,7 +14815,7 @@
       <w:pPr>
         <w:pStyle w:val="Heading1"/>
       </w:pPr>
-      <w:bookmarkStart w:id="26" w:name="_Toc243479281"/>
+      <w:bookmarkStart w:id="26" w:name="_Toc243582907"/>
       <w:r>
         <w:t>6. Unified Resource Model</w:t>
       </w:r>
@@ -14169,7 +15136,6 @@
                 <w:sz w:val="19"/>
                 <w:szCs w:val="19"/>
               </w:rPr>
-              <w:lastRenderedPageBreak/>
               <w:t>Salon / Barber</w:t>
             </w:r>
           </w:p>
@@ -14397,7 +15363,7 @@
       <w:pPr>
         <w:pStyle w:val="Heading1"/>
       </w:pPr>
-      <w:bookmarkStart w:id="27" w:name="_Toc243479282"/>
+      <w:bookmarkStart w:id="27" w:name="_Toc243582908"/>
       <w:r>
         <w:t>7. Restaurant</w:t>
       </w:r>
@@ -14407,7 +15373,7 @@
       <w:pPr>
         <w:pStyle w:val="Heading2"/>
       </w:pPr>
-      <w:bookmarkStart w:id="28" w:name="_Toc243479283"/>
+      <w:bookmarkStart w:id="28" w:name="_Toc243582909"/>
       <w:r>
         <w:t>7.1 Entities</w:t>
       </w:r>
@@ -14557,7 +15523,7 @@
       <w:pPr>
         <w:pStyle w:val="Heading2"/>
       </w:pPr>
-      <w:bookmarkStart w:id="29" w:name="_Toc243479284"/>
+      <w:bookmarkStart w:id="29" w:name="_Toc243582910"/>
       <w:r>
         <w:t>7.2 Activity</w:t>
       </w:r>
@@ -14664,6 +15630,7 @@
         <w:spacing w:after="60"/>
       </w:pPr>
       <w:r>
+        <w:lastRenderedPageBreak/>
         <w:t>Customers booking a VIP table see the minimum spend and must agree before submitting.</w:t>
       </w:r>
     </w:p>
@@ -14710,7 +15677,7 @@
       <w:pPr>
         <w:pStyle w:val="Heading2"/>
       </w:pPr>
-      <w:bookmarkStart w:id="30" w:name="_Toc243479285"/>
+      <w:bookmarkStart w:id="30" w:name="_Toc243582911"/>
       <w:r>
         <w:t>7.3 Business Logic</w:t>
       </w:r>
@@ -14817,7 +15784,6 @@
         <w:spacing w:after="60"/>
       </w:pPr>
       <w:r>
-        <w:lastRenderedPageBreak/>
         <w:t>VIP tables are counted separately from normal tables and never combined with them.</w:t>
       </w:r>
     </w:p>
@@ -15167,6 +16133,7 @@
           <w:b/>
           <w:bCs/>
         </w:rPr>
+        <w:lastRenderedPageBreak/>
         <w:t>Verified:</w:t>
       </w:r>
       <w:r>
@@ -15177,7 +16144,7 @@
       <w:pPr>
         <w:pStyle w:val="Heading1"/>
       </w:pPr>
-      <w:bookmarkStart w:id="31" w:name="_Toc243479286"/>
+      <w:bookmarkStart w:id="31" w:name="_Toc243582912"/>
       <w:r>
         <w:t>8. Spa / Clinic</w:t>
       </w:r>
@@ -15187,7 +16154,7 @@
       <w:pPr>
         <w:pStyle w:val="Heading2"/>
       </w:pPr>
-      <w:bookmarkStart w:id="32" w:name="_Toc243479287"/>
+      <w:bookmarkStart w:id="32" w:name="_Toc243582913"/>
       <w:r>
         <w:t>8.1 Entities</w:t>
       </w:r>
@@ -15327,7 +16294,6 @@
           <w:b/>
           <w:bCs/>
         </w:rPr>
-        <w:lastRenderedPageBreak/>
         <w:t>Review (new):</w:t>
       </w:r>
       <w:r>
@@ -15358,7 +16324,7 @@
       <w:pPr>
         <w:pStyle w:val="Heading2"/>
       </w:pPr>
-      <w:bookmarkStart w:id="33" w:name="_Toc243479288"/>
+      <w:bookmarkStart w:id="33" w:name="_Toc243582914"/>
       <w:r>
         <w:t>8.2 Activity</w:t>
       </w:r>
@@ -15440,7 +16406,7 @@
       <w:pPr>
         <w:pStyle w:val="Heading2"/>
       </w:pPr>
-      <w:bookmarkStart w:id="34" w:name="_Toc243479289"/>
+      <w:bookmarkStart w:id="34" w:name="_Toc243582915"/>
       <w:r>
         <w:t>8.3 Business Logic</w:t>
       </w:r>
@@ -15671,6 +16637,7 @@
           <w:b/>
           <w:bCs/>
         </w:rPr>
+        <w:lastRenderedPageBreak/>
         <w:t>Reviews:</w:t>
       </w:r>
       <w:r>
@@ -15681,7 +16648,7 @@
       <w:pPr>
         <w:pStyle w:val="Heading1"/>
       </w:pPr>
-      <w:bookmarkStart w:id="35" w:name="_Toc243479290"/>
+      <w:bookmarkStart w:id="35" w:name="_Toc243582916"/>
       <w:r>
         <w:t>9. Hair Salon / Barber</w:t>
       </w:r>
@@ -15691,7 +16658,7 @@
       <w:pPr>
         <w:pStyle w:val="Heading2"/>
       </w:pPr>
-      <w:bookmarkStart w:id="36" w:name="_Toc243479291"/>
+      <w:bookmarkStart w:id="36" w:name="_Toc243582917"/>
       <w:r>
         <w:t>9.1 Entities</w:t>
       </w:r>
@@ -15811,7 +16778,6 @@
           <w:b/>
           <w:bCs/>
         </w:rPr>
-        <w:lastRenderedPageBreak/>
         <w:t>Inventory (Retail Catalog):</w:t>
       </w:r>
       <w:r>
@@ -15862,7 +16828,7 @@
       <w:pPr>
         <w:pStyle w:val="Heading2"/>
       </w:pPr>
-      <w:bookmarkStart w:id="37" w:name="_Toc243479292"/>
+      <w:bookmarkStart w:id="37" w:name="_Toc243582918"/>
       <w:r>
         <w:t>9.2 Activity</w:t>
       </w:r>
@@ -15951,7 +16917,7 @@
       <w:pPr>
         <w:pStyle w:val="Heading2"/>
       </w:pPr>
-      <w:bookmarkStart w:id="38" w:name="_Toc243479293"/>
+      <w:bookmarkStart w:id="38" w:name="_Toc243582919"/>
       <w:r>
         <w:t>9.3 Business Logic</w:t>
       </w:r>
@@ -16136,7 +17102,11 @@
         <w:t>Stylist alert:</w:t>
       </w:r>
       <w:r>
-        <w:t xml:space="preserve"> built. When an upsell collides, a booking.schedule_conflict event is queued (webhook subscribers can push it) and the stylist is emailed and texted at the contact details a manager saved on their profile, with the next appointment's time, services and the customer's first name. A stylist with no contact details gets a 'skipped' entry in the notification log so a manager can see why nobody was told.</w:t>
+        <w:t xml:space="preserve"> built. When an upsell collides, a booking.schedule_conflict event is queued (webhook subscribers can push it) and the stylist is emailed and texted at the contact details a manager saved on </w:t>
+      </w:r>
+      <w:r>
+        <w:lastRenderedPageBreak/>
+        <w:t>their profile, with the next appointment's time, services and the customer's first name. A stylist with no contact details gets a 'skipped' entry in the notification log so a manager can see why nobody was told.</w:t>
       </w:r>
     </w:p>
     <w:p>
@@ -16191,7 +17161,7 @@
       <w:pPr>
         <w:pStyle w:val="Heading1"/>
       </w:pPr>
-      <w:bookmarkStart w:id="39" w:name="_Toc243479294"/>
+      <w:bookmarkStart w:id="39" w:name="_Toc243582920"/>
       <w:r>
         <w:t>10. Automotive Services</w:t>
       </w:r>
@@ -16201,7 +17171,7 @@
       <w:pPr>
         <w:pStyle w:val="Heading2"/>
       </w:pPr>
-      <w:bookmarkStart w:id="40" w:name="_Toc243479295"/>
+      <w:bookmarkStart w:id="40" w:name="_Toc243582921"/>
       <w:r>
         <w:t>10.1 Entities</w:t>
       </w:r>
@@ -16281,7 +17251,6 @@
           <w:b/>
           <w:bCs/>
         </w:rPr>
-        <w:lastRenderedPageBreak/>
         <w:t>StaffShift:</w:t>
       </w:r>
       <w:r>
@@ -16412,7 +17381,7 @@
       <w:pPr>
         <w:pStyle w:val="Heading2"/>
       </w:pPr>
-      <w:bookmarkStart w:id="41" w:name="_Toc243479296"/>
+      <w:bookmarkStart w:id="41" w:name="_Toc243582922"/>
       <w:r>
         <w:t>10.2 Activity</w:t>
       </w:r>
@@ -16521,7 +17490,7 @@
       <w:pPr>
         <w:pStyle w:val="Heading2"/>
       </w:pPr>
-      <w:bookmarkStart w:id="42" w:name="_Toc243479297"/>
+      <w:bookmarkStart w:id="42" w:name="_Toc243582923"/>
       <w:r>
         <w:t>10.3 Business Logic</w:t>
       </w:r>
@@ -16644,6 +17613,7 @@
           <w:sz w:val="17"/>
           <w:szCs w:val="17"/>
         </w:rPr>
+        <w:lastRenderedPageBreak/>
         <w:t>NEW IN 5TH VERSION</w:t>
       </w:r>
       <w:r>
@@ -16798,11 +17768,7 @@
         <w:t>Parts on the job order:</w:t>
       </w:r>
       <w:r>
-        <w:t xml:space="preserve"> built (purchased_parts). PUT /v1/admin/bookings/{id}/parts sets the whole list (each part once, up to 50 lines); a mechanic can only change their own jobs; allowed while the job is confirmed, running or waiting for parts. A part is priced when added. The shelf is only checked: a part the </w:t>
-      </w:r>
-      <w:r>
-        <w:lastRenderedPageBreak/>
-        <w:t>shelf cannot cover is flagged needs_ordering, which is the cue to set waiting-for-parts. Completing the job deducts the stock (never below zero; zero shows Out of Stock).</w:t>
+        <w:t xml:space="preserve"> built (purchased_parts). PUT /v1/admin/bookings/{id}/parts sets the whole list (each part once, up to 50 lines); a mechanic can only change their own jobs; allowed while the job is confirmed, running or waiting for parts. A part is priced when added. The shelf is only checked: a part the shelf cannot cover is flagged needs_ordering, which is the cue to set waiting-for-parts. Completing the job deducts the stock (never below zero; zero shows Out of Stock).</w:t>
       </w:r>
     </w:p>
     <w:p>
@@ -16857,7 +17823,7 @@
       <w:pPr>
         <w:pStyle w:val="Heading1"/>
       </w:pPr>
-      <w:bookmarkStart w:id="43" w:name="_Toc243479298"/>
+      <w:bookmarkStart w:id="43" w:name="_Toc243582924"/>
       <w:r>
         <w:t>11. Professional Services</w:t>
       </w:r>
@@ -16867,7 +17833,7 @@
       <w:pPr>
         <w:pStyle w:val="Heading2"/>
       </w:pPr>
-      <w:bookmarkStart w:id="44" w:name="_Toc243479299"/>
+      <w:bookmarkStart w:id="44" w:name="_Toc243582925"/>
       <w:r>
         <w:t>11.1 Entities</w:t>
       </w:r>
@@ -17017,7 +17983,7 @@
       <w:pPr>
         <w:pStyle w:val="Heading2"/>
       </w:pPr>
-      <w:bookmarkStart w:id="45" w:name="_Toc243479300"/>
+      <w:bookmarkStart w:id="45" w:name="_Toc243582926"/>
       <w:r>
         <w:t>11.2 Activity</w:t>
       </w:r>
@@ -17113,8 +18079,9 @@
       <w:pPr>
         <w:pStyle w:val="Heading2"/>
       </w:pPr>
-      <w:bookmarkStart w:id="46" w:name="_Toc243479301"/>
-      <w:r>
+      <w:bookmarkStart w:id="46" w:name="_Toc243582927"/>
+      <w:r>
+        <w:lastRenderedPageBreak/>
         <w:t>11.3 Business Logic</w:t>
       </w:r>
       <w:bookmarkEnd w:id="46"/>
@@ -17294,11 +18261,7 @@
         <w:t>Addresses:</w:t>
       </w:r>
       <w:r>
-        <w:t xml:space="preserve"> an on-site booking carries the customer's map pin, or just the address as typed: the server then looks it up through Google Geocoding. Only a precise result is accepted (a building or street with a full match); an area or partial match is refused with address_not_precise. POST /v1/public/geocode lets </w:t>
-      </w:r>
-      <w:r>
-        <w:lastRenderedPageBreak/>
-        <w:t>the booking page show the result and whether it is inside the service area before the customer picks a time. A business can give its own address instead of coordinates.</w:t>
+        <w:t xml:space="preserve"> an on-site booking carries the customer's map pin, or just the address as typed: the server then looks it up through Google Geocoding. Only a precise result is accepted (a building or street with a full match); an area or partial match is refused with address_not_precise. POST /v1/public/geocode lets the booking page show the result and whether it is inside the service area before the customer picks a time. A business can give its own address instead of coordinates.</w:t>
       </w:r>
     </w:p>
     <w:p>
@@ -17632,6 +18595,7 @@
           <w:b/>
           <w:bCs/>
         </w:rPr>
+        <w:lastRenderedPageBreak/>
         <w:t>Not done:</w:t>
       </w:r>
       <w:r>
@@ -17642,7 +18606,7 @@
       <w:pPr>
         <w:pStyle w:val="Heading1"/>
       </w:pPr>
-      <w:bookmarkStart w:id="47" w:name="_Toc243479302"/>
+      <w:bookmarkStart w:id="47" w:name="_Toc243582928"/>
       <w:r>
         <w:t>12. Database Design</w:t>
       </w:r>
@@ -17652,7 +18616,7 @@
       <w:pPr>
         <w:pStyle w:val="Heading2"/>
       </w:pPr>
-      <w:bookmarkStart w:id="48" w:name="_Toc243479303"/>
+      <w:bookmarkStart w:id="48" w:name="_Toc243582929"/>
       <w:r>
         <w:t>12.1 Why PostgreSQL (not MongoDB)</w:t>
       </w:r>
@@ -17742,7 +18706,7 @@
       <w:pPr>
         <w:pStyle w:val="Heading2"/>
       </w:pPr>
-      <w:bookmarkStart w:id="49" w:name="_Toc243479304"/>
+      <w:bookmarkStart w:id="49" w:name="_Toc243582930"/>
       <w:r>
         <w:t>12.2 Multi-Tenancy</w:t>
       </w:r>
@@ -17753,7 +18717,6 @@
         <w:spacing w:after="120"/>
       </w:pPr>
       <w:r>
-        <w:lastRenderedPageBreak/>
         <w:t>Every table carries tenant_id. PostgreSQL Row-Level Security policies restrict each request to its own tenant (the service sets app.tenant_id per transaction), so a coding mistake cannot leak one business’s data to another. Each microservice owns its own schema in one PostgreSQL cluster; services never read another service’s schema directly.</w:t>
       </w:r>
     </w:p>
@@ -17761,7 +18724,7 @@
       <w:pPr>
         <w:pStyle w:val="Heading2"/>
       </w:pPr>
-      <w:bookmarkStart w:id="50" w:name="_Toc243479305"/>
+      <w:bookmarkStart w:id="50" w:name="_Toc243582931"/>
       <w:r>
         <w:t>12.3 Tables by Service</w:t>
       </w:r>
@@ -18946,6 +19909,7 @@
                 <w:sz w:val="19"/>
                 <w:szCs w:val="19"/>
               </w:rPr>
+              <w:lastRenderedPageBreak/>
               <w:t>booking_items.seq</w:t>
             </w:r>
           </w:p>
@@ -19603,7 +20567,6 @@
           <w:b/>
           <w:bCs/>
         </w:rPr>
-        <w:lastRenderedPageBreak/>
         <w:t>Differences from the 3rd Version:</w:t>
       </w:r>
       <w:r>
@@ -19633,7 +20596,7 @@
       <w:pPr>
         <w:pStyle w:val="Heading2"/>
       </w:pPr>
-      <w:bookmarkStart w:id="51" w:name="_Toc243479306"/>
+      <w:bookmarkStart w:id="51" w:name="_Toc243582932"/>
       <w:r>
         <w:t>12.4 Core Schema (Scheduling)</w:t>
       </w:r>
@@ -20117,6 +21080,7 @@
           <w:sz w:val="16"/>
           <w:szCs w:val="16"/>
         </w:rPr>
+        <w:lastRenderedPageBreak/>
         <w:t>CREATE TABLE days_off (</w:t>
       </w:r>
     </w:p>
@@ -20442,7 +21406,6 @@
           <w:sz w:val="16"/>
           <w:szCs w:val="16"/>
         </w:rPr>
-        <w:lastRenderedPageBreak/>
         <w:t>);</w:t>
       </w:r>
     </w:p>
@@ -20900,7 +21863,7 @@
                 <w:sz w:val="19"/>
                 <w:szCs w:val="19"/>
               </w:rPr>
-              <w:t>The business's country (MY, SG, AU) and the address in parts.</w:t>
+              <w:t>The business's country (MY, SG, AU; any country since 0034) and the address in parts.</w:t>
             </w:r>
           </w:p>
         </w:tc>
@@ -21429,6 +22392,7 @@
                 <w:sz w:val="19"/>
                 <w:szCs w:val="19"/>
               </w:rPr>
+              <w:lastRenderedPageBreak/>
               <w:t>bookings.contact_email, customers.email_verified_at</w:t>
             </w:r>
           </w:p>
@@ -21982,6 +22946,89 @@
           </w:p>
         </w:tc>
       </w:tr>
+      <w:tr>
+        <w:trPr>
+          <w:cantSplit/>
+        </w:trPr>
+        <w:tc>
+          <w:tcPr>
+            <w:tcW w:w="1500" w:type="dxa"/>
+            <w:tcBorders>
+              <w:top w:val="single" w:sz="4" w:space="0" w:color="B4B2A9"/>
+              <w:left w:val="single" w:sz="4" w:space="0" w:color="B4B2A9"/>
+              <w:bottom w:val="single" w:sz="4" w:space="0" w:color="B4B2A9"/>
+              <w:right w:val="single" w:sz="4" w:space="0" w:color="B4B2A9"/>
+            </w:tcBorders>
+            <w:tcMar>
+              <w:top w:w="60" w:type="dxa"/>
+              <w:left w:w="100" w:type="dxa"/>
+              <w:bottom w:w="60" w:type="dxa"/>
+              <w:right w:w="100" w:type="dxa"/>
+            </w:tcMar>
+          </w:tcPr>
+          <w:p>
+            <w:r>
+              <w:rPr>
+                <w:sz w:val="19"/>
+                <w:szCs w:val="19"/>
+              </w:rPr>
+              <w:t>0034</w:t>
+            </w:r>
+          </w:p>
+        </w:tc>
+        <w:tc>
+          <w:tcPr>
+            <w:tcW w:w="3000" w:type="dxa"/>
+            <w:tcBorders>
+              <w:top w:val="single" w:sz="4" w:space="0" w:color="B4B2A9"/>
+              <w:left w:val="single" w:sz="4" w:space="0" w:color="B4B2A9"/>
+              <w:bottom w:val="single" w:sz="4" w:space="0" w:color="B4B2A9"/>
+              <w:right w:val="single" w:sz="4" w:space="0" w:color="B4B2A9"/>
+            </w:tcBorders>
+            <w:tcMar>
+              <w:top w:w="60" w:type="dxa"/>
+              <w:left w:w="100" w:type="dxa"/>
+              <w:bottom w:w="60" w:type="dxa"/>
+              <w:right w:w="100" w:type="dxa"/>
+            </w:tcMar>
+          </w:tcPr>
+          <w:p>
+            <w:r>
+              <w:rPr>
+                <w:sz w:val="19"/>
+                <w:szCs w:val="19"/>
+              </w:rPr>
+              <w:t>tenants.country, business_profiles.state</w:t>
+            </w:r>
+          </w:p>
+        </w:tc>
+        <w:tc>
+          <w:tcPr>
+            <w:tcW w:w="5138" w:type="dxa"/>
+            <w:tcBorders>
+              <w:top w:val="single" w:sz="4" w:space="0" w:color="B4B2A9"/>
+              <w:left w:val="single" w:sz="4" w:space="0" w:color="B4B2A9"/>
+              <w:bottom w:val="single" w:sz="4" w:space="0" w:color="B4B2A9"/>
+              <w:right w:val="single" w:sz="4" w:space="0" w:color="B4B2A9"/>
+            </w:tcBorders>
+            <w:tcMar>
+              <w:top w:w="60" w:type="dxa"/>
+              <w:left w:w="100" w:type="dxa"/>
+              <w:bottom w:w="60" w:type="dxa"/>
+              <w:right w:w="100" w:type="dxa"/>
+            </w:tcMar>
+          </w:tcPr>
+          <w:p>
+            <w:r>
+              <w:rPr>
+                <w:sz w:val="19"/>
+                <w:szCs w:val="19"/>
+              </w:rPr>
+              <w:t>Any two-letter country code (was MY, SG or AU); a state or province of up to 100 characters (was 3)</w:t>
+            </w:r>
+          </w:p>
+        </w:tc>
+      </w:tr>
     </w:tbl>
     <w:p>
       <w:pPr>
@@ -21992,9 +23039,8 @@
       <w:pPr>
         <w:pStyle w:val="Heading1"/>
       </w:pPr>
-      <w:bookmarkStart w:id="52" w:name="_Toc243479307"/>
-      <w:r>
-        <w:lastRenderedPageBreak/>
+      <w:bookmarkStart w:id="52" w:name="_Toc243582933"/>
+      <w:r>
         <w:t>13. Availability and Booking Engine</w:t>
       </w:r>
       <w:bookmarkEnd w:id="52"/>
@@ -22003,7 +23049,7 @@
       <w:pPr>
         <w:pStyle w:val="Heading2"/>
       </w:pPr>
-      <w:bookmarkStart w:id="53" w:name="_Toc243479308"/>
+      <w:bookmarkStart w:id="53" w:name="_Toc243582934"/>
       <w:r>
         <w:t>13.1 Slot Generation Pipeline</w:t>
       </w:r>
@@ -22262,7 +23308,7 @@
       <w:pPr>
         <w:pStyle w:val="Heading2"/>
       </w:pPr>
-      <w:bookmarkStart w:id="54" w:name="_Toc243479309"/>
+      <w:bookmarkStart w:id="54" w:name="_Toc243582935"/>
       <w:r>
         <w:t>13.2 Allocation Strategies (Python)</w:t>
       </w:r>
@@ -22318,6 +23364,7 @@
                 <w:sz w:val="19"/>
                 <w:szCs w:val="19"/>
               </w:rPr>
+              <w:lastRenderedPageBreak/>
               <w:t>Strategy</w:t>
             </w:r>
           </w:p>
@@ -22578,7 +23625,7 @@
       <w:pPr>
         <w:pStyle w:val="Heading2"/>
       </w:pPr>
-      <w:bookmarkStart w:id="55" w:name="_Toc243479310"/>
+      <w:bookmarkStart w:id="55" w:name="_Toc243582936"/>
       <w:r>
         <w:t>13.3 Concurrency</w:t>
       </w:r>
@@ -22772,7 +23819,6 @@
           <w:sz w:val="16"/>
           <w:szCs w:val="16"/>
         </w:rPr>
-        <w:lastRenderedPageBreak/>
         <w:t xml:space="preserve">    return booking</w:t>
       </w:r>
     </w:p>
@@ -23041,6 +24087,7 @@
           <w:b/>
           <w:bCs/>
         </w:rPr>
+        <w:lastRenderedPageBreak/>
         <w:t>Decided not to build:</w:t>
       </w:r>
       <w:r>
@@ -23051,7 +24098,7 @@
       <w:pPr>
         <w:pStyle w:val="Heading2"/>
       </w:pPr>
-      <w:bookmarkStart w:id="56" w:name="_Toc243479311"/>
+      <w:bookmarkStart w:id="56" w:name="_Toc243582937"/>
       <w:r>
         <w:t>13.4 Booking State Machine</w:t>
       </w:r>
@@ -23914,7 +24961,6 @@
           <w:sz w:val="17"/>
           <w:szCs w:val="17"/>
         </w:rPr>
-        <w:lastRenderedPageBreak/>
         <w:t>NEW IN 5TH VERSION</w:t>
       </w:r>
       <w:r>
@@ -24082,7 +25128,7 @@
       <w:pPr>
         <w:pStyle w:val="Heading2"/>
       </w:pPr>
-      <w:bookmarkStart w:id="57" w:name="_Toc243479312"/>
+      <w:bookmarkStart w:id="57" w:name="_Toc243582938"/>
       <w:r>
         <w:t>13.5 Background Jobs</w:t>
       </w:r>
@@ -24137,6 +25183,7 @@
         <w:spacing w:after="60"/>
       </w:pPr>
       <w:r>
+        <w:lastRenderedPageBreak/>
         <w:t>Retry failed Google Calendar syncs and notifications.</w:t>
       </w:r>
     </w:p>
@@ -24681,7 +25728,6 @@
                 <w:sz w:val="19"/>
                 <w:szCs w:val="19"/>
               </w:rPr>
-              <w:lastRenderedPageBreak/>
               <w:t>Retry failed Google Calendar syncs</w:t>
             </w:r>
           </w:p>
@@ -25136,7 +26182,7 @@
       <w:pPr>
         <w:pStyle w:val="Heading1"/>
       </w:pPr>
-      <w:bookmarkStart w:id="58" w:name="_Toc243479313"/>
+      <w:bookmarkStart w:id="58" w:name="_Toc243582939"/>
       <w:r>
         <w:t>14. API Design</w:t>
       </w:r>
@@ -25607,6 +26653,7 @@
                 <w:sz w:val="19"/>
                 <w:szCs w:val="19"/>
               </w:rPr>
+              <w:lastRenderedPageBreak/>
               <w:t>POST</w:t>
             </w:r>
           </w:p>
@@ -26405,7 +27452,6 @@
                 <w:sz w:val="19"/>
                 <w:szCs w:val="19"/>
               </w:rPr>
-              <w:lastRenderedPageBreak/>
               <w:t>Method</w:t>
             </w:r>
           </w:p>
@@ -27989,6 +29035,7 @@
                 <w:sz w:val="19"/>
                 <w:szCs w:val="19"/>
               </w:rPr>
+              <w:lastRenderedPageBreak/>
               <w:t>GET/PUT</w:t>
             </w:r>
           </w:p>
@@ -28653,7 +29700,6 @@
                 <w:sz w:val="19"/>
                 <w:szCs w:val="19"/>
               </w:rPr>
-              <w:lastRenderedPageBreak/>
               <w:t>GET/PUT/DELETE</w:t>
             </w:r>
           </w:p>
@@ -29285,7 +30331,7 @@
                 <w:sz w:val="19"/>
                 <w:szCs w:val="19"/>
               </w:rPr>
-              <w:t>Countries with their time zones, states, postcode shape, currency and privacy law (no key)</w:t>
+              <w:t>Every country (242, by name) with its time zones, phone code, currency and address rules; states, postcode shape and privacy law for Malaysia, Singapore and Australia (no key)</w:t>
             </w:r>
           </w:p>
         </w:tc>
@@ -29731,6 +30777,7 @@
                 <w:sz w:val="19"/>
                 <w:szCs w:val="19"/>
               </w:rPr>
+              <w:lastRenderedPageBreak/>
               <w:t>GET/PUT</w:t>
             </w:r>
           </w:p>
@@ -30309,7 +31356,6 @@
           <w:sz w:val="17"/>
           <w:szCs w:val="17"/>
         </w:rPr>
-        <w:lastRenderedPageBreak/>
         <w:t>NEW IN 7TH VERSION</w:t>
       </w:r>
       <w:r>
@@ -31445,6 +32491,173 @@
           </w:p>
         </w:tc>
       </w:tr>
+      <w:tr>
+        <w:trPr>
+          <w:cantSplit/>
+        </w:trPr>
+        <w:tc>
+          <w:tcPr>
+            <w:tcW w:w="1500" w:type="dxa"/>
+            <w:tcBorders>
+              <w:top w:val="single" w:sz="4" w:space="0" w:color="B4B2A9"/>
+              <w:left w:val="single" w:sz="4" w:space="0" w:color="B4B2A9"/>
+              <w:bottom w:val="single" w:sz="4" w:space="0" w:color="B4B2A9"/>
+              <w:right w:val="single" w:sz="4" w:space="0" w:color="B4B2A9"/>
+            </w:tcBorders>
+            <w:tcMar>
+              <w:top w:w="60" w:type="dxa"/>
+              <w:left w:w="100" w:type="dxa"/>
+              <w:bottom w:w="60" w:type="dxa"/>
+              <w:right w:w="100" w:type="dxa"/>
+            </w:tcMar>
+          </w:tcPr>
+          <w:p>
+            <w:r>
+              <w:rPr>
+                <w:sz w:val="19"/>
+                <w:szCs w:val="19"/>
+              </w:rPr>
+              <w:lastRenderedPageBreak/>
+              <w:t>GET</w:t>
+            </w:r>
+          </w:p>
+        </w:tc>
+        <w:tc>
+          <w:tcPr>
+            <w:tcW w:w="3300" w:type="dxa"/>
+            <w:tcBorders>
+              <w:top w:val="single" w:sz="4" w:space="0" w:color="B4B2A9"/>
+              <w:left w:val="single" w:sz="4" w:space="0" w:color="B4B2A9"/>
+              <w:bottom w:val="single" w:sz="4" w:space="0" w:color="B4B2A9"/>
+              <w:right w:val="single" w:sz="4" w:space="0" w:color="B4B2A9"/>
+            </w:tcBorders>
+            <w:tcMar>
+              <w:top w:w="60" w:type="dxa"/>
+              <w:left w:w="100" w:type="dxa"/>
+              <w:bottom w:w="60" w:type="dxa"/>
+              <w:right w:w="100" w:type="dxa"/>
+            </w:tcMar>
+          </w:tcPr>
+          <w:p>
+            <w:r>
+              <w:rPr>
+                <w:sz w:val="19"/>
+                <w:szCs w:val="19"/>
+              </w:rPr>
+              <w:t>/v1/countries</w:t>
+            </w:r>
+          </w:p>
+        </w:tc>
+        <w:tc>
+          <w:tcPr>
+            <w:tcW w:w="4838" w:type="dxa"/>
+            <w:tcBorders>
+              <w:top w:val="single" w:sz="4" w:space="0" w:color="B4B2A9"/>
+              <w:left w:val="single" w:sz="4" w:space="0" w:color="B4B2A9"/>
+              <w:bottom w:val="single" w:sz="4" w:space="0" w:color="B4B2A9"/>
+              <w:right w:val="single" w:sz="4" w:space="0" w:color="B4B2A9"/>
+            </w:tcBorders>
+            <w:tcMar>
+              <w:top w:w="60" w:type="dxa"/>
+              <w:left w:w="100" w:type="dxa"/>
+              <w:bottom w:w="60" w:type="dxa"/>
+              <w:right w:w="100" w:type="dxa"/>
+            </w:tcMar>
+          </w:tcPr>
+          <w:p>
+            <w:r>
+              <w:rPr>
+                <w:sz w:val="19"/>
+                <w:szCs w:val="19"/>
+              </w:rPr>
+              <w:t>Every country, by name; new exact_address; postcode_digits, postcode_example and privacy_law are empty for the basic countries</w:t>
+            </w:r>
+          </w:p>
+        </w:tc>
+      </w:tr>
+      <w:tr>
+        <w:trPr>
+          <w:cantSplit/>
+        </w:trPr>
+        <w:tc>
+          <w:tcPr>
+            <w:tcW w:w="1500" w:type="dxa"/>
+            <w:tcBorders>
+              <w:top w:val="single" w:sz="4" w:space="0" w:color="B4B2A9"/>
+              <w:left w:val="single" w:sz="4" w:space="0" w:color="B4B2A9"/>
+              <w:bottom w:val="single" w:sz="4" w:space="0" w:color="B4B2A9"/>
+              <w:right w:val="single" w:sz="4" w:space="0" w:color="B4B2A9"/>
+            </w:tcBorders>
+            <w:tcMar>
+              <w:top w:w="60" w:type="dxa"/>
+              <w:left w:w="100" w:type="dxa"/>
+              <w:bottom w:w="60" w:type="dxa"/>
+              <w:right w:w="100" w:type="dxa"/>
+            </w:tcMar>
+          </w:tcPr>
+          <w:p>
+            <w:r>
+              <w:rPr>
+                <w:sz w:val="19"/>
+                <w:szCs w:val="19"/>
+              </w:rPr>
+              <w:t>POST</w:t>
+            </w:r>
+          </w:p>
+        </w:tc>
+        <w:tc>
+          <w:tcPr>
+            <w:tcW w:w="3300" w:type="dxa"/>
+            <w:tcBorders>
+              <w:top w:val="single" w:sz="4" w:space="0" w:color="B4B2A9"/>
+              <w:left w:val="single" w:sz="4" w:space="0" w:color="B4B2A9"/>
+              <w:bottom w:val="single" w:sz="4" w:space="0" w:color="B4B2A9"/>
+              <w:right w:val="single" w:sz="4" w:space="0" w:color="B4B2A9"/>
+            </w:tcBorders>
+            <w:tcMar>
+              <w:top w:w="60" w:type="dxa"/>
+              <w:left w:w="100" w:type="dxa"/>
+              <w:bottom w:w="60" w:type="dxa"/>
+              <w:right w:w="100" w:type="dxa"/>
+            </w:tcMar>
+          </w:tcPr>
+          <w:p>
+            <w:r>
+              <w:rPr>
+                <w:sz w:val="19"/>
+                <w:szCs w:val="19"/>
+              </w:rPr>
+              <w:t>/v1/signup</w:t>
+            </w:r>
+          </w:p>
+        </w:tc>
+        <w:tc>
+          <w:tcPr>
+            <w:tcW w:w="4838" w:type="dxa"/>
+            <w:tcBorders>
+              <w:top w:val="single" w:sz="4" w:space="0" w:color="B4B2A9"/>
+              <w:left w:val="single" w:sz="4" w:space="0" w:color="B4B2A9"/>
+              <w:bottom w:val="single" w:sz="4" w:space="0" w:color="B4B2A9"/>
+              <w:right w:val="single" w:sz="4" w:space="0" w:color="B4B2A9"/>
+            </w:tcBorders>
+            <w:tcMar>
+              <w:top w:w="60" w:type="dxa"/>
+              <w:left w:w="100" w:type="dxa"/>
+              <w:bottom w:w="60" w:type="dxa"/>
+              <w:right w:w="100" w:type="dxa"/>
+            </w:tcMar>
+          </w:tcPr>
+          <w:p>
+            <w:r>
+              <w:rPr>
+                <w:sz w:val="19"/>
+                <w:szCs w:val="19"/>
+              </w:rPr>
+              <w:t>country takes any country code the service knows; outside Malaysia, Singapore and Australia the state is free text and the postcode optional</w:t>
+            </w:r>
+          </w:p>
+        </w:tc>
+      </w:tr>
     </w:tbl>
     <w:p>
       <w:pPr>
@@ -31455,7 +32668,7 @@
       <w:pPr>
         <w:pStyle w:val="Heading1"/>
       </w:pPr>
-      <w:bookmarkStart w:id="59" w:name="_Toc243479314"/>
+      <w:bookmarkStart w:id="59" w:name="_Toc243582940"/>
       <w:r>
         <w:t>15. Notifications and Integrations</w:t>
       </w:r>
@@ -31657,7 +32870,6 @@
           <w:b/>
           <w:bCs/>
         </w:rPr>
-        <w:lastRenderedPageBreak/>
         <w:t>Booking messages:</w:t>
       </w:r>
       <w:r>
@@ -31883,7 +33095,11 @@
         <w:t>Google Calendar (one way):</w:t>
       </w:r>
       <w:r>
-        <w:t xml:space="preserve"> confirmed, running and finished bookings appear as events in the business's calendar and in the calendar of the staff member who has them; cancelled, rejected and no-show bookings are removed. The booking system is the truth: an event edited in Google is overwritten the next time the booking changes. An event carries services, staff, status and a short booking reference; the customer's name, phone, party size, request and address go in only if the owner switched on share_customer_details for that calendar (Google is then a processor: list it in the privacy notice). Health notes are never sent. The owner connects through Google's OAuth 2.0 web flow (scope calendar.events); tokens are stored encrypted; a calendar that keeps failing, or whose sign-in Google no longer accepts, is paused and the business is emailed.</w:t>
+        <w:t xml:space="preserve"> confirmed, running and finished bookings appear as events in the business's calendar and in the calendar of the staff member who has them; cancelled, rejected and no-show bookings are removed. The booking system is the truth: an event edited in Google is overwritten the next time the booking changes. An event carries services, staff, status and a short booking reference; the </w:t>
+      </w:r>
+      <w:r>
+        <w:lastRenderedPageBreak/>
+        <w:t>customer's name, phone, party size, request and address go in only if the owner switched on share_customer_details for that calendar (Google is then a processor: list it in the privacy notice). Health notes are never sent. The owner connects through Google's OAuth 2.0 web flow (scope calendar.events); tokens are stored encrypted; a calendar that keeps failing, or whose sign-in Google no longer accepts, is paused and the business is emailed.</w:t>
       </w:r>
     </w:p>
     <w:p>
@@ -32078,7 +33294,6 @@
           <w:b/>
           <w:bCs/>
         </w:rPr>
-        <w:lastRenderedPageBreak/>
         <w:t>Not verified:</w:t>
       </w:r>
       <w:r>
@@ -32089,7 +33304,7 @@
       <w:pPr>
         <w:pStyle w:val="Heading1"/>
       </w:pPr>
-      <w:bookmarkStart w:id="60" w:name="_Toc243479315"/>
+      <w:bookmarkStart w:id="60" w:name="_Toc243582941"/>
       <w:r>
         <w:t>16. Security and Compliance</w:t>
       </w:r>
@@ -32311,6 +33526,7 @@
           <w:b/>
           <w:bCs/>
         </w:rPr>
+        <w:lastRenderedPageBreak/>
         <w:t>Credentials:</w:t>
       </w:r>
       <w:r>
@@ -33252,7 +34468,6 @@
           <w:b/>
           <w:bCs/>
         </w:rPr>
-        <w:lastRenderedPageBreak/>
         <w:t>Not built:</w:t>
       </w:r>
       <w:r>
@@ -33430,7 +34645,11 @@
         <w:t>Privacy:</w:t>
       </w:r>
       <w:r>
-        <w:t xml:space="preserve"> erasure also clears the email given with each of the customer's bookings, the confirmation of their email, and the idempotency key and request hash on their bookings, and queues the customer's Google Calendar events to be rewritten without their name, phone and request. A calendar that was paused at the time is rewritten in full when it is connected again; events in a calendar that was disconnected stay in Google.</w:t>
+        <w:t xml:space="preserve"> erasure also clears the email given with each of the customer's bookings, the confirmation of their email, and the idempotency key and request hash on their bookings, and queues the customer's Google Calendar events to be rewritten without their name, phone and request. A calendar that was </w:t>
+      </w:r>
+      <w:r>
+        <w:lastRenderedPageBreak/>
+        <w:t>paused at the time is rewritten in full when it is connected again; events in a calendar that was disconnected stay in Google.</w:t>
       </w:r>
     </w:p>
     <w:p>
@@ -33682,11 +34901,7 @@
         <w:t>The online demo's door:</w:t>
       </w:r>
       <w:r>
-        <w:t xml:space="preserve"> the demo website asks visitors to register and log in with an emailed one-use link (30 minutes, stored only as a hash); a signed cookie keeps them in for 30 days; requests are limited per </w:t>
-      </w:r>
-      <w:r>
-        <w:lastRenderedPageBreak/>
-        <w:t>address and per client; a log-in for an unknown address sends nothing and answers the same, so the page does not reveal who is registered. The backend's own API stays open, as on any deployment.</w:t>
+        <w:t xml:space="preserve"> the demo website asks visitors to register and log in with an emailed one-use link (30 minutes, stored only as a hash); a signed cookie keeps them in for 30 days; requests are limited per address and per client; a log-in for an unknown address sends nothing and answers the same, so the page does not reveal who is registered. The backend's own API stays open, as on any deployment.</w:t>
       </w:r>
     </w:p>
     <w:p>
@@ -33717,7 +34932,7 @@
       <w:pPr>
         <w:pStyle w:val="Heading1"/>
       </w:pPr>
-      <w:bookmarkStart w:id="61" w:name="_Toc243479316"/>
+      <w:bookmarkStart w:id="61" w:name="_Toc243582942"/>
       <w:r>
         <w:t>17. Development Roadmap</w:t>
       </w:r>
@@ -34513,6 +35728,7 @@
                 <w:sz w:val="19"/>
                 <w:szCs w:val="19"/>
               </w:rPr>
+              <w:lastRenderedPageBreak/>
               <w:t>4. Professional</w:t>
             </w:r>
           </w:p>
@@ -34755,7 +35971,7 @@
       <w:pPr>
         <w:pStyle w:val="Heading1"/>
       </w:pPr>
-      <w:bookmarkStart w:id="62" w:name="_Toc243479317"/>
+      <w:bookmarkStart w:id="62" w:name="_Toc243582943"/>
       <w:r>
         <w:t>18. Open Questions</w:t>
       </w:r>
@@ -34866,7 +36082,7 @@
         <w:pStyle w:val="Heading1"/>
       </w:pPr>
       <w:bookmarkStart w:id="63" w:name="_Toc96005002"/>
-      <w:bookmarkStart w:id="64" w:name="_Toc243479318"/>
+      <w:bookmarkStart w:id="64" w:name="_Toc243582944"/>
       <w:r>
         <w:t>19. Implementation Status (updated in 8th Version)</w:t>
       </w:r>
@@ -34878,7 +36094,6 @@
         <w:spacing w:after="120"/>
       </w:pPr>
       <w:r>
-        <w:lastRenderedPageBreak/>
         <w:t>This section gathers the status of the backend in one place. It is the 7th Version's Section 19, updated in place for the 8th Version; Section 19.8 is new. Nothing here changes the design above; it records what exists, what was only checked against test doubles, and what is missing.</w:t>
       </w:r>
     </w:p>
@@ -34887,7 +36102,7 @@
         <w:pStyle w:val="Heading2"/>
       </w:pPr>
       <w:bookmarkStart w:id="65" w:name="_Toc96005003"/>
-      <w:bookmarkStart w:id="66" w:name="_Toc243479319"/>
+      <w:bookmarkStart w:id="66" w:name="_Toc243582945"/>
       <w:r>
         <w:t>19.1 Built and tested</w:t>
       </w:r>
@@ -35176,10 +36391,11 @@
           <w:b/>
           <w:bCs/>
         </w:rPr>
+        <w:lastRenderedPageBreak/>
         <w:t>Since the 8th Version:</w:t>
       </w:r>
       <w:r>
-        <w:t xml:space="preserve"> booking rules for a new business, the business location from a Google Maps link, a consultant's own meeting room, price after inspection, the visit address in the admin detail, required service settings that cannot be emptied.</w:t>
+        <w:t xml:space="preserve"> booking rules for a new business, the business location from a Google Maps link, a consultant's own meeting room, price after inspection, the visit address in the admin detail, required service settings that cannot be emptied, sign-up from every country with its time zones, phone code and currency.</w:t>
       </w:r>
     </w:p>
     <w:p>
@@ -35187,7 +36403,7 @@
         <w:pStyle w:val="Heading2"/>
       </w:pPr>
       <w:bookmarkStart w:id="67" w:name="_Toc96005004"/>
-      <w:bookmarkStart w:id="68" w:name="_Toc243479320"/>
+      <w:bookmarkStart w:id="68" w:name="_Toc243582946"/>
       <w:r>
         <w:t>19.2 Built but not checked against the real thing</w:t>
       </w:r>
@@ -35391,9 +36607,8 @@
         <w:pStyle w:val="Heading2"/>
       </w:pPr>
       <w:bookmarkStart w:id="69" w:name="_Toc96005005"/>
-      <w:bookmarkStart w:id="70" w:name="_Toc243479321"/>
-      <w:r>
-        <w:lastRenderedPageBreak/>
+      <w:bookmarkStart w:id="70" w:name="_Toc243582947"/>
+      <w:r>
         <w:t>19.3 Not built</w:t>
       </w:r>
       <w:bookmarkEnd w:id="69"/>
@@ -36315,6 +37530,7 @@
                 <w:sz w:val="19"/>
                 <w:szCs w:val="19"/>
               </w:rPr>
+              <w:lastRenderedPageBreak/>
               <w:t>Customer</w:t>
             </w:r>
           </w:p>
@@ -36558,7 +37774,7 @@
         <w:pStyle w:val="Heading2"/>
       </w:pPr>
       <w:bookmarkStart w:id="71" w:name="_Toc96005006"/>
-      <w:bookmarkStart w:id="72" w:name="_Toc243479322"/>
+      <w:bookmarkStart w:id="72" w:name="_Toc243582948"/>
       <w:r>
         <w:t>19.4 Decisions taken during the build</w:t>
       </w:r>
@@ -36751,7 +37967,6 @@
           <w:b/>
           <w:bCs/>
         </w:rPr>
-        <w:lastRenderedPageBreak/>
         <w:t>Where free users' data lives:</w:t>
       </w:r>
       <w:r>
@@ -37027,7 +38242,7 @@
         <w:pStyle w:val="Heading2"/>
       </w:pPr>
       <w:bookmarkStart w:id="73" w:name="_Toc96005007"/>
-      <w:bookmarkStart w:id="74" w:name="_Toc243479323"/>
+      <w:bookmarkStart w:id="74" w:name="_Toc243582949"/>
       <w:r>
         <w:t>19.5 How it was verified</w:t>
       </w:r>
@@ -37055,7 +38270,7 @@
         <w:t>Tests:</w:t>
       </w:r>
       <w:r>
-        <w:t xml:space="preserve"> 2,607 tests pass with PostGIS; mypy is clean; alembic check and an upgrade and downgrade round trip were run for each migration (33 migrations).</w:t>
+        <w:t xml:space="preserve"> 2,635 tests pass with PostGIS; mypy is clean; alembic check and an upgrade and downgrade round trip were run for each migration up to 0033. Migration 0034 (every country) was upgraded on the local test site's database; its round trip, mutation testing and ten runs are still to do (Section 5.3).</w:t>
       </w:r>
     </w:p>
     <w:p>
@@ -37079,7 +38294,11 @@
         <w:t>Mutation testing:</w:t>
       </w:r>
       <w:r>
-        <w:t xml:space="preserve"> for each feature the key rules were broken one at a time and a test had to fail (for example 81 breakages of the customer-email rules, 35 of the refused-message rules, 32 of the idempotency rules, 25 of the timed moves, 33 of the second review's fixes, 21 of the admin customer details, 14 of the minimum-spend amount, 10 of the default booking rules, 28 of the Google Maps links, 23 of the meeting links, 13 of price after inspection and the visit address). Survivors were either closed with new tests or listed as equivalent (a redundant safeguard).</w:t>
+        <w:t xml:space="preserve"> for each feature the key rules were broken one at a time and a test had to fail (for example 81 breakages of the customer-email rules, 35 of the refused-message rules, 32 of the </w:t>
+      </w:r>
+      <w:r>
+        <w:lastRenderedPageBreak/>
+        <w:t>idempotency rules, 25 of the timed moves, 33 of the second review's fixes, 21 of the admin customer details, 14 of the minimum-spend amount, 10 of the default booking rules, 28 of the Google Maps links, 23 of the meeting links, 13 of price after inspection and the visit address). Survivors were either closed with new tests or listed as equivalent (a redundant safeguard).</w:t>
       </w:r>
     </w:p>
     <w:p>
@@ -37207,7 +38426,7 @@
         <w:pStyle w:val="Heading2"/>
       </w:pPr>
       <w:bookmarkStart w:id="75" w:name="_Toc96005008"/>
-      <w:bookmarkStart w:id="76" w:name="_Toc243479324"/>
+      <w:bookmarkStart w:id="76" w:name="_Toc243582950"/>
       <w:r>
         <w:t>19.6 Code review findings</w:t>
       </w:r>
@@ -37450,7 +38669,6 @@
                 <w:sz w:val="19"/>
                 <w:szCs w:val="19"/>
               </w:rPr>
-              <w:lastRenderedPageBreak/>
               <w:t>Medium: one failing channel held back the booking's other messages</w:t>
             </w:r>
           </w:p>
@@ -38139,6 +39357,7 @@
                 <w:sz w:val="19"/>
                 <w:szCs w:val="19"/>
               </w:rPr>
+              <w:lastRenderedPageBreak/>
               <w:t>Low: points left on purpose</w:t>
             </w:r>
           </w:p>
@@ -38210,7 +39429,7 @@
         <w:pStyle w:val="Heading2"/>
       </w:pPr>
       <w:bookmarkStart w:id="77" w:name="_Toc96007002"/>
-      <w:bookmarkStart w:id="78" w:name="_Toc243479325"/>
+      <w:bookmarkStart w:id="78" w:name="_Toc243582951"/>
       <w:r>
         <w:t>19.7 UX prototype and what it found (7th Version)</w:t>
       </w:r>
@@ -38398,7 +39617,6 @@
                 <w:sz w:val="19"/>
                 <w:szCs w:val="19"/>
               </w:rPr>
-              <w:lastRenderedPageBreak/>
               <w:t>Finding</w:t>
             </w:r>
           </w:p>
@@ -38989,7 +40207,7 @@
         <w:pStyle w:val="Heading2"/>
       </w:pPr>
       <w:bookmarkStart w:id="79" w:name="_Toc97008002"/>
-      <w:bookmarkStart w:id="80" w:name="_Toc243479326"/>
+      <w:bookmarkStart w:id="80" w:name="_Toc243582952"/>
       <w:r>
         <w:t>19.8 Local test site and online demo (8th Version)</w:t>
       </w:r>
@@ -39001,6 +40219,7 @@
         <w:spacing w:after="120"/>
       </w:pPr>
       <w:r>
+        <w:lastRenderedPageBreak/>
         <w:t>The prototype's screens were connected to the real backend in two ways, so testers and prospective customers can try the product before the WordPress plugin, widget and dashboard exist. Neither is the product's front end: they are test screens.</w:t>
       </w:r>
     </w:p>
@@ -39025,10 +40244,7 @@
         <w:t>Local test site (2026-10-16):</w:t>
       </w:r>
       <w:r>
-        <w:t xml:space="preserve"> the unchanged backend running on a tester's own Windows computer with a bundled PostgreSQL and PostGIS, sample data put in through the real API (five sample businesses, about 250 bookings), and the screens on one local address. Testers double-click start.bat; reset.bat starts again. Stand-ins replace only the outside world: a fake Redis, an inbox on the page instead of WhatsApp, SMS and email, a table of Klang Valley places instead of Google geocoding, and an admin key per role in place of the WordPress pl</w:t>
-      </w:r>
-      <w:r>
-        <w:t>ugin.</w:t>
+        <w:t xml:space="preserve"> the unchanged backend running on a tester's own Windows computer with a bundled PostgreSQL and PostGIS, sample data put in through the real API (five sample businesses, about 250 bookings), and the screens on one local address. Testers double-click start.bat; reset.bat starts again. Stand-ins replace only the outside world: a fake Redis, an inbox on the page instead of WhatsApp, SMS and email, a table of Klang Valley places instead of Google geocoding, and an admin key per role in place of the WordPress plugin.</w:t>
       </w:r>
     </w:p>
     <w:p>
@@ -39052,7 +40268,7 @@
         <w:t>Online demo (2026-10-20):</w:t>
       </w:r>
       <w:r>
-        <w:t xml:space="preserve"> the same backend and screens on a free hosting plan (Render: a web service and a PostgreSQL database with PostGIS), with booking for all five business types, the customer account, the business admin and self-service sign-up. The API and its documentation are at /api and /docs.</w:t>
+        <w:t xml:space="preserve"> the same backend and screens on a free hosting plan (Render: a web service; since 2026-10-21 the PostgreSQL database with PostGIS is on Neon's free plan in Singapore, because Render's free database is deleted after 30 days), with booking for all five business types, the customer account, the business admin and self-service sign-up. The API and its documentation are at /api and /docs.</w:t>
       </w:r>
     </w:p>
     <w:p>
@@ -39169,10 +40385,10 @@
           <w:b/>
           <w:bCs/>
         </w:rPr>
-        <w:t>Built and removed:</w:t>
-      </w:r>
-      <w:r>
-        <w:t xml:space="preserve"> a log-in by SMS code was built for the demo and removed at the owner's request, because of its running cost. A "scenario" switch that faked a lost race was removed: a real clash is refused by the backend, and the screens offer that day's other free times.</w:t>
+        <w:t>Since 2026-10-22:</w:t>
+      </w:r>
+      <w:r>
+        <w:t xml:space="preserve"> the sign-up screen offers every country (guessed from the browser's time zone) with address fields for that country, prices show in the business's currency, and the register page has a country code in front of the mobile number.</w:t>
       </w:r>
     </w:p>
     <w:p>
@@ -39193,7 +40409,30 @@
           <w:b/>
           <w:bCs/>
         </w:rPr>
-        <w:lastRenderedPageBreak/>
+        <w:t>Built and removed:</w:t>
+      </w:r>
+      <w:r>
+        <w:t xml:space="preserve"> a log-in by SMS code was built for the demo and removed at the owner's request, because of its running cost. A "scenario" switch that faked a lost race was removed: a real clash is refused by the backend, and the screens offer that day's other free times.</w:t>
+      </w:r>
+    </w:p>
+    <w:p>
+      <w:pPr>
+        <w:pStyle w:val="ListParagraph"/>
+        <w:numPr>
+          <w:ilvl w:val="0"/>
+          <w:numId w:val="2"/>
+        </w:numPr>
+        <w:pBdr>
+          <w:left w:val="single" w:sz="24" w:space="6" w:color="1E6B2E"/>
+        </w:pBdr>
+        <w:shd w:val="clear" w:color="auto" w:fill="EAF4EA"/>
+        <w:spacing w:after="60"/>
+      </w:pPr>
+      <w:r>
+        <w:rPr>
+          <w:b/>
+          <w:bCs/>
+        </w:rPr>
         <w:t>How it was checked:</w:t>
       </w:r>
       <w:r>
@@ -39858,6 +41097,7 @@
                 <w:sz w:val="19"/>
                 <w:szCs w:val="19"/>
               </w:rPr>
+              <w:lastRenderedPageBreak/>
               <w:t>Editing a service on the screens</w:t>
             </w:r>
           </w:p>
@@ -40015,7 +41255,7 @@
         <w:pStyle w:val="Heading1"/>
       </w:pPr>
       <w:bookmarkStart w:id="81" w:name="_Toc96005009"/>
-      <w:bookmarkStart w:id="82" w:name="_Toc243479327"/>
+      <w:bookmarkStart w:id="82" w:name="_Toc243582953"/>
       <w:r>
         <w:t>20. Product Direction (decisions of 2026-10-06, updated in 8th Version)</w:t>
       </w:r>
@@ -40035,7 +41275,7 @@
         <w:pStyle w:val="Heading2"/>
       </w:pPr>
       <w:bookmarkStart w:id="83" w:name="_Toc96005010"/>
-      <w:bookmarkStart w:id="84" w:name="_Toc243479328"/>
+      <w:bookmarkStart w:id="84" w:name="_Toc243582954"/>
       <w:r>
         <w:t>20.1 Standalone and WordPress</w:t>
       </w:r>
@@ -40119,7 +41359,7 @@
         <w:pStyle w:val="Heading2"/>
       </w:pPr>
       <w:bookmarkStart w:id="85" w:name="_Toc96005011"/>
-      <w:bookmarkStart w:id="86" w:name="_Toc243479329"/>
+      <w:bookmarkStart w:id="86" w:name="_Toc243582955"/>
       <w:r>
         <w:t>20.2 Free tier and paid tier</w:t>
       </w:r>
@@ -40565,7 +41805,6 @@
                 <w:sz w:val="19"/>
                 <w:szCs w:val="19"/>
               </w:rPr>
-              <w:lastRenderedPageBreak/>
               <w:t>WhatsApp and SMS messages a month (each)</w:t>
             </w:r>
           </w:p>
@@ -40824,7 +42063,7 @@
         <w:pStyle w:val="Heading2"/>
       </w:pPr>
       <w:bookmarkStart w:id="87" w:name="_Toc96005012"/>
-      <w:bookmarkStart w:id="88" w:name="_Toc243479330"/>
+      <w:bookmarkStart w:id="88" w:name="_Toc243582956"/>
       <w:r>
         <w:t>20.3 Where paid customers' data lives (the 'database bucket' question)</w:t>
       </w:r>
@@ -41075,6 +42314,7 @@
                 <w:sz w:val="19"/>
                 <w:szCs w:val="19"/>
               </w:rPr>
+              <w:lastRenderedPageBreak/>
               <w:t>Dedicated database</w:t>
             </w:r>
           </w:p>
@@ -41250,7 +42490,7 @@
         <w:pStyle w:val="Heading2"/>
       </w:pPr>
       <w:bookmarkStart w:id="89" w:name="_Toc96005013"/>
-      <w:bookmarkStart w:id="90" w:name="_Toc243479331"/>
+      <w:bookmarkStart w:id="90" w:name="_Toc243582957"/>
       <w:r>
         <w:t>20.4 One paid account, one business, one type</w:t>
       </w:r>
@@ -41334,9 +42574,9 @@
         <w:pStyle w:val="Heading2"/>
       </w:pPr>
       <w:bookmarkStart w:id="91" w:name="_Toc96005014"/>
-      <w:bookmarkStart w:id="92" w:name="_Toc243479332"/>
-      <w:r>
-        <w:t>20.5 Countries and localisation: Malaysia, Singapore, Australia</w:t>
+      <w:bookmarkStart w:id="92" w:name="_Toc243582958"/>
+      <w:r>
+        <w:t>20.5 Countries and localisation: every country, three in detail</w:t>
       </w:r>
       <w:bookmarkEnd w:id="91"/>
       <w:bookmarkEnd w:id="92"/>
@@ -41362,7 +42602,7 @@
         <w:t>Decision:</w:t>
       </w:r>
       <w:r>
-        <w:t xml:space="preserve"> the supported countries are Malaysia, Singapore and Australia, with the most attention on Malaysia. The country is the single place that decides time zones, phone code, postcode, states and currency.</w:t>
+        <w:t xml:space="preserve"> every country can sign up (updated 2026-10-22). Malaysia, Singapore and Australia keep the detailed rules (exact postcode, list of states, privacy law), with the most attention on Malaysia; every other country has the basic rules. The country is the single place that decides time zones, phone code, address rules and currency.</w:t>
       </w:r>
     </w:p>
     <w:p>
@@ -41386,7 +42626,7 @@
         <w:t>Built:</w:t>
       </w:r>
       <w:r>
-        <w:t xml:space="preserve"> see Section 5.3: country at set-up, validated time zone, address in parts, postcode and phone rules, daylight saving tested in Australia.</w:t>
+        <w:t xml:space="preserve"> see Section 5.3: country at set-up, validated time zone, address in parts, postcode and phone rules, daylight saving tested in Australia; since the 8th Version every country (242) and prices shown in the business's currency.</w:t>
       </w:r>
     </w:p>
     <w:p>
@@ -41410,7 +42650,7 @@
         <w:t>Not built:</w:t>
       </w:r>
       <w:r>
-        <w:t xml:space="preserve"> a currency on prices, privacy-law text per country, changing the country after set-up.</w:t>
+        <w:t xml:space="preserve"> a currency on each price, exact postcode shapes, state lists and privacy-law text for countries other than the three, changing the country after set-up.</w:t>
       </w:r>
     </w:p>
     <w:p>
@@ -41434,7 +42674,7 @@
         <w:t>Open:</w:t>
       </w:r>
       <w:r>
-        <w:t xml:space="preserve"> hosting region and data residency for Australian customers.</w:t>
+        <w:t xml:space="preserve"> hosting region and data residency for customers outside Malaysia (Australia first).</w:t>
       </w:r>
     </w:p>
     <w:p>
@@ -41442,7 +42682,7 @@
         <w:pStyle w:val="Heading2"/>
       </w:pPr>
       <w:bookmarkStart w:id="93" w:name="_Toc96005015"/>
-      <w:bookmarkStart w:id="94" w:name="_Toc243479333"/>
+      <w:bookmarkStart w:id="94" w:name="_Toc243582959"/>
       <w:r>
         <w:t>20.6 Registration</w:t>
       </w:r>
@@ -41491,7 +42731,6 @@
           <w:b/>
           <w:bCs/>
         </w:rPr>
-        <w:lastRenderedPageBreak/>
         <w:t>Not built:</w:t>
       </w:r>
       <w:r>
@@ -41503,7 +42742,7 @@
         <w:pStyle w:val="Heading2"/>
       </w:pPr>
       <w:bookmarkStart w:id="95" w:name="_Toc96005016"/>
-      <w:bookmarkStart w:id="96" w:name="_Toc243479334"/>
+      <w:bookmarkStart w:id="96" w:name="_Toc243582960"/>
       <w:r>
         <w:t>20.7 Order of work from here</w:t>
       </w:r>
@@ -41624,6 +42863,7 @@
           <w:b/>
           <w:bCs/>
         </w:rPr>
+        <w:lastRenderedPageBreak/>
         <w:t>5.</w:t>
       </w:r>
       <w:r>

</xml_diff>

<commit_message>
Verify every-country change (0034) and mark it verified in docs
New tests for region spaces, lower-case and one-letter country codes, and a 100-character region; 0034 downgrade wording fixed; SESSION_SUMMARY and the 8th docx now say 0034 is verified (round trip, 33 mutants, ten clean runs).
</commit_message>
<xml_diff>
--- a/BookingWebsiteBackendBlueprint_8th_Version.docx
+++ b/BookingWebsiteBackendBlueprint_8th_Version.docx
@@ -160,7 +160,7 @@
           <w:r>
             <w:fldChar w:fldCharType="separate"/>
           </w:r>
-          <w:hyperlink w:anchor="_Toc243582885" w:history="1">
+          <w:hyperlink w:anchor="_Toc243659368" w:history="1">
             <w:r>
               <w:rPr>
                 <w:rStyle w:val="Hyperlink"/>
@@ -184,7 +184,7 @@
               <w:rPr>
                 <w:noProof/>
               </w:rPr>
-              <w:instrText xml:space="preserve"> PAGEREF _Toc243582885 \h </w:instrText>
+              <w:instrText xml:space="preserve"> PAGEREF _Toc243659368 \h </w:instrText>
             </w:r>
             <w:r>
               <w:rPr>
@@ -226,7 +226,7 @@
               <w14:ligatures w14:val="standardContextual"/>
             </w:rPr>
           </w:pPr>
-          <w:hyperlink w:anchor="_Toc243582886" w:history="1">
+          <w:hyperlink w:anchor="_Toc243659369" w:history="1">
             <w:r>
               <w:rPr>
                 <w:rStyle w:val="Hyperlink"/>
@@ -250,7 +250,7 @@
               <w:rPr>
                 <w:noProof/>
               </w:rPr>
-              <w:instrText xml:space="preserve"> PAGEREF _Toc243582886 \h </w:instrText>
+              <w:instrText xml:space="preserve"> PAGEREF _Toc243659369 \h </w:instrText>
             </w:r>
             <w:r>
               <w:rPr>
@@ -292,7 +292,7 @@
               <w14:ligatures w14:val="standardContextual"/>
             </w:rPr>
           </w:pPr>
-          <w:hyperlink w:anchor="_Toc243582887" w:history="1">
+          <w:hyperlink w:anchor="_Toc243659370" w:history="1">
             <w:r>
               <w:rPr>
                 <w:rStyle w:val="Hyperlink"/>
@@ -316,7 +316,7 @@
               <w:rPr>
                 <w:noProof/>
               </w:rPr>
-              <w:instrText xml:space="preserve"> PAGEREF _Toc243582887 \h </w:instrText>
+              <w:instrText xml:space="preserve"> PAGEREF _Toc243659370 \h </w:instrText>
             </w:r>
             <w:r>
               <w:rPr>
@@ -358,7 +358,7 @@
               <w14:ligatures w14:val="standardContextual"/>
             </w:rPr>
           </w:pPr>
-          <w:hyperlink w:anchor="_Toc243582888" w:history="1">
+          <w:hyperlink w:anchor="_Toc243659371" w:history="1">
             <w:r>
               <w:rPr>
                 <w:rStyle w:val="Hyperlink"/>
@@ -382,7 +382,7 @@
               <w:rPr>
                 <w:noProof/>
               </w:rPr>
-              <w:instrText xml:space="preserve"> PAGEREF _Toc243582888 \h </w:instrText>
+              <w:instrText xml:space="preserve"> PAGEREF _Toc243659371 \h </w:instrText>
             </w:r>
             <w:r>
               <w:rPr>
@@ -424,7 +424,7 @@
               <w14:ligatures w14:val="standardContextual"/>
             </w:rPr>
           </w:pPr>
-          <w:hyperlink w:anchor="_Toc243582889" w:history="1">
+          <w:hyperlink w:anchor="_Toc243659372" w:history="1">
             <w:r>
               <w:rPr>
                 <w:rStyle w:val="Hyperlink"/>
@@ -448,7 +448,7 @@
               <w:rPr>
                 <w:noProof/>
               </w:rPr>
-              <w:instrText xml:space="preserve"> PAGEREF _Toc243582889 \h </w:instrText>
+              <w:instrText xml:space="preserve"> PAGEREF _Toc243659372 \h </w:instrText>
             </w:r>
             <w:r>
               <w:rPr>
@@ -490,7 +490,7 @@
               <w14:ligatures w14:val="standardContextual"/>
             </w:rPr>
           </w:pPr>
-          <w:hyperlink w:anchor="_Toc243582890" w:history="1">
+          <w:hyperlink w:anchor="_Toc243659373" w:history="1">
             <w:r>
               <w:rPr>
                 <w:rStyle w:val="Hyperlink"/>
@@ -514,7 +514,7 @@
               <w:rPr>
                 <w:noProof/>
               </w:rPr>
-              <w:instrText xml:space="preserve"> PAGEREF _Toc243582890 \h </w:instrText>
+              <w:instrText xml:space="preserve"> PAGEREF _Toc243659373 \h </w:instrText>
             </w:r>
             <w:r>
               <w:rPr>
@@ -556,7 +556,7 @@
               <w14:ligatures w14:val="standardContextual"/>
             </w:rPr>
           </w:pPr>
-          <w:hyperlink w:anchor="_Toc243582891" w:history="1">
+          <w:hyperlink w:anchor="_Toc243659374" w:history="1">
             <w:r>
               <w:rPr>
                 <w:rStyle w:val="Hyperlink"/>
@@ -580,7 +580,7 @@
               <w:rPr>
                 <w:noProof/>
               </w:rPr>
-              <w:instrText xml:space="preserve"> PAGEREF _Toc243582891 \h </w:instrText>
+              <w:instrText xml:space="preserve"> PAGEREF _Toc243659374 \h </w:instrText>
             </w:r>
             <w:r>
               <w:rPr>
@@ -622,7 +622,7 @@
               <w14:ligatures w14:val="standardContextual"/>
             </w:rPr>
           </w:pPr>
-          <w:hyperlink w:anchor="_Toc243582892" w:history="1">
+          <w:hyperlink w:anchor="_Toc243659375" w:history="1">
             <w:r>
               <w:rPr>
                 <w:rStyle w:val="Hyperlink"/>
@@ -646,7 +646,7 @@
               <w:rPr>
                 <w:noProof/>
               </w:rPr>
-              <w:instrText xml:space="preserve"> PAGEREF _Toc243582892 \h </w:instrText>
+              <w:instrText xml:space="preserve"> PAGEREF _Toc243659375 \h </w:instrText>
             </w:r>
             <w:r>
               <w:rPr>
@@ -688,7 +688,7 @@
               <w14:ligatures w14:val="standardContextual"/>
             </w:rPr>
           </w:pPr>
-          <w:hyperlink w:anchor="_Toc243582893" w:history="1">
+          <w:hyperlink w:anchor="_Toc243659376" w:history="1">
             <w:r>
               <w:rPr>
                 <w:rStyle w:val="Hyperlink"/>
@@ -712,7 +712,7 @@
               <w:rPr>
                 <w:noProof/>
               </w:rPr>
-              <w:instrText xml:space="preserve"> PAGEREF _Toc243582893 \h </w:instrText>
+              <w:instrText xml:space="preserve"> PAGEREF _Toc243659376 \h </w:instrText>
             </w:r>
             <w:r>
               <w:rPr>
@@ -754,7 +754,7 @@
               <w14:ligatures w14:val="standardContextual"/>
             </w:rPr>
           </w:pPr>
-          <w:hyperlink w:anchor="_Toc243582894" w:history="1">
+          <w:hyperlink w:anchor="_Toc243659377" w:history="1">
             <w:r>
               <w:rPr>
                 <w:rStyle w:val="Hyperlink"/>
@@ -778,7 +778,7 @@
               <w:rPr>
                 <w:noProof/>
               </w:rPr>
-              <w:instrText xml:space="preserve"> PAGEREF _Toc243582894 \h </w:instrText>
+              <w:instrText xml:space="preserve"> PAGEREF _Toc243659377 \h </w:instrText>
             </w:r>
             <w:r>
               <w:rPr>
@@ -820,7 +820,7 @@
               <w14:ligatures w14:val="standardContextual"/>
             </w:rPr>
           </w:pPr>
-          <w:hyperlink w:anchor="_Toc243582895" w:history="1">
+          <w:hyperlink w:anchor="_Toc243659378" w:history="1">
             <w:r>
               <w:rPr>
                 <w:rStyle w:val="Hyperlink"/>
@@ -844,7 +844,7 @@
               <w:rPr>
                 <w:noProof/>
               </w:rPr>
-              <w:instrText xml:space="preserve"> PAGEREF _Toc243582895 \h </w:instrText>
+              <w:instrText xml:space="preserve"> PAGEREF _Toc243659378 \h </w:instrText>
             </w:r>
             <w:r>
               <w:rPr>
@@ -886,7 +886,7 @@
               <w14:ligatures w14:val="standardContextual"/>
             </w:rPr>
           </w:pPr>
-          <w:hyperlink w:anchor="_Toc243582896" w:history="1">
+          <w:hyperlink w:anchor="_Toc243659379" w:history="1">
             <w:r>
               <w:rPr>
                 <w:rStyle w:val="Hyperlink"/>
@@ -910,7 +910,7 @@
               <w:rPr>
                 <w:noProof/>
               </w:rPr>
-              <w:instrText xml:space="preserve"> PAGEREF _Toc243582896 \h </w:instrText>
+              <w:instrText xml:space="preserve"> PAGEREF _Toc243659379 \h </w:instrText>
             </w:r>
             <w:r>
               <w:rPr>
@@ -952,7 +952,7 @@
               <w14:ligatures w14:val="standardContextual"/>
             </w:rPr>
           </w:pPr>
-          <w:hyperlink w:anchor="_Toc243582897" w:history="1">
+          <w:hyperlink w:anchor="_Toc243659380" w:history="1">
             <w:r>
               <w:rPr>
                 <w:rStyle w:val="Hyperlink"/>
@@ -976,7 +976,7 @@
               <w:rPr>
                 <w:noProof/>
               </w:rPr>
-              <w:instrText xml:space="preserve"> PAGEREF _Toc243582897 \h </w:instrText>
+              <w:instrText xml:space="preserve"> PAGEREF _Toc243659380 \h </w:instrText>
             </w:r>
             <w:r>
               <w:rPr>
@@ -1018,7 +1018,7 @@
               <w14:ligatures w14:val="standardContextual"/>
             </w:rPr>
           </w:pPr>
-          <w:hyperlink w:anchor="_Toc243582898" w:history="1">
+          <w:hyperlink w:anchor="_Toc243659381" w:history="1">
             <w:r>
               <w:rPr>
                 <w:rStyle w:val="Hyperlink"/>
@@ -1042,7 +1042,7 @@
               <w:rPr>
                 <w:noProof/>
               </w:rPr>
-              <w:instrText xml:space="preserve"> PAGEREF _Toc243582898 \h </w:instrText>
+              <w:instrText xml:space="preserve"> PAGEREF _Toc243659381 \h </w:instrText>
             </w:r>
             <w:r>
               <w:rPr>
@@ -1084,7 +1084,7 @@
               <w14:ligatures w14:val="standardContextual"/>
             </w:rPr>
           </w:pPr>
-          <w:hyperlink w:anchor="_Toc243582899" w:history="1">
+          <w:hyperlink w:anchor="_Toc243659382" w:history="1">
             <w:r>
               <w:rPr>
                 <w:rStyle w:val="Hyperlink"/>
@@ -1108,7 +1108,7 @@
               <w:rPr>
                 <w:noProof/>
               </w:rPr>
-              <w:instrText xml:space="preserve"> PAGEREF _Toc243582899 \h </w:instrText>
+              <w:instrText xml:space="preserve"> PAGEREF _Toc243659382 \h </w:instrText>
             </w:r>
             <w:r>
               <w:rPr>
@@ -1150,7 +1150,7 @@
               <w14:ligatures w14:val="standardContextual"/>
             </w:rPr>
           </w:pPr>
-          <w:hyperlink w:anchor="_Toc243582900" w:history="1">
+          <w:hyperlink w:anchor="_Toc243659383" w:history="1">
             <w:r>
               <w:rPr>
                 <w:rStyle w:val="Hyperlink"/>
@@ -1174,7 +1174,7 @@
               <w:rPr>
                 <w:noProof/>
               </w:rPr>
-              <w:instrText xml:space="preserve"> PAGEREF _Toc243582900 \h </w:instrText>
+              <w:instrText xml:space="preserve"> PAGEREF _Toc243659383 \h </w:instrText>
             </w:r>
             <w:r>
               <w:rPr>
@@ -1216,7 +1216,7 @@
               <w14:ligatures w14:val="standardContextual"/>
             </w:rPr>
           </w:pPr>
-          <w:hyperlink w:anchor="_Toc243582901" w:history="1">
+          <w:hyperlink w:anchor="_Toc243659384" w:history="1">
             <w:r>
               <w:rPr>
                 <w:rStyle w:val="Hyperlink"/>
@@ -1240,7 +1240,7 @@
               <w:rPr>
                 <w:noProof/>
               </w:rPr>
-              <w:instrText xml:space="preserve"> PAGEREF _Toc243582901 \h </w:instrText>
+              <w:instrText xml:space="preserve"> PAGEREF _Toc243659384 \h </w:instrText>
             </w:r>
             <w:r>
               <w:rPr>
@@ -1282,7 +1282,7 @@
               <w14:ligatures w14:val="standardContextual"/>
             </w:rPr>
           </w:pPr>
-          <w:hyperlink w:anchor="_Toc243582902" w:history="1">
+          <w:hyperlink w:anchor="_Toc243659385" w:history="1">
             <w:r>
               <w:rPr>
                 <w:rStyle w:val="Hyperlink"/>
@@ -1306,7 +1306,7 @@
               <w:rPr>
                 <w:noProof/>
               </w:rPr>
-              <w:instrText xml:space="preserve"> PAGEREF _Toc243582902 \h </w:instrText>
+              <w:instrText xml:space="preserve"> PAGEREF _Toc243659385 \h </w:instrText>
             </w:r>
             <w:r>
               <w:rPr>
@@ -1348,7 +1348,7 @@
               <w14:ligatures w14:val="standardContextual"/>
             </w:rPr>
           </w:pPr>
-          <w:hyperlink w:anchor="_Toc243582903" w:history="1">
+          <w:hyperlink w:anchor="_Toc243659386" w:history="1">
             <w:r>
               <w:rPr>
                 <w:rStyle w:val="Hyperlink"/>
@@ -1372,7 +1372,7 @@
               <w:rPr>
                 <w:noProof/>
               </w:rPr>
-              <w:instrText xml:space="preserve"> PAGEREF _Toc243582903 \h </w:instrText>
+              <w:instrText xml:space="preserve"> PAGEREF _Toc243659386 \h </w:instrText>
             </w:r>
             <w:r>
               <w:rPr>
@@ -1414,7 +1414,7 @@
               <w14:ligatures w14:val="standardContextual"/>
             </w:rPr>
           </w:pPr>
-          <w:hyperlink w:anchor="_Toc243582904" w:history="1">
+          <w:hyperlink w:anchor="_Toc243659387" w:history="1">
             <w:r>
               <w:rPr>
                 <w:rStyle w:val="Hyperlink"/>
@@ -1438,7 +1438,7 @@
               <w:rPr>
                 <w:noProof/>
               </w:rPr>
-              <w:instrText xml:space="preserve"> PAGEREF _Toc243582904 \h </w:instrText>
+              <w:instrText xml:space="preserve"> PAGEREF _Toc243659387 \h </w:instrText>
             </w:r>
             <w:r>
               <w:rPr>
@@ -1480,7 +1480,7 @@
               <w14:ligatures w14:val="standardContextual"/>
             </w:rPr>
           </w:pPr>
-          <w:hyperlink w:anchor="_Toc243582905" w:history="1">
+          <w:hyperlink w:anchor="_Toc243659388" w:history="1">
             <w:r>
               <w:rPr>
                 <w:rStyle w:val="Hyperlink"/>
@@ -1504,7 +1504,7 @@
               <w:rPr>
                 <w:noProof/>
               </w:rPr>
-              <w:instrText xml:space="preserve"> PAGEREF _Toc243582905 \h </w:instrText>
+              <w:instrText xml:space="preserve"> PAGEREF _Toc243659388 \h </w:instrText>
             </w:r>
             <w:r>
               <w:rPr>
@@ -1546,7 +1546,7 @@
               <w14:ligatures w14:val="standardContextual"/>
             </w:rPr>
           </w:pPr>
-          <w:hyperlink w:anchor="_Toc243582906" w:history="1">
+          <w:hyperlink w:anchor="_Toc243659389" w:history="1">
             <w:r>
               <w:rPr>
                 <w:rStyle w:val="Hyperlink"/>
@@ -1570,7 +1570,7 @@
               <w:rPr>
                 <w:noProof/>
               </w:rPr>
-              <w:instrText xml:space="preserve"> PAGEREF _Toc243582906 \h </w:instrText>
+              <w:instrText xml:space="preserve"> PAGEREF _Toc243659389 \h </w:instrText>
             </w:r>
             <w:r>
               <w:rPr>
@@ -1612,7 +1612,7 @@
               <w14:ligatures w14:val="standardContextual"/>
             </w:rPr>
           </w:pPr>
-          <w:hyperlink w:anchor="_Toc243582907" w:history="1">
+          <w:hyperlink w:anchor="_Toc243659390" w:history="1">
             <w:r>
               <w:rPr>
                 <w:rStyle w:val="Hyperlink"/>
@@ -1636,7 +1636,7 @@
               <w:rPr>
                 <w:noProof/>
               </w:rPr>
-              <w:instrText xml:space="preserve"> PAGEREF _Toc243582907 \h </w:instrText>
+              <w:instrText xml:space="preserve"> PAGEREF _Toc243659390 \h </w:instrText>
             </w:r>
             <w:r>
               <w:rPr>
@@ -1678,7 +1678,7 @@
               <w14:ligatures w14:val="standardContextual"/>
             </w:rPr>
           </w:pPr>
-          <w:hyperlink w:anchor="_Toc243582908" w:history="1">
+          <w:hyperlink w:anchor="_Toc243659391" w:history="1">
             <w:r>
               <w:rPr>
                 <w:rStyle w:val="Hyperlink"/>
@@ -1702,7 +1702,7 @@
               <w:rPr>
                 <w:noProof/>
               </w:rPr>
-              <w:instrText xml:space="preserve"> PAGEREF _Toc243582908 \h </w:instrText>
+              <w:instrText xml:space="preserve"> PAGEREF _Toc243659391 \h </w:instrText>
             </w:r>
             <w:r>
               <w:rPr>
@@ -1744,7 +1744,7 @@
               <w14:ligatures w14:val="standardContextual"/>
             </w:rPr>
           </w:pPr>
-          <w:hyperlink w:anchor="_Toc243582909" w:history="1">
+          <w:hyperlink w:anchor="_Toc243659392" w:history="1">
             <w:r>
               <w:rPr>
                 <w:rStyle w:val="Hyperlink"/>
@@ -1768,7 +1768,7 @@
               <w:rPr>
                 <w:noProof/>
               </w:rPr>
-              <w:instrText xml:space="preserve"> PAGEREF _Toc243582909 \h </w:instrText>
+              <w:instrText xml:space="preserve"> PAGEREF _Toc243659392 \h </w:instrText>
             </w:r>
             <w:r>
               <w:rPr>
@@ -1810,7 +1810,7 @@
               <w14:ligatures w14:val="standardContextual"/>
             </w:rPr>
           </w:pPr>
-          <w:hyperlink w:anchor="_Toc243582910" w:history="1">
+          <w:hyperlink w:anchor="_Toc243659393" w:history="1">
             <w:r>
               <w:rPr>
                 <w:rStyle w:val="Hyperlink"/>
@@ -1834,7 +1834,7 @@
               <w:rPr>
                 <w:noProof/>
               </w:rPr>
-              <w:instrText xml:space="preserve"> PAGEREF _Toc243582910 \h </w:instrText>
+              <w:instrText xml:space="preserve"> PAGEREF _Toc243659393 \h </w:instrText>
             </w:r>
             <w:r>
               <w:rPr>
@@ -1876,7 +1876,7 @@
               <w14:ligatures w14:val="standardContextual"/>
             </w:rPr>
           </w:pPr>
-          <w:hyperlink w:anchor="_Toc243582911" w:history="1">
+          <w:hyperlink w:anchor="_Toc243659394" w:history="1">
             <w:r>
               <w:rPr>
                 <w:rStyle w:val="Hyperlink"/>
@@ -1900,7 +1900,7 @@
               <w:rPr>
                 <w:noProof/>
               </w:rPr>
-              <w:instrText xml:space="preserve"> PAGEREF _Toc243582911 \h </w:instrText>
+              <w:instrText xml:space="preserve"> PAGEREF _Toc243659394 \h </w:instrText>
             </w:r>
             <w:r>
               <w:rPr>
@@ -1942,7 +1942,7 @@
               <w14:ligatures w14:val="standardContextual"/>
             </w:rPr>
           </w:pPr>
-          <w:hyperlink w:anchor="_Toc243582912" w:history="1">
+          <w:hyperlink w:anchor="_Toc243659395" w:history="1">
             <w:r>
               <w:rPr>
                 <w:rStyle w:val="Hyperlink"/>
@@ -1966,7 +1966,7 @@
               <w:rPr>
                 <w:noProof/>
               </w:rPr>
-              <w:instrText xml:space="preserve"> PAGEREF _Toc243582912 \h </w:instrText>
+              <w:instrText xml:space="preserve"> PAGEREF _Toc243659395 \h </w:instrText>
             </w:r>
             <w:r>
               <w:rPr>
@@ -2008,7 +2008,7 @@
               <w14:ligatures w14:val="standardContextual"/>
             </w:rPr>
           </w:pPr>
-          <w:hyperlink w:anchor="_Toc243582913" w:history="1">
+          <w:hyperlink w:anchor="_Toc243659396" w:history="1">
             <w:r>
               <w:rPr>
                 <w:rStyle w:val="Hyperlink"/>
@@ -2032,7 +2032,7 @@
               <w:rPr>
                 <w:noProof/>
               </w:rPr>
-              <w:instrText xml:space="preserve"> PAGEREF _Toc243582913 \h </w:instrText>
+              <w:instrText xml:space="preserve"> PAGEREF _Toc243659396 \h </w:instrText>
             </w:r>
             <w:r>
               <w:rPr>
@@ -2074,7 +2074,7 @@
               <w14:ligatures w14:val="standardContextual"/>
             </w:rPr>
           </w:pPr>
-          <w:hyperlink w:anchor="_Toc243582914" w:history="1">
+          <w:hyperlink w:anchor="_Toc243659397" w:history="1">
             <w:r>
               <w:rPr>
                 <w:rStyle w:val="Hyperlink"/>
@@ -2098,7 +2098,7 @@
               <w:rPr>
                 <w:noProof/>
               </w:rPr>
-              <w:instrText xml:space="preserve"> PAGEREF _Toc243582914 \h </w:instrText>
+              <w:instrText xml:space="preserve"> PAGEREF _Toc243659397 \h </w:instrText>
             </w:r>
             <w:r>
               <w:rPr>
@@ -2140,7 +2140,7 @@
               <w14:ligatures w14:val="standardContextual"/>
             </w:rPr>
           </w:pPr>
-          <w:hyperlink w:anchor="_Toc243582915" w:history="1">
+          <w:hyperlink w:anchor="_Toc243659398" w:history="1">
             <w:r>
               <w:rPr>
                 <w:rStyle w:val="Hyperlink"/>
@@ -2164,7 +2164,7 @@
               <w:rPr>
                 <w:noProof/>
               </w:rPr>
-              <w:instrText xml:space="preserve"> PAGEREF _Toc243582915 \h </w:instrText>
+              <w:instrText xml:space="preserve"> PAGEREF _Toc243659398 \h </w:instrText>
             </w:r>
             <w:r>
               <w:rPr>
@@ -2206,7 +2206,7 @@
               <w14:ligatures w14:val="standardContextual"/>
             </w:rPr>
           </w:pPr>
-          <w:hyperlink w:anchor="_Toc243582916" w:history="1">
+          <w:hyperlink w:anchor="_Toc243659399" w:history="1">
             <w:r>
               <w:rPr>
                 <w:rStyle w:val="Hyperlink"/>
@@ -2230,7 +2230,7 @@
               <w:rPr>
                 <w:noProof/>
               </w:rPr>
-              <w:instrText xml:space="preserve"> PAGEREF _Toc243582916 \h </w:instrText>
+              <w:instrText xml:space="preserve"> PAGEREF _Toc243659399 \h </w:instrText>
             </w:r>
             <w:r>
               <w:rPr>
@@ -2272,7 +2272,7 @@
               <w14:ligatures w14:val="standardContextual"/>
             </w:rPr>
           </w:pPr>
-          <w:hyperlink w:anchor="_Toc243582917" w:history="1">
+          <w:hyperlink w:anchor="_Toc243659400" w:history="1">
             <w:r>
               <w:rPr>
                 <w:rStyle w:val="Hyperlink"/>
@@ -2296,7 +2296,7 @@
               <w:rPr>
                 <w:noProof/>
               </w:rPr>
-              <w:instrText xml:space="preserve"> PAGEREF _Toc243582917 \h </w:instrText>
+              <w:instrText xml:space="preserve"> PAGEREF _Toc243659400 \h </w:instrText>
             </w:r>
             <w:r>
               <w:rPr>
@@ -2338,7 +2338,7 @@
               <w14:ligatures w14:val="standardContextual"/>
             </w:rPr>
           </w:pPr>
-          <w:hyperlink w:anchor="_Toc243582918" w:history="1">
+          <w:hyperlink w:anchor="_Toc243659401" w:history="1">
             <w:r>
               <w:rPr>
                 <w:rStyle w:val="Hyperlink"/>
@@ -2362,7 +2362,7 @@
               <w:rPr>
                 <w:noProof/>
               </w:rPr>
-              <w:instrText xml:space="preserve"> PAGEREF _Toc243582918 \h </w:instrText>
+              <w:instrText xml:space="preserve"> PAGEREF _Toc243659401 \h </w:instrText>
             </w:r>
             <w:r>
               <w:rPr>
@@ -2404,7 +2404,7 @@
               <w14:ligatures w14:val="standardContextual"/>
             </w:rPr>
           </w:pPr>
-          <w:hyperlink w:anchor="_Toc243582919" w:history="1">
+          <w:hyperlink w:anchor="_Toc243659402" w:history="1">
             <w:r>
               <w:rPr>
                 <w:rStyle w:val="Hyperlink"/>
@@ -2428,7 +2428,7 @@
               <w:rPr>
                 <w:noProof/>
               </w:rPr>
-              <w:instrText xml:space="preserve"> PAGEREF _Toc243582919 \h </w:instrText>
+              <w:instrText xml:space="preserve"> PAGEREF _Toc243659402 \h </w:instrText>
             </w:r>
             <w:r>
               <w:rPr>
@@ -2470,7 +2470,7 @@
               <w14:ligatures w14:val="standardContextual"/>
             </w:rPr>
           </w:pPr>
-          <w:hyperlink w:anchor="_Toc243582920" w:history="1">
+          <w:hyperlink w:anchor="_Toc243659403" w:history="1">
             <w:r>
               <w:rPr>
                 <w:rStyle w:val="Hyperlink"/>
@@ -2494,7 +2494,7 @@
               <w:rPr>
                 <w:noProof/>
               </w:rPr>
-              <w:instrText xml:space="preserve"> PAGEREF _Toc243582920 \h </w:instrText>
+              <w:instrText xml:space="preserve"> PAGEREF _Toc243659403 \h </w:instrText>
             </w:r>
             <w:r>
               <w:rPr>
@@ -2536,7 +2536,7 @@
               <w14:ligatures w14:val="standardContextual"/>
             </w:rPr>
           </w:pPr>
-          <w:hyperlink w:anchor="_Toc243582921" w:history="1">
+          <w:hyperlink w:anchor="_Toc243659404" w:history="1">
             <w:r>
               <w:rPr>
                 <w:rStyle w:val="Hyperlink"/>
@@ -2560,7 +2560,7 @@
               <w:rPr>
                 <w:noProof/>
               </w:rPr>
-              <w:instrText xml:space="preserve"> PAGEREF _Toc243582921 \h </w:instrText>
+              <w:instrText xml:space="preserve"> PAGEREF _Toc243659404 \h </w:instrText>
             </w:r>
             <w:r>
               <w:rPr>
@@ -2602,7 +2602,7 @@
               <w14:ligatures w14:val="standardContextual"/>
             </w:rPr>
           </w:pPr>
-          <w:hyperlink w:anchor="_Toc243582922" w:history="1">
+          <w:hyperlink w:anchor="_Toc243659405" w:history="1">
             <w:r>
               <w:rPr>
                 <w:rStyle w:val="Hyperlink"/>
@@ -2626,7 +2626,7 @@
               <w:rPr>
                 <w:noProof/>
               </w:rPr>
-              <w:instrText xml:space="preserve"> PAGEREF _Toc243582922 \h </w:instrText>
+              <w:instrText xml:space="preserve"> PAGEREF _Toc243659405 \h </w:instrText>
             </w:r>
             <w:r>
               <w:rPr>
@@ -2668,7 +2668,7 @@
               <w14:ligatures w14:val="standardContextual"/>
             </w:rPr>
           </w:pPr>
-          <w:hyperlink w:anchor="_Toc243582923" w:history="1">
+          <w:hyperlink w:anchor="_Toc243659406" w:history="1">
             <w:r>
               <w:rPr>
                 <w:rStyle w:val="Hyperlink"/>
@@ -2692,7 +2692,7 @@
               <w:rPr>
                 <w:noProof/>
               </w:rPr>
-              <w:instrText xml:space="preserve"> PAGEREF _Toc243582923 \h </w:instrText>
+              <w:instrText xml:space="preserve"> PAGEREF _Toc243659406 \h </w:instrText>
             </w:r>
             <w:r>
               <w:rPr>
@@ -2734,7 +2734,7 @@
               <w14:ligatures w14:val="standardContextual"/>
             </w:rPr>
           </w:pPr>
-          <w:hyperlink w:anchor="_Toc243582924" w:history="1">
+          <w:hyperlink w:anchor="_Toc243659407" w:history="1">
             <w:r>
               <w:rPr>
                 <w:rStyle w:val="Hyperlink"/>
@@ -2758,7 +2758,7 @@
               <w:rPr>
                 <w:noProof/>
               </w:rPr>
-              <w:instrText xml:space="preserve"> PAGEREF _Toc243582924 \h </w:instrText>
+              <w:instrText xml:space="preserve"> PAGEREF _Toc243659407 \h </w:instrText>
             </w:r>
             <w:r>
               <w:rPr>
@@ -2800,7 +2800,7 @@
               <w14:ligatures w14:val="standardContextual"/>
             </w:rPr>
           </w:pPr>
-          <w:hyperlink w:anchor="_Toc243582925" w:history="1">
+          <w:hyperlink w:anchor="_Toc243659408" w:history="1">
             <w:r>
               <w:rPr>
                 <w:rStyle w:val="Hyperlink"/>
@@ -2824,7 +2824,7 @@
               <w:rPr>
                 <w:noProof/>
               </w:rPr>
-              <w:instrText xml:space="preserve"> PAGEREF _Toc243582925 \h </w:instrText>
+              <w:instrText xml:space="preserve"> PAGEREF _Toc243659408 \h </w:instrText>
             </w:r>
             <w:r>
               <w:rPr>
@@ -2866,7 +2866,7 @@
               <w14:ligatures w14:val="standardContextual"/>
             </w:rPr>
           </w:pPr>
-          <w:hyperlink w:anchor="_Toc243582926" w:history="1">
+          <w:hyperlink w:anchor="_Toc243659409" w:history="1">
             <w:r>
               <w:rPr>
                 <w:rStyle w:val="Hyperlink"/>
@@ -2890,7 +2890,7 @@
               <w:rPr>
                 <w:noProof/>
               </w:rPr>
-              <w:instrText xml:space="preserve"> PAGEREF _Toc243582926 \h </w:instrText>
+              <w:instrText xml:space="preserve"> PAGEREF _Toc243659409 \h </w:instrText>
             </w:r>
             <w:r>
               <w:rPr>
@@ -2932,7 +2932,7 @@
               <w14:ligatures w14:val="standardContextual"/>
             </w:rPr>
           </w:pPr>
-          <w:hyperlink w:anchor="_Toc243582927" w:history="1">
+          <w:hyperlink w:anchor="_Toc243659410" w:history="1">
             <w:r>
               <w:rPr>
                 <w:rStyle w:val="Hyperlink"/>
@@ -2956,7 +2956,7 @@
               <w:rPr>
                 <w:noProof/>
               </w:rPr>
-              <w:instrText xml:space="preserve"> PAGEREF _Toc243582927 \h </w:instrText>
+              <w:instrText xml:space="preserve"> PAGEREF _Toc243659410 \h </w:instrText>
             </w:r>
             <w:r>
               <w:rPr>
@@ -2998,7 +2998,7 @@
               <w14:ligatures w14:val="standardContextual"/>
             </w:rPr>
           </w:pPr>
-          <w:hyperlink w:anchor="_Toc243582928" w:history="1">
+          <w:hyperlink w:anchor="_Toc243659411" w:history="1">
             <w:r>
               <w:rPr>
                 <w:rStyle w:val="Hyperlink"/>
@@ -3022,7 +3022,7 @@
               <w:rPr>
                 <w:noProof/>
               </w:rPr>
-              <w:instrText xml:space="preserve"> PAGEREF _Toc243582928 \h </w:instrText>
+              <w:instrText xml:space="preserve"> PAGEREF _Toc243659411 \h </w:instrText>
             </w:r>
             <w:r>
               <w:rPr>
@@ -3064,7 +3064,7 @@
               <w14:ligatures w14:val="standardContextual"/>
             </w:rPr>
           </w:pPr>
-          <w:hyperlink w:anchor="_Toc243582929" w:history="1">
+          <w:hyperlink w:anchor="_Toc243659412" w:history="1">
             <w:r>
               <w:rPr>
                 <w:rStyle w:val="Hyperlink"/>
@@ -3088,7 +3088,7 @@
               <w:rPr>
                 <w:noProof/>
               </w:rPr>
-              <w:instrText xml:space="preserve"> PAGEREF _Toc243582929 \h </w:instrText>
+              <w:instrText xml:space="preserve"> PAGEREF _Toc243659412 \h </w:instrText>
             </w:r>
             <w:r>
               <w:rPr>
@@ -3130,7 +3130,7 @@
               <w14:ligatures w14:val="standardContextual"/>
             </w:rPr>
           </w:pPr>
-          <w:hyperlink w:anchor="_Toc243582930" w:history="1">
+          <w:hyperlink w:anchor="_Toc243659413" w:history="1">
             <w:r>
               <w:rPr>
                 <w:rStyle w:val="Hyperlink"/>
@@ -3154,7 +3154,7 @@
               <w:rPr>
                 <w:noProof/>
               </w:rPr>
-              <w:instrText xml:space="preserve"> PAGEREF _Toc243582930 \h </w:instrText>
+              <w:instrText xml:space="preserve"> PAGEREF _Toc243659413 \h </w:instrText>
             </w:r>
             <w:r>
               <w:rPr>
@@ -3196,7 +3196,7 @@
               <w14:ligatures w14:val="standardContextual"/>
             </w:rPr>
           </w:pPr>
-          <w:hyperlink w:anchor="_Toc243582931" w:history="1">
+          <w:hyperlink w:anchor="_Toc243659414" w:history="1">
             <w:r>
               <w:rPr>
                 <w:rStyle w:val="Hyperlink"/>
@@ -3220,7 +3220,7 @@
               <w:rPr>
                 <w:noProof/>
               </w:rPr>
-              <w:instrText xml:space="preserve"> PAGEREF _Toc243582931 \h </w:instrText>
+              <w:instrText xml:space="preserve"> PAGEREF _Toc243659414 \h </w:instrText>
             </w:r>
             <w:r>
               <w:rPr>
@@ -3262,7 +3262,7 @@
               <w14:ligatures w14:val="standardContextual"/>
             </w:rPr>
           </w:pPr>
-          <w:hyperlink w:anchor="_Toc243582932" w:history="1">
+          <w:hyperlink w:anchor="_Toc243659415" w:history="1">
             <w:r>
               <w:rPr>
                 <w:rStyle w:val="Hyperlink"/>
@@ -3286,7 +3286,7 @@
               <w:rPr>
                 <w:noProof/>
               </w:rPr>
-              <w:instrText xml:space="preserve"> PAGEREF _Toc243582932 \h </w:instrText>
+              <w:instrText xml:space="preserve"> PAGEREF _Toc243659415 \h </w:instrText>
             </w:r>
             <w:r>
               <w:rPr>
@@ -3328,7 +3328,7 @@
               <w14:ligatures w14:val="standardContextual"/>
             </w:rPr>
           </w:pPr>
-          <w:hyperlink w:anchor="_Toc243582933" w:history="1">
+          <w:hyperlink w:anchor="_Toc243659416" w:history="1">
             <w:r>
               <w:rPr>
                 <w:rStyle w:val="Hyperlink"/>
@@ -3352,7 +3352,7 @@
               <w:rPr>
                 <w:noProof/>
               </w:rPr>
-              <w:instrText xml:space="preserve"> PAGEREF _Toc243582933 \h </w:instrText>
+              <w:instrText xml:space="preserve"> PAGEREF _Toc243659416 \h </w:instrText>
             </w:r>
             <w:r>
               <w:rPr>
@@ -3394,7 +3394,7 @@
               <w14:ligatures w14:val="standardContextual"/>
             </w:rPr>
           </w:pPr>
-          <w:hyperlink w:anchor="_Toc243582934" w:history="1">
+          <w:hyperlink w:anchor="_Toc243659417" w:history="1">
             <w:r>
               <w:rPr>
                 <w:rStyle w:val="Hyperlink"/>
@@ -3418,7 +3418,7 @@
               <w:rPr>
                 <w:noProof/>
               </w:rPr>
-              <w:instrText xml:space="preserve"> PAGEREF _Toc243582934 \h </w:instrText>
+              <w:instrText xml:space="preserve"> PAGEREF _Toc243659417 \h </w:instrText>
             </w:r>
             <w:r>
               <w:rPr>
@@ -3460,7 +3460,7 @@
               <w14:ligatures w14:val="standardContextual"/>
             </w:rPr>
           </w:pPr>
-          <w:hyperlink w:anchor="_Toc243582935" w:history="1">
+          <w:hyperlink w:anchor="_Toc243659418" w:history="1">
             <w:r>
               <w:rPr>
                 <w:rStyle w:val="Hyperlink"/>
@@ -3484,7 +3484,7 @@
               <w:rPr>
                 <w:noProof/>
               </w:rPr>
-              <w:instrText xml:space="preserve"> PAGEREF _Toc243582935 \h </w:instrText>
+              <w:instrText xml:space="preserve"> PAGEREF _Toc243659418 \h </w:instrText>
             </w:r>
             <w:r>
               <w:rPr>
@@ -3501,7 +3501,7 @@
               <w:rPr>
                 <w:noProof/>
               </w:rPr>
-              <w:t>26</w:t>
+              <w:t>27</w:t>
             </w:r>
             <w:r>
               <w:rPr>
@@ -3526,7 +3526,7 @@
               <w14:ligatures w14:val="standardContextual"/>
             </w:rPr>
           </w:pPr>
-          <w:hyperlink w:anchor="_Toc243582936" w:history="1">
+          <w:hyperlink w:anchor="_Toc243659419" w:history="1">
             <w:r>
               <w:rPr>
                 <w:rStyle w:val="Hyperlink"/>
@@ -3550,7 +3550,7 @@
               <w:rPr>
                 <w:noProof/>
               </w:rPr>
-              <w:instrText xml:space="preserve"> PAGEREF _Toc243582936 \h </w:instrText>
+              <w:instrText xml:space="preserve"> PAGEREF _Toc243659419 \h </w:instrText>
             </w:r>
             <w:r>
               <w:rPr>
@@ -3592,7 +3592,7 @@
               <w14:ligatures w14:val="standardContextual"/>
             </w:rPr>
           </w:pPr>
-          <w:hyperlink w:anchor="_Toc243582937" w:history="1">
+          <w:hyperlink w:anchor="_Toc243659420" w:history="1">
             <w:r>
               <w:rPr>
                 <w:rStyle w:val="Hyperlink"/>
@@ -3616,7 +3616,7 @@
               <w:rPr>
                 <w:noProof/>
               </w:rPr>
-              <w:instrText xml:space="preserve"> PAGEREF _Toc243582937 \h </w:instrText>
+              <w:instrText xml:space="preserve"> PAGEREF _Toc243659420 \h </w:instrText>
             </w:r>
             <w:r>
               <w:rPr>
@@ -3658,7 +3658,7 @@
               <w14:ligatures w14:val="standardContextual"/>
             </w:rPr>
           </w:pPr>
-          <w:hyperlink w:anchor="_Toc243582938" w:history="1">
+          <w:hyperlink w:anchor="_Toc243659421" w:history="1">
             <w:r>
               <w:rPr>
                 <w:rStyle w:val="Hyperlink"/>
@@ -3682,7 +3682,7 @@
               <w:rPr>
                 <w:noProof/>
               </w:rPr>
-              <w:instrText xml:space="preserve"> PAGEREF _Toc243582938 \h </w:instrText>
+              <w:instrText xml:space="preserve"> PAGEREF _Toc243659421 \h </w:instrText>
             </w:r>
             <w:r>
               <w:rPr>
@@ -3699,7 +3699,7 @@
               <w:rPr>
                 <w:noProof/>
               </w:rPr>
-              <w:t>28</w:t>
+              <w:t>29</w:t>
             </w:r>
             <w:r>
               <w:rPr>
@@ -3724,7 +3724,7 @@
               <w14:ligatures w14:val="standardContextual"/>
             </w:rPr>
           </w:pPr>
-          <w:hyperlink w:anchor="_Toc243582939" w:history="1">
+          <w:hyperlink w:anchor="_Toc243659422" w:history="1">
             <w:r>
               <w:rPr>
                 <w:rStyle w:val="Hyperlink"/>
@@ -3748,7 +3748,7 @@
               <w:rPr>
                 <w:noProof/>
               </w:rPr>
-              <w:instrText xml:space="preserve"> PAGEREF _Toc243582939 \h </w:instrText>
+              <w:instrText xml:space="preserve"> PAGEREF _Toc243659422 \h </w:instrText>
             </w:r>
             <w:r>
               <w:rPr>
@@ -3790,7 +3790,7 @@
               <w14:ligatures w14:val="standardContextual"/>
             </w:rPr>
           </w:pPr>
-          <w:hyperlink w:anchor="_Toc243582940" w:history="1">
+          <w:hyperlink w:anchor="_Toc243659423" w:history="1">
             <w:r>
               <w:rPr>
                 <w:rStyle w:val="Hyperlink"/>
@@ -3814,7 +3814,7 @@
               <w:rPr>
                 <w:noProof/>
               </w:rPr>
-              <w:instrText xml:space="preserve"> PAGEREF _Toc243582940 \h </w:instrText>
+              <w:instrText xml:space="preserve"> PAGEREF _Toc243659423 \h </w:instrText>
             </w:r>
             <w:r>
               <w:rPr>
@@ -3856,7 +3856,7 @@
               <w14:ligatures w14:val="standardContextual"/>
             </w:rPr>
           </w:pPr>
-          <w:hyperlink w:anchor="_Toc243582941" w:history="1">
+          <w:hyperlink w:anchor="_Toc243659424" w:history="1">
             <w:r>
               <w:rPr>
                 <w:rStyle w:val="Hyperlink"/>
@@ -3880,7 +3880,7 @@
               <w:rPr>
                 <w:noProof/>
               </w:rPr>
-              <w:instrText xml:space="preserve"> PAGEREF _Toc243582941 \h </w:instrText>
+              <w:instrText xml:space="preserve"> PAGEREF _Toc243659424 \h </w:instrText>
             </w:r>
             <w:r>
               <w:rPr>
@@ -3922,7 +3922,7 @@
               <w14:ligatures w14:val="standardContextual"/>
             </w:rPr>
           </w:pPr>
-          <w:hyperlink w:anchor="_Toc243582942" w:history="1">
+          <w:hyperlink w:anchor="_Toc243659425" w:history="1">
             <w:r>
               <w:rPr>
                 <w:rStyle w:val="Hyperlink"/>
@@ -3946,7 +3946,7 @@
               <w:rPr>
                 <w:noProof/>
               </w:rPr>
-              <w:instrText xml:space="preserve"> PAGEREF _Toc243582942 \h </w:instrText>
+              <w:instrText xml:space="preserve"> PAGEREF _Toc243659425 \h </w:instrText>
             </w:r>
             <w:r>
               <w:rPr>
@@ -3988,7 +3988,7 @@
               <w14:ligatures w14:val="standardContextual"/>
             </w:rPr>
           </w:pPr>
-          <w:hyperlink w:anchor="_Toc243582943" w:history="1">
+          <w:hyperlink w:anchor="_Toc243659426" w:history="1">
             <w:r>
               <w:rPr>
                 <w:rStyle w:val="Hyperlink"/>
@@ -4012,7 +4012,7 @@
               <w:rPr>
                 <w:noProof/>
               </w:rPr>
-              <w:instrText xml:space="preserve"> PAGEREF _Toc243582943 \h </w:instrText>
+              <w:instrText xml:space="preserve"> PAGEREF _Toc243659426 \h </w:instrText>
             </w:r>
             <w:r>
               <w:rPr>
@@ -4054,7 +4054,7 @@
               <w14:ligatures w14:val="standardContextual"/>
             </w:rPr>
           </w:pPr>
-          <w:hyperlink w:anchor="_Toc243582944" w:history="1">
+          <w:hyperlink w:anchor="_Toc243659427" w:history="1">
             <w:r>
               <w:rPr>
                 <w:rStyle w:val="Hyperlink"/>
@@ -4078,7 +4078,7 @@
               <w:rPr>
                 <w:noProof/>
               </w:rPr>
-              <w:instrText xml:space="preserve"> PAGEREF _Toc243582944 \h </w:instrText>
+              <w:instrText xml:space="preserve"> PAGEREF _Toc243659427 \h </w:instrText>
             </w:r>
             <w:r>
               <w:rPr>
@@ -4120,7 +4120,7 @@
               <w14:ligatures w14:val="standardContextual"/>
             </w:rPr>
           </w:pPr>
-          <w:hyperlink w:anchor="_Toc243582945" w:history="1">
+          <w:hyperlink w:anchor="_Toc243659428" w:history="1">
             <w:r>
               <w:rPr>
                 <w:rStyle w:val="Hyperlink"/>
@@ -4144,7 +4144,7 @@
               <w:rPr>
                 <w:noProof/>
               </w:rPr>
-              <w:instrText xml:space="preserve"> PAGEREF _Toc243582945 \h </w:instrText>
+              <w:instrText xml:space="preserve"> PAGEREF _Toc243659428 \h </w:instrText>
             </w:r>
             <w:r>
               <w:rPr>
@@ -4186,7 +4186,7 @@
               <w14:ligatures w14:val="standardContextual"/>
             </w:rPr>
           </w:pPr>
-          <w:hyperlink w:anchor="_Toc243582946" w:history="1">
+          <w:hyperlink w:anchor="_Toc243659429" w:history="1">
             <w:r>
               <w:rPr>
                 <w:rStyle w:val="Hyperlink"/>
@@ -4210,7 +4210,7 @@
               <w:rPr>
                 <w:noProof/>
               </w:rPr>
-              <w:instrText xml:space="preserve"> PAGEREF _Toc243582946 \h </w:instrText>
+              <w:instrText xml:space="preserve"> PAGEREF _Toc243659429 \h </w:instrText>
             </w:r>
             <w:r>
               <w:rPr>
@@ -4252,7 +4252,7 @@
               <w14:ligatures w14:val="standardContextual"/>
             </w:rPr>
           </w:pPr>
-          <w:hyperlink w:anchor="_Toc243582947" w:history="1">
+          <w:hyperlink w:anchor="_Toc243659430" w:history="1">
             <w:r>
               <w:rPr>
                 <w:rStyle w:val="Hyperlink"/>
@@ -4276,7 +4276,7 @@
               <w:rPr>
                 <w:noProof/>
               </w:rPr>
-              <w:instrText xml:space="preserve"> PAGEREF _Toc243582947 \h </w:instrText>
+              <w:instrText xml:space="preserve"> PAGEREF _Toc243659430 \h </w:instrText>
             </w:r>
             <w:r>
               <w:rPr>
@@ -4318,7 +4318,7 @@
               <w14:ligatures w14:val="standardContextual"/>
             </w:rPr>
           </w:pPr>
-          <w:hyperlink w:anchor="_Toc243582948" w:history="1">
+          <w:hyperlink w:anchor="_Toc243659431" w:history="1">
             <w:r>
               <w:rPr>
                 <w:rStyle w:val="Hyperlink"/>
@@ -4342,7 +4342,7 @@
               <w:rPr>
                 <w:noProof/>
               </w:rPr>
-              <w:instrText xml:space="preserve"> PAGEREF _Toc243582948 \h </w:instrText>
+              <w:instrText xml:space="preserve"> PAGEREF _Toc243659431 \h </w:instrText>
             </w:r>
             <w:r>
               <w:rPr>
@@ -4384,7 +4384,7 @@
               <w14:ligatures w14:val="standardContextual"/>
             </w:rPr>
           </w:pPr>
-          <w:hyperlink w:anchor="_Toc243582949" w:history="1">
+          <w:hyperlink w:anchor="_Toc243659432" w:history="1">
             <w:r>
               <w:rPr>
                 <w:rStyle w:val="Hyperlink"/>
@@ -4408,7 +4408,7 @@
               <w:rPr>
                 <w:noProof/>
               </w:rPr>
-              <w:instrText xml:space="preserve"> PAGEREF _Toc243582949 \h </w:instrText>
+              <w:instrText xml:space="preserve"> PAGEREF _Toc243659432 \h </w:instrText>
             </w:r>
             <w:r>
               <w:rPr>
@@ -4425,7 +4425,7 @@
               <w:rPr>
                 <w:noProof/>
               </w:rPr>
-              <w:t>39</w:t>
+              <w:t>40</w:t>
             </w:r>
             <w:r>
               <w:rPr>
@@ -4450,7 +4450,7 @@
               <w14:ligatures w14:val="standardContextual"/>
             </w:rPr>
           </w:pPr>
-          <w:hyperlink w:anchor="_Toc243582950" w:history="1">
+          <w:hyperlink w:anchor="_Toc243659433" w:history="1">
             <w:r>
               <w:rPr>
                 <w:rStyle w:val="Hyperlink"/>
@@ -4474,7 +4474,7 @@
               <w:rPr>
                 <w:noProof/>
               </w:rPr>
-              <w:instrText xml:space="preserve"> PAGEREF _Toc243582950 \h </w:instrText>
+              <w:instrText xml:space="preserve"> PAGEREF _Toc243659433 \h </w:instrText>
             </w:r>
             <w:r>
               <w:rPr>
@@ -4516,7 +4516,7 @@
               <w14:ligatures w14:val="standardContextual"/>
             </w:rPr>
           </w:pPr>
-          <w:hyperlink w:anchor="_Toc243582951" w:history="1">
+          <w:hyperlink w:anchor="_Toc243659434" w:history="1">
             <w:r>
               <w:rPr>
                 <w:rStyle w:val="Hyperlink"/>
@@ -4540,7 +4540,7 @@
               <w:rPr>
                 <w:noProof/>
               </w:rPr>
-              <w:instrText xml:space="preserve"> PAGEREF _Toc243582951 \h </w:instrText>
+              <w:instrText xml:space="preserve"> PAGEREF _Toc243659434 \h </w:instrText>
             </w:r>
             <w:r>
               <w:rPr>
@@ -4582,7 +4582,7 @@
               <w14:ligatures w14:val="standardContextual"/>
             </w:rPr>
           </w:pPr>
-          <w:hyperlink w:anchor="_Toc243582952" w:history="1">
+          <w:hyperlink w:anchor="_Toc243659435" w:history="1">
             <w:r>
               <w:rPr>
                 <w:rStyle w:val="Hyperlink"/>
@@ -4606,7 +4606,7 @@
               <w:rPr>
                 <w:noProof/>
               </w:rPr>
-              <w:instrText xml:space="preserve"> PAGEREF _Toc243582952 \h </w:instrText>
+              <w:instrText xml:space="preserve"> PAGEREF _Toc243659435 \h </w:instrText>
             </w:r>
             <w:r>
               <w:rPr>
@@ -4623,7 +4623,7 @@
               <w:rPr>
                 <w:noProof/>
               </w:rPr>
-              <w:t>41</w:t>
+              <w:t>42</w:t>
             </w:r>
             <w:r>
               <w:rPr>
@@ -4648,7 +4648,7 @@
               <w14:ligatures w14:val="standardContextual"/>
             </w:rPr>
           </w:pPr>
-          <w:hyperlink w:anchor="_Toc243582953" w:history="1">
+          <w:hyperlink w:anchor="_Toc243659436" w:history="1">
             <w:r>
               <w:rPr>
                 <w:rStyle w:val="Hyperlink"/>
@@ -4672,7 +4672,7 @@
               <w:rPr>
                 <w:noProof/>
               </w:rPr>
-              <w:instrText xml:space="preserve"> PAGEREF _Toc243582953 \h </w:instrText>
+              <w:instrText xml:space="preserve"> PAGEREF _Toc243659436 \h </w:instrText>
             </w:r>
             <w:r>
               <w:rPr>
@@ -4714,7 +4714,7 @@
               <w14:ligatures w14:val="standardContextual"/>
             </w:rPr>
           </w:pPr>
-          <w:hyperlink w:anchor="_Toc243582954" w:history="1">
+          <w:hyperlink w:anchor="_Toc243659437" w:history="1">
             <w:r>
               <w:rPr>
                 <w:rStyle w:val="Hyperlink"/>
@@ -4738,7 +4738,7 @@
               <w:rPr>
                 <w:noProof/>
               </w:rPr>
-              <w:instrText xml:space="preserve"> PAGEREF _Toc243582954 \h </w:instrText>
+              <w:instrText xml:space="preserve"> PAGEREF _Toc243659437 \h </w:instrText>
             </w:r>
             <w:r>
               <w:rPr>
@@ -4780,7 +4780,7 @@
               <w14:ligatures w14:val="standardContextual"/>
             </w:rPr>
           </w:pPr>
-          <w:hyperlink w:anchor="_Toc243582955" w:history="1">
+          <w:hyperlink w:anchor="_Toc243659438" w:history="1">
             <w:r>
               <w:rPr>
                 <w:rStyle w:val="Hyperlink"/>
@@ -4804,7 +4804,7 @@
               <w:rPr>
                 <w:noProof/>
               </w:rPr>
-              <w:instrText xml:space="preserve"> PAGEREF _Toc243582955 \h </w:instrText>
+              <w:instrText xml:space="preserve"> PAGEREF _Toc243659438 \h </w:instrText>
             </w:r>
             <w:r>
               <w:rPr>
@@ -4846,7 +4846,7 @@
               <w14:ligatures w14:val="standardContextual"/>
             </w:rPr>
           </w:pPr>
-          <w:hyperlink w:anchor="_Toc243582956" w:history="1">
+          <w:hyperlink w:anchor="_Toc243659439" w:history="1">
             <w:r>
               <w:rPr>
                 <w:rStyle w:val="Hyperlink"/>
@@ -4870,7 +4870,7 @@
               <w:rPr>
                 <w:noProof/>
               </w:rPr>
-              <w:instrText xml:space="preserve"> PAGEREF _Toc243582956 \h </w:instrText>
+              <w:instrText xml:space="preserve"> PAGEREF _Toc243659439 \h </w:instrText>
             </w:r>
             <w:r>
               <w:rPr>
@@ -4887,7 +4887,7 @@
               <w:rPr>
                 <w:noProof/>
               </w:rPr>
-              <w:t>43</w:t>
+              <w:t>44</w:t>
             </w:r>
             <w:r>
               <w:rPr>
@@ -4912,7 +4912,7 @@
               <w14:ligatures w14:val="standardContextual"/>
             </w:rPr>
           </w:pPr>
-          <w:hyperlink w:anchor="_Toc243582957" w:history="1">
+          <w:hyperlink w:anchor="_Toc243659440" w:history="1">
             <w:r>
               <w:rPr>
                 <w:rStyle w:val="Hyperlink"/>
@@ -4936,7 +4936,7 @@
               <w:rPr>
                 <w:noProof/>
               </w:rPr>
-              <w:instrText xml:space="preserve"> PAGEREF _Toc243582957 \h </w:instrText>
+              <w:instrText xml:space="preserve"> PAGEREF _Toc243659440 \h </w:instrText>
             </w:r>
             <w:r>
               <w:rPr>
@@ -4978,7 +4978,7 @@
               <w14:ligatures w14:val="standardContextual"/>
             </w:rPr>
           </w:pPr>
-          <w:hyperlink w:anchor="_Toc243582958" w:history="1">
+          <w:hyperlink w:anchor="_Toc243659441" w:history="1">
             <w:r>
               <w:rPr>
                 <w:rStyle w:val="Hyperlink"/>
@@ -5002,7 +5002,7 @@
               <w:rPr>
                 <w:noProof/>
               </w:rPr>
-              <w:instrText xml:space="preserve"> PAGEREF _Toc243582958 \h </w:instrText>
+              <w:instrText xml:space="preserve"> PAGEREF _Toc243659441 \h </w:instrText>
             </w:r>
             <w:r>
               <w:rPr>
@@ -5044,7 +5044,7 @@
               <w14:ligatures w14:val="standardContextual"/>
             </w:rPr>
           </w:pPr>
-          <w:hyperlink w:anchor="_Toc243582959" w:history="1">
+          <w:hyperlink w:anchor="_Toc243659442" w:history="1">
             <w:r>
               <w:rPr>
                 <w:rStyle w:val="Hyperlink"/>
@@ -5068,7 +5068,7 @@
               <w:rPr>
                 <w:noProof/>
               </w:rPr>
-              <w:instrText xml:space="preserve"> PAGEREF _Toc243582959 \h </w:instrText>
+              <w:instrText xml:space="preserve"> PAGEREF _Toc243659442 \h </w:instrText>
             </w:r>
             <w:r>
               <w:rPr>
@@ -5110,7 +5110,7 @@
               <w14:ligatures w14:val="standardContextual"/>
             </w:rPr>
           </w:pPr>
-          <w:hyperlink w:anchor="_Toc243582960" w:history="1">
+          <w:hyperlink w:anchor="_Toc243659443" w:history="1">
             <w:r>
               <w:rPr>
                 <w:rStyle w:val="Hyperlink"/>
@@ -5134,7 +5134,7 @@
               <w:rPr>
                 <w:noProof/>
               </w:rPr>
-              <w:instrText xml:space="preserve"> PAGEREF _Toc243582960 \h </w:instrText>
+              <w:instrText xml:space="preserve"> PAGEREF _Toc243659443 \h </w:instrText>
             </w:r>
             <w:r>
               <w:rPr>
@@ -5178,7 +5178,7 @@
         <w:pStyle w:val="Heading1"/>
       </w:pPr>
       <w:bookmarkStart w:id="0" w:name="_Toc97008001"/>
-      <w:bookmarkStart w:id="1" w:name="_Toc243582885"/>
+      <w:bookmarkStart w:id="1" w:name="_Toc243659368"/>
       <w:r>
         <w:lastRenderedPageBreak/>
         <w:t>What Changed from the 7th Version</w:t>
@@ -5788,7 +5788,7 @@
                 <w:sz w:val="19"/>
                 <w:szCs w:val="19"/>
               </w:rPr>
-              <w:t>34 migrations (0032, 0033 and 0034 are new) and 2,635 tests. The changes up to 0033 were mutation-tested, and the full suite was run ten times in a row, clean, after each. The every-country change (0034) was checked with one full run and in the browser; it has not been mutation-tested or run ten times yet.</w:t>
+              <w:t>34 migrations (0032, 0033 and 0034 are new) and 2,635 tests. Every change, the every-country change (0034) included, was mutation-tested, and the full suite was run ten times in a row, clean, after each.</w:t>
             </w:r>
           </w:p>
         </w:tc>
@@ -5861,7 +5861,7 @@
         <w:pStyle w:val="Heading1"/>
       </w:pPr>
       <w:bookmarkStart w:id="2" w:name="_Toc96007001"/>
-      <w:bookmarkStart w:id="3" w:name="_Toc243582886"/>
+      <w:bookmarkStart w:id="3" w:name="_Toc243659369"/>
       <w:r>
         <w:t>What Changed from the 6th Version</w:t>
       </w:r>
@@ -6316,7 +6316,7 @@
         <w:pStyle w:val="Heading1"/>
       </w:pPr>
       <w:bookmarkStart w:id="4" w:name="_Toc96005001"/>
-      <w:bookmarkStart w:id="5" w:name="_Toc243582887"/>
+      <w:bookmarkStart w:id="5" w:name="_Toc243659370"/>
       <w:r>
         <w:t>What Changed from the 5th Version</w:t>
       </w:r>
@@ -6941,7 +6941,7 @@
       <w:pPr>
         <w:pStyle w:val="Heading1"/>
       </w:pPr>
-      <w:bookmarkStart w:id="6" w:name="_Toc243582888"/>
+      <w:bookmarkStart w:id="6" w:name="_Toc243659371"/>
       <w:r>
         <w:t>What Changed from the 2nd Version</w:t>
       </w:r>
@@ -7536,7 +7536,7 @@
         <w:pStyle w:val="Heading1"/>
       </w:pPr>
       <w:bookmarkStart w:id="7" w:name="_Toc90001001"/>
-      <w:bookmarkStart w:id="8" w:name="_Toc243582889"/>
+      <w:bookmarkStart w:id="8" w:name="_Toc243659372"/>
       <w:r>
         <w:t>What Changed from the 3rd Version</w:t>
       </w:r>
@@ -8230,7 +8230,7 @@
       <w:pPr>
         <w:pStyle w:val="Heading1"/>
       </w:pPr>
-      <w:bookmarkStart w:id="9" w:name="_Toc243582890"/>
+      <w:bookmarkStart w:id="9" w:name="_Toc243659373"/>
       <w:r>
         <w:t>1. Overview and Scope</w:t>
       </w:r>
@@ -8240,7 +8240,7 @@
       <w:pPr>
         <w:pStyle w:val="Heading2"/>
       </w:pPr>
-      <w:bookmarkStart w:id="10" w:name="_Toc243582891"/>
+      <w:bookmarkStart w:id="10" w:name="_Toc243659374"/>
       <w:r>
         <w:t>1.1 Target Businesses</w:t>
       </w:r>
@@ -8330,7 +8330,7 @@
       <w:pPr>
         <w:pStyle w:val="Heading2"/>
       </w:pPr>
-      <w:bookmarkStart w:id="11" w:name="_Toc243582892"/>
+      <w:bookmarkStart w:id="11" w:name="_Toc243659375"/>
       <w:r>
         <w:t>1.2 References</w:t>
       </w:r>
@@ -8385,7 +8385,7 @@
       <w:pPr>
         <w:pStyle w:val="Heading2"/>
       </w:pPr>
-      <w:bookmarkStart w:id="12" w:name="_Toc243582893"/>
+      <w:bookmarkStart w:id="12" w:name="_Toc243659376"/>
       <w:r>
         <w:t>1.3 Product Model</w:t>
       </w:r>
@@ -8482,7 +8482,7 @@
       <w:pPr>
         <w:pStyle w:val="Heading1"/>
       </w:pPr>
-      <w:bookmarkStart w:id="13" w:name="_Toc243582894"/>
+      <w:bookmarkStart w:id="13" w:name="_Toc243659377"/>
       <w:r>
         <w:t>2. System Architecture</w:t>
       </w:r>
@@ -8564,7 +8564,7 @@
       <w:pPr>
         <w:pStyle w:val="Heading2"/>
       </w:pPr>
-      <w:bookmarkStart w:id="14" w:name="_Toc243582895"/>
+      <w:bookmarkStart w:id="14" w:name="_Toc243659378"/>
       <w:r>
         <w:t>2.1 Where Each Language Is Used</w:t>
       </w:r>
@@ -9094,7 +9094,7 @@
       <w:pPr>
         <w:pStyle w:val="Heading2"/>
       </w:pPr>
-      <w:bookmarkStart w:id="15" w:name="_Toc243582896"/>
+      <w:bookmarkStart w:id="15" w:name="_Toc243659379"/>
       <w:r>
         <w:t>2.2 Microservice Boundaries</w:t>
       </w:r>
@@ -9880,7 +9880,7 @@
       <w:pPr>
         <w:pStyle w:val="Heading2"/>
       </w:pPr>
-      <w:bookmarkStart w:id="16" w:name="_Toc243582897"/>
+      <w:bookmarkStart w:id="16" w:name="_Toc243659380"/>
       <w:r>
         <w:t>2.3 Communication</w:t>
       </w:r>
@@ -10178,7 +10178,7 @@
       <w:pPr>
         <w:pStyle w:val="Heading1"/>
       </w:pPr>
-      <w:bookmarkStart w:id="17" w:name="_Toc243582898"/>
+      <w:bookmarkStart w:id="17" w:name="_Toc243659381"/>
       <w:r>
         <w:t>3. Technology Stack</w:t>
       </w:r>
@@ -11119,7 +11119,7 @@
       <w:pPr>
         <w:pStyle w:val="Heading1"/>
       </w:pPr>
-      <w:bookmarkStart w:id="18" w:name="_Toc243582899"/>
+      <w:bookmarkStart w:id="18" w:name="_Toc243659382"/>
       <w:r>
         <w:t>4. WordPress Plugin and Headless Integration</w:t>
       </w:r>
@@ -11129,7 +11129,7 @@
       <w:pPr>
         <w:pStyle w:val="Heading2"/>
       </w:pPr>
-      <w:bookmarkStart w:id="19" w:name="_Toc243582900"/>
+      <w:bookmarkStart w:id="19" w:name="_Toc243659383"/>
       <w:r>
         <w:t>4.1 Plugin Responsibilities</w:t>
       </w:r>
@@ -11228,7 +11228,7 @@
       <w:pPr>
         <w:pStyle w:val="Heading2"/>
       </w:pPr>
-      <w:bookmarkStart w:id="20" w:name="_Toc243582901"/>
+      <w:bookmarkStart w:id="20" w:name="_Toc243659384"/>
       <w:r>
         <w:t>4.2 Headless Clients</w:t>
       </w:r>
@@ -11277,7 +11277,7 @@
       <w:pPr>
         <w:pStyle w:val="Heading2"/>
       </w:pPr>
-      <w:bookmarkStart w:id="21" w:name="_Toc243582902"/>
+      <w:bookmarkStart w:id="21" w:name="_Toc243659385"/>
       <w:r>
         <w:t>4.3 Roles</w:t>
       </w:r>
@@ -12180,7 +12180,7 @@
       <w:pPr>
         <w:pStyle w:val="Heading1"/>
       </w:pPr>
-      <w:bookmarkStart w:id="22" w:name="_Toc243582903"/>
+      <w:bookmarkStart w:id="22" w:name="_Toc243659386"/>
       <w:r>
         <w:t>5. Global Entities and Policies (All Business Types)</w:t>
       </w:r>
@@ -12190,7 +12190,7 @@
       <w:pPr>
         <w:pStyle w:val="Heading2"/>
       </w:pPr>
-      <w:bookmarkStart w:id="23" w:name="_Toc243582904"/>
+      <w:bookmarkStart w:id="23" w:name="_Toc243659387"/>
       <w:r>
         <w:t>5.1 Entities</w:t>
       </w:r>
@@ -12351,7 +12351,7 @@
       <w:pPr>
         <w:pStyle w:val="Heading2"/>
       </w:pPr>
-      <w:bookmarkStart w:id="24" w:name="_Toc243582905"/>
+      <w:bookmarkStart w:id="24" w:name="_Toc243659388"/>
       <w:r>
         <w:t>5.2 Data Entry / Activity</w:t>
       </w:r>
@@ -12421,7 +12421,7 @@
       <w:pPr>
         <w:pStyle w:val="Heading2"/>
       </w:pPr>
-      <w:bookmarkStart w:id="25" w:name="_Toc243582906"/>
+      <w:bookmarkStart w:id="25" w:name="_Toc243659389"/>
       <w:r>
         <w:t>5.3 Business Logic</w:t>
       </w:r>
@@ -13813,10 +13813,7 @@
         <w:t>How the time is worked out:</w:t>
       </w:r>
       <w:r>
-        <w:t xml:space="preserve"> a business's clock is its IANA time zone (tenants.timezone), read with Python's zoneinfo and tzdata, which carry every country's daylight-saving rules. The country only limits which zones may be chosen. A country with one zone gets it; a country with several gets a default (the zone of its main city, for example America/New_York, America/Toronto, America/Sao_Paulo, Europe/Moscow) and the owner can pick another of that country's zones. All interval maths stays in UTC, as in the 6th-Version block above. The </w:t>
-      </w:r>
-      <w:r>
-        <w:t>sign-up page guesses the country and zone from the browser's time zone; the owner can change both.</w:t>
+        <w:t xml:space="preserve"> a business's clock is its IANA time zone (tenants.timezone), read with Python's zoneinfo and tzdata, which carry every country's daylight-saving rules. The country only limits which zones may be chosen. A country with one zone gets it; a country with several gets a default (the zone of its main city, for example America/New_York, America/Toronto, America/Sao_Paulo, Europe/Moscow) and the owner can pick another of that country's zones. All interval maths stays in UTC, as in the 6th-Version block above. The sign-up page guesses the country and zone from the browser's time zone; the owner can change both.</w:t>
       </w:r>
     </w:p>
     <w:p>
@@ -14616,10 +14613,7 @@
         <w:t>Verified:</w:t>
       </w:r>
       <w:r>
-        <w:t xml:space="preserve"> the full suite once (2,634 passed; the one failure was an older test that expected New Zealand to be refused, now changed to an unknown code, and that file passes); mypy clean. A United States business was signed up on the local test site from start to finish: it was stored as US, USD and America/Los_Angeles with the address written as above, and its prices showed "$45". Not done yet: mutation testing, ten full runs in a row, and an upgrade and downgrade round trip of 0034 (it was upgraded on the local tes</w:t>
-      </w:r>
-      <w:r>
-        <w:t>t site's database).</w:t>
+        <w:t xml:space="preserve"> the full suite once (2,634 passed; the one failure was an older test that expected New Zealand to be refused, now changed to an unknown code, and that file passes); mypy clean. A United States business was signed up on the local test site from start to finish: it was stored as US, USD and America/Los_Angeles with the address written as above, and its prices showed "$45". Verified since (2026-10-23): an upgrade and downgrade round trip of 0034, the downgrade refusing while a United States business or a long state existed; 33 mutants, 29 caught at first, the gaps closed by new checks (spaces in a region made single, the database itself refusing "nz" and "N", a region of 100 characters kept as written) and the rest equivalent; and ten full runs in a row, clean (2,635 tests each).</w:t>
       </w:r>
     </w:p>
     <w:p>
@@ -14756,6 +14750,7 @@
           <w:b/>
           <w:bCs/>
         </w:rPr>
+        <w:lastRenderedPageBreak/>
         <w:t>Decision (2026-10-21):</w:t>
       </w:r>
       <w:r>
@@ -14780,7 +14775,6 @@
           <w:b/>
           <w:bCs/>
         </w:rPr>
-        <w:lastRenderedPageBreak/>
         <w:t>Required settings cannot be emptied:</w:t>
       </w:r>
       <w:r>
@@ -14815,7 +14809,7 @@
       <w:pPr>
         <w:pStyle w:val="Heading1"/>
       </w:pPr>
-      <w:bookmarkStart w:id="26" w:name="_Toc243582907"/>
+      <w:bookmarkStart w:id="26" w:name="_Toc243659390"/>
       <w:r>
         <w:t>6. Unified Resource Model</w:t>
       </w:r>
@@ -15363,7 +15357,7 @@
       <w:pPr>
         <w:pStyle w:val="Heading1"/>
       </w:pPr>
-      <w:bookmarkStart w:id="27" w:name="_Toc243582908"/>
+      <w:bookmarkStart w:id="27" w:name="_Toc243659391"/>
       <w:r>
         <w:t>7. Restaurant</w:t>
       </w:r>
@@ -15373,7 +15367,7 @@
       <w:pPr>
         <w:pStyle w:val="Heading2"/>
       </w:pPr>
-      <w:bookmarkStart w:id="28" w:name="_Toc243582909"/>
+      <w:bookmarkStart w:id="28" w:name="_Toc243659392"/>
       <w:r>
         <w:t>7.1 Entities</w:t>
       </w:r>
@@ -15523,7 +15517,7 @@
       <w:pPr>
         <w:pStyle w:val="Heading2"/>
       </w:pPr>
-      <w:bookmarkStart w:id="29" w:name="_Toc243582910"/>
+      <w:bookmarkStart w:id="29" w:name="_Toc243659393"/>
       <w:r>
         <w:t>7.2 Activity</w:t>
       </w:r>
@@ -15604,6 +15598,7 @@
         <w:spacing w:after="60"/>
       </w:pPr>
       <w:r>
+        <w:lastRenderedPageBreak/>
         <w:t>The restaurant approves or rejects pending reservations, cancels confirmed ones, or marks them completed or no-show.</w:t>
       </w:r>
     </w:p>
@@ -15630,7 +15625,6 @@
         <w:spacing w:after="60"/>
       </w:pPr>
       <w:r>
-        <w:lastRenderedPageBreak/>
         <w:t>Customers booking a VIP table see the minimum spend and must agree before submitting.</w:t>
       </w:r>
     </w:p>
@@ -15677,7 +15671,7 @@
       <w:pPr>
         <w:pStyle w:val="Heading2"/>
       </w:pPr>
-      <w:bookmarkStart w:id="30" w:name="_Toc243582911"/>
+      <w:bookmarkStart w:id="30" w:name="_Toc243659394"/>
       <w:r>
         <w:t>7.3 Business Logic</w:t>
       </w:r>
@@ -16088,7 +16082,11 @@
         <w:t>The fix:</w:t>
       </w:r>
       <w:r>
-        <w:t xml:space="preserve"> POST /v1/public/bookings and both reschedule calls (customer and admin) take an optional accepted_minimum_spend, the amount shown (zero or more). A table that needs more is refused with 422 minimum_spend_not_accepted, carrying the new amount in minimum_spend and the accepted one in accepted_minimum_spend, so the page can ask again. A cheaper table is fine. When a booking is moved, the amount already agreed needs no new consent.</w:t>
+        <w:t xml:space="preserve"> POST /v1/public/bookings and both reschedule calls (customer and admin) take an optional accepted_minimum_spend, the amount shown (zero or more). A table that needs more is refused with 422 minimum_spend_not_accepted, carrying the new amount in minimum_spend and the accepted one </w:t>
+      </w:r>
+      <w:r>
+        <w:lastRenderedPageBreak/>
+        <w:t>in accepted_minimum_spend, so the page can ask again. A cheaper table is fine. When a booking is moved, the amount already agreed needs no new consent.</w:t>
       </w:r>
     </w:p>
     <w:p>
@@ -16133,7 +16131,6 @@
           <w:b/>
           <w:bCs/>
         </w:rPr>
-        <w:lastRenderedPageBreak/>
         <w:t>Verified:</w:t>
       </w:r>
       <w:r>
@@ -16144,7 +16141,7 @@
       <w:pPr>
         <w:pStyle w:val="Heading1"/>
       </w:pPr>
-      <w:bookmarkStart w:id="31" w:name="_Toc243582912"/>
+      <w:bookmarkStart w:id="31" w:name="_Toc243659395"/>
       <w:r>
         <w:t>8. Spa / Clinic</w:t>
       </w:r>
@@ -16154,7 +16151,7 @@
       <w:pPr>
         <w:pStyle w:val="Heading2"/>
       </w:pPr>
-      <w:bookmarkStart w:id="32" w:name="_Toc243582913"/>
+      <w:bookmarkStart w:id="32" w:name="_Toc243659396"/>
       <w:r>
         <w:t>8.1 Entities</w:t>
       </w:r>
@@ -16324,7 +16321,7 @@
       <w:pPr>
         <w:pStyle w:val="Heading2"/>
       </w:pPr>
-      <w:bookmarkStart w:id="33" w:name="_Toc243582914"/>
+      <w:bookmarkStart w:id="33" w:name="_Toc243659397"/>
       <w:r>
         <w:t>8.2 Activity</w:t>
       </w:r>
@@ -16406,7 +16403,7 @@
       <w:pPr>
         <w:pStyle w:val="Heading2"/>
       </w:pPr>
-      <w:bookmarkStart w:id="34" w:name="_Toc243582915"/>
+      <w:bookmarkStart w:id="34" w:name="_Toc243659398"/>
       <w:r>
         <w:t>8.3 Business Logic</w:t>
       </w:r>
@@ -16589,6 +16586,7 @@
           <w:b/>
           <w:bCs/>
         </w:rPr>
+        <w:lastRenderedPageBreak/>
         <w:t>Health notes:</w:t>
       </w:r>
       <w:r>
@@ -16637,7 +16635,6 @@
           <w:b/>
           <w:bCs/>
         </w:rPr>
-        <w:lastRenderedPageBreak/>
         <w:t>Reviews:</w:t>
       </w:r>
       <w:r>
@@ -16648,7 +16645,7 @@
       <w:pPr>
         <w:pStyle w:val="Heading1"/>
       </w:pPr>
-      <w:bookmarkStart w:id="35" w:name="_Toc243582916"/>
+      <w:bookmarkStart w:id="35" w:name="_Toc243659399"/>
       <w:r>
         <w:t>9. Hair Salon / Barber</w:t>
       </w:r>
@@ -16658,7 +16655,7 @@
       <w:pPr>
         <w:pStyle w:val="Heading2"/>
       </w:pPr>
-      <w:bookmarkStart w:id="36" w:name="_Toc243582917"/>
+      <w:bookmarkStart w:id="36" w:name="_Toc243659400"/>
       <w:r>
         <w:t>9.1 Entities</w:t>
       </w:r>
@@ -16828,7 +16825,7 @@
       <w:pPr>
         <w:pStyle w:val="Heading2"/>
       </w:pPr>
-      <w:bookmarkStart w:id="37" w:name="_Toc243582918"/>
+      <w:bookmarkStart w:id="37" w:name="_Toc243659401"/>
       <w:r>
         <w:t>9.2 Activity</w:t>
       </w:r>
@@ -16917,7 +16914,7 @@
       <w:pPr>
         <w:pStyle w:val="Heading2"/>
       </w:pPr>
-      <w:bookmarkStart w:id="38" w:name="_Toc243582919"/>
+      <w:bookmarkStart w:id="38" w:name="_Toc243659402"/>
       <w:r>
         <w:t>9.3 Business Logic</w:t>
       </w:r>
@@ -17020,6 +17017,7 @@
           <w:sz w:val="17"/>
           <w:szCs w:val="17"/>
         </w:rPr>
+        <w:lastRenderedPageBreak/>
         <w:t>NEW IN 5TH VERSION</w:t>
       </w:r>
       <w:r>
@@ -17102,11 +17100,7 @@
         <w:t>Stylist alert:</w:t>
       </w:r>
       <w:r>
-        <w:t xml:space="preserve"> built. When an upsell collides, a booking.schedule_conflict event is queued (webhook subscribers can push it) and the stylist is emailed and texted at the contact details a manager saved on </w:t>
-      </w:r>
-      <w:r>
-        <w:lastRenderedPageBreak/>
-        <w:t>their profile, with the next appointment's time, services and the customer's first name. A stylist with no contact details gets a 'skipped' entry in the notification log so a manager can see why nobody was told.</w:t>
+        <w:t xml:space="preserve"> built. When an upsell collides, a booking.schedule_conflict event is queued (webhook subscribers can push it) and the stylist is emailed and texted at the contact details a manager saved on their profile, with the next appointment's time, services and the customer's first name. A stylist with no contact details gets a 'skipped' entry in the notification log so a manager can see why nobody was told.</w:t>
       </w:r>
     </w:p>
     <w:p>
@@ -17161,7 +17155,7 @@
       <w:pPr>
         <w:pStyle w:val="Heading1"/>
       </w:pPr>
-      <w:bookmarkStart w:id="39" w:name="_Toc243582920"/>
+      <w:bookmarkStart w:id="39" w:name="_Toc243659403"/>
       <w:r>
         <w:t>10. Automotive Services</w:t>
       </w:r>
@@ -17171,7 +17165,7 @@
       <w:pPr>
         <w:pStyle w:val="Heading2"/>
       </w:pPr>
-      <w:bookmarkStart w:id="40" w:name="_Toc243582921"/>
+      <w:bookmarkStart w:id="40" w:name="_Toc243659404"/>
       <w:r>
         <w:t>10.1 Entities</w:t>
       </w:r>
@@ -17381,7 +17375,7 @@
       <w:pPr>
         <w:pStyle w:val="Heading2"/>
       </w:pPr>
-      <w:bookmarkStart w:id="41" w:name="_Toc243582922"/>
+      <w:bookmarkStart w:id="41" w:name="_Toc243659405"/>
       <w:r>
         <w:t>10.2 Activity</w:t>
       </w:r>
@@ -17490,7 +17484,7 @@
       <w:pPr>
         <w:pStyle w:val="Heading2"/>
       </w:pPr>
-      <w:bookmarkStart w:id="42" w:name="_Toc243582923"/>
+      <w:bookmarkStart w:id="42" w:name="_Toc243659406"/>
       <w:r>
         <w:t>10.3 Business Logic</w:t>
       </w:r>
@@ -17530,6 +17524,7 @@
           <w:b/>
           <w:bCs/>
         </w:rPr>
+        <w:lastRenderedPageBreak/>
         <w:t>Double Constraint:</w:t>
       </w:r>
       <w:r>
@@ -17613,7 +17608,6 @@
           <w:sz w:val="17"/>
           <w:szCs w:val="17"/>
         </w:rPr>
-        <w:lastRenderedPageBreak/>
         <w:t>NEW IN 5TH VERSION</w:t>
       </w:r>
       <w:r>
@@ -17823,7 +17817,7 @@
       <w:pPr>
         <w:pStyle w:val="Heading1"/>
       </w:pPr>
-      <w:bookmarkStart w:id="43" w:name="_Toc243582924"/>
+      <w:bookmarkStart w:id="43" w:name="_Toc243659407"/>
       <w:r>
         <w:t>11. Professional Services</w:t>
       </w:r>
@@ -17833,7 +17827,7 @@
       <w:pPr>
         <w:pStyle w:val="Heading2"/>
       </w:pPr>
-      <w:bookmarkStart w:id="44" w:name="_Toc243582925"/>
+      <w:bookmarkStart w:id="44" w:name="_Toc243659408"/>
       <w:r>
         <w:t>11.1 Entities</w:t>
       </w:r>
@@ -17983,7 +17977,7 @@
       <w:pPr>
         <w:pStyle w:val="Heading2"/>
       </w:pPr>
-      <w:bookmarkStart w:id="45" w:name="_Toc243582926"/>
+      <w:bookmarkStart w:id="45" w:name="_Toc243659409"/>
       <w:r>
         <w:t>11.2 Activity</w:t>
       </w:r>
@@ -17999,6 +17993,7 @@
         <w:spacing w:after="60"/>
       </w:pPr>
       <w:r>
+        <w:lastRenderedPageBreak/>
         <w:t>Mobile services define service_radius_km to restrict travel distance.</w:t>
       </w:r>
     </w:p>
@@ -18079,9 +18074,8 @@
       <w:pPr>
         <w:pStyle w:val="Heading2"/>
       </w:pPr>
-      <w:bookmarkStart w:id="46" w:name="_Toc243582927"/>
-      <w:r>
-        <w:lastRenderedPageBreak/>
+      <w:bookmarkStart w:id="46" w:name="_Toc243659410"/>
+      <w:r>
         <w:t>11.3 Business Logic</w:t>
       </w:r>
       <w:bookmarkEnd w:id="46"/>
@@ -18531,7 +18525,11 @@
         <w:t>Online consultations:</w:t>
       </w:r>
       <w:r>
-        <w:t xml:space="preserve"> a consultant saves the room of the business's own meeting service once (resources.meeting_link, migration 0032; http or https only; staff only; seen in the admin only). A confirmed online appointment with no link takes the room of the consultant it is given to, so the confirmation already carries it.</w:t>
+        <w:t xml:space="preserve"> a consultant saves the room of the business's own meeting service once (resources.meeting_link, migration 0032; http or https only; staff only; seen in the admin only). A </w:t>
+      </w:r>
+      <w:r>
+        <w:lastRenderedPageBreak/>
+        <w:t>confirmed online appointment with no link takes the room of the consultant it is given to, so the confirmation already carries it.</w:t>
       </w:r>
     </w:p>
     <w:p>
@@ -18595,7 +18593,6 @@
           <w:b/>
           <w:bCs/>
         </w:rPr>
-        <w:lastRenderedPageBreak/>
         <w:t>Not done:</w:t>
       </w:r>
       <w:r>
@@ -18606,7 +18603,7 @@
       <w:pPr>
         <w:pStyle w:val="Heading1"/>
       </w:pPr>
-      <w:bookmarkStart w:id="47" w:name="_Toc243582928"/>
+      <w:bookmarkStart w:id="47" w:name="_Toc243659411"/>
       <w:r>
         <w:t>12. Database Design</w:t>
       </w:r>
@@ -18616,7 +18613,7 @@
       <w:pPr>
         <w:pStyle w:val="Heading2"/>
       </w:pPr>
-      <w:bookmarkStart w:id="48" w:name="_Toc243582929"/>
+      <w:bookmarkStart w:id="48" w:name="_Toc243659412"/>
       <w:r>
         <w:t>12.1 Why PostgreSQL (not MongoDB)</w:t>
       </w:r>
@@ -18706,7 +18703,7 @@
       <w:pPr>
         <w:pStyle w:val="Heading2"/>
       </w:pPr>
-      <w:bookmarkStart w:id="49" w:name="_Toc243582930"/>
+      <w:bookmarkStart w:id="49" w:name="_Toc243659413"/>
       <w:r>
         <w:t>12.2 Multi-Tenancy</w:t>
       </w:r>
@@ -18724,7 +18721,7 @@
       <w:pPr>
         <w:pStyle w:val="Heading2"/>
       </w:pPr>
-      <w:bookmarkStart w:id="50" w:name="_Toc243582931"/>
+      <w:bookmarkStart w:id="50" w:name="_Toc243659414"/>
       <w:r>
         <w:t>12.3 Tables by Service</w:t>
       </w:r>
@@ -19577,6 +19574,7 @@
                 <w:sz w:val="19"/>
                 <w:szCs w:val="19"/>
               </w:rPr>
+              <w:lastRenderedPageBreak/>
               <w:t>data_requests</w:t>
             </w:r>
           </w:p>
@@ -19909,7 +19907,6 @@
                 <w:sz w:val="19"/>
                 <w:szCs w:val="19"/>
               </w:rPr>
-              <w:lastRenderedPageBreak/>
               <w:t>booking_items.seq</w:t>
             </w:r>
           </w:p>
@@ -20596,7 +20593,7 @@
       <w:pPr>
         <w:pStyle w:val="Heading2"/>
       </w:pPr>
-      <w:bookmarkStart w:id="51" w:name="_Toc243582932"/>
+      <w:bookmarkStart w:id="51" w:name="_Toc243659415"/>
       <w:r>
         <w:t>12.4 Core Schema (Scheduling)</w:t>
       </w:r>
@@ -20963,6 +20960,7 @@
           <w:sz w:val="16"/>
           <w:szCs w:val="16"/>
         </w:rPr>
+        <w:lastRenderedPageBreak/>
         <w:t xml:space="preserve">  PRIMARY KEY (resource_id, service_id)</w:t>
       </w:r>
     </w:p>
@@ -21080,7 +21078,6 @@
           <w:sz w:val="16"/>
           <w:szCs w:val="16"/>
         </w:rPr>
-        <w:lastRenderedPageBreak/>
         <w:t>CREATE TABLE days_off (</w:t>
       </w:r>
     </w:p>
@@ -22143,6 +22140,7 @@
                 <w:sz w:val="19"/>
                 <w:szCs w:val="19"/>
               </w:rPr>
+              <w:lastRenderedPageBreak/>
               <w:t>tenants.plan_overrides, plan_warnings</w:t>
             </w:r>
           </w:p>
@@ -22392,7 +22390,6 @@
                 <w:sz w:val="19"/>
                 <w:szCs w:val="19"/>
               </w:rPr>
-              <w:lastRenderedPageBreak/>
               <w:t>bookings.contact_email, customers.email_verified_at</w:t>
             </w:r>
           </w:p>
@@ -23039,7 +23036,7 @@
       <w:pPr>
         <w:pStyle w:val="Heading1"/>
       </w:pPr>
-      <w:bookmarkStart w:id="52" w:name="_Toc243582933"/>
+      <w:bookmarkStart w:id="52" w:name="_Toc243659416"/>
       <w:r>
         <w:t>13. Availability and Booking Engine</w:t>
       </w:r>
@@ -23049,7 +23046,7 @@
       <w:pPr>
         <w:pStyle w:val="Heading2"/>
       </w:pPr>
-      <w:bookmarkStart w:id="53" w:name="_Toc243582934"/>
+      <w:bookmarkStart w:id="53" w:name="_Toc243659417"/>
       <w:r>
         <w:t>13.1 Slot Generation Pipeline</w:t>
       </w:r>
@@ -23274,6 +23271,7 @@
           <w:b/>
           <w:bCs/>
         </w:rPr>
+        <w:lastRenderedPageBreak/>
         <w:t>Minimum notice and booking window:</w:t>
       </w:r>
       <w:r>
@@ -23308,7 +23306,7 @@
       <w:pPr>
         <w:pStyle w:val="Heading2"/>
       </w:pPr>
-      <w:bookmarkStart w:id="54" w:name="_Toc243582935"/>
+      <w:bookmarkStart w:id="54" w:name="_Toc243659418"/>
       <w:r>
         <w:t>13.2 Allocation Strategies (Python)</w:t>
       </w:r>
@@ -23364,7 +23362,6 @@
                 <w:sz w:val="19"/>
                 <w:szCs w:val="19"/>
               </w:rPr>
-              <w:lastRenderedPageBreak/>
               <w:t>Strategy</w:t>
             </w:r>
           </w:p>
@@ -23625,7 +23622,7 @@
       <w:pPr>
         <w:pStyle w:val="Heading2"/>
       </w:pPr>
-      <w:bookmarkStart w:id="55" w:name="_Toc243582936"/>
+      <w:bookmarkStart w:id="55" w:name="_Toc243659419"/>
       <w:r>
         <w:t>13.3 Concurrency</w:t>
       </w:r>
@@ -24071,7 +24068,11 @@
         <w:t>Idempotency-Key:</w:t>
       </w:r>
       <w:r>
-        <w:t xml:space="preserve"> POST /v1/public/bookings takes an optional Idempotency-Key header (8 to 100 letters, digits and _ . : -). The first request with a key makes the booking and stamps it with the key and a hash of the whole request. The same request sent again (a double click, a retry after a time-out) returns that booking with the header Idempotent-Replayed: true and makes nothing new; the same key with a different request is 409 idempotency_key_reused. Copies arriving at the same moment queue on a lock for the key. A request that failed made nothing, so its key can be tried again. Without the header every call makes its own booking.</w:t>
+        <w:t xml:space="preserve"> POST /v1/public/bookings takes an optional Idempotency-Key header (8 to 100 letters, digits and _ . : -). The first request with a key makes the booking and stamps it with the key and a hash of </w:t>
+      </w:r>
+      <w:r>
+        <w:lastRenderedPageBreak/>
+        <w:t>the whole request. The same request sent again (a double click, a retry after a time-out) returns that booking with the header Idempotent-Replayed: true and makes nothing new; the same key with a different request is 409 idempotency_key_reused. Copies arriving at the same moment queue on a lock for the key. A request that failed made nothing, so its key can be tried again. Without the header every call makes its own booking.</w:t>
       </w:r>
     </w:p>
     <w:p>
@@ -24087,7 +24088,6 @@
           <w:b/>
           <w:bCs/>
         </w:rPr>
-        <w:lastRenderedPageBreak/>
         <w:t>Decided not to build:</w:t>
       </w:r>
       <w:r>
@@ -24098,7 +24098,7 @@
       <w:pPr>
         <w:pStyle w:val="Heading2"/>
       </w:pPr>
-      <w:bookmarkStart w:id="56" w:name="_Toc243582937"/>
+      <w:bookmarkStart w:id="56" w:name="_Toc243659420"/>
       <w:r>
         <w:t>13.4 Booking State Machine</w:t>
       </w:r>
@@ -25128,8 +25128,9 @@
       <w:pPr>
         <w:pStyle w:val="Heading2"/>
       </w:pPr>
-      <w:bookmarkStart w:id="57" w:name="_Toc243582938"/>
-      <w:r>
+      <w:bookmarkStart w:id="57" w:name="_Toc243659421"/>
+      <w:r>
+        <w:lastRenderedPageBreak/>
         <w:t>13.5 Background Jobs</w:t>
       </w:r>
       <w:bookmarkEnd w:id="57"/>
@@ -25183,7 +25184,6 @@
         <w:spacing w:after="60"/>
       </w:pPr>
       <w:r>
-        <w:lastRenderedPageBreak/>
         <w:t>Retry failed Google Calendar syncs and notifications.</w:t>
       </w:r>
     </w:p>
@@ -26182,7 +26182,7 @@
       <w:pPr>
         <w:pStyle w:val="Heading1"/>
       </w:pPr>
-      <w:bookmarkStart w:id="58" w:name="_Toc243582939"/>
+      <w:bookmarkStart w:id="58" w:name="_Toc243659422"/>
       <w:r>
         <w:t>14. API Design</w:t>
       </w:r>
@@ -26247,6 +26247,7 @@
                 <w:sz w:val="19"/>
                 <w:szCs w:val="19"/>
               </w:rPr>
+              <w:lastRenderedPageBreak/>
               <w:t>Method</w:t>
             </w:r>
           </w:p>
@@ -26653,7 +26654,6 @@
                 <w:sz w:val="19"/>
                 <w:szCs w:val="19"/>
               </w:rPr>
-              <w:lastRenderedPageBreak/>
               <w:t>POST</w:t>
             </w:r>
           </w:p>
@@ -28786,6 +28786,7 @@
                 <w:sz w:val="19"/>
                 <w:szCs w:val="19"/>
               </w:rPr>
+              <w:lastRenderedPageBreak/>
               <w:t>GET</w:t>
             </w:r>
           </w:p>
@@ -29035,7 +29036,6 @@
                 <w:sz w:val="19"/>
                 <w:szCs w:val="19"/>
               </w:rPr>
-              <w:lastRenderedPageBreak/>
               <w:t>GET/PUT</w:t>
             </w:r>
           </w:p>
@@ -30528,6 +30528,7 @@
                 <w:sz w:val="19"/>
                 <w:szCs w:val="19"/>
               </w:rPr>
+              <w:lastRenderedPageBreak/>
               <w:t>POST</w:t>
             </w:r>
           </w:p>
@@ -30777,7 +30778,6 @@
                 <w:sz w:val="19"/>
                 <w:szCs w:val="19"/>
               </w:rPr>
-              <w:lastRenderedPageBreak/>
               <w:t>GET/PUT</w:t>
             </w:r>
           </w:p>
@@ -32185,6 +32185,7 @@
                 <w:sz w:val="19"/>
                 <w:szCs w:val="19"/>
               </w:rPr>
+              <w:lastRenderedPageBreak/>
               <w:t>PATCH</w:t>
             </w:r>
           </w:p>
@@ -32517,7 +32518,6 @@
                 <w:sz w:val="19"/>
                 <w:szCs w:val="19"/>
               </w:rPr>
-              <w:lastRenderedPageBreak/>
               <w:t>GET</w:t>
             </w:r>
           </w:p>
@@ -32668,7 +32668,7 @@
       <w:pPr>
         <w:pStyle w:val="Heading1"/>
       </w:pPr>
-      <w:bookmarkStart w:id="59" w:name="_Toc243582940"/>
+      <w:bookmarkStart w:id="59" w:name="_Toc243659423"/>
       <w:r>
         <w:t>15. Notifications and Integrations</w:t>
       </w:r>
@@ -33038,6 +33038,7 @@
           <w:b/>
           <w:bCs/>
         </w:rPr>
+        <w:lastRenderedPageBreak/>
         <w:t>Not built:</w:t>
       </w:r>
       <w:r>
@@ -33095,11 +33096,7 @@
         <w:t>Google Calendar (one way):</w:t>
       </w:r>
       <w:r>
-        <w:t xml:space="preserve"> confirmed, running and finished bookings appear as events in the business's calendar and in the calendar of the staff member who has them; cancelled, rejected and no-show bookings are removed. The booking system is the truth: an event edited in Google is overwritten the next time the booking changes. An event carries services, staff, status and a short booking reference; the </w:t>
-      </w:r>
-      <w:r>
-        <w:lastRenderedPageBreak/>
-        <w:t>customer's name, phone, party size, request and address go in only if the owner switched on share_customer_details for that calendar (Google is then a processor: list it in the privacy notice). Health notes are never sent. The owner connects through Google's OAuth 2.0 web flow (scope calendar.events); tokens are stored encrypted; a calendar that keeps failing, or whose sign-in Google no longer accepts, is paused and the business is emailed.</w:t>
+        <w:t xml:space="preserve"> confirmed, running and finished bookings appear as events in the business's calendar and in the calendar of the staff member who has them; cancelled, rejected and no-show bookings are removed. The booking system is the truth: an event edited in Google is overwritten the next time the booking changes. An event carries services, staff, status and a short booking reference; the customer's name, phone, party size, request and address go in only if the owner switched on share_customer_details for that calendar (Google is then a processor: list it in the privacy notice). Health notes are never sent. The owner connects through Google's OAuth 2.0 web flow (scope calendar.events); tokens are stored encrypted; a calendar that keeps failing, or whose sign-in Google no longer accepts, is paused and the business is emailed.</w:t>
       </w:r>
     </w:p>
     <w:p>
@@ -33304,7 +33301,7 @@
       <w:pPr>
         <w:pStyle w:val="Heading1"/>
       </w:pPr>
-      <w:bookmarkStart w:id="60" w:name="_Toc243582941"/>
+      <w:bookmarkStart w:id="60" w:name="_Toc243659424"/>
       <w:r>
         <w:t>16. Security and Compliance</w:t>
       </w:r>
@@ -33478,6 +33475,7 @@
           <w:b/>
           <w:bCs/>
         </w:rPr>
+        <w:lastRenderedPageBreak/>
         <w:t>Start-up checks:</w:t>
       </w:r>
       <w:r>
@@ -33526,7 +33524,6 @@
           <w:b/>
           <w:bCs/>
         </w:rPr>
-        <w:lastRenderedPageBreak/>
         <w:t>Credentials:</w:t>
       </w:r>
       <w:r>
@@ -34618,6 +34615,7 @@
           <w:b/>
           <w:bCs/>
         </w:rPr>
+        <w:lastRenderedPageBreak/>
         <w:t>One website per free account:</w:t>
       </w:r>
       <w:r>
@@ -34645,11 +34643,7 @@
         <w:t>Privacy:</w:t>
       </w:r>
       <w:r>
-        <w:t xml:space="preserve"> erasure also clears the email given with each of the customer's bookings, the confirmation of their email, and the idempotency key and request hash on their bookings, and queues the customer's Google Calendar events to be rewritten without their name, phone and request. A calendar that was </w:t>
-      </w:r>
-      <w:r>
-        <w:lastRenderedPageBreak/>
-        <w:t>paused at the time is rewritten in full when it is connected again; events in a calendar that was disconnected stay in Google.</w:t>
+        <w:t xml:space="preserve"> erasure also clears the email given with each of the customer's bookings, the confirmation of their email, and the idempotency key and request hash on their bookings, and queues the customer's Google Calendar events to be rewritten without their name, phone and request. A calendar that was paused at the time is rewritten in full when it is connected again; events in a calendar that was disconnected stay in Google.</w:t>
       </w:r>
     </w:p>
     <w:p>
@@ -34932,7 +34926,7 @@
       <w:pPr>
         <w:pStyle w:val="Heading1"/>
       </w:pPr>
-      <w:bookmarkStart w:id="61" w:name="_Toc243582942"/>
+      <w:bookmarkStart w:id="61" w:name="_Toc243659425"/>
       <w:r>
         <w:t>17. Development Roadmap</w:t>
       </w:r>
@@ -35315,6 +35309,7 @@
           <w:sz w:val="17"/>
           <w:szCs w:val="17"/>
         </w:rPr>
+        <w:lastRenderedPageBreak/>
         <w:t>NEW IN 5TH VERSION</w:t>
       </w:r>
       <w:r>
@@ -35728,7 +35723,6 @@
                 <w:sz w:val="19"/>
                 <w:szCs w:val="19"/>
               </w:rPr>
-              <w:lastRenderedPageBreak/>
               <w:t>4. Professional</w:t>
             </w:r>
           </w:p>
@@ -35971,7 +35965,7 @@
       <w:pPr>
         <w:pStyle w:val="Heading1"/>
       </w:pPr>
-      <w:bookmarkStart w:id="62" w:name="_Toc243582943"/>
+      <w:bookmarkStart w:id="62" w:name="_Toc243659426"/>
       <w:r>
         <w:t>18. Open Questions</w:t>
       </w:r>
@@ -36082,7 +36076,7 @@
         <w:pStyle w:val="Heading1"/>
       </w:pPr>
       <w:bookmarkStart w:id="63" w:name="_Toc96005002"/>
-      <w:bookmarkStart w:id="64" w:name="_Toc243582944"/>
+      <w:bookmarkStart w:id="64" w:name="_Toc243659427"/>
       <w:r>
         <w:t>19. Implementation Status (updated in 8th Version)</w:t>
       </w:r>
@@ -36102,7 +36096,7 @@
         <w:pStyle w:val="Heading2"/>
       </w:pPr>
       <w:bookmarkStart w:id="65" w:name="_Toc96005003"/>
-      <w:bookmarkStart w:id="66" w:name="_Toc243582945"/>
+      <w:bookmarkStart w:id="66" w:name="_Toc243659428"/>
       <w:r>
         <w:t>19.1 Built and tested</w:t>
       </w:r>
@@ -36295,6 +36289,7 @@
           <w:b/>
           <w:bCs/>
         </w:rPr>
+        <w:lastRenderedPageBreak/>
         <w:t>Integrations:</w:t>
       </w:r>
       <w:r>
@@ -36391,7 +36386,6 @@
           <w:b/>
           <w:bCs/>
         </w:rPr>
-        <w:lastRenderedPageBreak/>
         <w:t>Since the 8th Version:</w:t>
       </w:r>
       <w:r>
@@ -36403,7 +36397,7 @@
         <w:pStyle w:val="Heading2"/>
       </w:pPr>
       <w:bookmarkStart w:id="67" w:name="_Toc96005004"/>
-      <w:bookmarkStart w:id="68" w:name="_Toc243582946"/>
+      <w:bookmarkStart w:id="68" w:name="_Toc243659429"/>
       <w:r>
         <w:t>19.2 Built but not checked against the real thing</w:t>
       </w:r>
@@ -36607,7 +36601,7 @@
         <w:pStyle w:val="Heading2"/>
       </w:pPr>
       <w:bookmarkStart w:id="69" w:name="_Toc96005005"/>
-      <w:bookmarkStart w:id="70" w:name="_Toc243582947"/>
+      <w:bookmarkStart w:id="70" w:name="_Toc243659430"/>
       <w:r>
         <w:t>19.3 Not built</w:t>
       </w:r>
@@ -37100,6 +37094,7 @@
                 <w:sz w:val="19"/>
                 <w:szCs w:val="19"/>
               </w:rPr>
+              <w:lastRenderedPageBreak/>
               <w:t>Infrastructure</w:t>
             </w:r>
           </w:p>
@@ -37530,7 +37525,6 @@
                 <w:sz w:val="19"/>
                 <w:szCs w:val="19"/>
               </w:rPr>
-              <w:lastRenderedPageBreak/>
               <w:t>Customer</w:t>
             </w:r>
           </w:p>
@@ -37774,7 +37768,7 @@
         <w:pStyle w:val="Heading2"/>
       </w:pPr>
       <w:bookmarkStart w:id="71" w:name="_Toc96005006"/>
-      <w:bookmarkStart w:id="72" w:name="_Toc243582948"/>
+      <w:bookmarkStart w:id="72" w:name="_Toc243659431"/>
       <w:r>
         <w:t>19.4 Decisions taken during the build</w:t>
       </w:r>
@@ -38183,6 +38177,7 @@
           <w:b/>
           <w:bCs/>
         </w:rPr>
+        <w:lastRenderedPageBreak/>
         <w:t>Booking rules for a new business:</w:t>
       </w:r>
       <w:r>
@@ -38242,7 +38237,7 @@
         <w:pStyle w:val="Heading2"/>
       </w:pPr>
       <w:bookmarkStart w:id="73" w:name="_Toc96005007"/>
-      <w:bookmarkStart w:id="74" w:name="_Toc243582949"/>
+      <w:bookmarkStart w:id="74" w:name="_Toc243659432"/>
       <w:r>
         <w:t>19.5 How it was verified</w:t>
       </w:r>
@@ -38270,7 +38265,7 @@
         <w:t>Tests:</w:t>
       </w:r>
       <w:r>
-        <w:t xml:space="preserve"> 2,635 tests pass with PostGIS; mypy is clean; alembic check and an upgrade and downgrade round trip were run for each migration up to 0033. Migration 0034 (every country) was upgraded on the local test site's database; its round trip, mutation testing and ten runs are still to do (Section 5.3).</w:t>
+        <w:t xml:space="preserve"> 2,635 tests pass with PostGIS; mypy is clean; alembic check and an upgrade and downgrade round trip were run for each migration, 0034 included (Section 5.3).</w:t>
       </w:r>
     </w:p>
     <w:p>
@@ -38294,11 +38289,7 @@
         <w:t>Mutation testing:</w:t>
       </w:r>
       <w:r>
-        <w:t xml:space="preserve"> for each feature the key rules were broken one at a time and a test had to fail (for example 81 breakages of the customer-email rules, 35 of the refused-message rules, 32 of the </w:t>
-      </w:r>
-      <w:r>
-        <w:lastRenderedPageBreak/>
-        <w:t>idempotency rules, 25 of the timed moves, 33 of the second review's fixes, 21 of the admin customer details, 14 of the minimum-spend amount, 10 of the default booking rules, 28 of the Google Maps links, 23 of the meeting links, 13 of price after inspection and the visit address). Survivors were either closed with new tests or listed as equivalent (a redundant safeguard).</w:t>
+        <w:t xml:space="preserve"> for each feature the key rules were broken one at a time and a test had to fail (for example 81 breakages of the customer-email rules, 35 of the refused-message rules, 32 of the idempotency rules, 25 of the timed moves, 33 of the second review's fixes, 21 of the admin customer details, 14 of the minimum-spend amount, 10 of the default booking rules, 28 of the Google Maps links, 23 of the meeting links, 13 of price after inspection and the visit address, 33 of the every-country change). Survivors were either closed with new tests or listed as equivalent (a redundant safeguard).</w:t>
       </w:r>
     </w:p>
     <w:p>
@@ -38426,7 +38417,7 @@
         <w:pStyle w:val="Heading2"/>
       </w:pPr>
       <w:bookmarkStart w:id="75" w:name="_Toc96005008"/>
-      <w:bookmarkStart w:id="76" w:name="_Toc243582950"/>
+      <w:bookmarkStart w:id="76" w:name="_Toc243659433"/>
       <w:r>
         <w:t>19.6 Code review findings</w:t>
       </w:r>
@@ -39185,6 +39176,7 @@
                 <w:sz w:val="19"/>
                 <w:szCs w:val="19"/>
               </w:rPr>
+              <w:lastRenderedPageBreak/>
               <w:t>Low-medium: webhook host lookup</w:t>
             </w:r>
           </w:p>
@@ -39357,7 +39349,6 @@
                 <w:sz w:val="19"/>
                 <w:szCs w:val="19"/>
               </w:rPr>
-              <w:lastRenderedPageBreak/>
               <w:t>Low: points left on purpose</w:t>
             </w:r>
           </w:p>
@@ -39429,7 +39420,7 @@
         <w:pStyle w:val="Heading2"/>
       </w:pPr>
       <w:bookmarkStart w:id="77" w:name="_Toc96007002"/>
-      <w:bookmarkStart w:id="78" w:name="_Toc243582951"/>
+      <w:bookmarkStart w:id="78" w:name="_Toc243659434"/>
       <w:r>
         <w:t>19.7 UX prototype and what it found (7th Version)</w:t>
       </w:r>
@@ -40050,6 +40041,7 @@
                 <w:sz w:val="19"/>
                 <w:szCs w:val="19"/>
               </w:rPr>
+              <w:lastRenderedPageBreak/>
               <w:t>Repeated requests across the deploy</w:t>
             </w:r>
           </w:p>
@@ -40207,7 +40199,7 @@
         <w:pStyle w:val="Heading2"/>
       </w:pPr>
       <w:bookmarkStart w:id="79" w:name="_Toc97008002"/>
-      <w:bookmarkStart w:id="80" w:name="_Toc243582952"/>
+      <w:bookmarkStart w:id="80" w:name="_Toc243659435"/>
       <w:r>
         <w:t>19.8 Local test site and online demo (8th Version)</w:t>
       </w:r>
@@ -40219,7 +40211,6 @@
         <w:spacing w:after="120"/>
       </w:pPr>
       <w:r>
-        <w:lastRenderedPageBreak/>
         <w:t>The prototype's screens were connected to the real backend in two ways, so testers and prospective customers can try the product before the WordPress plugin, widget and dashboard exist. Neither is the product's front end: they are test screens.</w:t>
       </w:r>
     </w:p>
@@ -40753,6 +40744,7 @@
                 <w:sz w:val="19"/>
                 <w:szCs w:val="19"/>
               </w:rPr>
+              <w:lastRenderedPageBreak/>
               <w:t>Price 0 looked free</w:t>
             </w:r>
           </w:p>
@@ -41097,7 +41089,6 @@
                 <w:sz w:val="19"/>
                 <w:szCs w:val="19"/>
               </w:rPr>
-              <w:lastRenderedPageBreak/>
               <w:t>Editing a service on the screens</w:t>
             </w:r>
           </w:p>
@@ -41255,7 +41246,7 @@
         <w:pStyle w:val="Heading1"/>
       </w:pPr>
       <w:bookmarkStart w:id="81" w:name="_Toc96005009"/>
-      <w:bookmarkStart w:id="82" w:name="_Toc243582953"/>
+      <w:bookmarkStart w:id="82" w:name="_Toc243659436"/>
       <w:r>
         <w:t>20. Product Direction (decisions of 2026-10-06, updated in 8th Version)</w:t>
       </w:r>
@@ -41275,7 +41266,7 @@
         <w:pStyle w:val="Heading2"/>
       </w:pPr>
       <w:bookmarkStart w:id="83" w:name="_Toc96005010"/>
-      <w:bookmarkStart w:id="84" w:name="_Toc243582954"/>
+      <w:bookmarkStart w:id="84" w:name="_Toc243659437"/>
       <w:r>
         <w:t>20.1 Standalone and WordPress</w:t>
       </w:r>
@@ -41359,7 +41350,7 @@
         <w:pStyle w:val="Heading2"/>
       </w:pPr>
       <w:bookmarkStart w:id="85" w:name="_Toc96005011"/>
-      <w:bookmarkStart w:id="86" w:name="_Toc243582955"/>
+      <w:bookmarkStart w:id="86" w:name="_Toc243659438"/>
       <w:r>
         <w:t>20.2 Free tier and paid tier</w:t>
       </w:r>
@@ -42063,8 +42054,9 @@
         <w:pStyle w:val="Heading2"/>
       </w:pPr>
       <w:bookmarkStart w:id="87" w:name="_Toc96005012"/>
-      <w:bookmarkStart w:id="88" w:name="_Toc243582956"/>
-      <w:r>
+      <w:bookmarkStart w:id="88" w:name="_Toc243659439"/>
+      <w:r>
+        <w:lastRenderedPageBreak/>
         <w:t>20.3 Where paid customers' data lives (the 'database bucket' question)</w:t>
       </w:r>
       <w:bookmarkEnd w:id="87"/>
@@ -42314,7 +42306,6 @@
                 <w:sz w:val="19"/>
                 <w:szCs w:val="19"/>
               </w:rPr>
-              <w:lastRenderedPageBreak/>
               <w:t>Dedicated database</w:t>
             </w:r>
           </w:p>
@@ -42490,7 +42481,7 @@
         <w:pStyle w:val="Heading2"/>
       </w:pPr>
       <w:bookmarkStart w:id="89" w:name="_Toc96005013"/>
-      <w:bookmarkStart w:id="90" w:name="_Toc243582957"/>
+      <w:bookmarkStart w:id="90" w:name="_Toc243659440"/>
       <w:r>
         <w:t>20.4 One paid account, one business, one type</w:t>
       </w:r>
@@ -42574,7 +42565,7 @@
         <w:pStyle w:val="Heading2"/>
       </w:pPr>
       <w:bookmarkStart w:id="91" w:name="_Toc96005014"/>
-      <w:bookmarkStart w:id="92" w:name="_Toc243582958"/>
+      <w:bookmarkStart w:id="92" w:name="_Toc243659441"/>
       <w:r>
         <w:t>20.5 Countries and localisation: every country, three in detail</w:t>
       </w:r>
@@ -42682,7 +42673,7 @@
         <w:pStyle w:val="Heading2"/>
       </w:pPr>
       <w:bookmarkStart w:id="93" w:name="_Toc96005015"/>
-      <w:bookmarkStart w:id="94" w:name="_Toc243582959"/>
+      <w:bookmarkStart w:id="94" w:name="_Toc243659442"/>
       <w:r>
         <w:t>20.6 Registration</w:t>
       </w:r>
@@ -42742,7 +42733,7 @@
         <w:pStyle w:val="Heading2"/>
       </w:pPr>
       <w:bookmarkStart w:id="95" w:name="_Toc96005016"/>
-      <w:bookmarkStart w:id="96" w:name="_Toc243582960"/>
+      <w:bookmarkStart w:id="96" w:name="_Toc243659443"/>
       <w:r>
         <w:t>20.7 Order of work from here</w:t>
       </w:r>
@@ -42815,6 +42806,7 @@
           <w:b/>
           <w:bCs/>
         </w:rPr>
+        <w:lastRenderedPageBreak/>
         <w:t>3.</w:t>
       </w:r>
       <w:r>
@@ -42863,7 +42855,6 @@
           <w:b/>
           <w:bCs/>
         </w:rPr>
-        <w:lastRenderedPageBreak/>
         <w:t>5.</w:t>
       </w:r>
       <w:r>

</xml_diff>

<commit_message>
Describe the demo website's new look in the 8th docx
</commit_message>
<xml_diff>
--- a/BookingWebsiteBackendBlueprint_8th_Version.docx
+++ b/BookingWebsiteBackendBlueprint_8th_Version.docx
@@ -160,7 +160,7 @@
           <w:r>
             <w:fldChar w:fldCharType="separate"/>
           </w:r>
-          <w:hyperlink w:anchor="_Toc243659368" w:history="1">
+          <w:hyperlink w:anchor="_Toc243905945" w:history="1">
             <w:r>
               <w:rPr>
                 <w:rStyle w:val="Hyperlink"/>
@@ -184,7 +184,7 @@
               <w:rPr>
                 <w:noProof/>
               </w:rPr>
-              <w:instrText xml:space="preserve"> PAGEREF _Toc243659368 \h </w:instrText>
+              <w:instrText xml:space="preserve"> PAGEREF _Toc243905945 \h </w:instrText>
             </w:r>
             <w:r>
               <w:rPr>
@@ -226,7 +226,7 @@
               <w14:ligatures w14:val="standardContextual"/>
             </w:rPr>
           </w:pPr>
-          <w:hyperlink w:anchor="_Toc243659369" w:history="1">
+          <w:hyperlink w:anchor="_Toc243905946" w:history="1">
             <w:r>
               <w:rPr>
                 <w:rStyle w:val="Hyperlink"/>
@@ -250,7 +250,7 @@
               <w:rPr>
                 <w:noProof/>
               </w:rPr>
-              <w:instrText xml:space="preserve"> PAGEREF _Toc243659369 \h </w:instrText>
+              <w:instrText xml:space="preserve"> PAGEREF _Toc243905946 \h </w:instrText>
             </w:r>
             <w:r>
               <w:rPr>
@@ -292,7 +292,7 @@
               <w14:ligatures w14:val="standardContextual"/>
             </w:rPr>
           </w:pPr>
-          <w:hyperlink w:anchor="_Toc243659370" w:history="1">
+          <w:hyperlink w:anchor="_Toc243905947" w:history="1">
             <w:r>
               <w:rPr>
                 <w:rStyle w:val="Hyperlink"/>
@@ -316,7 +316,7 @@
               <w:rPr>
                 <w:noProof/>
               </w:rPr>
-              <w:instrText xml:space="preserve"> PAGEREF _Toc243659370 \h </w:instrText>
+              <w:instrText xml:space="preserve"> PAGEREF _Toc243905947 \h </w:instrText>
             </w:r>
             <w:r>
               <w:rPr>
@@ -358,7 +358,7 @@
               <w14:ligatures w14:val="standardContextual"/>
             </w:rPr>
           </w:pPr>
-          <w:hyperlink w:anchor="_Toc243659371" w:history="1">
+          <w:hyperlink w:anchor="_Toc243905948" w:history="1">
             <w:r>
               <w:rPr>
                 <w:rStyle w:val="Hyperlink"/>
@@ -382,7 +382,7 @@
               <w:rPr>
                 <w:noProof/>
               </w:rPr>
-              <w:instrText xml:space="preserve"> PAGEREF _Toc243659371 \h </w:instrText>
+              <w:instrText xml:space="preserve"> PAGEREF _Toc243905948 \h </w:instrText>
             </w:r>
             <w:r>
               <w:rPr>
@@ -424,7 +424,7 @@
               <w14:ligatures w14:val="standardContextual"/>
             </w:rPr>
           </w:pPr>
-          <w:hyperlink w:anchor="_Toc243659372" w:history="1">
+          <w:hyperlink w:anchor="_Toc243905949" w:history="1">
             <w:r>
               <w:rPr>
                 <w:rStyle w:val="Hyperlink"/>
@@ -448,7 +448,7 @@
               <w:rPr>
                 <w:noProof/>
               </w:rPr>
-              <w:instrText xml:space="preserve"> PAGEREF _Toc243659372 \h </w:instrText>
+              <w:instrText xml:space="preserve"> PAGEREF _Toc243905949 \h </w:instrText>
             </w:r>
             <w:r>
               <w:rPr>
@@ -490,7 +490,7 @@
               <w14:ligatures w14:val="standardContextual"/>
             </w:rPr>
           </w:pPr>
-          <w:hyperlink w:anchor="_Toc243659373" w:history="1">
+          <w:hyperlink w:anchor="_Toc243905950" w:history="1">
             <w:r>
               <w:rPr>
                 <w:rStyle w:val="Hyperlink"/>
@@ -514,7 +514,7 @@
               <w:rPr>
                 <w:noProof/>
               </w:rPr>
-              <w:instrText xml:space="preserve"> PAGEREF _Toc243659373 \h </w:instrText>
+              <w:instrText xml:space="preserve"> PAGEREF _Toc243905950 \h </w:instrText>
             </w:r>
             <w:r>
               <w:rPr>
@@ -556,7 +556,7 @@
               <w14:ligatures w14:val="standardContextual"/>
             </w:rPr>
           </w:pPr>
-          <w:hyperlink w:anchor="_Toc243659374" w:history="1">
+          <w:hyperlink w:anchor="_Toc243905951" w:history="1">
             <w:r>
               <w:rPr>
                 <w:rStyle w:val="Hyperlink"/>
@@ -580,7 +580,7 @@
               <w:rPr>
                 <w:noProof/>
               </w:rPr>
-              <w:instrText xml:space="preserve"> PAGEREF _Toc243659374 \h </w:instrText>
+              <w:instrText xml:space="preserve"> PAGEREF _Toc243905951 \h </w:instrText>
             </w:r>
             <w:r>
               <w:rPr>
@@ -622,7 +622,7 @@
               <w14:ligatures w14:val="standardContextual"/>
             </w:rPr>
           </w:pPr>
-          <w:hyperlink w:anchor="_Toc243659375" w:history="1">
+          <w:hyperlink w:anchor="_Toc243905952" w:history="1">
             <w:r>
               <w:rPr>
                 <w:rStyle w:val="Hyperlink"/>
@@ -646,7 +646,7 @@
               <w:rPr>
                 <w:noProof/>
               </w:rPr>
-              <w:instrText xml:space="preserve"> PAGEREF _Toc243659375 \h </w:instrText>
+              <w:instrText xml:space="preserve"> PAGEREF _Toc243905952 \h </w:instrText>
             </w:r>
             <w:r>
               <w:rPr>
@@ -688,7 +688,7 @@
               <w14:ligatures w14:val="standardContextual"/>
             </w:rPr>
           </w:pPr>
-          <w:hyperlink w:anchor="_Toc243659376" w:history="1">
+          <w:hyperlink w:anchor="_Toc243905953" w:history="1">
             <w:r>
               <w:rPr>
                 <w:rStyle w:val="Hyperlink"/>
@@ -712,7 +712,7 @@
               <w:rPr>
                 <w:noProof/>
               </w:rPr>
-              <w:instrText xml:space="preserve"> PAGEREF _Toc243659376 \h </w:instrText>
+              <w:instrText xml:space="preserve"> PAGEREF _Toc243905953 \h </w:instrText>
             </w:r>
             <w:r>
               <w:rPr>
@@ -754,7 +754,7 @@
               <w14:ligatures w14:val="standardContextual"/>
             </w:rPr>
           </w:pPr>
-          <w:hyperlink w:anchor="_Toc243659377" w:history="1">
+          <w:hyperlink w:anchor="_Toc243905954" w:history="1">
             <w:r>
               <w:rPr>
                 <w:rStyle w:val="Hyperlink"/>
@@ -778,7 +778,7 @@
               <w:rPr>
                 <w:noProof/>
               </w:rPr>
-              <w:instrText xml:space="preserve"> PAGEREF _Toc243659377 \h </w:instrText>
+              <w:instrText xml:space="preserve"> PAGEREF _Toc243905954 \h </w:instrText>
             </w:r>
             <w:r>
               <w:rPr>
@@ -820,7 +820,7 @@
               <w14:ligatures w14:val="standardContextual"/>
             </w:rPr>
           </w:pPr>
-          <w:hyperlink w:anchor="_Toc243659378" w:history="1">
+          <w:hyperlink w:anchor="_Toc243905955" w:history="1">
             <w:r>
               <w:rPr>
                 <w:rStyle w:val="Hyperlink"/>
@@ -844,7 +844,7 @@
               <w:rPr>
                 <w:noProof/>
               </w:rPr>
-              <w:instrText xml:space="preserve"> PAGEREF _Toc243659378 \h </w:instrText>
+              <w:instrText xml:space="preserve"> PAGEREF _Toc243905955 \h </w:instrText>
             </w:r>
             <w:r>
               <w:rPr>
@@ -886,7 +886,7 @@
               <w14:ligatures w14:val="standardContextual"/>
             </w:rPr>
           </w:pPr>
-          <w:hyperlink w:anchor="_Toc243659379" w:history="1">
+          <w:hyperlink w:anchor="_Toc243905956" w:history="1">
             <w:r>
               <w:rPr>
                 <w:rStyle w:val="Hyperlink"/>
@@ -910,7 +910,7 @@
               <w:rPr>
                 <w:noProof/>
               </w:rPr>
-              <w:instrText xml:space="preserve"> PAGEREF _Toc243659379 \h </w:instrText>
+              <w:instrText xml:space="preserve"> PAGEREF _Toc243905956 \h </w:instrText>
             </w:r>
             <w:r>
               <w:rPr>
@@ -952,7 +952,7 @@
               <w14:ligatures w14:val="standardContextual"/>
             </w:rPr>
           </w:pPr>
-          <w:hyperlink w:anchor="_Toc243659380" w:history="1">
+          <w:hyperlink w:anchor="_Toc243905957" w:history="1">
             <w:r>
               <w:rPr>
                 <w:rStyle w:val="Hyperlink"/>
@@ -976,7 +976,7 @@
               <w:rPr>
                 <w:noProof/>
               </w:rPr>
-              <w:instrText xml:space="preserve"> PAGEREF _Toc243659380 \h </w:instrText>
+              <w:instrText xml:space="preserve"> PAGEREF _Toc243905957 \h </w:instrText>
             </w:r>
             <w:r>
               <w:rPr>
@@ -1018,7 +1018,7 @@
               <w14:ligatures w14:val="standardContextual"/>
             </w:rPr>
           </w:pPr>
-          <w:hyperlink w:anchor="_Toc243659381" w:history="1">
+          <w:hyperlink w:anchor="_Toc243905958" w:history="1">
             <w:r>
               <w:rPr>
                 <w:rStyle w:val="Hyperlink"/>
@@ -1042,7 +1042,7 @@
               <w:rPr>
                 <w:noProof/>
               </w:rPr>
-              <w:instrText xml:space="preserve"> PAGEREF _Toc243659381 \h </w:instrText>
+              <w:instrText xml:space="preserve"> PAGEREF _Toc243905958 \h </w:instrText>
             </w:r>
             <w:r>
               <w:rPr>
@@ -1084,7 +1084,7 @@
               <w14:ligatures w14:val="standardContextual"/>
             </w:rPr>
           </w:pPr>
-          <w:hyperlink w:anchor="_Toc243659382" w:history="1">
+          <w:hyperlink w:anchor="_Toc243905959" w:history="1">
             <w:r>
               <w:rPr>
                 <w:rStyle w:val="Hyperlink"/>
@@ -1108,7 +1108,7 @@
               <w:rPr>
                 <w:noProof/>
               </w:rPr>
-              <w:instrText xml:space="preserve"> PAGEREF _Toc243659382 \h </w:instrText>
+              <w:instrText xml:space="preserve"> PAGEREF _Toc243905959 \h </w:instrText>
             </w:r>
             <w:r>
               <w:rPr>
@@ -1150,7 +1150,7 @@
               <w14:ligatures w14:val="standardContextual"/>
             </w:rPr>
           </w:pPr>
-          <w:hyperlink w:anchor="_Toc243659383" w:history="1">
+          <w:hyperlink w:anchor="_Toc243905960" w:history="1">
             <w:r>
               <w:rPr>
                 <w:rStyle w:val="Hyperlink"/>
@@ -1174,7 +1174,7 @@
               <w:rPr>
                 <w:noProof/>
               </w:rPr>
-              <w:instrText xml:space="preserve"> PAGEREF _Toc243659383 \h </w:instrText>
+              <w:instrText xml:space="preserve"> PAGEREF _Toc243905960 \h </w:instrText>
             </w:r>
             <w:r>
               <w:rPr>
@@ -1216,7 +1216,7 @@
               <w14:ligatures w14:val="standardContextual"/>
             </w:rPr>
           </w:pPr>
-          <w:hyperlink w:anchor="_Toc243659384" w:history="1">
+          <w:hyperlink w:anchor="_Toc243905961" w:history="1">
             <w:r>
               <w:rPr>
                 <w:rStyle w:val="Hyperlink"/>
@@ -1240,7 +1240,7 @@
               <w:rPr>
                 <w:noProof/>
               </w:rPr>
-              <w:instrText xml:space="preserve"> PAGEREF _Toc243659384 \h </w:instrText>
+              <w:instrText xml:space="preserve"> PAGEREF _Toc243905961 \h </w:instrText>
             </w:r>
             <w:r>
               <w:rPr>
@@ -1282,7 +1282,7 @@
               <w14:ligatures w14:val="standardContextual"/>
             </w:rPr>
           </w:pPr>
-          <w:hyperlink w:anchor="_Toc243659385" w:history="1">
+          <w:hyperlink w:anchor="_Toc243905962" w:history="1">
             <w:r>
               <w:rPr>
                 <w:rStyle w:val="Hyperlink"/>
@@ -1306,7 +1306,7 @@
               <w:rPr>
                 <w:noProof/>
               </w:rPr>
-              <w:instrText xml:space="preserve"> PAGEREF _Toc243659385 \h </w:instrText>
+              <w:instrText xml:space="preserve"> PAGEREF _Toc243905962 \h </w:instrText>
             </w:r>
             <w:r>
               <w:rPr>
@@ -1348,7 +1348,7 @@
               <w14:ligatures w14:val="standardContextual"/>
             </w:rPr>
           </w:pPr>
-          <w:hyperlink w:anchor="_Toc243659386" w:history="1">
+          <w:hyperlink w:anchor="_Toc243905963" w:history="1">
             <w:r>
               <w:rPr>
                 <w:rStyle w:val="Hyperlink"/>
@@ -1372,7 +1372,7 @@
               <w:rPr>
                 <w:noProof/>
               </w:rPr>
-              <w:instrText xml:space="preserve"> PAGEREF _Toc243659386 \h </w:instrText>
+              <w:instrText xml:space="preserve"> PAGEREF _Toc243905963 \h </w:instrText>
             </w:r>
             <w:r>
               <w:rPr>
@@ -1414,7 +1414,7 @@
               <w14:ligatures w14:val="standardContextual"/>
             </w:rPr>
           </w:pPr>
-          <w:hyperlink w:anchor="_Toc243659387" w:history="1">
+          <w:hyperlink w:anchor="_Toc243905964" w:history="1">
             <w:r>
               <w:rPr>
                 <w:rStyle w:val="Hyperlink"/>
@@ -1438,7 +1438,7 @@
               <w:rPr>
                 <w:noProof/>
               </w:rPr>
-              <w:instrText xml:space="preserve"> PAGEREF _Toc243659387 \h </w:instrText>
+              <w:instrText xml:space="preserve"> PAGEREF _Toc243905964 \h </w:instrText>
             </w:r>
             <w:r>
               <w:rPr>
@@ -1480,7 +1480,7 @@
               <w14:ligatures w14:val="standardContextual"/>
             </w:rPr>
           </w:pPr>
-          <w:hyperlink w:anchor="_Toc243659388" w:history="1">
+          <w:hyperlink w:anchor="_Toc243905965" w:history="1">
             <w:r>
               <w:rPr>
                 <w:rStyle w:val="Hyperlink"/>
@@ -1504,7 +1504,7 @@
               <w:rPr>
                 <w:noProof/>
               </w:rPr>
-              <w:instrText xml:space="preserve"> PAGEREF _Toc243659388 \h </w:instrText>
+              <w:instrText xml:space="preserve"> PAGEREF _Toc243905965 \h </w:instrText>
             </w:r>
             <w:r>
               <w:rPr>
@@ -1546,7 +1546,7 @@
               <w14:ligatures w14:val="standardContextual"/>
             </w:rPr>
           </w:pPr>
-          <w:hyperlink w:anchor="_Toc243659389" w:history="1">
+          <w:hyperlink w:anchor="_Toc243905966" w:history="1">
             <w:r>
               <w:rPr>
                 <w:rStyle w:val="Hyperlink"/>
@@ -1570,7 +1570,7 @@
               <w:rPr>
                 <w:noProof/>
               </w:rPr>
-              <w:instrText xml:space="preserve"> PAGEREF _Toc243659389 \h </w:instrText>
+              <w:instrText xml:space="preserve"> PAGEREF _Toc243905966 \h </w:instrText>
             </w:r>
             <w:r>
               <w:rPr>
@@ -1612,7 +1612,7 @@
               <w14:ligatures w14:val="standardContextual"/>
             </w:rPr>
           </w:pPr>
-          <w:hyperlink w:anchor="_Toc243659390" w:history="1">
+          <w:hyperlink w:anchor="_Toc243905967" w:history="1">
             <w:r>
               <w:rPr>
                 <w:rStyle w:val="Hyperlink"/>
@@ -1636,7 +1636,7 @@
               <w:rPr>
                 <w:noProof/>
               </w:rPr>
-              <w:instrText xml:space="preserve"> PAGEREF _Toc243659390 \h </w:instrText>
+              <w:instrText xml:space="preserve"> PAGEREF _Toc243905967 \h </w:instrText>
             </w:r>
             <w:r>
               <w:rPr>
@@ -1678,7 +1678,7 @@
               <w14:ligatures w14:val="standardContextual"/>
             </w:rPr>
           </w:pPr>
-          <w:hyperlink w:anchor="_Toc243659391" w:history="1">
+          <w:hyperlink w:anchor="_Toc243905968" w:history="1">
             <w:r>
               <w:rPr>
                 <w:rStyle w:val="Hyperlink"/>
@@ -1702,7 +1702,7 @@
               <w:rPr>
                 <w:noProof/>
               </w:rPr>
-              <w:instrText xml:space="preserve"> PAGEREF _Toc243659391 \h </w:instrText>
+              <w:instrText xml:space="preserve"> PAGEREF _Toc243905968 \h </w:instrText>
             </w:r>
             <w:r>
               <w:rPr>
@@ -1744,7 +1744,7 @@
               <w14:ligatures w14:val="standardContextual"/>
             </w:rPr>
           </w:pPr>
-          <w:hyperlink w:anchor="_Toc243659392" w:history="1">
+          <w:hyperlink w:anchor="_Toc243905969" w:history="1">
             <w:r>
               <w:rPr>
                 <w:rStyle w:val="Hyperlink"/>
@@ -1768,7 +1768,7 @@
               <w:rPr>
                 <w:noProof/>
               </w:rPr>
-              <w:instrText xml:space="preserve"> PAGEREF _Toc243659392 \h </w:instrText>
+              <w:instrText xml:space="preserve"> PAGEREF _Toc243905969 \h </w:instrText>
             </w:r>
             <w:r>
               <w:rPr>
@@ -1810,7 +1810,7 @@
               <w14:ligatures w14:val="standardContextual"/>
             </w:rPr>
           </w:pPr>
-          <w:hyperlink w:anchor="_Toc243659393" w:history="1">
+          <w:hyperlink w:anchor="_Toc243905970" w:history="1">
             <w:r>
               <w:rPr>
                 <w:rStyle w:val="Hyperlink"/>
@@ -1834,7 +1834,7 @@
               <w:rPr>
                 <w:noProof/>
               </w:rPr>
-              <w:instrText xml:space="preserve"> PAGEREF _Toc243659393 \h </w:instrText>
+              <w:instrText xml:space="preserve"> PAGEREF _Toc243905970 \h </w:instrText>
             </w:r>
             <w:r>
               <w:rPr>
@@ -1876,7 +1876,7 @@
               <w14:ligatures w14:val="standardContextual"/>
             </w:rPr>
           </w:pPr>
-          <w:hyperlink w:anchor="_Toc243659394" w:history="1">
+          <w:hyperlink w:anchor="_Toc243905971" w:history="1">
             <w:r>
               <w:rPr>
                 <w:rStyle w:val="Hyperlink"/>
@@ -1900,7 +1900,7 @@
               <w:rPr>
                 <w:noProof/>
               </w:rPr>
-              <w:instrText xml:space="preserve"> PAGEREF _Toc243659394 \h </w:instrText>
+              <w:instrText xml:space="preserve"> PAGEREF _Toc243905971 \h </w:instrText>
             </w:r>
             <w:r>
               <w:rPr>
@@ -1942,7 +1942,7 @@
               <w14:ligatures w14:val="standardContextual"/>
             </w:rPr>
           </w:pPr>
-          <w:hyperlink w:anchor="_Toc243659395" w:history="1">
+          <w:hyperlink w:anchor="_Toc243905972" w:history="1">
             <w:r>
               <w:rPr>
                 <w:rStyle w:val="Hyperlink"/>
@@ -1966,7 +1966,7 @@
               <w:rPr>
                 <w:noProof/>
               </w:rPr>
-              <w:instrText xml:space="preserve"> PAGEREF _Toc243659395 \h </w:instrText>
+              <w:instrText xml:space="preserve"> PAGEREF _Toc243905972 \h </w:instrText>
             </w:r>
             <w:r>
               <w:rPr>
@@ -2008,7 +2008,7 @@
               <w14:ligatures w14:val="standardContextual"/>
             </w:rPr>
           </w:pPr>
-          <w:hyperlink w:anchor="_Toc243659396" w:history="1">
+          <w:hyperlink w:anchor="_Toc243905973" w:history="1">
             <w:r>
               <w:rPr>
                 <w:rStyle w:val="Hyperlink"/>
@@ -2032,7 +2032,7 @@
               <w:rPr>
                 <w:noProof/>
               </w:rPr>
-              <w:instrText xml:space="preserve"> PAGEREF _Toc243659396 \h </w:instrText>
+              <w:instrText xml:space="preserve"> PAGEREF _Toc243905973 \h </w:instrText>
             </w:r>
             <w:r>
               <w:rPr>
@@ -2074,7 +2074,7 @@
               <w14:ligatures w14:val="standardContextual"/>
             </w:rPr>
           </w:pPr>
-          <w:hyperlink w:anchor="_Toc243659397" w:history="1">
+          <w:hyperlink w:anchor="_Toc243905974" w:history="1">
             <w:r>
               <w:rPr>
                 <w:rStyle w:val="Hyperlink"/>
@@ -2098,7 +2098,7 @@
               <w:rPr>
                 <w:noProof/>
               </w:rPr>
-              <w:instrText xml:space="preserve"> PAGEREF _Toc243659397 \h </w:instrText>
+              <w:instrText xml:space="preserve"> PAGEREF _Toc243905974 \h </w:instrText>
             </w:r>
             <w:r>
               <w:rPr>
@@ -2140,7 +2140,7 @@
               <w14:ligatures w14:val="standardContextual"/>
             </w:rPr>
           </w:pPr>
-          <w:hyperlink w:anchor="_Toc243659398" w:history="1">
+          <w:hyperlink w:anchor="_Toc243905975" w:history="1">
             <w:r>
               <w:rPr>
                 <w:rStyle w:val="Hyperlink"/>
@@ -2164,7 +2164,7 @@
               <w:rPr>
                 <w:noProof/>
               </w:rPr>
-              <w:instrText xml:space="preserve"> PAGEREF _Toc243659398 \h </w:instrText>
+              <w:instrText xml:space="preserve"> PAGEREF _Toc243905975 \h </w:instrText>
             </w:r>
             <w:r>
               <w:rPr>
@@ -2206,7 +2206,7 @@
               <w14:ligatures w14:val="standardContextual"/>
             </w:rPr>
           </w:pPr>
-          <w:hyperlink w:anchor="_Toc243659399" w:history="1">
+          <w:hyperlink w:anchor="_Toc243905976" w:history="1">
             <w:r>
               <w:rPr>
                 <w:rStyle w:val="Hyperlink"/>
@@ -2230,7 +2230,7 @@
               <w:rPr>
                 <w:noProof/>
               </w:rPr>
-              <w:instrText xml:space="preserve"> PAGEREF _Toc243659399 \h </w:instrText>
+              <w:instrText xml:space="preserve"> PAGEREF _Toc243905976 \h </w:instrText>
             </w:r>
             <w:r>
               <w:rPr>
@@ -2272,7 +2272,7 @@
               <w14:ligatures w14:val="standardContextual"/>
             </w:rPr>
           </w:pPr>
-          <w:hyperlink w:anchor="_Toc243659400" w:history="1">
+          <w:hyperlink w:anchor="_Toc243905977" w:history="1">
             <w:r>
               <w:rPr>
                 <w:rStyle w:val="Hyperlink"/>
@@ -2296,7 +2296,7 @@
               <w:rPr>
                 <w:noProof/>
               </w:rPr>
-              <w:instrText xml:space="preserve"> PAGEREF _Toc243659400 \h </w:instrText>
+              <w:instrText xml:space="preserve"> PAGEREF _Toc243905977 \h </w:instrText>
             </w:r>
             <w:r>
               <w:rPr>
@@ -2338,7 +2338,7 @@
               <w14:ligatures w14:val="standardContextual"/>
             </w:rPr>
           </w:pPr>
-          <w:hyperlink w:anchor="_Toc243659401" w:history="1">
+          <w:hyperlink w:anchor="_Toc243905978" w:history="1">
             <w:r>
               <w:rPr>
                 <w:rStyle w:val="Hyperlink"/>
@@ -2362,7 +2362,7 @@
               <w:rPr>
                 <w:noProof/>
               </w:rPr>
-              <w:instrText xml:space="preserve"> PAGEREF _Toc243659401 \h </w:instrText>
+              <w:instrText xml:space="preserve"> PAGEREF _Toc243905978 \h </w:instrText>
             </w:r>
             <w:r>
               <w:rPr>
@@ -2404,7 +2404,7 @@
               <w14:ligatures w14:val="standardContextual"/>
             </w:rPr>
           </w:pPr>
-          <w:hyperlink w:anchor="_Toc243659402" w:history="1">
+          <w:hyperlink w:anchor="_Toc243905979" w:history="1">
             <w:r>
               <w:rPr>
                 <w:rStyle w:val="Hyperlink"/>
@@ -2428,7 +2428,7 @@
               <w:rPr>
                 <w:noProof/>
               </w:rPr>
-              <w:instrText xml:space="preserve"> PAGEREF _Toc243659402 \h </w:instrText>
+              <w:instrText xml:space="preserve"> PAGEREF _Toc243905979 \h </w:instrText>
             </w:r>
             <w:r>
               <w:rPr>
@@ -2470,7 +2470,7 @@
               <w14:ligatures w14:val="standardContextual"/>
             </w:rPr>
           </w:pPr>
-          <w:hyperlink w:anchor="_Toc243659403" w:history="1">
+          <w:hyperlink w:anchor="_Toc243905980" w:history="1">
             <w:r>
               <w:rPr>
                 <w:rStyle w:val="Hyperlink"/>
@@ -2494,7 +2494,7 @@
               <w:rPr>
                 <w:noProof/>
               </w:rPr>
-              <w:instrText xml:space="preserve"> PAGEREF _Toc243659403 \h </w:instrText>
+              <w:instrText xml:space="preserve"> PAGEREF _Toc243905980 \h </w:instrText>
             </w:r>
             <w:r>
               <w:rPr>
@@ -2536,7 +2536,7 @@
               <w14:ligatures w14:val="standardContextual"/>
             </w:rPr>
           </w:pPr>
-          <w:hyperlink w:anchor="_Toc243659404" w:history="1">
+          <w:hyperlink w:anchor="_Toc243905981" w:history="1">
             <w:r>
               <w:rPr>
                 <w:rStyle w:val="Hyperlink"/>
@@ -2560,7 +2560,7 @@
               <w:rPr>
                 <w:noProof/>
               </w:rPr>
-              <w:instrText xml:space="preserve"> PAGEREF _Toc243659404 \h </w:instrText>
+              <w:instrText xml:space="preserve"> PAGEREF _Toc243905981 \h </w:instrText>
             </w:r>
             <w:r>
               <w:rPr>
@@ -2602,7 +2602,7 @@
               <w14:ligatures w14:val="standardContextual"/>
             </w:rPr>
           </w:pPr>
-          <w:hyperlink w:anchor="_Toc243659405" w:history="1">
+          <w:hyperlink w:anchor="_Toc243905982" w:history="1">
             <w:r>
               <w:rPr>
                 <w:rStyle w:val="Hyperlink"/>
@@ -2626,7 +2626,7 @@
               <w:rPr>
                 <w:noProof/>
               </w:rPr>
-              <w:instrText xml:space="preserve"> PAGEREF _Toc243659405 \h </w:instrText>
+              <w:instrText xml:space="preserve"> PAGEREF _Toc243905982 \h </w:instrText>
             </w:r>
             <w:r>
               <w:rPr>
@@ -2668,7 +2668,7 @@
               <w14:ligatures w14:val="standardContextual"/>
             </w:rPr>
           </w:pPr>
-          <w:hyperlink w:anchor="_Toc243659406" w:history="1">
+          <w:hyperlink w:anchor="_Toc243905983" w:history="1">
             <w:r>
               <w:rPr>
                 <w:rStyle w:val="Hyperlink"/>
@@ -2692,7 +2692,7 @@
               <w:rPr>
                 <w:noProof/>
               </w:rPr>
-              <w:instrText xml:space="preserve"> PAGEREF _Toc243659406 \h </w:instrText>
+              <w:instrText xml:space="preserve"> PAGEREF _Toc243905983 \h </w:instrText>
             </w:r>
             <w:r>
               <w:rPr>
@@ -2734,7 +2734,7 @@
               <w14:ligatures w14:val="standardContextual"/>
             </w:rPr>
           </w:pPr>
-          <w:hyperlink w:anchor="_Toc243659407" w:history="1">
+          <w:hyperlink w:anchor="_Toc243905984" w:history="1">
             <w:r>
               <w:rPr>
                 <w:rStyle w:val="Hyperlink"/>
@@ -2758,7 +2758,7 @@
               <w:rPr>
                 <w:noProof/>
               </w:rPr>
-              <w:instrText xml:space="preserve"> PAGEREF _Toc243659407 \h </w:instrText>
+              <w:instrText xml:space="preserve"> PAGEREF _Toc243905984 \h </w:instrText>
             </w:r>
             <w:r>
               <w:rPr>
@@ -2800,7 +2800,7 @@
               <w14:ligatures w14:val="standardContextual"/>
             </w:rPr>
           </w:pPr>
-          <w:hyperlink w:anchor="_Toc243659408" w:history="1">
+          <w:hyperlink w:anchor="_Toc243905985" w:history="1">
             <w:r>
               <w:rPr>
                 <w:rStyle w:val="Hyperlink"/>
@@ -2824,7 +2824,7 @@
               <w:rPr>
                 <w:noProof/>
               </w:rPr>
-              <w:instrText xml:space="preserve"> PAGEREF _Toc243659408 \h </w:instrText>
+              <w:instrText xml:space="preserve"> PAGEREF _Toc243905985 \h </w:instrText>
             </w:r>
             <w:r>
               <w:rPr>
@@ -2866,7 +2866,7 @@
               <w14:ligatures w14:val="standardContextual"/>
             </w:rPr>
           </w:pPr>
-          <w:hyperlink w:anchor="_Toc243659409" w:history="1">
+          <w:hyperlink w:anchor="_Toc243905986" w:history="1">
             <w:r>
               <w:rPr>
                 <w:rStyle w:val="Hyperlink"/>
@@ -2890,7 +2890,7 @@
               <w:rPr>
                 <w:noProof/>
               </w:rPr>
-              <w:instrText xml:space="preserve"> PAGEREF _Toc243659409 \h </w:instrText>
+              <w:instrText xml:space="preserve"> PAGEREF _Toc243905986 \h </w:instrText>
             </w:r>
             <w:r>
               <w:rPr>
@@ -2932,7 +2932,7 @@
               <w14:ligatures w14:val="standardContextual"/>
             </w:rPr>
           </w:pPr>
-          <w:hyperlink w:anchor="_Toc243659410" w:history="1">
+          <w:hyperlink w:anchor="_Toc243905987" w:history="1">
             <w:r>
               <w:rPr>
                 <w:rStyle w:val="Hyperlink"/>
@@ -2956,7 +2956,7 @@
               <w:rPr>
                 <w:noProof/>
               </w:rPr>
-              <w:instrText xml:space="preserve"> PAGEREF _Toc243659410 \h </w:instrText>
+              <w:instrText xml:space="preserve"> PAGEREF _Toc243905987 \h </w:instrText>
             </w:r>
             <w:r>
               <w:rPr>
@@ -2998,7 +2998,7 @@
               <w14:ligatures w14:val="standardContextual"/>
             </w:rPr>
           </w:pPr>
-          <w:hyperlink w:anchor="_Toc243659411" w:history="1">
+          <w:hyperlink w:anchor="_Toc243905988" w:history="1">
             <w:r>
               <w:rPr>
                 <w:rStyle w:val="Hyperlink"/>
@@ -3022,7 +3022,7 @@
               <w:rPr>
                 <w:noProof/>
               </w:rPr>
-              <w:instrText xml:space="preserve"> PAGEREF _Toc243659411 \h </w:instrText>
+              <w:instrText xml:space="preserve"> PAGEREF _Toc243905988 \h </w:instrText>
             </w:r>
             <w:r>
               <w:rPr>
@@ -3064,7 +3064,7 @@
               <w14:ligatures w14:val="standardContextual"/>
             </w:rPr>
           </w:pPr>
-          <w:hyperlink w:anchor="_Toc243659412" w:history="1">
+          <w:hyperlink w:anchor="_Toc243905989" w:history="1">
             <w:r>
               <w:rPr>
                 <w:rStyle w:val="Hyperlink"/>
@@ -3088,7 +3088,7 @@
               <w:rPr>
                 <w:noProof/>
               </w:rPr>
-              <w:instrText xml:space="preserve"> PAGEREF _Toc243659412 \h </w:instrText>
+              <w:instrText xml:space="preserve"> PAGEREF _Toc243905989 \h </w:instrText>
             </w:r>
             <w:r>
               <w:rPr>
@@ -3130,7 +3130,7 @@
               <w14:ligatures w14:val="standardContextual"/>
             </w:rPr>
           </w:pPr>
-          <w:hyperlink w:anchor="_Toc243659413" w:history="1">
+          <w:hyperlink w:anchor="_Toc243905990" w:history="1">
             <w:r>
               <w:rPr>
                 <w:rStyle w:val="Hyperlink"/>
@@ -3154,7 +3154,7 @@
               <w:rPr>
                 <w:noProof/>
               </w:rPr>
-              <w:instrText xml:space="preserve"> PAGEREF _Toc243659413 \h </w:instrText>
+              <w:instrText xml:space="preserve"> PAGEREF _Toc243905990 \h </w:instrText>
             </w:r>
             <w:r>
               <w:rPr>
@@ -3196,7 +3196,7 @@
               <w14:ligatures w14:val="standardContextual"/>
             </w:rPr>
           </w:pPr>
-          <w:hyperlink w:anchor="_Toc243659414" w:history="1">
+          <w:hyperlink w:anchor="_Toc243905991" w:history="1">
             <w:r>
               <w:rPr>
                 <w:rStyle w:val="Hyperlink"/>
@@ -3220,7 +3220,7 @@
               <w:rPr>
                 <w:noProof/>
               </w:rPr>
-              <w:instrText xml:space="preserve"> PAGEREF _Toc243659414 \h </w:instrText>
+              <w:instrText xml:space="preserve"> PAGEREF _Toc243905991 \h </w:instrText>
             </w:r>
             <w:r>
               <w:rPr>
@@ -3262,7 +3262,7 @@
               <w14:ligatures w14:val="standardContextual"/>
             </w:rPr>
           </w:pPr>
-          <w:hyperlink w:anchor="_Toc243659415" w:history="1">
+          <w:hyperlink w:anchor="_Toc243905992" w:history="1">
             <w:r>
               <w:rPr>
                 <w:rStyle w:val="Hyperlink"/>
@@ -3286,7 +3286,7 @@
               <w:rPr>
                 <w:noProof/>
               </w:rPr>
-              <w:instrText xml:space="preserve"> PAGEREF _Toc243659415 \h </w:instrText>
+              <w:instrText xml:space="preserve"> PAGEREF _Toc243905992 \h </w:instrText>
             </w:r>
             <w:r>
               <w:rPr>
@@ -3328,7 +3328,7 @@
               <w14:ligatures w14:val="standardContextual"/>
             </w:rPr>
           </w:pPr>
-          <w:hyperlink w:anchor="_Toc243659416" w:history="1">
+          <w:hyperlink w:anchor="_Toc243905993" w:history="1">
             <w:r>
               <w:rPr>
                 <w:rStyle w:val="Hyperlink"/>
@@ -3352,7 +3352,7 @@
               <w:rPr>
                 <w:noProof/>
               </w:rPr>
-              <w:instrText xml:space="preserve"> PAGEREF _Toc243659416 \h </w:instrText>
+              <w:instrText xml:space="preserve"> PAGEREF _Toc243905993 \h </w:instrText>
             </w:r>
             <w:r>
               <w:rPr>
@@ -3394,7 +3394,7 @@
               <w14:ligatures w14:val="standardContextual"/>
             </w:rPr>
           </w:pPr>
-          <w:hyperlink w:anchor="_Toc243659417" w:history="1">
+          <w:hyperlink w:anchor="_Toc243905994" w:history="1">
             <w:r>
               <w:rPr>
                 <w:rStyle w:val="Hyperlink"/>
@@ -3418,7 +3418,7 @@
               <w:rPr>
                 <w:noProof/>
               </w:rPr>
-              <w:instrText xml:space="preserve"> PAGEREF _Toc243659417 \h </w:instrText>
+              <w:instrText xml:space="preserve"> PAGEREF _Toc243905994 \h </w:instrText>
             </w:r>
             <w:r>
               <w:rPr>
@@ -3460,7 +3460,7 @@
               <w14:ligatures w14:val="standardContextual"/>
             </w:rPr>
           </w:pPr>
-          <w:hyperlink w:anchor="_Toc243659418" w:history="1">
+          <w:hyperlink w:anchor="_Toc243905995" w:history="1">
             <w:r>
               <w:rPr>
                 <w:rStyle w:val="Hyperlink"/>
@@ -3484,7 +3484,7 @@
               <w:rPr>
                 <w:noProof/>
               </w:rPr>
-              <w:instrText xml:space="preserve"> PAGEREF _Toc243659418 \h </w:instrText>
+              <w:instrText xml:space="preserve"> PAGEREF _Toc243905995 \h </w:instrText>
             </w:r>
             <w:r>
               <w:rPr>
@@ -3526,7 +3526,7 @@
               <w14:ligatures w14:val="standardContextual"/>
             </w:rPr>
           </w:pPr>
-          <w:hyperlink w:anchor="_Toc243659419" w:history="1">
+          <w:hyperlink w:anchor="_Toc243905996" w:history="1">
             <w:r>
               <w:rPr>
                 <w:rStyle w:val="Hyperlink"/>
@@ -3550,7 +3550,7 @@
               <w:rPr>
                 <w:noProof/>
               </w:rPr>
-              <w:instrText xml:space="preserve"> PAGEREF _Toc243659419 \h </w:instrText>
+              <w:instrText xml:space="preserve"> PAGEREF _Toc243905996 \h </w:instrText>
             </w:r>
             <w:r>
               <w:rPr>
@@ -3592,7 +3592,7 @@
               <w14:ligatures w14:val="standardContextual"/>
             </w:rPr>
           </w:pPr>
-          <w:hyperlink w:anchor="_Toc243659420" w:history="1">
+          <w:hyperlink w:anchor="_Toc243905997" w:history="1">
             <w:r>
               <w:rPr>
                 <w:rStyle w:val="Hyperlink"/>
@@ -3616,7 +3616,7 @@
               <w:rPr>
                 <w:noProof/>
               </w:rPr>
-              <w:instrText xml:space="preserve"> PAGEREF _Toc243659420 \h </w:instrText>
+              <w:instrText xml:space="preserve"> PAGEREF _Toc243905997 \h </w:instrText>
             </w:r>
             <w:r>
               <w:rPr>
@@ -3658,7 +3658,7 @@
               <w14:ligatures w14:val="standardContextual"/>
             </w:rPr>
           </w:pPr>
-          <w:hyperlink w:anchor="_Toc243659421" w:history="1">
+          <w:hyperlink w:anchor="_Toc243905998" w:history="1">
             <w:r>
               <w:rPr>
                 <w:rStyle w:val="Hyperlink"/>
@@ -3682,7 +3682,7 @@
               <w:rPr>
                 <w:noProof/>
               </w:rPr>
-              <w:instrText xml:space="preserve"> PAGEREF _Toc243659421 \h </w:instrText>
+              <w:instrText xml:space="preserve"> PAGEREF _Toc243905998 \h </w:instrText>
             </w:r>
             <w:r>
               <w:rPr>
@@ -3724,7 +3724,7 @@
               <w14:ligatures w14:val="standardContextual"/>
             </w:rPr>
           </w:pPr>
-          <w:hyperlink w:anchor="_Toc243659422" w:history="1">
+          <w:hyperlink w:anchor="_Toc243905999" w:history="1">
             <w:r>
               <w:rPr>
                 <w:rStyle w:val="Hyperlink"/>
@@ -3748,7 +3748,7 @@
               <w:rPr>
                 <w:noProof/>
               </w:rPr>
-              <w:instrText xml:space="preserve"> PAGEREF _Toc243659422 \h </w:instrText>
+              <w:instrText xml:space="preserve"> PAGEREF _Toc243905999 \h </w:instrText>
             </w:r>
             <w:r>
               <w:rPr>
@@ -3790,7 +3790,7 @@
               <w14:ligatures w14:val="standardContextual"/>
             </w:rPr>
           </w:pPr>
-          <w:hyperlink w:anchor="_Toc243659423" w:history="1">
+          <w:hyperlink w:anchor="_Toc243906000" w:history="1">
             <w:r>
               <w:rPr>
                 <w:rStyle w:val="Hyperlink"/>
@@ -3814,7 +3814,7 @@
               <w:rPr>
                 <w:noProof/>
               </w:rPr>
-              <w:instrText xml:space="preserve"> PAGEREF _Toc243659423 \h </w:instrText>
+              <w:instrText xml:space="preserve"> PAGEREF _Toc243906000 \h </w:instrText>
             </w:r>
             <w:r>
               <w:rPr>
@@ -3856,7 +3856,7 @@
               <w14:ligatures w14:val="standardContextual"/>
             </w:rPr>
           </w:pPr>
-          <w:hyperlink w:anchor="_Toc243659424" w:history="1">
+          <w:hyperlink w:anchor="_Toc243906001" w:history="1">
             <w:r>
               <w:rPr>
                 <w:rStyle w:val="Hyperlink"/>
@@ -3880,7 +3880,7 @@
               <w:rPr>
                 <w:noProof/>
               </w:rPr>
-              <w:instrText xml:space="preserve"> PAGEREF _Toc243659424 \h </w:instrText>
+              <w:instrText xml:space="preserve"> PAGEREF _Toc243906001 \h </w:instrText>
             </w:r>
             <w:r>
               <w:rPr>
@@ -3922,7 +3922,7 @@
               <w14:ligatures w14:val="standardContextual"/>
             </w:rPr>
           </w:pPr>
-          <w:hyperlink w:anchor="_Toc243659425" w:history="1">
+          <w:hyperlink w:anchor="_Toc243906002" w:history="1">
             <w:r>
               <w:rPr>
                 <w:rStyle w:val="Hyperlink"/>
@@ -3946,7 +3946,7 @@
               <w:rPr>
                 <w:noProof/>
               </w:rPr>
-              <w:instrText xml:space="preserve"> PAGEREF _Toc243659425 \h </w:instrText>
+              <w:instrText xml:space="preserve"> PAGEREF _Toc243906002 \h </w:instrText>
             </w:r>
             <w:r>
               <w:rPr>
@@ -3988,7 +3988,7 @@
               <w14:ligatures w14:val="standardContextual"/>
             </w:rPr>
           </w:pPr>
-          <w:hyperlink w:anchor="_Toc243659426" w:history="1">
+          <w:hyperlink w:anchor="_Toc243906003" w:history="1">
             <w:r>
               <w:rPr>
                 <w:rStyle w:val="Hyperlink"/>
@@ -4012,7 +4012,7 @@
               <w:rPr>
                 <w:noProof/>
               </w:rPr>
-              <w:instrText xml:space="preserve"> PAGEREF _Toc243659426 \h </w:instrText>
+              <w:instrText xml:space="preserve"> PAGEREF _Toc243906003 \h </w:instrText>
             </w:r>
             <w:r>
               <w:rPr>
@@ -4054,7 +4054,7 @@
               <w14:ligatures w14:val="standardContextual"/>
             </w:rPr>
           </w:pPr>
-          <w:hyperlink w:anchor="_Toc243659427" w:history="1">
+          <w:hyperlink w:anchor="_Toc243906004" w:history="1">
             <w:r>
               <w:rPr>
                 <w:rStyle w:val="Hyperlink"/>
@@ -4078,7 +4078,7 @@
               <w:rPr>
                 <w:noProof/>
               </w:rPr>
-              <w:instrText xml:space="preserve"> PAGEREF _Toc243659427 \h </w:instrText>
+              <w:instrText xml:space="preserve"> PAGEREF _Toc243906004 \h </w:instrText>
             </w:r>
             <w:r>
               <w:rPr>
@@ -4120,7 +4120,7 @@
               <w14:ligatures w14:val="standardContextual"/>
             </w:rPr>
           </w:pPr>
-          <w:hyperlink w:anchor="_Toc243659428" w:history="1">
+          <w:hyperlink w:anchor="_Toc243906005" w:history="1">
             <w:r>
               <w:rPr>
                 <w:rStyle w:val="Hyperlink"/>
@@ -4144,7 +4144,7 @@
               <w:rPr>
                 <w:noProof/>
               </w:rPr>
-              <w:instrText xml:space="preserve"> PAGEREF _Toc243659428 \h </w:instrText>
+              <w:instrText xml:space="preserve"> PAGEREF _Toc243906005 \h </w:instrText>
             </w:r>
             <w:r>
               <w:rPr>
@@ -4186,7 +4186,7 @@
               <w14:ligatures w14:val="standardContextual"/>
             </w:rPr>
           </w:pPr>
-          <w:hyperlink w:anchor="_Toc243659429" w:history="1">
+          <w:hyperlink w:anchor="_Toc243906006" w:history="1">
             <w:r>
               <w:rPr>
                 <w:rStyle w:val="Hyperlink"/>
@@ -4210,7 +4210,7 @@
               <w:rPr>
                 <w:noProof/>
               </w:rPr>
-              <w:instrText xml:space="preserve"> PAGEREF _Toc243659429 \h </w:instrText>
+              <w:instrText xml:space="preserve"> PAGEREF _Toc243906006 \h </w:instrText>
             </w:r>
             <w:r>
               <w:rPr>
@@ -4252,7 +4252,7 @@
               <w14:ligatures w14:val="standardContextual"/>
             </w:rPr>
           </w:pPr>
-          <w:hyperlink w:anchor="_Toc243659430" w:history="1">
+          <w:hyperlink w:anchor="_Toc243906007" w:history="1">
             <w:r>
               <w:rPr>
                 <w:rStyle w:val="Hyperlink"/>
@@ -4276,7 +4276,7 @@
               <w:rPr>
                 <w:noProof/>
               </w:rPr>
-              <w:instrText xml:space="preserve"> PAGEREF _Toc243659430 \h </w:instrText>
+              <w:instrText xml:space="preserve"> PAGEREF _Toc243906007 \h </w:instrText>
             </w:r>
             <w:r>
               <w:rPr>
@@ -4318,7 +4318,7 @@
               <w14:ligatures w14:val="standardContextual"/>
             </w:rPr>
           </w:pPr>
-          <w:hyperlink w:anchor="_Toc243659431" w:history="1">
+          <w:hyperlink w:anchor="_Toc243906008" w:history="1">
             <w:r>
               <w:rPr>
                 <w:rStyle w:val="Hyperlink"/>
@@ -4342,7 +4342,7 @@
               <w:rPr>
                 <w:noProof/>
               </w:rPr>
-              <w:instrText xml:space="preserve"> PAGEREF _Toc243659431 \h </w:instrText>
+              <w:instrText xml:space="preserve"> PAGEREF _Toc243906008 \h </w:instrText>
             </w:r>
             <w:r>
               <w:rPr>
@@ -4384,7 +4384,7 @@
               <w14:ligatures w14:val="standardContextual"/>
             </w:rPr>
           </w:pPr>
-          <w:hyperlink w:anchor="_Toc243659432" w:history="1">
+          <w:hyperlink w:anchor="_Toc243906009" w:history="1">
             <w:r>
               <w:rPr>
                 <w:rStyle w:val="Hyperlink"/>
@@ -4408,7 +4408,7 @@
               <w:rPr>
                 <w:noProof/>
               </w:rPr>
-              <w:instrText xml:space="preserve"> PAGEREF _Toc243659432 \h </w:instrText>
+              <w:instrText xml:space="preserve"> PAGEREF _Toc243906009 \h </w:instrText>
             </w:r>
             <w:r>
               <w:rPr>
@@ -4450,7 +4450,7 @@
               <w14:ligatures w14:val="standardContextual"/>
             </w:rPr>
           </w:pPr>
-          <w:hyperlink w:anchor="_Toc243659433" w:history="1">
+          <w:hyperlink w:anchor="_Toc243906010" w:history="1">
             <w:r>
               <w:rPr>
                 <w:rStyle w:val="Hyperlink"/>
@@ -4474,7 +4474,7 @@
               <w:rPr>
                 <w:noProof/>
               </w:rPr>
-              <w:instrText xml:space="preserve"> PAGEREF _Toc243659433 \h </w:instrText>
+              <w:instrText xml:space="preserve"> PAGEREF _Toc243906010 \h </w:instrText>
             </w:r>
             <w:r>
               <w:rPr>
@@ -4516,7 +4516,7 @@
               <w14:ligatures w14:val="standardContextual"/>
             </w:rPr>
           </w:pPr>
-          <w:hyperlink w:anchor="_Toc243659434" w:history="1">
+          <w:hyperlink w:anchor="_Toc243906011" w:history="1">
             <w:r>
               <w:rPr>
                 <w:rStyle w:val="Hyperlink"/>
@@ -4540,7 +4540,7 @@
               <w:rPr>
                 <w:noProof/>
               </w:rPr>
-              <w:instrText xml:space="preserve"> PAGEREF _Toc243659434 \h </w:instrText>
+              <w:instrText xml:space="preserve"> PAGEREF _Toc243906011 \h </w:instrText>
             </w:r>
             <w:r>
               <w:rPr>
@@ -4582,7 +4582,7 @@
               <w14:ligatures w14:val="standardContextual"/>
             </w:rPr>
           </w:pPr>
-          <w:hyperlink w:anchor="_Toc243659435" w:history="1">
+          <w:hyperlink w:anchor="_Toc243906012" w:history="1">
             <w:r>
               <w:rPr>
                 <w:rStyle w:val="Hyperlink"/>
@@ -4606,7 +4606,7 @@
               <w:rPr>
                 <w:noProof/>
               </w:rPr>
-              <w:instrText xml:space="preserve"> PAGEREF _Toc243659435 \h </w:instrText>
+              <w:instrText xml:space="preserve"> PAGEREF _Toc243906012 \h </w:instrText>
             </w:r>
             <w:r>
               <w:rPr>
@@ -4648,7 +4648,7 @@
               <w14:ligatures w14:val="standardContextual"/>
             </w:rPr>
           </w:pPr>
-          <w:hyperlink w:anchor="_Toc243659436" w:history="1">
+          <w:hyperlink w:anchor="_Toc243906013" w:history="1">
             <w:r>
               <w:rPr>
                 <w:rStyle w:val="Hyperlink"/>
@@ -4672,7 +4672,7 @@
               <w:rPr>
                 <w:noProof/>
               </w:rPr>
-              <w:instrText xml:space="preserve"> PAGEREF _Toc243659436 \h </w:instrText>
+              <w:instrText xml:space="preserve"> PAGEREF _Toc243906013 \h </w:instrText>
             </w:r>
             <w:r>
               <w:rPr>
@@ -4714,7 +4714,7 @@
               <w14:ligatures w14:val="standardContextual"/>
             </w:rPr>
           </w:pPr>
-          <w:hyperlink w:anchor="_Toc243659437" w:history="1">
+          <w:hyperlink w:anchor="_Toc243906014" w:history="1">
             <w:r>
               <w:rPr>
                 <w:rStyle w:val="Hyperlink"/>
@@ -4738,7 +4738,7 @@
               <w:rPr>
                 <w:noProof/>
               </w:rPr>
-              <w:instrText xml:space="preserve"> PAGEREF _Toc243659437 \h </w:instrText>
+              <w:instrText xml:space="preserve"> PAGEREF _Toc243906014 \h </w:instrText>
             </w:r>
             <w:r>
               <w:rPr>
@@ -4780,7 +4780,7 @@
               <w14:ligatures w14:val="standardContextual"/>
             </w:rPr>
           </w:pPr>
-          <w:hyperlink w:anchor="_Toc243659438" w:history="1">
+          <w:hyperlink w:anchor="_Toc243906015" w:history="1">
             <w:r>
               <w:rPr>
                 <w:rStyle w:val="Hyperlink"/>
@@ -4804,7 +4804,7 @@
               <w:rPr>
                 <w:noProof/>
               </w:rPr>
-              <w:instrText xml:space="preserve"> PAGEREF _Toc243659438 \h </w:instrText>
+              <w:instrText xml:space="preserve"> PAGEREF _Toc243906015 \h </w:instrText>
             </w:r>
             <w:r>
               <w:rPr>
@@ -4846,7 +4846,7 @@
               <w14:ligatures w14:val="standardContextual"/>
             </w:rPr>
           </w:pPr>
-          <w:hyperlink w:anchor="_Toc243659439" w:history="1">
+          <w:hyperlink w:anchor="_Toc243906016" w:history="1">
             <w:r>
               <w:rPr>
                 <w:rStyle w:val="Hyperlink"/>
@@ -4870,7 +4870,7 @@
               <w:rPr>
                 <w:noProof/>
               </w:rPr>
-              <w:instrText xml:space="preserve"> PAGEREF _Toc243659439 \h </w:instrText>
+              <w:instrText xml:space="preserve"> PAGEREF _Toc243906016 \h </w:instrText>
             </w:r>
             <w:r>
               <w:rPr>
@@ -4912,7 +4912,7 @@
               <w14:ligatures w14:val="standardContextual"/>
             </w:rPr>
           </w:pPr>
-          <w:hyperlink w:anchor="_Toc243659440" w:history="1">
+          <w:hyperlink w:anchor="_Toc243906017" w:history="1">
             <w:r>
               <w:rPr>
                 <w:rStyle w:val="Hyperlink"/>
@@ -4936,7 +4936,7 @@
               <w:rPr>
                 <w:noProof/>
               </w:rPr>
-              <w:instrText xml:space="preserve"> PAGEREF _Toc243659440 \h </w:instrText>
+              <w:instrText xml:space="preserve"> PAGEREF _Toc243906017 \h </w:instrText>
             </w:r>
             <w:r>
               <w:rPr>
@@ -4978,7 +4978,7 @@
               <w14:ligatures w14:val="standardContextual"/>
             </w:rPr>
           </w:pPr>
-          <w:hyperlink w:anchor="_Toc243659441" w:history="1">
+          <w:hyperlink w:anchor="_Toc243906018" w:history="1">
             <w:r>
               <w:rPr>
                 <w:rStyle w:val="Hyperlink"/>
@@ -5002,7 +5002,7 @@
               <w:rPr>
                 <w:noProof/>
               </w:rPr>
-              <w:instrText xml:space="preserve"> PAGEREF _Toc243659441 \h </w:instrText>
+              <w:instrText xml:space="preserve"> PAGEREF _Toc243906018 \h </w:instrText>
             </w:r>
             <w:r>
               <w:rPr>
@@ -5044,7 +5044,7 @@
               <w14:ligatures w14:val="standardContextual"/>
             </w:rPr>
           </w:pPr>
-          <w:hyperlink w:anchor="_Toc243659442" w:history="1">
+          <w:hyperlink w:anchor="_Toc243906019" w:history="1">
             <w:r>
               <w:rPr>
                 <w:rStyle w:val="Hyperlink"/>
@@ -5068,7 +5068,7 @@
               <w:rPr>
                 <w:noProof/>
               </w:rPr>
-              <w:instrText xml:space="preserve"> PAGEREF _Toc243659442 \h </w:instrText>
+              <w:instrText xml:space="preserve"> PAGEREF _Toc243906019 \h </w:instrText>
             </w:r>
             <w:r>
               <w:rPr>
@@ -5085,7 +5085,7 @@
               <w:rPr>
                 <w:noProof/>
               </w:rPr>
-              <w:t>44</w:t>
+              <w:t>45</w:t>
             </w:r>
             <w:r>
               <w:rPr>
@@ -5110,7 +5110,7 @@
               <w14:ligatures w14:val="standardContextual"/>
             </w:rPr>
           </w:pPr>
-          <w:hyperlink w:anchor="_Toc243659443" w:history="1">
+          <w:hyperlink w:anchor="_Toc243906020" w:history="1">
             <w:r>
               <w:rPr>
                 <w:rStyle w:val="Hyperlink"/>
@@ -5134,7 +5134,7 @@
               <w:rPr>
                 <w:noProof/>
               </w:rPr>
-              <w:instrText xml:space="preserve"> PAGEREF _Toc243659443 \h </w:instrText>
+              <w:instrText xml:space="preserve"> PAGEREF _Toc243906020 \h </w:instrText>
             </w:r>
             <w:r>
               <w:rPr>
@@ -5151,7 +5151,7 @@
               <w:rPr>
                 <w:noProof/>
               </w:rPr>
-              <w:t>44</w:t>
+              <w:t>45</w:t>
             </w:r>
             <w:r>
               <w:rPr>
@@ -5178,7 +5178,7 @@
         <w:pStyle w:val="Heading1"/>
       </w:pPr>
       <w:bookmarkStart w:id="0" w:name="_Toc97008001"/>
-      <w:bookmarkStart w:id="1" w:name="_Toc243659368"/>
+      <w:bookmarkStart w:id="1" w:name="_Toc243905945"/>
       <w:r>
         <w:lastRenderedPageBreak/>
         <w:t>What Changed from the 7th Version</w:t>
@@ -5762,7 +5762,7 @@
                 <w:sz w:val="19"/>
                 <w:szCs w:val="19"/>
               </w:rPr>
-              <w:t>Numbers</w:t>
+              <w:t>Look of the test screens</w:t>
             </w:r>
           </w:p>
         </w:tc>
@@ -5788,7 +5788,7 @@
                 <w:sz w:val="19"/>
                 <w:szCs w:val="19"/>
               </w:rPr>
-              <w:t>34 migrations (0032, 0033 and 0034 are new) and 2,635 tests. Every change, the every-country change (0034) included, was mutation-tested, and the full suite was run ten times in a row, clean, after each.</w:t>
+              <w:t>The test screens and the demo's register and log-in pages have a new look (2026-10-22), finished to the level of AmeliaWP and Cal.com; on the booking page the business and a live summary of the booking sit beside the steps. Every screen, step, wording and function is unchanged, and the backend did not change (Section 19.8).</w:t>
             </w:r>
           </w:p>
         </w:tc>
@@ -5819,6 +5819,63 @@
                 <w:sz w:val="19"/>
                 <w:szCs w:val="19"/>
               </w:rPr>
+              <w:t>Numbers</w:t>
+            </w:r>
+          </w:p>
+        </w:tc>
+        <w:tc>
+          <w:tcPr>
+            <w:tcW w:w="7438" w:type="dxa"/>
+            <w:tcBorders>
+              <w:top w:val="single" w:sz="4" w:space="0" w:color="B4B2A9"/>
+              <w:left w:val="single" w:sz="4" w:space="0" w:color="B4B2A9"/>
+              <w:bottom w:val="single" w:sz="4" w:space="0" w:color="B4B2A9"/>
+              <w:right w:val="single" w:sz="4" w:space="0" w:color="B4B2A9"/>
+            </w:tcBorders>
+            <w:tcMar>
+              <w:top w:w="60" w:type="dxa"/>
+              <w:left w:w="100" w:type="dxa"/>
+              <w:bottom w:w="60" w:type="dxa"/>
+              <w:right w:w="100" w:type="dxa"/>
+            </w:tcMar>
+          </w:tcPr>
+          <w:p>
+            <w:r>
+              <w:rPr>
+                <w:sz w:val="19"/>
+                <w:szCs w:val="19"/>
+              </w:rPr>
+              <w:t>34 migrations (0032, 0033 and 0034 are new) and 2,635 tests. Every change, the every-country change (0034) included, was mutation-tested, and the full suite was run ten times in a row, clean, after each.</w:t>
+            </w:r>
+          </w:p>
+        </w:tc>
+      </w:tr>
+      <w:tr>
+        <w:trPr>
+          <w:cantSplit/>
+        </w:trPr>
+        <w:tc>
+          <w:tcPr>
+            <w:tcW w:w="2200" w:type="dxa"/>
+            <w:tcBorders>
+              <w:top w:val="single" w:sz="4" w:space="0" w:color="B4B2A9"/>
+              <w:left w:val="single" w:sz="4" w:space="0" w:color="B4B2A9"/>
+              <w:bottom w:val="single" w:sz="4" w:space="0" w:color="B4B2A9"/>
+              <w:right w:val="single" w:sz="4" w:space="0" w:color="B4B2A9"/>
+            </w:tcBorders>
+            <w:tcMar>
+              <w:top w:w="60" w:type="dxa"/>
+              <w:left w:w="100" w:type="dxa"/>
+              <w:bottom w:w="60" w:type="dxa"/>
+              <w:right w:w="100" w:type="dxa"/>
+            </w:tcMar>
+          </w:tcPr>
+          <w:p>
+            <w:r>
+              <w:rPr>
+                <w:sz w:val="19"/>
+                <w:szCs w:val="19"/>
+              </w:rPr>
               <w:t>Still open</w:t>
             </w:r>
           </w:p>
@@ -5861,7 +5918,7 @@
         <w:pStyle w:val="Heading1"/>
       </w:pPr>
       <w:bookmarkStart w:id="2" w:name="_Toc96007001"/>
-      <w:bookmarkStart w:id="3" w:name="_Toc243659369"/>
+      <w:bookmarkStart w:id="3" w:name="_Toc243905946"/>
       <w:r>
         <w:t>What Changed from the 6th Version</w:t>
       </w:r>
@@ -5928,6 +5985,7 @@
                 <w:sz w:val="19"/>
                 <w:szCs w:val="19"/>
               </w:rPr>
+              <w:lastRenderedPageBreak/>
               <w:t>Area</w:t>
             </w:r>
           </w:p>
@@ -6045,7 +6103,6 @@
                 <w:sz w:val="19"/>
                 <w:szCs w:val="19"/>
               </w:rPr>
-              <w:lastRenderedPageBreak/>
               <w:t>Restaurant</w:t>
             </w:r>
           </w:p>
@@ -6316,7 +6373,7 @@
         <w:pStyle w:val="Heading1"/>
       </w:pPr>
       <w:bookmarkStart w:id="4" w:name="_Toc96005001"/>
-      <w:bookmarkStart w:id="5" w:name="_Toc243659370"/>
+      <w:bookmarkStart w:id="5" w:name="_Toc243905947"/>
       <w:r>
         <w:t>What Changed from the 5th Version</w:t>
       </w:r>
@@ -6785,6 +6842,7 @@
                 <w:sz w:val="19"/>
                 <w:szCs w:val="19"/>
               </w:rPr>
+              <w:lastRenderedPageBreak/>
               <w:t>Corrections</w:t>
             </w:r>
           </w:p>
@@ -6899,7 +6957,6 @@
                 <w:sz w:val="19"/>
                 <w:szCs w:val="19"/>
               </w:rPr>
-              <w:lastRenderedPageBreak/>
               <w:t>Still open</w:t>
             </w:r>
           </w:p>
@@ -6941,7 +6998,7 @@
       <w:pPr>
         <w:pStyle w:val="Heading1"/>
       </w:pPr>
-      <w:bookmarkStart w:id="6" w:name="_Toc243659371"/>
+      <w:bookmarkStart w:id="6" w:name="_Toc243905948"/>
       <w:r>
         <w:t>What Changed from the 2nd Version</w:t>
       </w:r>
@@ -7536,7 +7593,7 @@
         <w:pStyle w:val="Heading1"/>
       </w:pPr>
       <w:bookmarkStart w:id="7" w:name="_Toc90001001"/>
-      <w:bookmarkStart w:id="8" w:name="_Toc243659372"/>
+      <w:bookmarkStart w:id="8" w:name="_Toc243905949"/>
       <w:r>
         <w:t>What Changed from the 3rd Version</w:t>
       </w:r>
@@ -7729,6 +7786,7 @@
                 <w:sz w:val="19"/>
                 <w:szCs w:val="19"/>
               </w:rPr>
+              <w:lastRenderedPageBreak/>
               <w:t>Area</w:t>
             </w:r>
           </w:p>
@@ -7846,7 +7904,6 @@
                 <w:sz w:val="19"/>
                 <w:szCs w:val="19"/>
               </w:rPr>
-              <w:lastRenderedPageBreak/>
               <w:t>Customer side</w:t>
             </w:r>
           </w:p>
@@ -8230,7 +8287,7 @@
       <w:pPr>
         <w:pStyle w:val="Heading1"/>
       </w:pPr>
-      <w:bookmarkStart w:id="9" w:name="_Toc243659373"/>
+      <w:bookmarkStart w:id="9" w:name="_Toc243905950"/>
       <w:r>
         <w:t>1. Overview and Scope</w:t>
       </w:r>
@@ -8240,7 +8297,7 @@
       <w:pPr>
         <w:pStyle w:val="Heading2"/>
       </w:pPr>
-      <w:bookmarkStart w:id="10" w:name="_Toc243659374"/>
+      <w:bookmarkStart w:id="10" w:name="_Toc243905951"/>
       <w:r>
         <w:t>1.1 Target Businesses</w:t>
       </w:r>
@@ -8330,7 +8387,7 @@
       <w:pPr>
         <w:pStyle w:val="Heading2"/>
       </w:pPr>
-      <w:bookmarkStart w:id="11" w:name="_Toc243659375"/>
+      <w:bookmarkStart w:id="11" w:name="_Toc243905952"/>
       <w:r>
         <w:t>1.2 References</w:t>
       </w:r>
@@ -8385,7 +8442,7 @@
       <w:pPr>
         <w:pStyle w:val="Heading2"/>
       </w:pPr>
-      <w:bookmarkStart w:id="12" w:name="_Toc243659376"/>
+      <w:bookmarkStart w:id="12" w:name="_Toc243905953"/>
       <w:r>
         <w:t>1.3 Product Model</w:t>
       </w:r>
@@ -8443,6 +8500,7 @@
           <w:b/>
           <w:bCs/>
         </w:rPr>
+        <w:lastRenderedPageBreak/>
         <w:t>Any other website</w:t>
       </w:r>
       <w:r>
@@ -8474,7 +8532,6 @@
         <w:spacing w:after="120"/>
       </w:pPr>
       <w:r>
-        <w:lastRenderedPageBreak/>
         <w:t>Because the company pays for hosting continuously, the expected pricing model is a monthly or yearly subscription (for example tiered by staff count, locations, or bookings). A self-hosted Docker package for large clients can be considered later.</w:t>
       </w:r>
     </w:p>
@@ -8482,7 +8539,7 @@
       <w:pPr>
         <w:pStyle w:val="Heading1"/>
       </w:pPr>
-      <w:bookmarkStart w:id="13" w:name="_Toc243659377"/>
+      <w:bookmarkStart w:id="13" w:name="_Toc243905954"/>
       <w:r>
         <w:t>2. System Architecture</w:t>
       </w:r>
@@ -8564,7 +8621,7 @@
       <w:pPr>
         <w:pStyle w:val="Heading2"/>
       </w:pPr>
-      <w:bookmarkStart w:id="14" w:name="_Toc243659378"/>
+      <w:bookmarkStart w:id="14" w:name="_Toc243905955"/>
       <w:r>
         <w:t>2.1 Where Each Language Is Used</w:t>
       </w:r>
@@ -9094,7 +9151,7 @@
       <w:pPr>
         <w:pStyle w:val="Heading2"/>
       </w:pPr>
-      <w:bookmarkStart w:id="15" w:name="_Toc243659379"/>
+      <w:bookmarkStart w:id="15" w:name="_Toc243905956"/>
       <w:r>
         <w:t>2.2 Microservice Boundaries</w:t>
       </w:r>
@@ -9397,6 +9454,7 @@
                 <w:sz w:val="19"/>
                 <w:szCs w:val="19"/>
               </w:rPr>
+              <w:lastRenderedPageBreak/>
               <w:t>Catalog</w:t>
             </w:r>
           </w:p>
@@ -9477,7 +9535,6 @@
                 <w:sz w:val="19"/>
                 <w:szCs w:val="19"/>
               </w:rPr>
-              <w:lastRenderedPageBreak/>
               <w:t>Scheduling Core</w:t>
             </w:r>
           </w:p>
@@ -9880,7 +9937,7 @@
       <w:pPr>
         <w:pStyle w:val="Heading2"/>
       </w:pPr>
-      <w:bookmarkStart w:id="16" w:name="_Toc243659380"/>
+      <w:bookmarkStart w:id="16" w:name="_Toc243905957"/>
       <w:r>
         <w:t>2.3 Communication</w:t>
       </w:r>
@@ -10178,7 +10235,7 @@
       <w:pPr>
         <w:pStyle w:val="Heading1"/>
       </w:pPr>
-      <w:bookmarkStart w:id="17" w:name="_Toc243659381"/>
+      <w:bookmarkStart w:id="17" w:name="_Toc243905958"/>
       <w:r>
         <w:t>3. Technology Stack</w:t>
       </w:r>
@@ -10345,6 +10402,7 @@
                 <w:sz w:val="19"/>
                 <w:szCs w:val="19"/>
               </w:rPr>
+              <w:lastRenderedPageBreak/>
               <w:t>ORM and migrations</w:t>
             </w:r>
           </w:p>
@@ -10399,7 +10457,6 @@
                 <w:sz w:val="19"/>
                 <w:szCs w:val="19"/>
               </w:rPr>
-              <w:lastRenderedPageBreak/>
               <w:t>Database</w:t>
             </w:r>
           </w:p>
@@ -11119,7 +11176,7 @@
       <w:pPr>
         <w:pStyle w:val="Heading1"/>
       </w:pPr>
-      <w:bookmarkStart w:id="18" w:name="_Toc243659382"/>
+      <w:bookmarkStart w:id="18" w:name="_Toc243905959"/>
       <w:r>
         <w:t>4. WordPress Plugin and Headless Integration</w:t>
       </w:r>
@@ -11129,7 +11186,7 @@
       <w:pPr>
         <w:pStyle w:val="Heading2"/>
       </w:pPr>
-      <w:bookmarkStart w:id="19" w:name="_Toc243659383"/>
+      <w:bookmarkStart w:id="19" w:name="_Toc243905960"/>
       <w:r>
         <w:t>4.1 Plugin Responsibilities</w:t>
       </w:r>
@@ -11189,6 +11246,7 @@
           <w:b/>
           <w:bCs/>
         </w:rPr>
+        <w:lastRenderedPageBreak/>
         <w:t>Frontend booking:</w:t>
       </w:r>
       <w:r>
@@ -11209,7 +11267,6 @@
           <w:b/>
           <w:bCs/>
         </w:rPr>
-        <w:lastRenderedPageBreak/>
         <w:t>Webhook receiver (optional):</w:t>
       </w:r>
       <w:r>
@@ -11228,7 +11285,7 @@
       <w:pPr>
         <w:pStyle w:val="Heading2"/>
       </w:pPr>
-      <w:bookmarkStart w:id="20" w:name="_Toc243659384"/>
+      <w:bookmarkStart w:id="20" w:name="_Toc243905961"/>
       <w:r>
         <w:t>4.2 Headless Clients</w:t>
       </w:r>
@@ -11277,7 +11334,7 @@
       <w:pPr>
         <w:pStyle w:val="Heading2"/>
       </w:pPr>
-      <w:bookmarkStart w:id="21" w:name="_Toc243659385"/>
+      <w:bookmarkStart w:id="21" w:name="_Toc243905962"/>
       <w:r>
         <w:t>4.3 Roles</w:t>
       </w:r>
@@ -11870,6 +11927,7 @@
           <w:sz w:val="17"/>
           <w:szCs w:val="17"/>
         </w:rPr>
+        <w:lastRenderedPageBreak/>
         <w:t>NEW IN 6TH VERSION</w:t>
       </w:r>
       <w:r>
@@ -11904,11 +11962,7 @@
         <w:t>Owner sign-in by email:</w:t>
       </w:r>
       <w:r>
-        <w:t xml:space="preserve"> an owner signs in with the email address the business has on file, without WordPress and without a password. A single-use link (valid 15 minutes, kept only as a hash) returns the </w:t>
-      </w:r>
-      <w:r>
-        <w:lastRenderedPageBreak/>
-        <w:t>same owner admin token that WordPress gets. The answer never says whether an address is registered, and requests are limited per address and per client.</w:t>
+        <w:t xml:space="preserve"> an owner signs in with the email address the business has on file, without WordPress and without a password. A single-use link (valid 15 minutes, kept only as a hash) returns the same owner admin token that WordPress gets. The answer never says whether an address is registered, and requests are limited per address and per client.</w:t>
       </w:r>
     </w:p>
     <w:p>
@@ -12180,7 +12234,7 @@
       <w:pPr>
         <w:pStyle w:val="Heading1"/>
       </w:pPr>
-      <w:bookmarkStart w:id="22" w:name="_Toc243659386"/>
+      <w:bookmarkStart w:id="22" w:name="_Toc243905963"/>
       <w:r>
         <w:t>5. Global Entities and Policies (All Business Types)</w:t>
       </w:r>
@@ -12190,7 +12244,7 @@
       <w:pPr>
         <w:pStyle w:val="Heading2"/>
       </w:pPr>
-      <w:bookmarkStart w:id="23" w:name="_Toc243659387"/>
+      <w:bookmarkStart w:id="23" w:name="_Toc243905964"/>
       <w:r>
         <w:t>5.1 Entities</w:t>
       </w:r>
@@ -12290,6 +12344,7 @@
           <w:b/>
           <w:bCs/>
         </w:rPr>
+        <w:lastRenderedPageBreak/>
         <w:t>EmployeeDayOff (Personal Leave):</w:t>
       </w:r>
       <w:r>
@@ -12310,7 +12365,6 @@
           <w:b/>
           <w:bCs/>
         </w:rPr>
-        <w:lastRenderedPageBreak/>
         <w:t>BookingPolicy:</w:t>
       </w:r>
       <w:r>
@@ -12351,7 +12405,7 @@
       <w:pPr>
         <w:pStyle w:val="Heading2"/>
       </w:pPr>
-      <w:bookmarkStart w:id="24" w:name="_Toc243659388"/>
+      <w:bookmarkStart w:id="24" w:name="_Toc243905965"/>
       <w:r>
         <w:t>5.2 Data Entry / Activity</w:t>
       </w:r>
@@ -12421,7 +12475,7 @@
       <w:pPr>
         <w:pStyle w:val="Heading2"/>
       </w:pPr>
-      <w:bookmarkStart w:id="25" w:name="_Toc243659389"/>
+      <w:bookmarkStart w:id="25" w:name="_Toc243905966"/>
       <w:r>
         <w:t>5.3 Business Logic</w:t>
       </w:r>
@@ -12775,6 +12829,7 @@
           <w:b/>
           <w:bCs/>
         </w:rPr>
+        <w:lastRenderedPageBreak/>
         <w:t>Known limits:</w:t>
       </w:r>
       <w:r>
@@ -12798,7 +12853,6 @@
           <w:sz w:val="17"/>
           <w:szCs w:val="17"/>
         </w:rPr>
-        <w:lastRenderedPageBreak/>
         <w:t>NEW IN 6TH VERSION</w:t>
       </w:r>
       <w:r>
@@ -13834,6 +13888,7 @@
           <w:b/>
           <w:bCs/>
         </w:rPr>
+        <w:lastRenderedPageBreak/>
         <w:t>Country codes:</w:t>
       </w:r>
       <w:r>
@@ -13853,7 +13908,6 @@
           <w:b/>
           <w:bCs/>
         </w:rPr>
-        <w:lastRenderedPageBreak/>
         <w:t>Two levels of address rules:</w:t>
       </w:r>
     </w:p>
@@ -14734,7 +14788,11 @@
         <w:t>Price after inspection:</w:t>
       </w:r>
       <w:r>
-        <w:t xml:space="preserve"> a service has a new setting, price_after_inspection (off by default; migration 0033). With it on and a price of 0, customers see "Price after inspection"; with a price above 0 that price is a starting price ("From RM 50", for example an inspection fee). It is in the public and admin service answers, and only a manager or owner can change it.</w:t>
+        <w:t xml:space="preserve"> a service has a new setting, price_after_inspection (off by default; migration 0033). With it on and a price of 0, customers see "Price after inspection"; with a price above 0 that price is a </w:t>
+      </w:r>
+      <w:r>
+        <w:lastRenderedPageBreak/>
+        <w:t>starting price ("From RM 50", for example an inspection fee). It is in the public and admin service answers, and only a manager or owner can change it.</w:t>
       </w:r>
     </w:p>
     <w:p>
@@ -14750,7 +14808,6 @@
           <w:b/>
           <w:bCs/>
         </w:rPr>
-        <w:lastRenderedPageBreak/>
         <w:t>Decision (2026-10-21):</w:t>
       </w:r>
       <w:r>
@@ -14809,7 +14866,7 @@
       <w:pPr>
         <w:pStyle w:val="Heading1"/>
       </w:pPr>
-      <w:bookmarkStart w:id="26" w:name="_Toc243659390"/>
+      <w:bookmarkStart w:id="26" w:name="_Toc243905967"/>
       <w:r>
         <w:t>6. Unified Resource Model</w:t>
       </w:r>
@@ -15357,7 +15414,7 @@
       <w:pPr>
         <w:pStyle w:val="Heading1"/>
       </w:pPr>
-      <w:bookmarkStart w:id="27" w:name="_Toc243659391"/>
+      <w:bookmarkStart w:id="27" w:name="_Toc243905968"/>
       <w:r>
         <w:t>7. Restaurant</w:t>
       </w:r>
@@ -15367,7 +15424,7 @@
       <w:pPr>
         <w:pStyle w:val="Heading2"/>
       </w:pPr>
-      <w:bookmarkStart w:id="28" w:name="_Toc243659392"/>
+      <w:bookmarkStart w:id="28" w:name="_Toc243905969"/>
       <w:r>
         <w:t>7.1 Entities</w:t>
       </w:r>
@@ -15517,7 +15574,7 @@
       <w:pPr>
         <w:pStyle w:val="Heading2"/>
       </w:pPr>
-      <w:bookmarkStart w:id="29" w:name="_Toc243659393"/>
+      <w:bookmarkStart w:id="29" w:name="_Toc243905970"/>
       <w:r>
         <w:t>7.2 Activity</w:t>
       </w:r>
@@ -15585,6 +15642,7 @@
         <w:spacing w:after="60"/>
       </w:pPr>
       <w:r>
+        <w:lastRenderedPageBreak/>
         <w:t>The restaurant views reservations by day, filters by status and table type, and reviews special requests.</w:t>
       </w:r>
     </w:p>
@@ -15598,7 +15656,6 @@
         <w:spacing w:after="60"/>
       </w:pPr>
       <w:r>
-        <w:lastRenderedPageBreak/>
         <w:t>The restaurant approves or rejects pending reservations, cancels confirmed ones, or marks them completed or no-show.</w:t>
       </w:r>
     </w:p>
@@ -15671,7 +15728,7 @@
       <w:pPr>
         <w:pStyle w:val="Heading2"/>
       </w:pPr>
-      <w:bookmarkStart w:id="30" w:name="_Toc243659394"/>
+      <w:bookmarkStart w:id="30" w:name="_Toc243905971"/>
       <w:r>
         <w:t>7.3 Business Logic</w:t>
       </w:r>
@@ -16141,7 +16198,7 @@
       <w:pPr>
         <w:pStyle w:val="Heading1"/>
       </w:pPr>
-      <w:bookmarkStart w:id="31" w:name="_Toc243659395"/>
+      <w:bookmarkStart w:id="31" w:name="_Toc243905972"/>
       <w:r>
         <w:t>8. Spa / Clinic</w:t>
       </w:r>
@@ -16151,7 +16208,7 @@
       <w:pPr>
         <w:pStyle w:val="Heading2"/>
       </w:pPr>
-      <w:bookmarkStart w:id="32" w:name="_Toc243659396"/>
+      <w:bookmarkStart w:id="32" w:name="_Toc243905973"/>
       <w:r>
         <w:t>8.1 Entities</w:t>
       </w:r>
@@ -16321,7 +16378,7 @@
       <w:pPr>
         <w:pStyle w:val="Heading2"/>
       </w:pPr>
-      <w:bookmarkStart w:id="33" w:name="_Toc243659397"/>
+      <w:bookmarkStart w:id="33" w:name="_Toc243905974"/>
       <w:r>
         <w:t>8.2 Activity</w:t>
       </w:r>
@@ -16403,7 +16460,7 @@
       <w:pPr>
         <w:pStyle w:val="Heading2"/>
       </w:pPr>
-      <w:bookmarkStart w:id="34" w:name="_Toc243659398"/>
+      <w:bookmarkStart w:id="34" w:name="_Toc243905975"/>
       <w:r>
         <w:t>8.3 Business Logic</w:t>
       </w:r>
@@ -16645,7 +16702,7 @@
       <w:pPr>
         <w:pStyle w:val="Heading1"/>
       </w:pPr>
-      <w:bookmarkStart w:id="35" w:name="_Toc243659399"/>
+      <w:bookmarkStart w:id="35" w:name="_Toc243905976"/>
       <w:r>
         <w:t>9. Hair Salon / Barber</w:t>
       </w:r>
@@ -16655,7 +16712,7 @@
       <w:pPr>
         <w:pStyle w:val="Heading2"/>
       </w:pPr>
-      <w:bookmarkStart w:id="36" w:name="_Toc243659400"/>
+      <w:bookmarkStart w:id="36" w:name="_Toc243905977"/>
       <w:r>
         <w:t>9.1 Entities</w:t>
       </w:r>
@@ -16825,7 +16882,7 @@
       <w:pPr>
         <w:pStyle w:val="Heading2"/>
       </w:pPr>
-      <w:bookmarkStart w:id="37" w:name="_Toc243659401"/>
+      <w:bookmarkStart w:id="37" w:name="_Toc243905978"/>
       <w:r>
         <w:t>9.2 Activity</w:t>
       </w:r>
@@ -16914,7 +16971,7 @@
       <w:pPr>
         <w:pStyle w:val="Heading2"/>
       </w:pPr>
-      <w:bookmarkStart w:id="38" w:name="_Toc243659402"/>
+      <w:bookmarkStart w:id="38" w:name="_Toc243905979"/>
       <w:r>
         <w:t>9.3 Business Logic</w:t>
       </w:r>
@@ -17155,7 +17212,7 @@
       <w:pPr>
         <w:pStyle w:val="Heading1"/>
       </w:pPr>
-      <w:bookmarkStart w:id="39" w:name="_Toc243659403"/>
+      <w:bookmarkStart w:id="39" w:name="_Toc243905980"/>
       <w:r>
         <w:t>10. Automotive Services</w:t>
       </w:r>
@@ -17165,7 +17222,7 @@
       <w:pPr>
         <w:pStyle w:val="Heading2"/>
       </w:pPr>
-      <w:bookmarkStart w:id="40" w:name="_Toc243659404"/>
+      <w:bookmarkStart w:id="40" w:name="_Toc243905981"/>
       <w:r>
         <w:t>10.1 Entities</w:t>
       </w:r>
@@ -17375,7 +17432,7 @@
       <w:pPr>
         <w:pStyle w:val="Heading2"/>
       </w:pPr>
-      <w:bookmarkStart w:id="41" w:name="_Toc243659405"/>
+      <w:bookmarkStart w:id="41" w:name="_Toc243905982"/>
       <w:r>
         <w:t>10.2 Activity</w:t>
       </w:r>
@@ -17484,7 +17541,7 @@
       <w:pPr>
         <w:pStyle w:val="Heading2"/>
       </w:pPr>
-      <w:bookmarkStart w:id="42" w:name="_Toc243659406"/>
+      <w:bookmarkStart w:id="42" w:name="_Toc243905983"/>
       <w:r>
         <w:t>10.3 Business Logic</w:t>
       </w:r>
@@ -17817,7 +17874,7 @@
       <w:pPr>
         <w:pStyle w:val="Heading1"/>
       </w:pPr>
-      <w:bookmarkStart w:id="43" w:name="_Toc243659407"/>
+      <w:bookmarkStart w:id="43" w:name="_Toc243905984"/>
       <w:r>
         <w:t>11. Professional Services</w:t>
       </w:r>
@@ -17827,7 +17884,7 @@
       <w:pPr>
         <w:pStyle w:val="Heading2"/>
       </w:pPr>
-      <w:bookmarkStart w:id="44" w:name="_Toc243659408"/>
+      <w:bookmarkStart w:id="44" w:name="_Toc243905985"/>
       <w:r>
         <w:t>11.1 Entities</w:t>
       </w:r>
@@ -17977,7 +18034,7 @@
       <w:pPr>
         <w:pStyle w:val="Heading2"/>
       </w:pPr>
-      <w:bookmarkStart w:id="45" w:name="_Toc243659409"/>
+      <w:bookmarkStart w:id="45" w:name="_Toc243905986"/>
       <w:r>
         <w:t>11.2 Activity</w:t>
       </w:r>
@@ -18074,7 +18131,7 @@
       <w:pPr>
         <w:pStyle w:val="Heading2"/>
       </w:pPr>
-      <w:bookmarkStart w:id="46" w:name="_Toc243659410"/>
+      <w:bookmarkStart w:id="46" w:name="_Toc243905987"/>
       <w:r>
         <w:t>11.3 Business Logic</w:t>
       </w:r>
@@ -18603,7 +18660,7 @@
       <w:pPr>
         <w:pStyle w:val="Heading1"/>
       </w:pPr>
-      <w:bookmarkStart w:id="47" w:name="_Toc243659411"/>
+      <w:bookmarkStart w:id="47" w:name="_Toc243905988"/>
       <w:r>
         <w:t>12. Database Design</w:t>
       </w:r>
@@ -18613,7 +18670,7 @@
       <w:pPr>
         <w:pStyle w:val="Heading2"/>
       </w:pPr>
-      <w:bookmarkStart w:id="48" w:name="_Toc243659412"/>
+      <w:bookmarkStart w:id="48" w:name="_Toc243905989"/>
       <w:r>
         <w:t>12.1 Why PostgreSQL (not MongoDB)</w:t>
       </w:r>
@@ -18703,7 +18760,7 @@
       <w:pPr>
         <w:pStyle w:val="Heading2"/>
       </w:pPr>
-      <w:bookmarkStart w:id="49" w:name="_Toc243659413"/>
+      <w:bookmarkStart w:id="49" w:name="_Toc243905990"/>
       <w:r>
         <w:t>12.2 Multi-Tenancy</w:t>
       </w:r>
@@ -18721,7 +18778,7 @@
       <w:pPr>
         <w:pStyle w:val="Heading2"/>
       </w:pPr>
-      <w:bookmarkStart w:id="50" w:name="_Toc243659414"/>
+      <w:bookmarkStart w:id="50" w:name="_Toc243905991"/>
       <w:r>
         <w:t>12.3 Tables by Service</w:t>
       </w:r>
@@ -20593,7 +20650,7 @@
       <w:pPr>
         <w:pStyle w:val="Heading2"/>
       </w:pPr>
-      <w:bookmarkStart w:id="51" w:name="_Toc243659415"/>
+      <w:bookmarkStart w:id="51" w:name="_Toc243905992"/>
       <w:r>
         <w:t>12.4 Core Schema (Scheduling)</w:t>
       </w:r>
@@ -23036,7 +23093,7 @@
       <w:pPr>
         <w:pStyle w:val="Heading1"/>
       </w:pPr>
-      <w:bookmarkStart w:id="52" w:name="_Toc243659416"/>
+      <w:bookmarkStart w:id="52" w:name="_Toc243905993"/>
       <w:r>
         <w:t>13. Availability and Booking Engine</w:t>
       </w:r>
@@ -23046,7 +23103,7 @@
       <w:pPr>
         <w:pStyle w:val="Heading2"/>
       </w:pPr>
-      <w:bookmarkStart w:id="53" w:name="_Toc243659417"/>
+      <w:bookmarkStart w:id="53" w:name="_Toc243905994"/>
       <w:r>
         <w:t>13.1 Slot Generation Pipeline</w:t>
       </w:r>
@@ -23306,7 +23363,7 @@
       <w:pPr>
         <w:pStyle w:val="Heading2"/>
       </w:pPr>
-      <w:bookmarkStart w:id="54" w:name="_Toc243659418"/>
+      <w:bookmarkStart w:id="54" w:name="_Toc243905995"/>
       <w:r>
         <w:t>13.2 Allocation Strategies (Python)</w:t>
       </w:r>
@@ -23622,7 +23679,7 @@
       <w:pPr>
         <w:pStyle w:val="Heading2"/>
       </w:pPr>
-      <w:bookmarkStart w:id="55" w:name="_Toc243659419"/>
+      <w:bookmarkStart w:id="55" w:name="_Toc243905996"/>
       <w:r>
         <w:t>13.3 Concurrency</w:t>
       </w:r>
@@ -24098,7 +24155,7 @@
       <w:pPr>
         <w:pStyle w:val="Heading2"/>
       </w:pPr>
-      <w:bookmarkStart w:id="56" w:name="_Toc243659420"/>
+      <w:bookmarkStart w:id="56" w:name="_Toc243905997"/>
       <w:r>
         <w:t>13.4 Booking State Machine</w:t>
       </w:r>
@@ -25128,7 +25185,7 @@
       <w:pPr>
         <w:pStyle w:val="Heading2"/>
       </w:pPr>
-      <w:bookmarkStart w:id="57" w:name="_Toc243659421"/>
+      <w:bookmarkStart w:id="57" w:name="_Toc243905998"/>
       <w:r>
         <w:lastRenderedPageBreak/>
         <w:t>13.5 Background Jobs</w:t>
@@ -26182,7 +26239,7 @@
       <w:pPr>
         <w:pStyle w:val="Heading1"/>
       </w:pPr>
-      <w:bookmarkStart w:id="58" w:name="_Toc243659422"/>
+      <w:bookmarkStart w:id="58" w:name="_Toc243905999"/>
       <w:r>
         <w:t>14. API Design</w:t>
       </w:r>
@@ -32668,7 +32725,7 @@
       <w:pPr>
         <w:pStyle w:val="Heading1"/>
       </w:pPr>
-      <w:bookmarkStart w:id="59" w:name="_Toc243659423"/>
+      <w:bookmarkStart w:id="59" w:name="_Toc243906000"/>
       <w:r>
         <w:t>15. Notifications and Integrations</w:t>
       </w:r>
@@ -33301,7 +33358,7 @@
       <w:pPr>
         <w:pStyle w:val="Heading1"/>
       </w:pPr>
-      <w:bookmarkStart w:id="60" w:name="_Toc243659424"/>
+      <w:bookmarkStart w:id="60" w:name="_Toc243906001"/>
       <w:r>
         <w:t>16. Security and Compliance</w:t>
       </w:r>
@@ -34926,7 +34983,7 @@
       <w:pPr>
         <w:pStyle w:val="Heading1"/>
       </w:pPr>
-      <w:bookmarkStart w:id="61" w:name="_Toc243659425"/>
+      <w:bookmarkStart w:id="61" w:name="_Toc243906002"/>
       <w:r>
         <w:t>17. Development Roadmap</w:t>
       </w:r>
@@ -35965,7 +36022,7 @@
       <w:pPr>
         <w:pStyle w:val="Heading1"/>
       </w:pPr>
-      <w:bookmarkStart w:id="62" w:name="_Toc243659426"/>
+      <w:bookmarkStart w:id="62" w:name="_Toc243906003"/>
       <w:r>
         <w:t>18. Open Questions</w:t>
       </w:r>
@@ -36076,7 +36133,7 @@
         <w:pStyle w:val="Heading1"/>
       </w:pPr>
       <w:bookmarkStart w:id="63" w:name="_Toc96005002"/>
-      <w:bookmarkStart w:id="64" w:name="_Toc243659427"/>
+      <w:bookmarkStart w:id="64" w:name="_Toc243906004"/>
       <w:r>
         <w:t>19. Implementation Status (updated in 8th Version)</w:t>
       </w:r>
@@ -36096,7 +36153,7 @@
         <w:pStyle w:val="Heading2"/>
       </w:pPr>
       <w:bookmarkStart w:id="65" w:name="_Toc96005003"/>
-      <w:bookmarkStart w:id="66" w:name="_Toc243659428"/>
+      <w:bookmarkStart w:id="66" w:name="_Toc243906005"/>
       <w:r>
         <w:t>19.1 Built and tested</w:t>
       </w:r>
@@ -36397,7 +36454,7 @@
         <w:pStyle w:val="Heading2"/>
       </w:pPr>
       <w:bookmarkStart w:id="67" w:name="_Toc96005004"/>
-      <w:bookmarkStart w:id="68" w:name="_Toc243659429"/>
+      <w:bookmarkStart w:id="68" w:name="_Toc243906006"/>
       <w:r>
         <w:t>19.2 Built but not checked against the real thing</w:t>
       </w:r>
@@ -36601,7 +36658,7 @@
         <w:pStyle w:val="Heading2"/>
       </w:pPr>
       <w:bookmarkStart w:id="69" w:name="_Toc96005005"/>
-      <w:bookmarkStart w:id="70" w:name="_Toc243659430"/>
+      <w:bookmarkStart w:id="70" w:name="_Toc243906007"/>
       <w:r>
         <w:t>19.3 Not built</w:t>
       </w:r>
@@ -37768,7 +37825,7 @@
         <w:pStyle w:val="Heading2"/>
       </w:pPr>
       <w:bookmarkStart w:id="71" w:name="_Toc96005006"/>
-      <w:bookmarkStart w:id="72" w:name="_Toc243659431"/>
+      <w:bookmarkStart w:id="72" w:name="_Toc243906008"/>
       <w:r>
         <w:t>19.4 Decisions taken during the build</w:t>
       </w:r>
@@ -38237,7 +38294,7 @@
         <w:pStyle w:val="Heading2"/>
       </w:pPr>
       <w:bookmarkStart w:id="73" w:name="_Toc96005007"/>
-      <w:bookmarkStart w:id="74" w:name="_Toc243659432"/>
+      <w:bookmarkStart w:id="74" w:name="_Toc243906009"/>
       <w:r>
         <w:t>19.5 How it was verified</w:t>
       </w:r>
@@ -38417,7 +38474,7 @@
         <w:pStyle w:val="Heading2"/>
       </w:pPr>
       <w:bookmarkStart w:id="75" w:name="_Toc96005008"/>
-      <w:bookmarkStart w:id="76" w:name="_Toc243659433"/>
+      <w:bookmarkStart w:id="76" w:name="_Toc243906010"/>
       <w:r>
         <w:t>19.6 Code review findings</w:t>
       </w:r>
@@ -39420,7 +39477,7 @@
         <w:pStyle w:val="Heading2"/>
       </w:pPr>
       <w:bookmarkStart w:id="77" w:name="_Toc96007002"/>
-      <w:bookmarkStart w:id="78" w:name="_Toc243659434"/>
+      <w:bookmarkStart w:id="78" w:name="_Toc243906011"/>
       <w:r>
         <w:t>19.7 UX prototype and what it found (7th Version)</w:t>
       </w:r>
@@ -40199,7 +40256,7 @@
         <w:pStyle w:val="Heading2"/>
       </w:pPr>
       <w:bookmarkStart w:id="79" w:name="_Toc97008002"/>
-      <w:bookmarkStart w:id="80" w:name="_Toc243659435"/>
+      <w:bookmarkStart w:id="80" w:name="_Toc243906012"/>
       <w:r>
         <w:t>19.8 Local test site and online demo (8th Version)</w:t>
       </w:r>
@@ -40380,6 +40437,58 @@
       </w:r>
       <w:r>
         <w:t xml:space="preserve"> the sign-up screen offers every country (guessed from the browser's time zone) with address fields for that country, prices show in the business's currency, and the register page has a country code in front of the mobile number.</w:t>
+      </w:r>
+    </w:p>
+    <w:p>
+      <w:pPr>
+        <w:pStyle w:val="ListParagraph"/>
+        <w:numPr>
+          <w:ilvl w:val="0"/>
+          <w:numId w:val="2"/>
+        </w:numPr>
+        <w:pBdr>
+          <w:left w:val="single" w:sz="24" w:space="6" w:color="1E6B2E"/>
+        </w:pBdr>
+        <w:shd w:val="clear" w:color="auto" w:fill="EAF4EA"/>
+        <w:spacing w:after="60"/>
+      </w:pPr>
+      <w:r>
+        <w:rPr>
+          <w:b/>
+          <w:bCs/>
+        </w:rPr>
+        <w:t>New look (2026-10-22):</w:t>
+      </w:r>
+      <w:r>
+        <w:t xml:space="preserve"> the screens were redesigned for business owners deciding whether to use JustSimple, in the category's standard style at the finish level of AmeliaWP and Cal.com; every screen, step, wording and function was kept. One typeface (Hanken Grotesk); near-black buttons, with the brand green only on the mark, the current step, free days, confirmed status and focus; borders instead of shadows; outline icons; a new mark, a ticked calendar. On a desktop the booking page shows the business (photo, name, rating, address) and a live "Your booking" summary beside the step card, with the total and Continue in a footer that stays in view; on a phone they stack. The top bar has the areas and Messages on one row and the business and role on a second. In the admin the schedule board has hour lines and the booking detail opens from the bottom on a phone. Steps slide in the direction of travel; motion is turned off for visitors who ask for less. The demo's register, log-in and API pages match.</w:t>
+      </w:r>
+    </w:p>
+    <w:p>
+      <w:pPr>
+        <w:pStyle w:val="ListParagraph"/>
+        <w:numPr>
+          <w:ilvl w:val="0"/>
+          <w:numId w:val="2"/>
+        </w:numPr>
+        <w:pBdr>
+          <w:left w:val="single" w:sz="24" w:space="6" w:color="1E6B2E"/>
+        </w:pBdr>
+        <w:shd w:val="clear" w:color="auto" w:fill="EAF4EA"/>
+        <w:spacing w:after="60"/>
+      </w:pPr>
+      <w:r>
+        <w:rPr>
+          <w:b/>
+          <w:bCs/>
+        </w:rPr>
+        <w:t>Design records:</w:t>
+      </w:r>
+      <w:r>
+        <w:t xml:space="preserve"> PRODUCT.md (who the product is for) and DESIGN.md (colours, type, spacing and components, taken from the finished pages) are in the repository, and later design work follows them. The </w:t>
+      </w:r>
+      <w:r>
+        <w:lastRenderedPageBreak/>
+        <w:t>look was checked with the design tools' own checks: an inspector and a pattern detector with no failures left, and a final review that passed after eight fixes. The older prototype (Section 19.7) keeps the old look.</w:t>
       </w:r>
     </w:p>
     <w:p>
@@ -40744,7 +40853,6 @@
                 <w:sz w:val="19"/>
                 <w:szCs w:val="19"/>
               </w:rPr>
-              <w:lastRenderedPageBreak/>
               <w:t>Price 0 looked free</w:t>
             </w:r>
           </w:p>
@@ -41246,7 +41354,7 @@
         <w:pStyle w:val="Heading1"/>
       </w:pPr>
       <w:bookmarkStart w:id="81" w:name="_Toc96005009"/>
-      <w:bookmarkStart w:id="82" w:name="_Toc243659436"/>
+      <w:bookmarkStart w:id="82" w:name="_Toc243906013"/>
       <w:r>
         <w:t>20. Product Direction (decisions of 2026-10-06, updated in 8th Version)</w:t>
       </w:r>
@@ -41266,7 +41374,7 @@
         <w:pStyle w:val="Heading2"/>
       </w:pPr>
       <w:bookmarkStart w:id="83" w:name="_Toc96005010"/>
-      <w:bookmarkStart w:id="84" w:name="_Toc243659437"/>
+      <w:bookmarkStart w:id="84" w:name="_Toc243906014"/>
       <w:r>
         <w:t>20.1 Standalone and WordPress</w:t>
       </w:r>
@@ -41350,7 +41458,7 @@
         <w:pStyle w:val="Heading2"/>
       </w:pPr>
       <w:bookmarkStart w:id="85" w:name="_Toc96005011"/>
-      <w:bookmarkStart w:id="86" w:name="_Toc243659438"/>
+      <w:bookmarkStart w:id="86" w:name="_Toc243906015"/>
       <w:r>
         <w:t>20.2 Free tier and paid tier</w:t>
       </w:r>
@@ -41458,6 +41566,7 @@
                 <w:sz w:val="19"/>
                 <w:szCs w:val="19"/>
               </w:rPr>
+              <w:lastRenderedPageBreak/>
               <w:t>Limit</w:t>
             </w:r>
           </w:p>
@@ -42054,9 +42163,8 @@
         <w:pStyle w:val="Heading2"/>
       </w:pPr>
       <w:bookmarkStart w:id="87" w:name="_Toc96005012"/>
-      <w:bookmarkStart w:id="88" w:name="_Toc243659439"/>
-      <w:r>
-        <w:lastRenderedPageBreak/>
+      <w:bookmarkStart w:id="88" w:name="_Toc243906016"/>
+      <w:r>
         <w:t>20.3 Where paid customers' data lives (the 'database bucket' question)</w:t>
       </w:r>
       <w:bookmarkEnd w:id="87"/>
@@ -42481,7 +42589,7 @@
         <w:pStyle w:val="Heading2"/>
       </w:pPr>
       <w:bookmarkStart w:id="89" w:name="_Toc96005013"/>
-      <w:bookmarkStart w:id="90" w:name="_Toc243659440"/>
+      <w:bookmarkStart w:id="90" w:name="_Toc243906017"/>
       <w:r>
         <w:t>20.4 One paid account, one business, one type</w:t>
       </w:r>
@@ -42565,7 +42673,7 @@
         <w:pStyle w:val="Heading2"/>
       </w:pPr>
       <w:bookmarkStart w:id="91" w:name="_Toc96005014"/>
-      <w:bookmarkStart w:id="92" w:name="_Toc243659441"/>
+      <w:bookmarkStart w:id="92" w:name="_Toc243906018"/>
       <w:r>
         <w:t>20.5 Countries and localisation: every country, three in detail</w:t>
       </w:r>
@@ -42673,8 +42781,9 @@
         <w:pStyle w:val="Heading2"/>
       </w:pPr>
       <w:bookmarkStart w:id="93" w:name="_Toc96005015"/>
-      <w:bookmarkStart w:id="94" w:name="_Toc243659442"/>
-      <w:r>
+      <w:bookmarkStart w:id="94" w:name="_Toc243906019"/>
+      <w:r>
+        <w:lastRenderedPageBreak/>
         <w:t>20.6 Registration</w:t>
       </w:r>
       <w:bookmarkEnd w:id="93"/>
@@ -42733,7 +42842,7 @@
         <w:pStyle w:val="Heading2"/>
       </w:pPr>
       <w:bookmarkStart w:id="95" w:name="_Toc96005016"/>
-      <w:bookmarkStart w:id="96" w:name="_Toc243659443"/>
+      <w:bookmarkStart w:id="96" w:name="_Toc243906020"/>
       <w:r>
         <w:t>20.7 Order of work from here</w:t>
       </w:r>
@@ -42806,7 +42915,6 @@
           <w:b/>
           <w:bCs/>
         </w:rPr>
-        <w:lastRenderedPageBreak/>
         <w:t>3.</w:t>
       </w:r>
       <w:r>

</xml_diff>